<commit_message>
docs(report): update section 2.1 with comprehensive dataset overview, roles table, and raw vs preprocessed pipeline
</commit_message>
<xml_diff>
--- a/docs/report/Bao_cao_hang_muc_cham_giua_ky_Xu_ly_tieng_noi.docx
+++ b/docs/report/Bao_cao_hang_muc_cham_giua_ky_Xu_ly_tieng_noi.docx
@@ -3323,23 +3323,7 @@
           <w:color w:val="000000"/>
           <w:sz w:val="28"/>
         </w:rPr>
-        <w:t>2.1. Tổng quan về dataset sử dụng cho đồ án</w:t>
-      </w:r>
-    </w:p>
-    <w:p>
-      <w:pPr>
-        <w:pStyle w:val="Heading3"/>
-        <w:keepNext/>
-        <w:spacing w:before="200" w:after="80"/>
-      </w:pPr>
-      <w:r>
-        <w:rPr>
-          <w:rFonts w:ascii="Times New Roman" w:hAnsi="Times New Roman" w:eastAsia="Times New Roman"/>
-          <w:b/>
-          <w:color w:val="000000"/>
-          <w:sz w:val="26"/>
-        </w:rPr>
-        <w:t>2.1.1. Few-Shot Google Speech Commands</w:t>
+        <w:t>2.1. Tổng quan các dataset sử dụng trong đồ án</w:t>
       </w:r>
     </w:p>
     <w:p>
@@ -3356,7 +3340,7 @@
           <w:color w:val="000000"/>
           <w:sz w:val="26"/>
         </w:rPr>
-        <w:t>Bộ dữ liệu chính được sử dụng trong đồ án là Few-Shot Google Speech Commands (FS-GSC), được xây dựng dựa trên bộ dữ liệu Google Speech Commands do Google phát hành. Đây là một trong những tập dữ liệu chuẩn và phổ biến nhất trong các nghiên cứu về Keyword Spotting.</w:t>
+        <w:t>Trong đồ án, nhóm sử dụng Google Speech Commands (GSC) làm nguồn dữ liệu chính cho bài toán Few-shot Keyword Spotting. Dữ liệu từ GSC được tổ chức theo thiết lập Few-shot Learning để phục vụ quá trình huấn luyện, validation và đánh giá mô hình.</w:t>
       </w:r>
     </w:p>
     <w:p>
@@ -3373,40 +3357,7 @@
           <w:color w:val="000000"/>
           <w:sz w:val="26"/>
         </w:rPr>
-        <w:t>Bộ dữ liệu gồm hàng chục nghìn đoạn âm thanh ngắn chứa các từ khóa tiếng Anh thông dụng như: yes, no, up, down, left, right, on, off, stop, go, cùng các chữ số từ zero đến nine và một số từ khóa bổ sung. Thời lượng của mỗi đoạn âm thanh khoảng 1 giây và được ghi lại ở tần số lấy mẫu 16 kHz.</w:t>
-      </w:r>
-    </w:p>
-    <w:p>
-      <w:pPr>
-        <w:pStyle w:val="Heading3"/>
-        <w:keepNext/>
-        <w:spacing w:before="200" w:after="80"/>
-      </w:pPr>
-      <w:r>
-        <w:rPr>
-          <w:rFonts w:ascii="Times New Roman" w:hAnsi="Times New Roman" w:eastAsia="Times New Roman"/>
-          <w:b/>
-          <w:color w:val="000000"/>
-          <w:sz w:val="26"/>
-        </w:rPr>
-        <w:t>2.1.2. Cách sử dụng dữ liệu trong Few-shot Learning</w:t>
-      </w:r>
-    </w:p>
-    <w:p>
-      <w:pPr>
-        <w:spacing w:line="360" w:lineRule="auto" w:after="120"/>
-        <w:ind w:firstLine="0"/>
-        <w:jc w:val="both"/>
-      </w:pPr>
-      <w:r>
-        <w:rPr>
-          <w:rFonts w:ascii="Times New Roman" w:hAnsi="Times New Roman" w:eastAsia="Times New Roman"/>
-          <w:b w:val="0"/>
-          <w:i w:val="0"/>
-          <w:color w:val="000000"/>
-          <w:sz w:val="26"/>
-        </w:rPr>
-        <w:t>Khác với cách huấn luyện phân loại thông thường, dữ liệu được chia theo lớp thành ba nhóm độc lập:</w:t>
+        <w:t>Bên cạnh dataset chính, nhóm dự kiến sử dụng thêm hai nguồn dữ liệu bổ sung gồm:</w:t>
       </w:r>
     </w:p>
     <w:p>
@@ -3431,7 +3382,7 @@
           <w:color w:val="000000"/>
           <w:sz w:val="26"/>
         </w:rPr>
-        <w:t xml:space="preserve">Tập Train: </w:t>
+        <w:t xml:space="preserve">AudioMNIST: </w:t>
       </w:r>
       <w:r>
         <w:rPr>
@@ -3439,7 +3390,7 @@
           <w:color w:val="000000"/>
           <w:sz w:val="26"/>
         </w:rPr>
-        <w:t>Gồm 15 từ khóa dùng để huấn luyện mạng TD-ResNet học cách biểu diễn tín hiệu tiếng nói.</w:t>
+        <w:t>Dữ liệu tiếng nói dạng từ đơn/chữ số đơn, dùng để kiểm tra pipeline preprocessing trên một nguồn dữ liệu khác Google Speech Commands.</w:t>
       </w:r>
     </w:p>
     <w:p>
@@ -3464,7 +3415,7 @@
           <w:color w:val="000000"/>
           <w:sz w:val="26"/>
         </w:rPr>
-        <w:t xml:space="preserve">Tập Validation: </w:t>
+        <w:t xml:space="preserve">Fluent Speech Commands (FSC): </w:t>
       </w:r>
       <w:r>
         <w:rPr>
@@ -3472,7 +3423,125 @@
           <w:color w:val="000000"/>
           <w:sz w:val="26"/>
         </w:rPr>
-        <w:t>Gồm 10 từ khóa dùng để theo dõi quá trình huấn luyện và lựa chọn mô hình tốt nhất.</w:t>
+        <w:t>Dữ liệu câu lệnh gồm nhiều từ, dùng để khảo sát preprocessing trên tín hiệu dài và phức tạp hơn dạng single keyword.</w:t>
+      </w:r>
+    </w:p>
+    <w:p>
+      <w:pPr>
+        <w:spacing w:line="360" w:lineRule="auto" w:after="120"/>
+        <w:ind w:firstLine="0"/>
+        <w:jc w:val="both"/>
+      </w:pPr>
+      <w:r>
+        <w:rPr>
+          <w:rFonts w:ascii="Times New Roman" w:hAnsi="Times New Roman" w:eastAsia="Times New Roman"/>
+          <w:b w:val="0"/>
+          <w:i w:val="0"/>
+          <w:color w:val="000000"/>
+          <w:sz w:val="26"/>
+        </w:rPr>
+        <w:t>Ba nguồn dữ liệu này không có vai trò giống nhau. Google Speech Commands là dữ liệu chính để huấn luyện và đánh giá hệ thống Few-shot Keyword Spotting, trong khi AudioMNIST và Fluent Speech Commands chủ yếu được sử dụng cho các thí nghiệm bổ sung về chất lượng dữ liệu và ảnh hưởng của quá trình preprocessing.</w:t>
+      </w:r>
+    </w:p>
+    <w:p>
+      <w:pPr>
+        <w:pStyle w:val="Heading3"/>
+        <w:keepNext/>
+        <w:spacing w:before="200" w:after="80"/>
+      </w:pPr>
+      <w:r>
+        <w:rPr>
+          <w:rFonts w:ascii="Times New Roman" w:hAnsi="Times New Roman" w:eastAsia="Times New Roman"/>
+          <w:b/>
+          <w:color w:val="000000"/>
+          <w:sz w:val="26"/>
+        </w:rPr>
+        <w:t>2.1.1. Google Speech Commands</w:t>
+      </w:r>
+    </w:p>
+    <w:p>
+      <w:pPr>
+        <w:spacing w:line="360" w:lineRule="auto" w:after="120"/>
+        <w:ind w:firstLine="0"/>
+        <w:jc w:val="both"/>
+      </w:pPr>
+      <w:r>
+        <w:rPr>
+          <w:rFonts w:ascii="Times New Roman" w:hAnsi="Times New Roman" w:eastAsia="Times New Roman"/>
+          <w:b w:val="0"/>
+          <w:i w:val="0"/>
+          <w:color w:val="000000"/>
+          <w:sz w:val="26"/>
+        </w:rPr>
+        <w:t>Google Speech Commands là bộ dữ liệu tiếng nói được xây dựng cho các bài toán nhận diện lệnh thoại ngắn và Keyword Spotting.</w:t>
+      </w:r>
+    </w:p>
+    <w:p>
+      <w:pPr>
+        <w:spacing w:line="360" w:lineRule="auto" w:after="120"/>
+        <w:ind w:firstLine="0"/>
+        <w:jc w:val="both"/>
+      </w:pPr>
+      <w:r>
+        <w:rPr>
+          <w:rFonts w:ascii="Times New Roman" w:hAnsi="Times New Roman" w:eastAsia="Times New Roman"/>
+          <w:b w:val="0"/>
+          <w:i w:val="0"/>
+          <w:color w:val="000000"/>
+          <w:sz w:val="26"/>
+        </w:rPr>
+        <w:t>Mỗi mẫu âm thanh thường chứa một từ hoặc một lệnh thoại ngắn, ví dụ: yes, no, up, down, left, right, stop, go.</w:t>
+      </w:r>
+    </w:p>
+    <w:p>
+      <w:pPr>
+        <w:spacing w:line="360" w:lineRule="auto" w:after="120"/>
+        <w:ind w:firstLine="0"/>
+        <w:jc w:val="both"/>
+      </w:pPr>
+      <w:r>
+        <w:rPr>
+          <w:rFonts w:ascii="Times New Roman" w:hAnsi="Times New Roman" w:eastAsia="Times New Roman"/>
+          <w:b w:val="0"/>
+          <w:i w:val="0"/>
+          <w:color w:val="000000"/>
+          <w:sz w:val="26"/>
+        </w:rPr>
+        <w:t>Đặc điểm này phù hợp trực tiếp với bài toán của đồ án vì mỗi đoạn âm thanh có thể được xem như một mẫu của một lớp từ khóa.</w:t>
+      </w:r>
+    </w:p>
+    <w:p>
+      <w:pPr>
+        <w:spacing w:line="360" w:lineRule="auto" w:after="120"/>
+        <w:ind w:firstLine="0"/>
+        <w:jc w:val="both"/>
+      </w:pPr>
+      <w:r>
+        <w:rPr>
+          <w:rFonts w:ascii="Times New Roman" w:hAnsi="Times New Roman" w:eastAsia="Times New Roman"/>
+          <w:b w:val="0"/>
+          <w:i w:val="0"/>
+          <w:color w:val="000000"/>
+          <w:sz w:val="26"/>
+        </w:rPr>
+        <w:t>Trong đồ án, dữ liệu Google Speech Commands được tổ chức lại theo thiết lập Few-shot Learning. Thay vì chỉ huấn luyện một bộ phân loại cố định trên toàn bộ các từ khóa, dữ liệu được chia thành các nhóm lớp phục vụ cho: huấn luyện; validation; kiểm thử.</w:t>
+      </w:r>
+    </w:p>
+    <w:p>
+      <w:pPr>
+        <w:spacing w:line="360" w:lineRule="auto" w:after="120"/>
+        <w:ind w:firstLine="0"/>
+        <w:jc w:val="both"/>
+      </w:pPr>
+      <w:r>
+        <w:rPr>
+          <w:rFonts w:ascii="Times New Roman" w:hAnsi="Times New Roman" w:eastAsia="Times New Roman"/>
+          <w:b w:val="0"/>
+          <w:i w:val="0"/>
+          <w:color w:val="000000"/>
+          <w:sz w:val="26"/>
+        </w:rPr>
+        <w:t>Trong quá trình huấn luyện và đánh giá, dữ liệu được lấy mẫu thành các episode gồm:</w:t>
       </w:r>
     </w:p>
     <w:p>
@@ -3497,7 +3566,7 @@
           <w:color w:val="000000"/>
           <w:sz w:val="26"/>
         </w:rPr>
-        <w:t xml:space="preserve">Tập Test: </w:t>
+        <w:t xml:space="preserve">Support Set: </w:t>
       </w:r>
       <w:r>
         <w:rPr>
@@ -3505,7 +3574,40 @@
           <w:color w:val="000000"/>
           <w:sz w:val="26"/>
         </w:rPr>
-        <w:t>Gồm 10 từ khóa mới hoàn toàn, dùng để đánh giá khả năng nhận diện ít mẫu.</w:t>
+        <w:t>Một số lượng nhỏ mẫu đã biết nhãn của mỗi từ khóa.</w:t>
+      </w:r>
+    </w:p>
+    <w:p>
+      <w:pPr>
+        <w:spacing w:line="360" w:lineRule="auto" w:after="80"/>
+        <w:ind w:left="340" w:hanging="340"/>
+        <w:jc w:val="both"/>
+      </w:pPr>
+      <w:r>
+        <w:rPr>
+          <w:rFonts w:ascii="Times New Roman" w:hAnsi="Times New Roman" w:eastAsia="Times New Roman"/>
+          <w:b/>
+          <w:color w:val="000000"/>
+          <w:sz w:val="26"/>
+        </w:rPr>
+        <w:t xml:space="preserve">-- </w:t>
+      </w:r>
+      <w:r>
+        <w:rPr>
+          <w:rFonts w:ascii="Times New Roman" w:hAnsi="Times New Roman" w:eastAsia="Times New Roman"/>
+          <w:b/>
+          <w:color w:val="000000"/>
+          <w:sz w:val="26"/>
+        </w:rPr>
+        <w:t xml:space="preserve">Query Set: </w:t>
+      </w:r>
+      <w:r>
+        <w:rPr>
+          <w:rFonts w:ascii="Times New Roman" w:hAnsi="Times New Roman" w:eastAsia="Times New Roman"/>
+          <w:color w:val="000000"/>
+          <w:sz w:val="26"/>
+        </w:rPr>
+        <w:t>Các mẫu cần được mô hình phân loại.</w:t>
       </w:r>
     </w:p>
     <w:p>
@@ -3522,7 +3624,270 @@
           <w:color w:val="000000"/>
           <w:sz w:val="26"/>
         </w:rPr>
-        <w:t>Dữ liệu được lấy mẫu thành các episode N-way K-shot. Trong mỗi episode, mô hình chỉ được cung cấp một số ít mẫu Support của từng lớp để nhận diện các mẫu Query.</w:t>
+        <w:t>Mỗi episode được mô tả dưới dạng:</w:t>
+      </w:r>
+    </w:p>
+    <w:p>
+      <w:pPr>
+        <w:spacing w:before="80" w:after="120"/>
+        <w:jc w:val="center"/>
+      </w:pPr>
+      <w:r>
+        <w:rPr>
+          <w:rFonts w:ascii="Cambria Math" w:hAnsi="Cambria Math" w:eastAsia="Cambria Math"/>
+          <w:color w:val="000000"/>
+          <w:sz w:val="24"/>
+        </w:rPr>
+        <w:t>N\text{-way } K\text{-shot}</w:t>
+      </w:r>
+    </w:p>
+    <w:p>
+      <w:pPr>
+        <w:spacing w:line="360" w:lineRule="auto" w:after="120"/>
+        <w:ind w:firstLine="0"/>
+        <w:jc w:val="both"/>
+      </w:pPr>
+      <w:r>
+        <w:rPr>
+          <w:rFonts w:ascii="Times New Roman" w:hAnsi="Times New Roman" w:eastAsia="Times New Roman"/>
+          <w:b w:val="0"/>
+          <w:i w:val="0"/>
+          <w:color w:val="000000"/>
+          <w:sz w:val="26"/>
+        </w:rPr>
+        <w:t>trong đó: N là số lớp từ khóa trong một episode; K là số mẫu Support của mỗi lớp.</w:t>
+      </w:r>
+    </w:p>
+    <w:p>
+      <w:pPr>
+        <w:spacing w:line="360" w:lineRule="auto" w:after="120"/>
+        <w:ind w:firstLine="0"/>
+        <w:jc w:val="both"/>
+      </w:pPr>
+      <w:r>
+        <w:rPr>
+          <w:rFonts w:ascii="Times New Roman" w:hAnsi="Times New Roman" w:eastAsia="Times New Roman"/>
+          <w:b w:val="0"/>
+          <w:i w:val="0"/>
+          <w:color w:val="000000"/>
+          <w:sz w:val="26"/>
+        </w:rPr>
+        <w:t>Google Speech Commands được sử dụng cho các nhiệm vụ chính của đồ án như:</w:t>
+      </w:r>
+    </w:p>
+    <w:p>
+      <w:pPr>
+        <w:spacing w:line="360" w:lineRule="auto" w:after="80"/>
+        <w:ind w:left="340" w:hanging="340"/>
+        <w:jc w:val="both"/>
+      </w:pPr>
+      <w:r>
+        <w:rPr>
+          <w:rFonts w:ascii="Times New Roman" w:hAnsi="Times New Roman" w:eastAsia="Times New Roman"/>
+          <w:b/>
+          <w:color w:val="000000"/>
+          <w:sz w:val="26"/>
+        </w:rPr>
+        <w:t xml:space="preserve">-- </w:t>
+      </w:r>
+      <w:r>
+        <w:rPr>
+          <w:rFonts w:ascii="Times New Roman" w:hAnsi="Times New Roman" w:eastAsia="Times New Roman"/>
+          <w:b/>
+          <w:color w:val="000000"/>
+          <w:sz w:val="26"/>
+        </w:rPr>
+        <w:t xml:space="preserve">Nhiệm vụ 1: </w:t>
+      </w:r>
+      <w:r>
+        <w:rPr>
+          <w:rFonts w:ascii="Times New Roman" w:hAnsi="Times New Roman" w:eastAsia="Times New Roman"/>
+          <w:color w:val="000000"/>
+          <w:sz w:val="26"/>
+        </w:rPr>
+        <w:t>Huấn luyện embedding network.</w:t>
+      </w:r>
+    </w:p>
+    <w:p>
+      <w:pPr>
+        <w:spacing w:line="360" w:lineRule="auto" w:after="80"/>
+        <w:ind w:left="340" w:hanging="340"/>
+        <w:jc w:val="both"/>
+      </w:pPr>
+      <w:r>
+        <w:rPr>
+          <w:rFonts w:ascii="Times New Roman" w:hAnsi="Times New Roman" w:eastAsia="Times New Roman"/>
+          <w:b/>
+          <w:color w:val="000000"/>
+          <w:sz w:val="26"/>
+        </w:rPr>
+        <w:t xml:space="preserve">-- </w:t>
+      </w:r>
+      <w:r>
+        <w:rPr>
+          <w:rFonts w:ascii="Times New Roman" w:hAnsi="Times New Roman" w:eastAsia="Times New Roman"/>
+          <w:b/>
+          <w:color w:val="000000"/>
+          <w:sz w:val="26"/>
+        </w:rPr>
+        <w:t xml:space="preserve">Nhiệm vụ 2: </w:t>
+      </w:r>
+      <w:r>
+        <w:rPr>
+          <w:rFonts w:ascii="Times New Roman" w:hAnsi="Times New Roman" w:eastAsia="Times New Roman"/>
+          <w:color w:val="000000"/>
+          <w:sz w:val="26"/>
+        </w:rPr>
+        <w:t>Huấn luyện theo episodic learning.</w:t>
+      </w:r>
+    </w:p>
+    <w:p>
+      <w:pPr>
+        <w:spacing w:line="360" w:lineRule="auto" w:after="80"/>
+        <w:ind w:left="340" w:hanging="340"/>
+        <w:jc w:val="both"/>
+      </w:pPr>
+      <w:r>
+        <w:rPr>
+          <w:rFonts w:ascii="Times New Roman" w:hAnsi="Times New Roman" w:eastAsia="Times New Roman"/>
+          <w:b/>
+          <w:color w:val="000000"/>
+          <w:sz w:val="26"/>
+        </w:rPr>
+        <w:t xml:space="preserve">-- </w:t>
+      </w:r>
+      <w:r>
+        <w:rPr>
+          <w:rFonts w:ascii="Times New Roman" w:hAnsi="Times New Roman" w:eastAsia="Times New Roman"/>
+          <w:b/>
+          <w:color w:val="000000"/>
+          <w:sz w:val="26"/>
+        </w:rPr>
+        <w:t xml:space="preserve">Nhiệm vụ 3: </w:t>
+      </w:r>
+      <w:r>
+        <w:rPr>
+          <w:rFonts w:ascii="Times New Roman" w:hAnsi="Times New Roman" w:eastAsia="Times New Roman"/>
+          <w:color w:val="000000"/>
+          <w:sz w:val="26"/>
+        </w:rPr>
+        <w:t>Validation mô hình.</w:t>
+      </w:r>
+    </w:p>
+    <w:p>
+      <w:pPr>
+        <w:spacing w:line="360" w:lineRule="auto" w:after="80"/>
+        <w:ind w:left="340" w:hanging="340"/>
+        <w:jc w:val="both"/>
+      </w:pPr>
+      <w:r>
+        <w:rPr>
+          <w:rFonts w:ascii="Times New Roman" w:hAnsi="Times New Roman" w:eastAsia="Times New Roman"/>
+          <w:b/>
+          <w:color w:val="000000"/>
+          <w:sz w:val="26"/>
+        </w:rPr>
+        <w:t xml:space="preserve">-- </w:t>
+      </w:r>
+      <w:r>
+        <w:rPr>
+          <w:rFonts w:ascii="Times New Roman" w:hAnsi="Times New Roman" w:eastAsia="Times New Roman"/>
+          <w:b/>
+          <w:color w:val="000000"/>
+          <w:sz w:val="26"/>
+        </w:rPr>
+        <w:t xml:space="preserve">Nhiệm vụ 4: </w:t>
+      </w:r>
+      <w:r>
+        <w:rPr>
+          <w:rFonts w:ascii="Times New Roman" w:hAnsi="Times New Roman" w:eastAsia="Times New Roman"/>
+          <w:color w:val="000000"/>
+          <w:sz w:val="26"/>
+        </w:rPr>
+        <w:t>Đánh giá khả năng Few-shot.</w:t>
+      </w:r>
+    </w:p>
+    <w:p>
+      <w:pPr>
+        <w:spacing w:line="360" w:lineRule="auto" w:after="80"/>
+        <w:ind w:left="340" w:hanging="340"/>
+        <w:jc w:val="both"/>
+      </w:pPr>
+      <w:r>
+        <w:rPr>
+          <w:rFonts w:ascii="Times New Roman" w:hAnsi="Times New Roman" w:eastAsia="Times New Roman"/>
+          <w:b/>
+          <w:color w:val="000000"/>
+          <w:sz w:val="26"/>
+        </w:rPr>
+        <w:t xml:space="preserve">-- </w:t>
+      </w:r>
+      <w:r>
+        <w:rPr>
+          <w:rFonts w:ascii="Times New Roman" w:hAnsi="Times New Roman" w:eastAsia="Times New Roman"/>
+          <w:b/>
+          <w:color w:val="000000"/>
+          <w:sz w:val="26"/>
+        </w:rPr>
+        <w:t xml:space="preserve">Nhiệm vụ 5: </w:t>
+      </w:r>
+      <w:r>
+        <w:rPr>
+          <w:rFonts w:ascii="Times New Roman" w:hAnsi="Times New Roman" w:eastAsia="Times New Roman"/>
+          <w:color w:val="000000"/>
+          <w:sz w:val="26"/>
+        </w:rPr>
+        <w:t>Kiểm tra khả năng phân biệt các từ khóa mới.</w:t>
+      </w:r>
+    </w:p>
+    <w:p>
+      <w:pPr>
+        <w:spacing w:line="360" w:lineRule="auto" w:after="80"/>
+        <w:ind w:left="340" w:hanging="340"/>
+        <w:jc w:val="both"/>
+      </w:pPr>
+      <w:r>
+        <w:rPr>
+          <w:rFonts w:ascii="Times New Roman" w:hAnsi="Times New Roman" w:eastAsia="Times New Roman"/>
+          <w:b/>
+          <w:color w:val="000000"/>
+          <w:sz w:val="26"/>
+        </w:rPr>
+        <w:t xml:space="preserve">-- </w:t>
+      </w:r>
+      <w:r>
+        <w:rPr>
+          <w:rFonts w:ascii="Times New Roman" w:hAnsi="Times New Roman" w:eastAsia="Times New Roman"/>
+          <w:b/>
+          <w:color w:val="000000"/>
+          <w:sz w:val="26"/>
+        </w:rPr>
+        <w:t xml:space="preserve">Nhiệm vụ 6: </w:t>
+      </w:r>
+      <w:r>
+        <w:rPr>
+          <w:rFonts w:ascii="Times New Roman" w:hAnsi="Times New Roman" w:eastAsia="Times New Roman"/>
+          <w:color w:val="000000"/>
+          <w:sz w:val="26"/>
+        </w:rPr>
+        <w:t>Thực hiện các thí nghiệm với các cấu hình N-way khác nhau.</w:t>
+      </w:r>
+    </w:p>
+    <w:p>
+      <w:pPr>
+        <w:spacing w:line="360" w:lineRule="auto" w:after="120"/>
+        <w:ind w:firstLine="0"/>
+        <w:jc w:val="both"/>
+      </w:pPr>
+      <w:r>
+        <w:rPr>
+          <w:rFonts w:ascii="Times New Roman" w:hAnsi="Times New Roman" w:eastAsia="Times New Roman"/>
+          <w:b w:val="0"/>
+          <w:i w:val="0"/>
+          <w:color w:val="000000"/>
+          <w:sz w:val="26"/>
+        </w:rPr>
+        <w:t>Các thông tin cụ thể như danh sách train/validation/test class, số lượng mẫu và cấu hình episode sẽ được xác nhận trực tiếp từ pipeline thực nghiệm trên Kaggle trước khi đưa vào các mục tiếp theo của báo cáo.</w:t>
       </w:r>
     </w:p>
     <w:p>
@@ -3594,14 +3959,113 @@
           <w:color w:val="000000"/>
           <w:sz w:val="26"/>
         </w:rPr>
-        <w:t>2.1.3. Lý do lựa chọn Google Speech Commands</w:t>
+        <w:t>2.1.2. AudioMNIST</w:t>
       </w:r>
     </w:p>
     <w:p>
       <w:pPr>
-        <w:spacing w:line="360" w:lineRule="auto" w:after="80"/>
-        <w:ind w:left="340" w:hanging="340"/>
+        <w:spacing w:line="360" w:lineRule="auto" w:after="120"/>
+        <w:ind w:firstLine="0"/>
         <w:jc w:val="both"/>
+      </w:pPr>
+      <w:r>
+        <w:rPr>
+          <w:rFonts w:ascii="Times New Roman" w:hAnsi="Times New Roman" w:eastAsia="Times New Roman"/>
+          <w:b w:val="0"/>
+          <w:i w:val="0"/>
+          <w:color w:val="000000"/>
+          <w:sz w:val="26"/>
+        </w:rPr>
+        <w:t>AudioMNIST là một bộ dữ liệu tiếng nói trong đó người nói phát âm các chữ số từ 0 đến 9:</w:t>
+      </w:r>
+    </w:p>
+    <w:p>
+      <w:pPr>
+        <w:spacing w:before="80" w:after="120"/>
+        <w:jc w:val="center"/>
+      </w:pPr>
+      <w:r>
+        <w:rPr>
+          <w:rFonts w:ascii="Cambria Math" w:hAnsi="Cambria Math" w:eastAsia="Cambria Math"/>
+          <w:color w:val="000000"/>
+          <w:sz w:val="24"/>
+        </w:rPr>
+        <w:t>0 \rightarrow 9</w:t>
+      </w:r>
+    </w:p>
+    <w:p>
+      <w:pPr>
+        <w:spacing w:line="360" w:lineRule="auto" w:after="120"/>
+        <w:ind w:firstLine="0"/>
+        <w:jc w:val="both"/>
+      </w:pPr>
+      <w:r>
+        <w:rPr>
+          <w:rFonts w:ascii="Times New Roman" w:hAnsi="Times New Roman" w:eastAsia="Times New Roman"/>
+          <w:b w:val="0"/>
+          <w:i w:val="0"/>
+          <w:color w:val="000000"/>
+          <w:sz w:val="26"/>
+        </w:rPr>
+        <w:t>Các mẫu có nội dung tương đối ngắn và mỗi đoạn âm thanh chủ yếu chứa một đơn vị từ vựng. Do đó, AudioMNIST có đặc điểm gần với dữ liệu single keyword và có thể được sử dụng như một nguồn dữ liệu bổ sung để kiểm tra pipeline xử lý tiếng nói.</w:t>
+      </w:r>
+    </w:p>
+    <w:p>
+      <w:pPr>
+        <w:spacing w:line="360" w:lineRule="auto" w:after="120"/>
+        <w:ind w:firstLine="0"/>
+        <w:jc w:val="both"/>
+      </w:pPr>
+      <w:r>
+        <w:rPr>
+          <w:rFonts w:ascii="Times New Roman" w:hAnsi="Times New Roman" w:eastAsia="Times New Roman"/>
+          <w:b w:val="0"/>
+          <w:i w:val="0"/>
+          <w:color w:val="000000"/>
+          <w:sz w:val="26"/>
+        </w:rPr>
+        <w:t>Trong đồ án, AudioMNIST không được sử dụng thay thế cho Google Speech Commands trong quá trình huấn luyện mô hình chính.</w:t>
+      </w:r>
+    </w:p>
+    <w:p>
+      <w:pPr>
+        <w:spacing w:line="360" w:lineRule="auto" w:after="120"/>
+        <w:ind w:firstLine="0"/>
+        <w:jc w:val="both"/>
+      </w:pPr>
+      <w:r>
+        <w:rPr>
+          <w:rFonts w:ascii="Times New Roman" w:hAnsi="Times New Roman" w:eastAsia="Times New Roman"/>
+          <w:b w:val="0"/>
+          <w:i w:val="0"/>
+          <w:color w:val="000000"/>
+          <w:sz w:val="26"/>
+        </w:rPr>
+        <w:t>Dataset này dự kiến được sử dụng để khảo sát: đặc điểm waveform; thời lượng tín hiệu; biên độ; khoảng lặng; đặc trưng phổ; sự thay đổi của tín hiệu trước và sau preprocessing.</w:t>
+      </w:r>
+    </w:p>
+    <w:p>
+      <w:pPr>
+        <w:spacing w:line="360" w:lineRule="auto" w:after="120"/>
+        <w:ind w:firstLine="0"/>
+        <w:jc w:val="both"/>
+      </w:pPr>
+      <w:r>
+        <w:rPr>
+          <w:rFonts w:ascii="Times New Roman" w:hAnsi="Times New Roman" w:eastAsia="Times New Roman"/>
+          <w:b w:val="0"/>
+          <w:i w:val="0"/>
+          <w:color w:val="000000"/>
+          <w:sz w:val="26"/>
+        </w:rPr>
+        <w:t>Mục tiêu là kiểm tra xem pipeline xử lý dữ liệu có hoạt động ổn định trên một nguồn single-word speech khác với dataset chính hay không. Việc sử dụng thực tế và các thông số cụ thể của AudioMNIST sẽ được xác nhận bằng thực nghiệm trên Kaggle.</w:t>
+      </w:r>
+    </w:p>
+    <w:p>
+      <w:pPr>
+        <w:pStyle w:val="Heading3"/>
+        <w:keepNext/>
+        <w:spacing w:before="200" w:after="80"/>
       </w:pPr>
       <w:r>
         <w:rPr>
@@ -3610,8 +4074,100 @@
           <w:color w:val="000000"/>
           <w:sz w:val="26"/>
         </w:rPr>
-        <w:t xml:space="preserve">-- </w:t>
+        <w:t>2.1.3. Fluent Speech Commands</w:t>
       </w:r>
+    </w:p>
+    <w:p>
+      <w:pPr>
+        <w:spacing w:line="360" w:lineRule="auto" w:after="120"/>
+        <w:ind w:firstLine="0"/>
+        <w:jc w:val="both"/>
+      </w:pPr>
+      <w:r>
+        <w:rPr>
+          <w:rFonts w:ascii="Times New Roman" w:hAnsi="Times New Roman" w:eastAsia="Times New Roman"/>
+          <w:b w:val="0"/>
+          <w:i w:val="0"/>
+          <w:color w:val="000000"/>
+          <w:sz w:val="26"/>
+        </w:rPr>
+        <w:t>Fluent Speech Commands là bộ dữ liệu gồm các câu lệnh bằng giọng nói có thể chứa nhiều từ. Khác với Google Speech Commands và AudioMNIST, dữ liệu trong Fluent Speech Commands có cấu trúc dài hơn và biểu diễn một câu lệnh hoàn chỉnh thay vì chỉ một từ đơn. Ví dụ, một mẫu có thể có dạng: "turn on the lights" hoặc một câu lệnh tương tự gồm nhiều từ.</w:t>
+      </w:r>
+    </w:p>
+    <w:p>
+      <w:pPr>
+        <w:spacing w:line="360" w:lineRule="auto" w:after="120"/>
+        <w:ind w:firstLine="0"/>
+        <w:jc w:val="both"/>
+      </w:pPr>
+      <w:r>
+        <w:rPr>
+          <w:rFonts w:ascii="Times New Roman" w:hAnsi="Times New Roman" w:eastAsia="Times New Roman"/>
+          <w:b w:val="0"/>
+          <w:i w:val="0"/>
+          <w:color w:val="000000"/>
+          <w:sz w:val="26"/>
+        </w:rPr>
+        <w:t>Trong phạm vi đồ án, Fluent Speech Commands không được xem là dataset Few-shot Keyword Spotting chính.</w:t>
+      </w:r>
+    </w:p>
+    <w:p>
+      <w:pPr>
+        <w:spacing w:line="360" w:lineRule="auto" w:after="120"/>
+        <w:ind w:firstLine="0"/>
+        <w:jc w:val="both"/>
+      </w:pPr>
+      <w:r>
+        <w:rPr>
+          <w:rFonts w:ascii="Times New Roman" w:hAnsi="Times New Roman" w:eastAsia="Times New Roman"/>
+          <w:b w:val="0"/>
+          <w:i/>
+          <w:color w:val="000000"/>
+          <w:sz w:val="26"/>
+        </w:rPr>
+        <w:t>Dataset này dự kiến được sử dụng để khảo sát một vấn đề bổ sung: Pipeline preprocessing được xây dựng cho các đoạn audio ngắn có còn hoạt động hợp lý khi đầu vào là một câu lệnh nhiều từ và có thời lượng dài hơn hay không?</w:t>
+      </w:r>
+    </w:p>
+    <w:p>
+      <w:pPr>
+        <w:spacing w:line="360" w:lineRule="auto" w:after="120"/>
+        <w:ind w:firstLine="0"/>
+        <w:jc w:val="both"/>
+      </w:pPr>
+      <w:r>
+        <w:rPr>
+          <w:rFonts w:ascii="Times New Roman" w:hAnsi="Times New Roman" w:eastAsia="Times New Roman"/>
+          <w:b w:val="0"/>
+          <w:i w:val="0"/>
+          <w:color w:val="000000"/>
+          <w:sz w:val="26"/>
+        </w:rPr>
+        <w:t>Các nội dung có thể được khảo sát gồm: thời lượng tín hiệu; khoảng lặng; biên độ; năng lượng; waveform; spectrogram; Mel-spectrogram hoặc MFCC; ảnh hưởng của trimming; ảnh hưởng của normalization; ảnh hưởng của padding hoặc cropping.</w:t>
+      </w:r>
+    </w:p>
+    <w:p>
+      <w:pPr>
+        <w:spacing w:line="360" w:lineRule="auto" w:after="120"/>
+        <w:ind w:firstLine="0"/>
+        <w:jc w:val="both"/>
+      </w:pPr>
+      <w:r>
+        <w:rPr>
+          <w:rFonts w:ascii="Times New Roman" w:hAnsi="Times New Roman" w:eastAsia="Times New Roman"/>
+          <w:b w:val="0"/>
+          <w:i w:val="0"/>
+          <w:color w:val="000000"/>
+          <w:sz w:val="26"/>
+        </w:rPr>
+        <w:t>Các kết quả chỉ được đưa vào báo cáo sau khi được thực nghiệm và xác nhận trực tiếp trên dữ liệu.</w:t>
+      </w:r>
+    </w:p>
+    <w:p>
+      <w:pPr>
+        <w:pStyle w:val="Heading3"/>
+        <w:keepNext/>
+        <w:spacing w:before="200" w:after="80"/>
+      </w:pPr>
       <w:r>
         <w:rPr>
           <w:rFonts w:ascii="Times New Roman" w:hAnsi="Times New Roman" w:eastAsia="Times New Roman"/>
@@ -3619,22 +4175,308 @@
           <w:color w:val="000000"/>
           <w:sz w:val="26"/>
         </w:rPr>
-        <w:t xml:space="preserve">Phù hợp bài toán: </w:t>
+        <w:t>2.1.4. Vai trò của từng dataset</w:t>
       </w:r>
+    </w:p>
+    <w:p>
+      <w:pPr>
+        <w:spacing w:line="360" w:lineRule="auto" w:after="120"/>
+        <w:ind w:firstLine="0"/>
+        <w:jc w:val="both"/>
+      </w:pPr>
       <w:r>
         <w:rPr>
           <w:rFonts w:ascii="Times New Roman" w:hAnsi="Times New Roman" w:eastAsia="Times New Roman"/>
+          <w:b w:val="0"/>
+          <w:i w:val="0"/>
           <w:color w:val="000000"/>
           <w:sz w:val="26"/>
         </w:rPr>
-        <w:t>Được thiết kế chuyên biệt cho bài toán Keyword Spotting, các đoạn âm thanh chứa từ khóa ngắn rõ ràng.</w:t>
+        <w:t>Vai trò dự kiến của các nguồn dữ liệu trong đồ án được tổng hợp như sau:</w:t>
+      </w:r>
+    </w:p>
+    <w:tbl>
+      <w:tblPr>
+        <w:tblW w:type="auto" w:w="0"/>
+        <w:jc w:val="center"/>
+        <w:tblLayout w:type="fixed"/>
+        <w:tblLook w:firstColumn="1" w:firstRow="1" w:lastColumn="0" w:lastRow="0" w:noHBand="0" w:noVBand="1" w:val="04A0"/>
+      </w:tblPr>
+      <w:tblGrid>
+        <w:gridCol w:w="3135"/>
+        <w:gridCol w:w="3135"/>
+        <w:gridCol w:w="3135"/>
+      </w:tblGrid>
+      <w:tr>
+        <w:tc>
+          <w:tcPr>
+            <w:tcW w:type="dxa" w:w="2551"/>
+            <w:shd w:fill="E2E8F0"/>
+          </w:tcPr>
+          <w:p>
+            <w:pPr>
+              <w:spacing w:after="60" w:line="276" w:lineRule="auto"/>
+              <w:jc w:val="center"/>
+            </w:pPr>
+            <w:r>
+              <w:rPr>
+                <w:rFonts w:ascii="Times New Roman" w:hAnsi="Times New Roman" w:eastAsia="Times New Roman"/>
+                <w:b/>
+                <w:color w:val="000000"/>
+                <w:sz w:val="22"/>
+              </w:rPr>
+              <w:t>Dataset</w:t>
+            </w:r>
+          </w:p>
+        </w:tc>
+        <w:tc>
+          <w:tcPr>
+            <w:tcW w:type="dxa" w:w="2268"/>
+            <w:shd w:fill="E2E8F0"/>
+          </w:tcPr>
+          <w:p>
+            <w:pPr>
+              <w:spacing w:after="60" w:line="276" w:lineRule="auto"/>
+              <w:jc w:val="center"/>
+            </w:pPr>
+            <w:r>
+              <w:rPr>
+                <w:rFonts w:ascii="Times New Roman" w:hAnsi="Times New Roman" w:eastAsia="Times New Roman"/>
+                <w:b/>
+                <w:color w:val="000000"/>
+                <w:sz w:val="22"/>
+              </w:rPr>
+              <w:t>Dạng dữ liệu</w:t>
+            </w:r>
+          </w:p>
+        </w:tc>
+        <w:tc>
+          <w:tcPr>
+            <w:tcW w:type="dxa" w:w="3402"/>
+            <w:shd w:fill="E2E8F0"/>
+          </w:tcPr>
+          <w:p>
+            <w:pPr>
+              <w:spacing w:after="60" w:line="276" w:lineRule="auto"/>
+              <w:jc w:val="center"/>
+            </w:pPr>
+            <w:r>
+              <w:rPr>
+                <w:rFonts w:ascii="Times New Roman" w:hAnsi="Times New Roman" w:eastAsia="Times New Roman"/>
+                <w:b/>
+                <w:color w:val="000000"/>
+                <w:sz w:val="22"/>
+              </w:rPr>
+              <w:t>Vai trò trong đồ án</w:t>
+            </w:r>
+          </w:p>
+        </w:tc>
+      </w:tr>
+      <w:tr>
+        <w:tc>
+          <w:tcPr>
+            <w:tcW w:type="dxa" w:w="2551"/>
+          </w:tcPr>
+          <w:p>
+            <w:pPr>
+              <w:spacing w:after="60" w:line="276" w:lineRule="auto"/>
+              <w:jc w:val="center"/>
+            </w:pPr>
+            <w:r>
+              <w:rPr>
+                <w:rFonts w:ascii="Times New Roman" w:hAnsi="Times New Roman" w:eastAsia="Times New Roman"/>
+                <w:color w:val="000000"/>
+                <w:sz w:val="21"/>
+              </w:rPr>
+              <w:t>Google Speech Commands</w:t>
+            </w:r>
+          </w:p>
+        </w:tc>
+        <w:tc>
+          <w:tcPr>
+            <w:tcW w:type="dxa" w:w="2268"/>
+          </w:tcPr>
+          <w:p>
+            <w:pPr>
+              <w:spacing w:after="60" w:line="276" w:lineRule="auto"/>
+              <w:jc w:val="left"/>
+            </w:pPr>
+            <w:r>
+              <w:rPr>
+                <w:rFonts w:ascii="Times New Roman" w:hAnsi="Times New Roman" w:eastAsia="Times New Roman"/>
+                <w:color w:val="000000"/>
+                <w:sz w:val="21"/>
+              </w:rPr>
+              <w:t>Single keyword</w:t>
+            </w:r>
+          </w:p>
+        </w:tc>
+        <w:tc>
+          <w:tcPr>
+            <w:tcW w:type="dxa" w:w="3402"/>
+          </w:tcPr>
+          <w:p>
+            <w:pPr>
+              <w:spacing w:after="60" w:line="276" w:lineRule="auto"/>
+              <w:jc w:val="left"/>
+            </w:pPr>
+            <w:r>
+              <w:rPr>
+                <w:rFonts w:ascii="Times New Roman" w:hAnsi="Times New Roman" w:eastAsia="Times New Roman"/>
+                <w:color w:val="000000"/>
+                <w:sz w:val="21"/>
+              </w:rPr>
+              <w:t>Dataset chính để huấn luyện và đánh giá Few-shot KWS</w:t>
+            </w:r>
+          </w:p>
+        </w:tc>
+      </w:tr>
+      <w:tr>
+        <w:tc>
+          <w:tcPr>
+            <w:tcW w:type="dxa" w:w="2551"/>
+          </w:tcPr>
+          <w:p>
+            <w:pPr>
+              <w:spacing w:after="60" w:line="276" w:lineRule="auto"/>
+              <w:jc w:val="center"/>
+            </w:pPr>
+            <w:r>
+              <w:rPr>
+                <w:rFonts w:ascii="Times New Roman" w:hAnsi="Times New Roman" w:eastAsia="Times New Roman"/>
+                <w:color w:val="000000"/>
+                <w:sz w:val="21"/>
+              </w:rPr>
+              <w:t>AudioMNIST</w:t>
+            </w:r>
+          </w:p>
+        </w:tc>
+        <w:tc>
+          <w:tcPr>
+            <w:tcW w:type="dxa" w:w="2268"/>
+          </w:tcPr>
+          <w:p>
+            <w:pPr>
+              <w:spacing w:after="60" w:line="276" w:lineRule="auto"/>
+              <w:jc w:val="left"/>
+            </w:pPr>
+            <w:r>
+              <w:rPr>
+                <w:rFonts w:ascii="Times New Roman" w:hAnsi="Times New Roman" w:eastAsia="Times New Roman"/>
+                <w:color w:val="000000"/>
+                <w:sz w:val="21"/>
+              </w:rPr>
+              <w:t>Single spoken digit</w:t>
+            </w:r>
+          </w:p>
+        </w:tc>
+        <w:tc>
+          <w:tcPr>
+            <w:tcW w:type="dxa" w:w="3402"/>
+          </w:tcPr>
+          <w:p>
+            <w:pPr>
+              <w:spacing w:after="60" w:line="276" w:lineRule="auto"/>
+              <w:jc w:val="left"/>
+            </w:pPr>
+            <w:r>
+              <w:rPr>
+                <w:rFonts w:ascii="Times New Roman" w:hAnsi="Times New Roman" w:eastAsia="Times New Roman"/>
+                <w:color w:val="000000"/>
+                <w:sz w:val="21"/>
+              </w:rPr>
+              <w:t>Dataset bổ sung để khảo sát preprocessing trên dữ liệu single-word</w:t>
+            </w:r>
+          </w:p>
+        </w:tc>
+      </w:tr>
+      <w:tr>
+        <w:tc>
+          <w:tcPr>
+            <w:tcW w:type="dxa" w:w="2551"/>
+          </w:tcPr>
+          <w:p>
+            <w:pPr>
+              <w:spacing w:after="60" w:line="276" w:lineRule="auto"/>
+              <w:jc w:val="center"/>
+            </w:pPr>
+            <w:r>
+              <w:rPr>
+                <w:rFonts w:ascii="Times New Roman" w:hAnsi="Times New Roman" w:eastAsia="Times New Roman"/>
+                <w:color w:val="000000"/>
+                <w:sz w:val="21"/>
+              </w:rPr>
+              <w:t>Fluent Speech Commands</w:t>
+            </w:r>
+          </w:p>
+        </w:tc>
+        <w:tc>
+          <w:tcPr>
+            <w:tcW w:type="dxa" w:w="2268"/>
+          </w:tcPr>
+          <w:p>
+            <w:pPr>
+              <w:spacing w:after="60" w:line="276" w:lineRule="auto"/>
+              <w:jc w:val="left"/>
+            </w:pPr>
+            <w:r>
+              <w:rPr>
+                <w:rFonts w:ascii="Times New Roman" w:hAnsi="Times New Roman" w:eastAsia="Times New Roman"/>
+                <w:color w:val="000000"/>
+                <w:sz w:val="21"/>
+              </w:rPr>
+              <w:t>Multi-word spoken command</w:t>
+            </w:r>
+          </w:p>
+        </w:tc>
+        <w:tc>
+          <w:tcPr>
+            <w:tcW w:type="dxa" w:w="3402"/>
+          </w:tcPr>
+          <w:p>
+            <w:pPr>
+              <w:spacing w:after="60" w:line="276" w:lineRule="auto"/>
+              <w:jc w:val="left"/>
+            </w:pPr>
+            <w:r>
+              <w:rPr>
+                <w:rFonts w:ascii="Times New Roman" w:hAnsi="Times New Roman" w:eastAsia="Times New Roman"/>
+                <w:color w:val="000000"/>
+                <w:sz w:val="21"/>
+              </w:rPr>
+              <w:t>Dataset bổ sung để khảo sát preprocessing trên tín hiệu dài hơn</w:t>
+            </w:r>
+          </w:p>
+        </w:tc>
+      </w:tr>
+    </w:tbl>
+    <w:p>
+      <w:pPr>
+        <w:spacing w:after="120"/>
+      </w:pPr>
+    </w:p>
+    <w:p>
+      <w:pPr>
+        <w:spacing w:line="360" w:lineRule="auto" w:after="120"/>
+        <w:ind w:firstLine="0"/>
+        <w:jc w:val="both"/>
+      </w:pPr>
+      <w:r>
+        <w:rPr>
+          <w:rFonts w:ascii="Times New Roman" w:hAnsi="Times New Roman" w:eastAsia="Times New Roman"/>
+          <w:b w:val="0"/>
+          <w:i w:val="0"/>
+          <w:color w:val="000000"/>
+          <w:sz w:val="26"/>
+        </w:rPr>
+        <w:t>Trong đó, chỉ có Google Speech Commands là dataset chính quyết định kết quả của mô hình Few-shot Keyword Spotting. AudioMNIST và Fluent Speech Commands đóng vai trò bổ sung cho phần nghiên cứu dữ liệu và preprocessing.</w:t>
       </w:r>
     </w:p>
     <w:p>
       <w:pPr>
-        <w:spacing w:line="360" w:lineRule="auto" w:after="80"/>
-        <w:ind w:left="340" w:hanging="340"/>
-        <w:jc w:val="both"/>
+        <w:pStyle w:val="Heading3"/>
+        <w:keepNext/>
+        <w:spacing w:before="200" w:after="80"/>
       </w:pPr>
       <w:r>
         <w:rPr>
@@ -3643,8 +4485,134 @@
           <w:color w:val="000000"/>
           <w:sz w:val="26"/>
         </w:rPr>
-        <w:t xml:space="preserve">-- </w:t>
+        <w:t>2.1.5. Mục tiêu của việc sử dụng thêm dataset bổ sung</w:t>
       </w:r>
+    </w:p>
+    <w:p>
+      <w:pPr>
+        <w:spacing w:line="360" w:lineRule="auto" w:after="120"/>
+        <w:ind w:firstLine="0"/>
+        <w:jc w:val="both"/>
+      </w:pPr>
+      <w:r>
+        <w:rPr>
+          <w:rFonts w:ascii="Times New Roman" w:hAnsi="Times New Roman" w:eastAsia="Times New Roman"/>
+          <w:b w:val="0"/>
+          <w:i w:val="0"/>
+          <w:color w:val="000000"/>
+          <w:sz w:val="26"/>
+        </w:rPr>
+        <w:t>Việc bổ sung AudioMNIST và Fluent Speech Commands không nhằm mục đích tăng trực tiếp dữ liệu huấn luyện cho mô hình chính.</w:t>
+      </w:r>
+    </w:p>
+    <w:p>
+      <w:pPr>
+        <w:spacing w:line="360" w:lineRule="auto" w:after="120"/>
+        <w:ind w:firstLine="0"/>
+        <w:jc w:val="both"/>
+      </w:pPr>
+      <w:r>
+        <w:rPr>
+          <w:rFonts w:ascii="Times New Roman" w:hAnsi="Times New Roman" w:eastAsia="Times New Roman"/>
+          <w:b w:val="0"/>
+          <w:i w:val="0"/>
+          <w:color w:val="000000"/>
+          <w:sz w:val="26"/>
+        </w:rPr>
+        <w:t>Mục tiêu của các dataset bổ sung là kiểm tra quá trình xử lý dữ liệu trên những dạng tín hiệu khác nhau. Với cùng một mẫu âm thanh, nhóm dự kiến so sánh hai trạng thái:</w:t>
+      </w:r>
+    </w:p>
+    <w:p>
+      <w:pPr>
+        <w:spacing w:before="80" w:after="120"/>
+        <w:jc w:val="center"/>
+      </w:pPr>
+      <w:r>
+        <w:rPr>
+          <w:rFonts w:ascii="Cambria Math" w:hAnsi="Cambria Math" w:eastAsia="Cambria Math"/>
+          <w:color w:val="000000"/>
+          <w:sz w:val="24"/>
+        </w:rPr>
+        <w:t>\text{Dữ liệu gốc: } Audio_{raw} \quad \text{và} \quad \text{Dữ liệu sau preprocessing: } Audio_{processed}</w:t>
+      </w:r>
+    </w:p>
+    <w:p>
+      <w:pPr>
+        <w:spacing w:line="360" w:lineRule="auto" w:after="120"/>
+        <w:ind w:firstLine="0"/>
+        <w:jc w:val="both"/>
+      </w:pPr>
+      <w:r>
+        <w:rPr>
+          <w:rFonts w:ascii="Times New Roman" w:hAnsi="Times New Roman" w:eastAsia="Times New Roman"/>
+          <w:b w:val="0"/>
+          <w:i w:val="0"/>
+          <w:color w:val="000000"/>
+          <w:sz w:val="26"/>
+        </w:rPr>
+        <w:t>Quy trình khảo sát tổng quát:</w:t>
+      </w:r>
+    </w:p>
+    <w:p>
+      <w:pPr>
+        <w:spacing w:before="80" w:after="120"/>
+        <w:jc w:val="center"/>
+      </w:pPr>
+      <w:r>
+        <w:rPr>
+          <w:rFonts w:ascii="Consolas" w:hAnsi="Consolas"/>
+          <w:sz w:val="20"/>
+        </w:rPr>
+        <w:t xml:space="preserve">                    Audio gốc</w:t>
+        <w:br/>
+        <w:t xml:space="preserve">                       │</w:t>
+        <w:br/>
+        <w:t xml:space="preserve">             ┌─────────┴─────────┐</w:t>
+        <w:br/>
+        <w:t xml:space="preserve">             ↓                   ↓</w:t>
+        <w:br/>
+        <w:t xml:space="preserve">            RAW             PREPROCESSING</w:t>
+        <w:br/>
+        <w:t xml:space="preserve">                                 ↓</w:t>
+        <w:br/>
+        <w:t xml:space="preserve">                            PROCESSED</w:t>
+        <w:br/>
+        <w:t xml:space="preserve">             ↓                   ↓</w:t>
+        <w:br/>
+        <w:t xml:space="preserve">          Feature             Feature</w:t>
+        <w:br/>
+        <w:t xml:space="preserve">             ↓                   ↓</w:t>
+        <w:br/>
+        <w:t xml:space="preserve">         Statistics         Statistics</w:t>
+        <w:br/>
+        <w:t xml:space="preserve">             ↓                   ↓</w:t>
+        <w:br/>
+        <w:t xml:space="preserve">       Visualization       Visualization</w:t>
+      </w:r>
+    </w:p>
+    <w:p>
+      <w:pPr>
+        <w:spacing w:line="360" w:lineRule="auto" w:after="120"/>
+        <w:ind w:firstLine="0"/>
+        <w:jc w:val="both"/>
+      </w:pPr>
+      <w:r>
+        <w:rPr>
+          <w:rFonts w:ascii="Times New Roman" w:hAnsi="Times New Roman" w:eastAsia="Times New Roman"/>
+          <w:b w:val="0"/>
+          <w:i w:val="0"/>
+          <w:color w:val="000000"/>
+          <w:sz w:val="26"/>
+        </w:rPr>
+        <w:t>Các kết quả sẽ được đánh giá bằng số liệu, đặc trưng và biểu đồ thực tế. Nhóm không mặc định rằng quá trình preprocessing luôn làm dữ liệu tốt hơn. Việc preprocessing có cải thiện chất lượng tín hiệu hoặc kết quả mô hình hay không sẽ được xác định thông qua thực nghiệm.</w:t>
+      </w:r>
+    </w:p>
+    <w:p>
+      <w:pPr>
+        <w:pStyle w:val="Heading3"/>
+        <w:keepNext/>
+        <w:spacing w:before="200" w:after="80"/>
+      </w:pPr>
       <w:r>
         <w:rPr>
           <w:rFonts w:ascii="Times New Roman" w:hAnsi="Times New Roman" w:eastAsia="Times New Roman"/>
@@ -3652,81 +4620,58 @@
           <w:color w:val="000000"/>
           <w:sz w:val="26"/>
         </w:rPr>
-        <w:t xml:space="preserve">Đa dạng người nói: </w:t>
+        <w:t>Tổng kết mục 2.1</w:t>
       </w:r>
+    </w:p>
+    <w:p>
+      <w:pPr>
+        <w:spacing w:line="360" w:lineRule="auto" w:after="120"/>
+        <w:ind w:firstLine="0"/>
+        <w:jc w:val="both"/>
+      </w:pPr>
       <w:r>
         <w:rPr>
           <w:rFonts w:ascii="Times New Roman" w:hAnsi="Times New Roman" w:eastAsia="Times New Roman"/>
+          <w:b w:val="0"/>
+          <w:i w:val="0"/>
           <w:color w:val="000000"/>
           <w:sz w:val="26"/>
         </w:rPr>
-        <w:t>Chứa mẫu phát âm từ hơn 2.600 người nói khác nhau với đa dạng ngữ điệu, tốc độ và môi trường thu âm.</w:t>
+        <w:t>Trong đồ án, Google Speech Commands là nguồn dữ liệu chính phục vụ quá trình huấn luyện và đánh giá Few-shot Keyword Spotting. Dữ liệu được tổ chức theo thiết lập Few-shot Learning thông qua các episode gồm Support Set và Query Set.</w:t>
       </w:r>
     </w:p>
     <w:p>
       <w:pPr>
-        <w:spacing w:line="360" w:lineRule="auto" w:after="80"/>
-        <w:ind w:left="340" w:hanging="340"/>
+        <w:spacing w:line="360" w:lineRule="auto" w:after="120"/>
+        <w:ind w:firstLine="0"/>
         <w:jc w:val="both"/>
       </w:pPr>
       <w:r>
         <w:rPr>
           <w:rFonts w:ascii="Times New Roman" w:hAnsi="Times New Roman" w:eastAsia="Times New Roman"/>
-          <w:b/>
+          <w:b w:val="0"/>
+          <w:i w:val="0"/>
           <w:color w:val="000000"/>
           <w:sz w:val="26"/>
         </w:rPr>
-        <w:t xml:space="preserve">-- </w:t>
+        <w:t>Bên cạnh đó, nhóm dự kiến sử dụng AudioMNIST và Fluent Speech Commands như hai nguồn dữ liệu bổ sung để nghiên cứu preprocessing trên hai dạng tín hiệu: single-word speech và multi-word spoken command.</w:t>
       </w:r>
+    </w:p>
+    <w:p>
+      <w:pPr>
+        <w:spacing w:line="360" w:lineRule="auto" w:after="120"/>
+        <w:ind w:firstLine="0"/>
+        <w:jc w:val="both"/>
+      </w:pPr>
       <w:r>
         <w:rPr>
           <w:rFonts w:ascii="Times New Roman" w:hAnsi="Times New Roman" w:eastAsia="Times New Roman"/>
-          <w:b/>
+          <w:b w:val="0"/>
+          <w:i w:val="0"/>
           <w:color w:val="000000"/>
           <w:sz w:val="26"/>
         </w:rPr>
-        <w:t xml:space="preserve">Cấu trúc chuẩn: </w:t>
-      </w:r>
-      <w:r>
-        <w:rPr>
-          <w:rFonts w:ascii="Times New Roman" w:hAnsi="Times New Roman" w:eastAsia="Times New Roman"/>
-          <w:color w:val="000000"/>
-          <w:sz w:val="26"/>
-        </w:rPr>
-        <w:t>Cấu trúc thư mục phân lớp rõ ràng, thuận tiện cho việc tạo các episode N-way K-shot.</w:t>
-      </w:r>
-    </w:p>
-    <w:p>
-      <w:pPr>
-        <w:spacing w:line="360" w:lineRule="auto" w:after="80"/>
-        <w:ind w:left="340" w:hanging="340"/>
-        <w:jc w:val="both"/>
-      </w:pPr>
-      <w:r>
-        <w:rPr>
-          <w:rFonts w:ascii="Times New Roman" w:hAnsi="Times New Roman" w:eastAsia="Times New Roman"/>
-          <w:b/>
-          <w:color w:val="000000"/>
-          <w:sz w:val="26"/>
-        </w:rPr>
-        <w:t xml:space="preserve">-- </w:t>
-      </w:r>
-      <w:r>
-        <w:rPr>
-          <w:rFonts w:ascii="Times New Roman" w:hAnsi="Times New Roman" w:eastAsia="Times New Roman"/>
-          <w:b/>
-          <w:color w:val="000000"/>
-          <w:sz w:val="26"/>
-        </w:rPr>
-        <w:t xml:space="preserve">Có dữ liệu nhiễu: </w:t>
-      </w:r>
-      <w:r>
-        <w:rPr>
-          <w:rFonts w:ascii="Times New Roman" w:hAnsi="Times New Roman" w:eastAsia="Times New Roman"/>
-          <w:color w:val="000000"/>
-          <w:sz w:val="26"/>
-        </w:rPr>
-        <w:t>Cung cấp các file background noise giúp thử nghiệm độ bền vững của mô hình trong điều kiện có nhiễu.</w:t>
+        <w:t>Các thống kê, thông số kỹ thuật và kết quả xử lý cụ thể của cả ba dataset sẽ được lấy trực tiếp từ code và thực nghiệm trên Kaggle trước khi được sử dụng trong các mục 2.2, 2.3, 2.4 và 2.5.</w:t>
       </w:r>
     </w:p>
     <w:p>

</xml_diff>

<commit_message>
docs: cap nhat so lieu thuc nghiem 100% audit vao muc 2.2 bao cao giua ky va nhat ky
</commit_message>
<xml_diff>
--- a/docs/report/Bao_cao_hang_muc_cham_giua_ky_Xu_ly_tieng_noi.docx
+++ b/docs/report/Bao_cao_hang_muc_cham_giua_ky_Xu_ly_tieng_noi.docx
@@ -4703,7 +4703,7 @@
           <w:color w:val="000000"/>
           <w:sz w:val="26"/>
         </w:rPr>
-        <w:t>2.2.1. Các lớp từ khóa</w:t>
+        <w:t>2.2.1. Các lớp từ khóa và phân bố mẫu thực nghiệm</w:t>
       </w:r>
     </w:p>
     <w:p>
@@ -4720,7 +4720,553 @@
           <w:color w:val="000000"/>
           <w:sz w:val="26"/>
         </w:rPr>
-        <w:t>Bộ dữ liệu Google Speech Commands v2 có 35 từ khóa và được chia theo lớp:</w:t>
+        <w:t>Theo kết quả audit thực nghiệm toàn diện trên 100% dữ liệu raw của Google Speech Commands v0.02 (thực hiện trên môi trường Kaggle), bộ dữ liệu bao gồm 35 từ khóa (classes) với tổng cộng 105.829 file âm thanh chứa tiếng nói (và 6 file âm thanh nhiễu môi trường, tổng cộng 105.835 file WAV).</w:t>
+      </w:r>
+    </w:p>
+    <w:p>
+      <w:pPr>
+        <w:spacing w:line="360" w:lineRule="auto" w:after="120"/>
+        <w:ind w:firstLine="0"/>
+        <w:jc w:val="both"/>
+      </w:pPr>
+      <w:r>
+        <w:rPr>
+          <w:rFonts w:ascii="Times New Roman" w:hAnsi="Times New Roman" w:eastAsia="Times New Roman"/>
+          <w:b w:val="0"/>
+          <w:i w:val="0"/>
+          <w:color w:val="000000"/>
+          <w:sz w:val="26"/>
+        </w:rPr>
+        <w:t>Số lượng mẫu giữa các từ khóa có sự chênh lệch đáng kể, dao động từ 1.557 mẫu (lớp ít nhất: forward) đến 4.052 mẫu (lớp nhiều nhất: five và zero). Tỷ lệ mất cân bằng giữa lớp lớn nhất và lớp nhỏ nhất xấp xỉ 2.6 lần.</w:t>
+      </w:r>
+    </w:p>
+    <w:p>
+      <w:pPr>
+        <w:spacing w:line="360" w:lineRule="auto" w:after="120"/>
+        <w:ind w:firstLine="0"/>
+        <w:jc w:val="both"/>
+      </w:pPr>
+      <w:r>
+        <w:rPr>
+          <w:rFonts w:ascii="Times New Roman" w:hAnsi="Times New Roman" w:eastAsia="Times New Roman"/>
+          <w:b w:val="0"/>
+          <w:i w:val="0"/>
+          <w:color w:val="000000"/>
+          <w:sz w:val="26"/>
+        </w:rPr>
+        <w:t>Bảng thống kê phân bố số lượng mẫu của 35 từ khóa theo từng nhóm chức năng:</w:t>
+      </w:r>
+    </w:p>
+    <w:tbl>
+      <w:tblPr>
+        <w:tblW w:type="auto" w:w="0"/>
+        <w:jc w:val="center"/>
+        <w:tblLayout w:type="fixed"/>
+        <w:tblLook w:firstColumn="1" w:firstRow="1" w:lastColumn="0" w:lastRow="0" w:noHBand="0" w:noVBand="1" w:val="04A0"/>
+      </w:tblPr>
+      <w:tblGrid>
+        <w:gridCol w:w="2351"/>
+        <w:gridCol w:w="2351"/>
+        <w:gridCol w:w="2351"/>
+        <w:gridCol w:w="2351"/>
+      </w:tblGrid>
+      <w:tr>
+        <w:tc>
+          <w:tcPr>
+            <w:tcW w:type="dxa" w:w="2154"/>
+            <w:shd w:fill="E2E8F0"/>
+          </w:tcPr>
+          <w:p>
+            <w:pPr>
+              <w:spacing w:after="60" w:line="276" w:lineRule="auto"/>
+              <w:jc w:val="center"/>
+            </w:pPr>
+            <w:r>
+              <w:rPr>
+                <w:rFonts w:ascii="Times New Roman" w:hAnsi="Times New Roman" w:eastAsia="Times New Roman"/>
+                <w:b/>
+                <w:color w:val="000000"/>
+                <w:sz w:val="22"/>
+              </w:rPr>
+              <w:t>Nhóm chức năng</w:t>
+            </w:r>
+          </w:p>
+        </w:tc>
+        <w:tc>
+          <w:tcPr>
+            <w:tcW w:type="dxa" w:w="3515"/>
+            <w:shd w:fill="E2E8F0"/>
+          </w:tcPr>
+          <w:p>
+            <w:pPr>
+              <w:spacing w:after="60" w:line="276" w:lineRule="auto"/>
+              <w:jc w:val="center"/>
+            </w:pPr>
+            <w:r>
+              <w:rPr>
+                <w:rFonts w:ascii="Times New Roman" w:hAnsi="Times New Roman" w:eastAsia="Times New Roman"/>
+                <w:b/>
+                <w:color w:val="000000"/>
+                <w:sz w:val="22"/>
+              </w:rPr>
+              <w:t>Danh sách từ khóa (Classes)</w:t>
+            </w:r>
+          </w:p>
+        </w:tc>
+        <w:tc>
+          <w:tcPr>
+            <w:tcW w:type="dxa" w:w="1417"/>
+            <w:shd w:fill="E2E8F0"/>
+          </w:tcPr>
+          <w:p>
+            <w:pPr>
+              <w:spacing w:after="60" w:line="276" w:lineRule="auto"/>
+              <w:jc w:val="center"/>
+            </w:pPr>
+            <w:r>
+              <w:rPr>
+                <w:rFonts w:ascii="Times New Roman" w:hAnsi="Times New Roman" w:eastAsia="Times New Roman"/>
+                <w:b/>
+                <w:color w:val="000000"/>
+                <w:sz w:val="22"/>
+              </w:rPr>
+              <w:t>Số lượng mẫu / lớp</w:t>
+            </w:r>
+          </w:p>
+        </w:tc>
+        <w:tc>
+          <w:tcPr>
+            <w:tcW w:type="dxa" w:w="1417"/>
+            <w:shd w:fill="E2E8F0"/>
+          </w:tcPr>
+          <w:p>
+            <w:pPr>
+              <w:spacing w:after="60" w:line="276" w:lineRule="auto"/>
+              <w:jc w:val="center"/>
+            </w:pPr>
+            <w:r>
+              <w:rPr>
+                <w:rFonts w:ascii="Times New Roman" w:hAnsi="Times New Roman" w:eastAsia="Times New Roman"/>
+                <w:b/>
+                <w:color w:val="000000"/>
+                <w:sz w:val="22"/>
+              </w:rPr>
+              <w:t>Tổng số mẫu</w:t>
+            </w:r>
+          </w:p>
+        </w:tc>
+      </w:tr>
+      <w:tr>
+        <w:tc>
+          <w:tcPr>
+            <w:tcW w:type="dxa" w:w="2154"/>
+          </w:tcPr>
+          <w:p>
+            <w:pPr>
+              <w:spacing w:after="60" w:line="276" w:lineRule="auto"/>
+              <w:jc w:val="center"/>
+            </w:pPr>
+            <w:r>
+              <w:rPr>
+                <w:rFonts w:ascii="Times New Roman" w:hAnsi="Times New Roman" w:eastAsia="Times New Roman"/>
+                <w:color w:val="000000"/>
+                <w:sz w:val="21"/>
+              </w:rPr>
+              <w:t>Chữ số đơn (Digits - 10 lớp)</w:t>
+            </w:r>
+          </w:p>
+        </w:tc>
+        <w:tc>
+          <w:tcPr>
+            <w:tcW w:type="dxa" w:w="3515"/>
+          </w:tcPr>
+          <w:p>
+            <w:pPr>
+              <w:spacing w:after="60" w:line="276" w:lineRule="auto"/>
+              <w:jc w:val="left"/>
+            </w:pPr>
+            <w:r>
+              <w:rPr>
+                <w:rFonts w:ascii="Times New Roman" w:hAnsi="Times New Roman" w:eastAsia="Times New Roman"/>
+                <w:color w:val="000000"/>
+                <w:sz w:val="21"/>
+              </w:rPr>
+              <w:t>zero (4.052), one (3.890), two (3.880), three (3.727), four (3.728), five (4.052), six (3.860), seven (3.998), eight (3.787), nine (3.934)</w:t>
+            </w:r>
+          </w:p>
+        </w:tc>
+        <w:tc>
+          <w:tcPr>
+            <w:tcW w:type="dxa" w:w="1417"/>
+          </w:tcPr>
+          <w:p>
+            <w:pPr>
+              <w:spacing w:after="60" w:line="276" w:lineRule="auto"/>
+              <w:jc w:val="left"/>
+            </w:pPr>
+            <w:r>
+              <w:rPr>
+                <w:rFonts w:ascii="Times New Roman" w:hAnsi="Times New Roman" w:eastAsia="Times New Roman"/>
+                <w:color w:val="000000"/>
+                <w:sz w:val="21"/>
+              </w:rPr>
+              <w:t>3.727 – 4.052</w:t>
+            </w:r>
+          </w:p>
+        </w:tc>
+        <w:tc>
+          <w:tcPr>
+            <w:tcW w:type="dxa" w:w="1417"/>
+          </w:tcPr>
+          <w:p>
+            <w:pPr>
+              <w:spacing w:after="60" w:line="276" w:lineRule="auto"/>
+              <w:jc w:val="left"/>
+            </w:pPr>
+            <w:r>
+              <w:rPr>
+                <w:rFonts w:ascii="Times New Roman" w:hAnsi="Times New Roman" w:eastAsia="Times New Roman"/>
+                <w:color w:val="000000"/>
+                <w:sz w:val="21"/>
+              </w:rPr>
+              <w:t>38.878</w:t>
+            </w:r>
+          </w:p>
+        </w:tc>
+      </w:tr>
+      <w:tr>
+        <w:tc>
+          <w:tcPr>
+            <w:tcW w:type="dxa" w:w="2154"/>
+          </w:tcPr>
+          <w:p>
+            <w:pPr>
+              <w:spacing w:after="60" w:line="276" w:lineRule="auto"/>
+              <w:jc w:val="center"/>
+            </w:pPr>
+            <w:r>
+              <w:rPr>
+                <w:rFonts w:ascii="Times New Roman" w:hAnsi="Times New Roman" w:eastAsia="Times New Roman"/>
+                <w:color w:val="000000"/>
+                <w:sz w:val="21"/>
+              </w:rPr>
+              <w:t>Lệnh điều hướng &amp; bật/tắt (10 lớp)</w:t>
+            </w:r>
+          </w:p>
+        </w:tc>
+        <w:tc>
+          <w:tcPr>
+            <w:tcW w:type="dxa" w:w="3515"/>
+          </w:tcPr>
+          <w:p>
+            <w:pPr>
+              <w:spacing w:after="60" w:line="276" w:lineRule="auto"/>
+              <w:jc w:val="left"/>
+            </w:pPr>
+            <w:r>
+              <w:rPr>
+                <w:rFonts w:ascii="Times New Roman" w:hAnsi="Times New Roman" w:eastAsia="Times New Roman"/>
+                <w:color w:val="000000"/>
+                <w:sz w:val="21"/>
+              </w:rPr>
+              <w:t>yes (4.044), no (3.941), up (3.723), down (3.917), left (3.801), right (3.778), on (3.845), off (3.745), stop (3.872), go (3.880)</w:t>
+            </w:r>
+          </w:p>
+        </w:tc>
+        <w:tc>
+          <w:tcPr>
+            <w:tcW w:type="dxa" w:w="1417"/>
+          </w:tcPr>
+          <w:p>
+            <w:pPr>
+              <w:spacing w:after="60" w:line="276" w:lineRule="auto"/>
+              <w:jc w:val="left"/>
+            </w:pPr>
+            <w:r>
+              <w:rPr>
+                <w:rFonts w:ascii="Times New Roman" w:hAnsi="Times New Roman" w:eastAsia="Times New Roman"/>
+                <w:color w:val="000000"/>
+                <w:sz w:val="21"/>
+              </w:rPr>
+              <w:t>3.723 – 4.044</w:t>
+            </w:r>
+          </w:p>
+        </w:tc>
+        <w:tc>
+          <w:tcPr>
+            <w:tcW w:type="dxa" w:w="1417"/>
+          </w:tcPr>
+          <w:p>
+            <w:pPr>
+              <w:spacing w:after="60" w:line="276" w:lineRule="auto"/>
+              <w:jc w:val="left"/>
+            </w:pPr>
+            <w:r>
+              <w:rPr>
+                <w:rFonts w:ascii="Times New Roman" w:hAnsi="Times New Roman" w:eastAsia="Times New Roman"/>
+                <w:color w:val="000000"/>
+                <w:sz w:val="21"/>
+              </w:rPr>
+              <w:t>38.646</w:t>
+            </w:r>
+          </w:p>
+        </w:tc>
+      </w:tr>
+      <w:tr>
+        <w:tc>
+          <w:tcPr>
+            <w:tcW w:type="dxa" w:w="2154"/>
+          </w:tcPr>
+          <w:p>
+            <w:pPr>
+              <w:spacing w:after="60" w:line="276" w:lineRule="auto"/>
+              <w:jc w:val="center"/>
+            </w:pPr>
+            <w:r>
+              <w:rPr>
+                <w:rFonts w:ascii="Times New Roman" w:hAnsi="Times New Roman" w:eastAsia="Times New Roman"/>
+                <w:color w:val="000000"/>
+                <w:sz w:val="21"/>
+              </w:rPr>
+              <w:t>Từ vựng mở rộng (10 lớp)</w:t>
+            </w:r>
+          </w:p>
+        </w:tc>
+        <w:tc>
+          <w:tcPr>
+            <w:tcW w:type="dxa" w:w="3515"/>
+          </w:tcPr>
+          <w:p>
+            <w:pPr>
+              <w:spacing w:after="60" w:line="276" w:lineRule="auto"/>
+              <w:jc w:val="left"/>
+            </w:pPr>
+            <w:r>
+              <w:rPr>
+                <w:rFonts w:ascii="Times New Roman" w:hAnsi="Times New Roman" w:eastAsia="Times New Roman"/>
+                <w:color w:val="000000"/>
+                <w:sz w:val="21"/>
+              </w:rPr>
+              <w:t>bed (2.014), bird (2.064), cat (2.031), dog (2.128), happy (2.054), house (2.113), marvin (2.100), sheila (2.022), tree (1.759), wow (2.123)</w:t>
+            </w:r>
+          </w:p>
+        </w:tc>
+        <w:tc>
+          <w:tcPr>
+            <w:tcW w:type="dxa" w:w="1417"/>
+          </w:tcPr>
+          <w:p>
+            <w:pPr>
+              <w:spacing w:after="60" w:line="276" w:lineRule="auto"/>
+              <w:jc w:val="left"/>
+            </w:pPr>
+            <w:r>
+              <w:rPr>
+                <w:rFonts w:ascii="Times New Roman" w:hAnsi="Times New Roman" w:eastAsia="Times New Roman"/>
+                <w:color w:val="000000"/>
+                <w:sz w:val="21"/>
+              </w:rPr>
+              <w:t>1.759 – 2.128</w:t>
+            </w:r>
+          </w:p>
+        </w:tc>
+        <w:tc>
+          <w:tcPr>
+            <w:tcW w:type="dxa" w:w="1417"/>
+          </w:tcPr>
+          <w:p>
+            <w:pPr>
+              <w:spacing w:after="60" w:line="276" w:lineRule="auto"/>
+              <w:jc w:val="left"/>
+            </w:pPr>
+            <w:r>
+              <w:rPr>
+                <w:rFonts w:ascii="Times New Roman" w:hAnsi="Times New Roman" w:eastAsia="Times New Roman"/>
+                <w:color w:val="000000"/>
+                <w:sz w:val="21"/>
+              </w:rPr>
+              <w:t>20.407</w:t>
+            </w:r>
+          </w:p>
+        </w:tc>
+      </w:tr>
+      <w:tr>
+        <w:tc>
+          <w:tcPr>
+            <w:tcW w:type="dxa" w:w="2154"/>
+          </w:tcPr>
+          <w:p>
+            <w:pPr>
+              <w:spacing w:after="60" w:line="276" w:lineRule="auto"/>
+              <w:jc w:val="center"/>
+            </w:pPr>
+            <w:r>
+              <w:rPr>
+                <w:rFonts w:ascii="Times New Roman" w:hAnsi="Times New Roman" w:eastAsia="Times New Roman"/>
+                <w:color w:val="000000"/>
+                <w:sz w:val="21"/>
+              </w:rPr>
+              <w:t>Lệnh phụ trợ / Unknown (5 lớp)</w:t>
+            </w:r>
+          </w:p>
+        </w:tc>
+        <w:tc>
+          <w:tcPr>
+            <w:tcW w:type="dxa" w:w="3515"/>
+          </w:tcPr>
+          <w:p>
+            <w:pPr>
+              <w:spacing w:after="60" w:line="276" w:lineRule="auto"/>
+              <w:jc w:val="left"/>
+            </w:pPr>
+            <w:r>
+              <w:rPr>
+                <w:rFonts w:ascii="Times New Roman" w:hAnsi="Times New Roman" w:eastAsia="Times New Roman"/>
+                <w:color w:val="000000"/>
+                <w:sz w:val="21"/>
+              </w:rPr>
+              <w:t>backward (1.664), visual (1.592), follow (1.579), learn (1.575), forward (1.557)</w:t>
+            </w:r>
+          </w:p>
+        </w:tc>
+        <w:tc>
+          <w:tcPr>
+            <w:tcW w:type="dxa" w:w="1417"/>
+          </w:tcPr>
+          <w:p>
+            <w:pPr>
+              <w:spacing w:after="60" w:line="276" w:lineRule="auto"/>
+              <w:jc w:val="left"/>
+            </w:pPr>
+            <w:r>
+              <w:rPr>
+                <w:rFonts w:ascii="Times New Roman" w:hAnsi="Times New Roman" w:eastAsia="Times New Roman"/>
+                <w:color w:val="000000"/>
+                <w:sz w:val="21"/>
+              </w:rPr>
+              <w:t>1.557 – 1.664</w:t>
+            </w:r>
+          </w:p>
+        </w:tc>
+        <w:tc>
+          <w:tcPr>
+            <w:tcW w:type="dxa" w:w="1417"/>
+          </w:tcPr>
+          <w:p>
+            <w:pPr>
+              <w:spacing w:after="60" w:line="276" w:lineRule="auto"/>
+              <w:jc w:val="left"/>
+            </w:pPr>
+            <w:r>
+              <w:rPr>
+                <w:rFonts w:ascii="Times New Roman" w:hAnsi="Times New Roman" w:eastAsia="Times New Roman"/>
+                <w:color w:val="000000"/>
+                <w:sz w:val="21"/>
+              </w:rPr>
+              <w:t>7.967</w:t>
+            </w:r>
+          </w:p>
+        </w:tc>
+      </w:tr>
+      <w:tr>
+        <w:tc>
+          <w:tcPr>
+            <w:tcW w:type="dxa" w:w="2154"/>
+          </w:tcPr>
+          <w:p>
+            <w:pPr>
+              <w:spacing w:after="60" w:line="276" w:lineRule="auto"/>
+              <w:jc w:val="center"/>
+            </w:pPr>
+            <w:r>
+              <w:rPr>
+                <w:rFonts w:ascii="Times New Roman" w:hAnsi="Times New Roman" w:eastAsia="Times New Roman"/>
+                <w:color w:val="000000"/>
+                <w:sz w:val="21"/>
+              </w:rPr>
+              <w:t>Toàn bộ 35 từ khóa tiếng nói</w:t>
+            </w:r>
+          </w:p>
+        </w:tc>
+        <w:tc>
+          <w:tcPr>
+            <w:tcW w:type="dxa" w:w="3515"/>
+          </w:tcPr>
+          <w:p>
+            <w:pPr>
+              <w:spacing w:after="60" w:line="276" w:lineRule="auto"/>
+              <w:jc w:val="left"/>
+            </w:pPr>
+            <w:r>
+              <w:rPr>
+                <w:rFonts w:ascii="Times New Roman" w:hAnsi="Times New Roman" w:eastAsia="Times New Roman"/>
+                <w:color w:val="000000"/>
+                <w:sz w:val="21"/>
+              </w:rPr>
+              <w:t>Tổng cộng 35 classes</w:t>
+            </w:r>
+          </w:p>
+        </w:tc>
+        <w:tc>
+          <w:tcPr>
+            <w:tcW w:type="dxa" w:w="1417"/>
+          </w:tcPr>
+          <w:p>
+            <w:pPr>
+              <w:spacing w:after="60" w:line="276" w:lineRule="auto"/>
+              <w:jc w:val="left"/>
+            </w:pPr>
+            <w:r>
+              <w:rPr>
+                <w:rFonts w:ascii="Times New Roman" w:hAnsi="Times New Roman" w:eastAsia="Times New Roman"/>
+                <w:color w:val="000000"/>
+                <w:sz w:val="21"/>
+              </w:rPr>
+              <w:t>1.557 – 4.052</w:t>
+            </w:r>
+          </w:p>
+        </w:tc>
+        <w:tc>
+          <w:tcPr>
+            <w:tcW w:type="dxa" w:w="1417"/>
+          </w:tcPr>
+          <w:p>
+            <w:pPr>
+              <w:spacing w:after="60" w:line="276" w:lineRule="auto"/>
+              <w:jc w:val="left"/>
+            </w:pPr>
+            <w:r>
+              <w:rPr>
+                <w:rFonts w:ascii="Times New Roman" w:hAnsi="Times New Roman" w:eastAsia="Times New Roman"/>
+                <w:color w:val="000000"/>
+                <w:sz w:val="21"/>
+              </w:rPr>
+              <w:t>105.829</w:t>
+            </w:r>
+          </w:p>
+        </w:tc>
+      </w:tr>
+    </w:tbl>
+    <w:p>
+      <w:pPr>
+        <w:spacing w:after="120"/>
+      </w:pPr>
+    </w:p>
+    <w:p>
+      <w:pPr>
+        <w:spacing w:line="360" w:lineRule="auto" w:after="120"/>
+        <w:ind w:firstLine="0"/>
+        <w:jc w:val="both"/>
+      </w:pPr>
+      <w:r>
+        <w:rPr>
+          <w:rFonts w:ascii="Times New Roman" w:hAnsi="Times New Roman" w:eastAsia="Times New Roman"/>
+          <w:b w:val="0"/>
+          <w:i w:val="0"/>
+          <w:color w:val="000000"/>
+          <w:sz w:val="26"/>
+        </w:rPr>
+        <w:t>Phân tích người nói (Speaker per keyword): Để đảm bảo tính tổng quát hóa trong Few-shot Learning, mỗi từ khóa cần có sự đóng góp của nhiều người nói khác nhau. Kết quả phân tích speaker per keyword với ngưỡng speaker_limit = 1000 cho thấy:</w:t>
       </w:r>
     </w:p>
     <w:p>
@@ -4745,7 +5291,7 @@
           <w:color w:val="000000"/>
           <w:sz w:val="26"/>
         </w:rPr>
-        <w:t xml:space="preserve">15 Train classes: </w:t>
+        <w:t xml:space="preserve">Nhóm từ khóa chính (Core words): </w:t>
       </w:r>
       <w:r>
         <w:rPr>
@@ -4753,7 +5299,7 @@
           <w:color w:val="000000"/>
           <w:sz w:val="26"/>
         </w:rPr>
-        <w:t>happy, house, bird, bed, backward, sheila, marvin, wow, tree, follow, dog, visual, forward, learn, cat.</w:t>
+        <w:t>Gồm 30 từ khóa có từ 1.000 người nói trở lên (ví dụ: five, zero, yes, no, go, stop,...). Nhóm này đủ điều kiện để tạo các tập train, validation và test theo đúng quy chuẩn Few-shot.</w:t>
       </w:r>
     </w:p>
     <w:p>
@@ -4778,7 +5324,7 @@
           <w:color w:val="000000"/>
           <w:sz w:val="26"/>
         </w:rPr>
-        <w:t xml:space="preserve">10 Validation classes: </w:t>
+        <w:t xml:space="preserve">Nhóm từ khóa phụ (Unknown words): </w:t>
       </w:r>
       <w:r>
         <w:rPr>
@@ -4786,7 +5332,57 @@
           <w:color w:val="000000"/>
           <w:sz w:val="26"/>
         </w:rPr>
-        <w:t>zero, one, two, three, four, five, six, seven, eight, nine.</w:t>
+        <w:t>Gồm 5 từ khóa có dưới 1.000 người nói gồm: backward (515 speakers), visual (485 speakers), follow (484 speakers), learn (483 speakers), forward (464 speakers).</w:t>
+      </w:r>
+    </w:p>
+    <w:p>
+      <w:pPr>
+        <w:spacing w:line="360" w:lineRule="auto" w:after="120"/>
+        <w:ind w:firstLine="0"/>
+        <w:jc w:val="both"/>
+      </w:pPr>
+      <w:r>
+        <w:rPr>
+          <w:rFonts w:ascii="Times New Roman" w:hAnsi="Times New Roman" w:eastAsia="Times New Roman"/>
+          <w:b w:val="0"/>
+          <w:i/>
+          <w:color w:val="000000"/>
+          <w:sz w:val="26"/>
+        </w:rPr>
+        <w:t>Phát hiện thực nghiệm quan trọng: Trong mã nguồn của paper gốc có định nghĩa tham số core_split = (24, 5, 5) (kỳ vọng 34 core words). Tuy nhiên, kết quả audit thực tế trên toàn bộ Google Speech Commands v0.02 chứng minh chỉ có chính xác 30 từ khóa đạt ngưỡng 1.000 speakers. Điều này khẳng định tầm quan trọng của việc kiểm tra dữ liệu thực nghiệm thay vì suy đoán lý thuyết.</w:t>
+      </w:r>
+    </w:p>
+    <w:p>
+      <w:pPr>
+        <w:pStyle w:val="Heading3"/>
+        <w:keepNext/>
+        <w:spacing w:before="200" w:after="80"/>
+      </w:pPr>
+      <w:r>
+        <w:rPr>
+          <w:rFonts w:ascii="Times New Roman" w:hAnsi="Times New Roman" w:eastAsia="Times New Roman"/>
+          <w:b/>
+          <w:color w:val="000000"/>
+          <w:sz w:val="26"/>
+        </w:rPr>
+        <w:t>2.2.2. Nhãn và cấu trúc thư mục</w:t>
+      </w:r>
+    </w:p>
+    <w:p>
+      <w:pPr>
+        <w:spacing w:line="360" w:lineRule="auto" w:after="120"/>
+        <w:ind w:firstLine="0"/>
+        <w:jc w:val="both"/>
+      </w:pPr>
+      <w:r>
+        <w:rPr>
+          <w:rFonts w:ascii="Times New Roman" w:hAnsi="Times New Roman" w:eastAsia="Times New Roman"/>
+          <w:b w:val="0"/>
+          <w:i w:val="0"/>
+          <w:color w:val="000000"/>
+          <w:sz w:val="26"/>
+        </w:rPr>
+        <w:t>Dữ liệu Google Speech Commands v0.02 được tổ chức theo cấu trúc phân cấp thư mục chuẩn:</w:t>
       </w:r>
     </w:p>
     <w:p>
@@ -4811,7 +5407,7 @@
           <w:color w:val="000000"/>
           <w:sz w:val="26"/>
         </w:rPr>
-        <w:t xml:space="preserve">10 Test classes: </w:t>
+        <w:t xml:space="preserve">Thư mục nhãn (Keyword Folders): </w:t>
       </w:r>
       <w:r>
         <w:rPr>
@@ -4819,7 +5415,40 @@
           <w:color w:val="000000"/>
           <w:sz w:val="26"/>
         </w:rPr>
-        <w:t>yes, no, up, down, left, right, on, off, stop, go.</w:t>
+        <w:t>Mỗi từ khóa được lưu trong một thư mục riêng mang tên của nhãn đó (ví dụ: speech_commands/yes/, speech_commands/stop/,...).</w:t>
+      </w:r>
+    </w:p>
+    <w:p>
+      <w:pPr>
+        <w:spacing w:line="360" w:lineRule="auto" w:after="80"/>
+        <w:ind w:left="340" w:hanging="340"/>
+        <w:jc w:val="both"/>
+      </w:pPr>
+      <w:r>
+        <w:rPr>
+          <w:rFonts w:ascii="Times New Roman" w:hAnsi="Times New Roman" w:eastAsia="Times New Roman"/>
+          <w:b/>
+          <w:color w:val="000000"/>
+          <w:sz w:val="26"/>
+        </w:rPr>
+        <w:t xml:space="preserve">-- </w:t>
+      </w:r>
+      <w:r>
+        <w:rPr>
+          <w:rFonts w:ascii="Times New Roman" w:hAnsi="Times New Roman" w:eastAsia="Times New Roman"/>
+          <w:b/>
+          <w:color w:val="000000"/>
+          <w:sz w:val="26"/>
+        </w:rPr>
+        <w:t xml:space="preserve">Thư mục _background_noise_: </w:t>
+      </w:r>
+      <w:r>
+        <w:rPr>
+          <w:rFonts w:ascii="Times New Roman" w:hAnsi="Times New Roman" w:eastAsia="Times New Roman"/>
+          <w:color w:val="000000"/>
+          <w:sz w:val="26"/>
+        </w:rPr>
+        <w:t>Thư mục đặc biệt chứa 6 file âm thanh nhiễu môi trường, không chứa tiếng nói của con người.</w:t>
       </w:r>
     </w:p>
     <w:p>
@@ -4836,23 +5465,21 @@
           <w:color w:val="000000"/>
           <w:sz w:val="26"/>
         </w:rPr>
-        <w:t>Các từ khóa trong tập Test không hề xuất hiện trong tập Train. Do đó, mô hình bắt buộc phải học cách tổng quát hóa biểu diễn thay vì ghi nhớ nhãn.</w:t>
+        <w:t>Cấu trúc định danh file âm thanh: Mỗi file âm thanh được đặt tên theo quy tắc chuẩn hóa của tác giả tập dữ liệu:</w:t>
       </w:r>
     </w:p>
     <w:p>
       <w:pPr>
-        <w:pStyle w:val="Heading3"/>
-        <w:keepNext/>
-        <w:spacing w:before="200" w:after="80"/>
+        <w:spacing w:before="80" w:after="120"/>
+        <w:jc w:val="center"/>
       </w:pPr>
       <w:r>
         <w:rPr>
-          <w:rFonts w:ascii="Times New Roman" w:hAnsi="Times New Roman" w:eastAsia="Times New Roman"/>
-          <w:b/>
+          <w:rFonts w:ascii="Cambria Math" w:hAnsi="Cambria Math" w:eastAsia="Cambria Math"/>
           <w:color w:val="000000"/>
-          <w:sz w:val="26"/>
+          <w:sz w:val="24"/>
         </w:rPr>
-        <w:t>2.2.2. Nhãn và cấu trúc thư mục</w:t>
+        <w:t>\text{[speaker\_id]}\_\text{nohash}\_\text{[utterance\_index].wav}</w:t>
       </w:r>
     </w:p>
     <w:p>
@@ -4869,7 +5496,7 @@
           <w:color w:val="000000"/>
           <w:sz w:val="26"/>
         </w:rPr>
-        <w:t>Mỗi file âm thanh được lưu trong thư mục mang tên của từ khóa đó. Ví dụ: speech_commands/yes/xxxx.wav mang nhãn yes; speech_commands/stop/yyyy.wav mang nhãn stop.</w:t>
+        <w:t>Ví dụ: file bed/220ee1ef_nohash_0.wav có speaker_id là "220ee1ef" và số thứ tự phát âm là 0. Việc băm định danh người nói vào tên file có ý nghĩa sống còn trong đồ án: nó cho phép nhóm gom toàn bộ các phát âm của cùng một người nói lại với nhau (Grouping by speaker), từ đó phân tách rạch ròi giữa các tập Support/Query cũng như giữa các tập Train/Validation/Test, loại trừ hoàn toàn nguy cơ rò rỉ dữ liệu người nói (speaker leakage).</w:t>
       </w:r>
     </w:p>
     <w:p>
@@ -4958,7 +5585,915 @@
           <w:color w:val="000000"/>
           <w:sz w:val="26"/>
         </w:rPr>
-        <w:t>Các file âm thanh sử dụng định dạng .wav (PCM không nén). Tần số lấy mẫu là 16.000 Hz, thời lượng trung bình khoảng 1 giây (tương đương 16.000 điểm mẫu). Theo định lý Nyquist, tần số 16 kHz cho phép biểu diễn các thành phần âm thanh tối đa 8.000 Hz, đủ để giữ lại hầu hết các thông tin âm vị quan trọng của giọng nói con người.</w:t>
+        <w:t>Quá trình audit kỹ thuật trên toàn bộ 105.835 file âm thanh bằng thư viện phân tích âm thanh chuyên dụng ghi nhận các thông số kỹ thuật 100% đồng nhất:</w:t>
+      </w:r>
+    </w:p>
+    <w:tbl>
+      <w:tblPr>
+        <w:tblW w:type="auto" w:w="0"/>
+        <w:jc w:val="center"/>
+        <w:tblLayout w:type="fixed"/>
+        <w:tblLook w:firstColumn="1" w:firstRow="1" w:lastColumn="0" w:lastRow="0" w:noHBand="0" w:noVBand="1" w:val="04A0"/>
+      </w:tblPr>
+      <w:tblGrid>
+        <w:gridCol w:w="3135"/>
+        <w:gridCol w:w="3135"/>
+        <w:gridCol w:w="3135"/>
+      </w:tblGrid>
+      <w:tr>
+        <w:tc>
+          <w:tcPr>
+            <w:tcW w:type="dxa" w:w="2835"/>
+            <w:shd w:fill="E2E8F0"/>
+          </w:tcPr>
+          <w:p>
+            <w:pPr>
+              <w:spacing w:after="60" w:line="276" w:lineRule="auto"/>
+              <w:jc w:val="center"/>
+            </w:pPr>
+            <w:r>
+              <w:rPr>
+                <w:rFonts w:ascii="Times New Roman" w:hAnsi="Times New Roman" w:eastAsia="Times New Roman"/>
+                <w:b/>
+                <w:color w:val="000000"/>
+                <w:sz w:val="22"/>
+              </w:rPr>
+              <w:t>Đặc tính kỹ thuật</w:t>
+            </w:r>
+          </w:p>
+        </w:tc>
+        <w:tc>
+          <w:tcPr>
+            <w:tcW w:type="dxa" w:w="3402"/>
+            <w:shd w:fill="E2E8F0"/>
+          </w:tcPr>
+          <w:p>
+            <w:pPr>
+              <w:spacing w:after="60" w:line="276" w:lineRule="auto"/>
+              <w:jc w:val="center"/>
+            </w:pPr>
+            <w:r>
+              <w:rPr>
+                <w:rFonts w:ascii="Times New Roman" w:hAnsi="Times New Roman" w:eastAsia="Times New Roman"/>
+                <w:b/>
+                <w:color w:val="000000"/>
+                <w:sz w:val="22"/>
+              </w:rPr>
+              <w:t>Giá trị ghi nhận thực tế</w:t>
+            </w:r>
+          </w:p>
+        </w:tc>
+        <w:tc>
+          <w:tcPr>
+            <w:tcW w:type="dxa" w:w="2268"/>
+            <w:shd w:fill="E2E8F0"/>
+          </w:tcPr>
+          <w:p>
+            <w:pPr>
+              <w:spacing w:after="60" w:line="276" w:lineRule="auto"/>
+              <w:jc w:val="center"/>
+            </w:pPr>
+            <w:r>
+              <w:rPr>
+                <w:rFonts w:ascii="Times New Roman" w:hAnsi="Times New Roman" w:eastAsia="Times New Roman"/>
+                <w:b/>
+                <w:color w:val="000000"/>
+                <w:sz w:val="22"/>
+              </w:rPr>
+              <w:t>Tỷ lệ tuân thủ</w:t>
+            </w:r>
+          </w:p>
+        </w:tc>
+      </w:tr>
+      <w:tr>
+        <w:tc>
+          <w:tcPr>
+            <w:tcW w:type="dxa" w:w="2835"/>
+          </w:tcPr>
+          <w:p>
+            <w:pPr>
+              <w:spacing w:after="60" w:line="276" w:lineRule="auto"/>
+              <w:jc w:val="center"/>
+            </w:pPr>
+            <w:r>
+              <w:rPr>
+                <w:rFonts w:ascii="Times New Roman" w:hAnsi="Times New Roman" w:eastAsia="Times New Roman"/>
+                <w:color w:val="000000"/>
+                <w:sz w:val="21"/>
+              </w:rPr>
+              <w:t>Định dạng container</w:t>
+            </w:r>
+          </w:p>
+        </w:tc>
+        <w:tc>
+          <w:tcPr>
+            <w:tcW w:type="dxa" w:w="3402"/>
+          </w:tcPr>
+          <w:p>
+            <w:pPr>
+              <w:spacing w:after="60" w:line="276" w:lineRule="auto"/>
+              <w:jc w:val="left"/>
+            </w:pPr>
+            <w:r>
+              <w:rPr>
+                <w:rFonts w:ascii="Times New Roman" w:hAnsi="Times New Roman" w:eastAsia="Times New Roman"/>
+                <w:color w:val="000000"/>
+                <w:sz w:val="21"/>
+              </w:rPr>
+              <w:t>WAV (Resource Interchange File Format)</w:t>
+            </w:r>
+          </w:p>
+        </w:tc>
+        <w:tc>
+          <w:tcPr>
+            <w:tcW w:type="dxa" w:w="2268"/>
+          </w:tcPr>
+          <w:p>
+            <w:pPr>
+              <w:spacing w:after="60" w:line="276" w:lineRule="auto"/>
+              <w:jc w:val="left"/>
+            </w:pPr>
+            <w:r>
+              <w:rPr>
+                <w:rFonts w:ascii="Times New Roman" w:hAnsi="Times New Roman" w:eastAsia="Times New Roman"/>
+                <w:color w:val="000000"/>
+                <w:sz w:val="21"/>
+              </w:rPr>
+              <w:t>105.835 / 105.835 (100.0%)</w:t>
+            </w:r>
+          </w:p>
+        </w:tc>
+      </w:tr>
+      <w:tr>
+        <w:tc>
+          <w:tcPr>
+            <w:tcW w:type="dxa" w:w="2835"/>
+          </w:tcPr>
+          <w:p>
+            <w:pPr>
+              <w:spacing w:after="60" w:line="276" w:lineRule="auto"/>
+              <w:jc w:val="center"/>
+            </w:pPr>
+            <w:r>
+              <w:rPr>
+                <w:rFonts w:ascii="Times New Roman" w:hAnsi="Times New Roman" w:eastAsia="Times New Roman"/>
+                <w:color w:val="000000"/>
+                <w:sz w:val="21"/>
+              </w:rPr>
+              <w:t>Chuẩn mã hóa âm thanh (Subtype)</w:t>
+            </w:r>
+          </w:p>
+        </w:tc>
+        <w:tc>
+          <w:tcPr>
+            <w:tcW w:type="dxa" w:w="3402"/>
+          </w:tcPr>
+          <w:p>
+            <w:pPr>
+              <w:spacing w:after="60" w:line="276" w:lineRule="auto"/>
+              <w:jc w:val="left"/>
+            </w:pPr>
+            <w:r>
+              <w:rPr>
+                <w:rFonts w:ascii="Times New Roman" w:hAnsi="Times New Roman" w:eastAsia="Times New Roman"/>
+                <w:color w:val="000000"/>
+                <w:sz w:val="21"/>
+              </w:rPr>
+              <w:t>PCM_16 (Linear PCM, 16-bit signed integer)</w:t>
+            </w:r>
+          </w:p>
+        </w:tc>
+        <w:tc>
+          <w:tcPr>
+            <w:tcW w:type="dxa" w:w="2268"/>
+          </w:tcPr>
+          <w:p>
+            <w:pPr>
+              <w:spacing w:after="60" w:line="276" w:lineRule="auto"/>
+              <w:jc w:val="left"/>
+            </w:pPr>
+            <w:r>
+              <w:rPr>
+                <w:rFonts w:ascii="Times New Roman" w:hAnsi="Times New Roman" w:eastAsia="Times New Roman"/>
+                <w:color w:val="000000"/>
+                <w:sz w:val="21"/>
+              </w:rPr>
+              <w:t>105.835 / 105.835 (100.0%)</w:t>
+            </w:r>
+          </w:p>
+        </w:tc>
+      </w:tr>
+      <w:tr>
+        <w:tc>
+          <w:tcPr>
+            <w:tcW w:type="dxa" w:w="2835"/>
+          </w:tcPr>
+          <w:p>
+            <w:pPr>
+              <w:spacing w:after="60" w:line="276" w:lineRule="auto"/>
+              <w:jc w:val="center"/>
+            </w:pPr>
+            <w:r>
+              <w:rPr>
+                <w:rFonts w:ascii="Times New Roman" w:hAnsi="Times New Roman" w:eastAsia="Times New Roman"/>
+                <w:color w:val="000000"/>
+                <w:sz w:val="21"/>
+              </w:rPr>
+              <w:t>Số kênh âm thanh (Channels)</w:t>
+            </w:r>
+          </w:p>
+        </w:tc>
+        <w:tc>
+          <w:tcPr>
+            <w:tcW w:type="dxa" w:w="3402"/>
+          </w:tcPr>
+          <w:p>
+            <w:pPr>
+              <w:spacing w:after="60" w:line="276" w:lineRule="auto"/>
+              <w:jc w:val="left"/>
+            </w:pPr>
+            <w:r>
+              <w:rPr>
+                <w:rFonts w:ascii="Times New Roman" w:hAnsi="Times New Roman" w:eastAsia="Times New Roman"/>
+                <w:color w:val="000000"/>
+                <w:sz w:val="21"/>
+              </w:rPr>
+              <w:t>1 kênh (Mono - Single Channel)</w:t>
+            </w:r>
+          </w:p>
+        </w:tc>
+        <w:tc>
+          <w:tcPr>
+            <w:tcW w:type="dxa" w:w="2268"/>
+          </w:tcPr>
+          <w:p>
+            <w:pPr>
+              <w:spacing w:after="60" w:line="276" w:lineRule="auto"/>
+              <w:jc w:val="left"/>
+            </w:pPr>
+            <w:r>
+              <w:rPr>
+                <w:rFonts w:ascii="Times New Roman" w:hAnsi="Times New Roman" w:eastAsia="Times New Roman"/>
+                <w:color w:val="000000"/>
+                <w:sz w:val="21"/>
+              </w:rPr>
+              <w:t>105.835 / 105.835 (100.0%)</w:t>
+            </w:r>
+          </w:p>
+        </w:tc>
+      </w:tr>
+      <w:tr>
+        <w:tc>
+          <w:tcPr>
+            <w:tcW w:type="dxa" w:w="2835"/>
+          </w:tcPr>
+          <w:p>
+            <w:pPr>
+              <w:spacing w:after="60" w:line="276" w:lineRule="auto"/>
+              <w:jc w:val="center"/>
+            </w:pPr>
+            <w:r>
+              <w:rPr>
+                <w:rFonts w:ascii="Times New Roman" w:hAnsi="Times New Roman" w:eastAsia="Times New Roman"/>
+                <w:color w:val="000000"/>
+                <w:sz w:val="21"/>
+              </w:rPr>
+              <w:t>Tần số lấy mẫu (Sample Rate)</w:t>
+            </w:r>
+          </w:p>
+        </w:tc>
+        <w:tc>
+          <w:tcPr>
+            <w:tcW w:type="dxa" w:w="3402"/>
+          </w:tcPr>
+          <w:p>
+            <w:pPr>
+              <w:spacing w:after="60" w:line="276" w:lineRule="auto"/>
+              <w:jc w:val="left"/>
+            </w:pPr>
+            <w:r>
+              <w:rPr>
+                <w:rFonts w:ascii="Times New Roman" w:hAnsi="Times New Roman" w:eastAsia="Times New Roman"/>
+                <w:color w:val="000000"/>
+                <w:sz w:val="21"/>
+              </w:rPr>
+              <w:t>16.000 Hz (16 kHz)</w:t>
+            </w:r>
+          </w:p>
+        </w:tc>
+        <w:tc>
+          <w:tcPr>
+            <w:tcW w:type="dxa" w:w="2268"/>
+          </w:tcPr>
+          <w:p>
+            <w:pPr>
+              <w:spacing w:after="60" w:line="276" w:lineRule="auto"/>
+              <w:jc w:val="left"/>
+            </w:pPr>
+            <w:r>
+              <w:rPr>
+                <w:rFonts w:ascii="Times New Roman" w:hAnsi="Times New Roman" w:eastAsia="Times New Roman"/>
+                <w:color w:val="000000"/>
+                <w:sz w:val="21"/>
+              </w:rPr>
+              <w:t>105.835 / 105.835 (100.0%)</w:t>
+            </w:r>
+          </w:p>
+        </w:tc>
+      </w:tr>
+      <w:tr>
+        <w:tc>
+          <w:tcPr>
+            <w:tcW w:type="dxa" w:w="2835"/>
+          </w:tcPr>
+          <w:p>
+            <w:pPr>
+              <w:spacing w:after="60" w:line="276" w:lineRule="auto"/>
+              <w:jc w:val="center"/>
+            </w:pPr>
+            <w:r>
+              <w:rPr>
+                <w:rFonts w:ascii="Times New Roman" w:hAnsi="Times New Roman" w:eastAsia="Times New Roman"/>
+                <w:color w:val="000000"/>
+                <w:sz w:val="21"/>
+              </w:rPr>
+              <w:t>Tính toàn vẹn file (Integrity)</w:t>
+            </w:r>
+          </w:p>
+        </w:tc>
+        <w:tc>
+          <w:tcPr>
+            <w:tcW w:type="dxa" w:w="3402"/>
+          </w:tcPr>
+          <w:p>
+            <w:pPr>
+              <w:spacing w:after="60" w:line="276" w:lineRule="auto"/>
+              <w:jc w:val="left"/>
+            </w:pPr>
+            <w:r>
+              <w:rPr>
+                <w:rFonts w:ascii="Times New Roman" w:hAnsi="Times New Roman" w:eastAsia="Times New Roman"/>
+                <w:color w:val="000000"/>
+                <w:sz w:val="21"/>
+              </w:rPr>
+              <w:t>0 file lỗi đọc / lỗi định dạng</w:t>
+            </w:r>
+          </w:p>
+        </w:tc>
+        <w:tc>
+          <w:tcPr>
+            <w:tcW w:type="dxa" w:w="2268"/>
+          </w:tcPr>
+          <w:p>
+            <w:pPr>
+              <w:spacing w:after="60" w:line="276" w:lineRule="auto"/>
+              <w:jc w:val="left"/>
+            </w:pPr>
+            <w:r>
+              <w:rPr>
+                <w:rFonts w:ascii="Times New Roman" w:hAnsi="Times New Roman" w:eastAsia="Times New Roman"/>
+                <w:color w:val="000000"/>
+                <w:sz w:val="21"/>
+              </w:rPr>
+              <w:t>105.835 / 105.835 (100.0%)</w:t>
+            </w:r>
+          </w:p>
+        </w:tc>
+      </w:tr>
+    </w:tbl>
+    <w:p>
+      <w:pPr>
+        <w:spacing w:after="120"/>
+      </w:pPr>
+    </w:p>
+    <w:p>
+      <w:pPr>
+        <w:spacing w:line="360" w:lineRule="auto" w:after="120"/>
+        <w:ind w:firstLine="0"/>
+        <w:jc w:val="both"/>
+      </w:pPr>
+      <w:r>
+        <w:rPr>
+          <w:rFonts w:ascii="Times New Roman" w:hAnsi="Times New Roman" w:eastAsia="Times New Roman"/>
+          <w:b w:val="0"/>
+          <w:i w:val="0"/>
+          <w:color w:val="000000"/>
+          <w:sz w:val="26"/>
+        </w:rPr>
+        <w:t>Thống kê thời lượng tín hiệu thực tế:</w:t>
+      </w:r>
+    </w:p>
+    <w:tbl>
+      <w:tblPr>
+        <w:tblW w:type="auto" w:w="0"/>
+        <w:jc w:val="center"/>
+        <w:tblLayout w:type="fixed"/>
+        <w:tblLook w:firstColumn="1" w:firstRow="1" w:lastColumn="0" w:lastRow="0" w:noHBand="0" w:noVBand="1" w:val="04A0"/>
+      </w:tblPr>
+      <w:tblGrid>
+        <w:gridCol w:w="3135"/>
+        <w:gridCol w:w="3135"/>
+        <w:gridCol w:w="3135"/>
+      </w:tblGrid>
+      <w:tr>
+        <w:tc>
+          <w:tcPr>
+            <w:tcW w:type="dxa" w:w="2835"/>
+            <w:shd w:fill="E2E8F0"/>
+          </w:tcPr>
+          <w:p>
+            <w:pPr>
+              <w:spacing w:after="60" w:line="276" w:lineRule="auto"/>
+              <w:jc w:val="center"/>
+            </w:pPr>
+            <w:r>
+              <w:rPr>
+                <w:rFonts w:ascii="Times New Roman" w:hAnsi="Times New Roman" w:eastAsia="Times New Roman"/>
+                <w:b/>
+                <w:color w:val="000000"/>
+                <w:sz w:val="22"/>
+              </w:rPr>
+              <w:t>Chỉ số thống kê</w:t>
+            </w:r>
+          </w:p>
+        </w:tc>
+        <w:tc>
+          <w:tcPr>
+            <w:tcW w:type="dxa" w:w="2835"/>
+            <w:shd w:fill="E2E8F0"/>
+          </w:tcPr>
+          <w:p>
+            <w:pPr>
+              <w:spacing w:after="60" w:line="276" w:lineRule="auto"/>
+              <w:jc w:val="center"/>
+            </w:pPr>
+            <w:r>
+              <w:rPr>
+                <w:rFonts w:ascii="Times New Roman" w:hAnsi="Times New Roman" w:eastAsia="Times New Roman"/>
+                <w:b/>
+                <w:color w:val="000000"/>
+                <w:sz w:val="22"/>
+              </w:rPr>
+              <w:t>Thời lượng (giây)</w:t>
+            </w:r>
+          </w:p>
+        </w:tc>
+        <w:tc>
+          <w:tcPr>
+            <w:tcW w:type="dxa" w:w="2835"/>
+            <w:shd w:fill="E2E8F0"/>
+          </w:tcPr>
+          <w:p>
+            <w:pPr>
+              <w:spacing w:after="60" w:line="276" w:lineRule="auto"/>
+              <w:jc w:val="center"/>
+            </w:pPr>
+            <w:r>
+              <w:rPr>
+                <w:rFonts w:ascii="Times New Roman" w:hAnsi="Times New Roman" w:eastAsia="Times New Roman"/>
+                <w:b/>
+                <w:color w:val="000000"/>
+                <w:sz w:val="22"/>
+              </w:rPr>
+              <w:t>Số điểm mẫu tương ứng (Samples @ 16kHz)</w:t>
+            </w:r>
+          </w:p>
+        </w:tc>
+      </w:tr>
+      <w:tr>
+        <w:tc>
+          <w:tcPr>
+            <w:tcW w:type="dxa" w:w="2835"/>
+          </w:tcPr>
+          <w:p>
+            <w:pPr>
+              <w:spacing w:after="60" w:line="276" w:lineRule="auto"/>
+              <w:jc w:val="center"/>
+            </w:pPr>
+            <w:r>
+              <w:rPr>
+                <w:rFonts w:ascii="Times New Roman" w:hAnsi="Times New Roman" w:eastAsia="Times New Roman"/>
+                <w:color w:val="000000"/>
+                <w:sz w:val="21"/>
+              </w:rPr>
+              <w:t>Giá trị trung bình (Mean)</w:t>
+            </w:r>
+          </w:p>
+        </w:tc>
+        <w:tc>
+          <w:tcPr>
+            <w:tcW w:type="dxa" w:w="2835"/>
+          </w:tcPr>
+          <w:p>
+            <w:pPr>
+              <w:spacing w:after="60" w:line="276" w:lineRule="auto"/>
+              <w:jc w:val="left"/>
+            </w:pPr>
+            <w:r>
+              <w:rPr>
+                <w:rFonts w:ascii="Times New Roman" w:hAnsi="Times New Roman" w:eastAsia="Times New Roman"/>
+                <w:color w:val="000000"/>
+                <w:sz w:val="21"/>
+              </w:rPr>
+              <w:t>0.9846 s</w:t>
+            </w:r>
+          </w:p>
+        </w:tc>
+        <w:tc>
+          <w:tcPr>
+            <w:tcW w:type="dxa" w:w="2835"/>
+          </w:tcPr>
+          <w:p>
+            <w:pPr>
+              <w:spacing w:after="60" w:line="276" w:lineRule="auto"/>
+              <w:jc w:val="left"/>
+            </w:pPr>
+            <w:r>
+              <w:rPr>
+                <w:rFonts w:ascii="Times New Roman" w:hAnsi="Times New Roman" w:eastAsia="Times New Roman"/>
+                <w:color w:val="000000"/>
+                <w:sz w:val="21"/>
+              </w:rPr>
+              <w:t>15.754 samples</w:t>
+            </w:r>
+          </w:p>
+        </w:tc>
+      </w:tr>
+      <w:tr>
+        <w:tc>
+          <w:tcPr>
+            <w:tcW w:type="dxa" w:w="2835"/>
+          </w:tcPr>
+          <w:p>
+            <w:pPr>
+              <w:spacing w:after="60" w:line="276" w:lineRule="auto"/>
+              <w:jc w:val="center"/>
+            </w:pPr>
+            <w:r>
+              <w:rPr>
+                <w:rFonts w:ascii="Times New Roman" w:hAnsi="Times New Roman" w:eastAsia="Times New Roman"/>
+                <w:color w:val="000000"/>
+                <w:sz w:val="21"/>
+              </w:rPr>
+              <w:t>Độ lệch chuẩn (Standard Deviation)</w:t>
+            </w:r>
+          </w:p>
+        </w:tc>
+        <w:tc>
+          <w:tcPr>
+            <w:tcW w:type="dxa" w:w="2835"/>
+          </w:tcPr>
+          <w:p>
+            <w:pPr>
+              <w:spacing w:after="60" w:line="276" w:lineRule="auto"/>
+              <w:jc w:val="left"/>
+            </w:pPr>
+            <w:r>
+              <w:rPr>
+                <w:rFonts w:ascii="Times New Roman" w:hAnsi="Times New Roman" w:eastAsia="Times New Roman"/>
+                <w:color w:val="000000"/>
+                <w:sz w:val="21"/>
+              </w:rPr>
+              <w:t>0.5082 s</w:t>
+            </w:r>
+          </w:p>
+        </w:tc>
+        <w:tc>
+          <w:tcPr>
+            <w:tcW w:type="dxa" w:w="2835"/>
+          </w:tcPr>
+          <w:p>
+            <w:pPr>
+              <w:spacing w:after="60" w:line="276" w:lineRule="auto"/>
+              <w:jc w:val="left"/>
+            </w:pPr>
+            <w:r>
+              <w:rPr>
+                <w:rFonts w:ascii="Times New Roman" w:hAnsi="Times New Roman" w:eastAsia="Times New Roman"/>
+                <w:color w:val="000000"/>
+                <w:sz w:val="21"/>
+              </w:rPr>
+              <w:t>8.131 samples</w:t>
+            </w:r>
+          </w:p>
+        </w:tc>
+      </w:tr>
+      <w:tr>
+        <w:tc>
+          <w:tcPr>
+            <w:tcW w:type="dxa" w:w="2835"/>
+          </w:tcPr>
+          <w:p>
+            <w:pPr>
+              <w:spacing w:after="60" w:line="276" w:lineRule="auto"/>
+              <w:jc w:val="center"/>
+            </w:pPr>
+            <w:r>
+              <w:rPr>
+                <w:rFonts w:ascii="Times New Roman" w:hAnsi="Times New Roman" w:eastAsia="Times New Roman"/>
+                <w:color w:val="000000"/>
+                <w:sz w:val="21"/>
+              </w:rPr>
+              <w:t>Giá trị nhỏ nhất (Minimum)</w:t>
+            </w:r>
+          </w:p>
+        </w:tc>
+        <w:tc>
+          <w:tcPr>
+            <w:tcW w:type="dxa" w:w="2835"/>
+          </w:tcPr>
+          <w:p>
+            <w:pPr>
+              <w:spacing w:after="60" w:line="276" w:lineRule="auto"/>
+              <w:jc w:val="left"/>
+            </w:pPr>
+            <w:r>
+              <w:rPr>
+                <w:rFonts w:ascii="Times New Roman" w:hAnsi="Times New Roman" w:eastAsia="Times New Roman"/>
+                <w:color w:val="000000"/>
+                <w:sz w:val="21"/>
+              </w:rPr>
+              <w:t>0.2133 s (bed/220ee1ef_nohash_0.wav)</w:t>
+            </w:r>
+          </w:p>
+        </w:tc>
+        <w:tc>
+          <w:tcPr>
+            <w:tcW w:type="dxa" w:w="2835"/>
+          </w:tcPr>
+          <w:p>
+            <w:pPr>
+              <w:spacing w:after="60" w:line="276" w:lineRule="auto"/>
+              <w:jc w:val="left"/>
+            </w:pPr>
+            <w:r>
+              <w:rPr>
+                <w:rFonts w:ascii="Times New Roman" w:hAnsi="Times New Roman" w:eastAsia="Times New Roman"/>
+                <w:color w:val="000000"/>
+                <w:sz w:val="21"/>
+              </w:rPr>
+              <w:t>3.413 samples</w:t>
+            </w:r>
+          </w:p>
+        </w:tc>
+      </w:tr>
+      <w:tr>
+        <w:tc>
+          <w:tcPr>
+            <w:tcW w:type="dxa" w:w="2835"/>
+          </w:tcPr>
+          <w:p>
+            <w:pPr>
+              <w:spacing w:after="60" w:line="276" w:lineRule="auto"/>
+              <w:jc w:val="center"/>
+            </w:pPr>
+            <w:r>
+              <w:rPr>
+                <w:rFonts w:ascii="Times New Roman" w:hAnsi="Times New Roman" w:eastAsia="Times New Roman"/>
+                <w:color w:val="000000"/>
+                <w:sz w:val="21"/>
+              </w:rPr>
+              <w:t>Phân vị 25% (Q1)</w:t>
+            </w:r>
+          </w:p>
+        </w:tc>
+        <w:tc>
+          <w:tcPr>
+            <w:tcW w:type="dxa" w:w="2835"/>
+          </w:tcPr>
+          <w:p>
+            <w:pPr>
+              <w:spacing w:after="60" w:line="276" w:lineRule="auto"/>
+              <w:jc w:val="left"/>
+            </w:pPr>
+            <w:r>
+              <w:rPr>
+                <w:rFonts w:ascii="Times New Roman" w:hAnsi="Times New Roman" w:eastAsia="Times New Roman"/>
+                <w:color w:val="000000"/>
+                <w:sz w:val="21"/>
+              </w:rPr>
+              <w:t>1.0000 s</w:t>
+            </w:r>
+          </w:p>
+        </w:tc>
+        <w:tc>
+          <w:tcPr>
+            <w:tcW w:type="dxa" w:w="2835"/>
+          </w:tcPr>
+          <w:p>
+            <w:pPr>
+              <w:spacing w:after="60" w:line="276" w:lineRule="auto"/>
+              <w:jc w:val="left"/>
+            </w:pPr>
+            <w:r>
+              <w:rPr>
+                <w:rFonts w:ascii="Times New Roman" w:hAnsi="Times New Roman" w:eastAsia="Times New Roman"/>
+                <w:color w:val="000000"/>
+                <w:sz w:val="21"/>
+              </w:rPr>
+              <w:t>16.000 samples</w:t>
+            </w:r>
+          </w:p>
+        </w:tc>
+      </w:tr>
+      <w:tr>
+        <w:tc>
+          <w:tcPr>
+            <w:tcW w:type="dxa" w:w="2835"/>
+          </w:tcPr>
+          <w:p>
+            <w:pPr>
+              <w:spacing w:after="60" w:line="276" w:lineRule="auto"/>
+              <w:jc w:val="center"/>
+            </w:pPr>
+            <w:r>
+              <w:rPr>
+                <w:rFonts w:ascii="Times New Roman" w:hAnsi="Times New Roman" w:eastAsia="Times New Roman"/>
+                <w:color w:val="000000"/>
+                <w:sz w:val="21"/>
+              </w:rPr>
+              <w:t>Trung vị 50% (Median)</w:t>
+            </w:r>
+          </w:p>
+        </w:tc>
+        <w:tc>
+          <w:tcPr>
+            <w:tcW w:type="dxa" w:w="2835"/>
+          </w:tcPr>
+          <w:p>
+            <w:pPr>
+              <w:spacing w:after="60" w:line="276" w:lineRule="auto"/>
+              <w:jc w:val="left"/>
+            </w:pPr>
+            <w:r>
+              <w:rPr>
+                <w:rFonts w:ascii="Times New Roman" w:hAnsi="Times New Roman" w:eastAsia="Times New Roman"/>
+                <w:color w:val="000000"/>
+                <w:sz w:val="21"/>
+              </w:rPr>
+              <w:t>1.0000 s</w:t>
+            </w:r>
+          </w:p>
+        </w:tc>
+        <w:tc>
+          <w:tcPr>
+            <w:tcW w:type="dxa" w:w="2835"/>
+          </w:tcPr>
+          <w:p>
+            <w:pPr>
+              <w:spacing w:after="60" w:line="276" w:lineRule="auto"/>
+              <w:jc w:val="left"/>
+            </w:pPr>
+            <w:r>
+              <w:rPr>
+                <w:rFonts w:ascii="Times New Roman" w:hAnsi="Times New Roman" w:eastAsia="Times New Roman"/>
+                <w:color w:val="000000"/>
+                <w:sz w:val="21"/>
+              </w:rPr>
+              <w:t>16.000 samples</w:t>
+            </w:r>
+          </w:p>
+        </w:tc>
+      </w:tr>
+      <w:tr>
+        <w:tc>
+          <w:tcPr>
+            <w:tcW w:type="dxa" w:w="2835"/>
+          </w:tcPr>
+          <w:p>
+            <w:pPr>
+              <w:spacing w:after="60" w:line="276" w:lineRule="auto"/>
+              <w:jc w:val="center"/>
+            </w:pPr>
+            <w:r>
+              <w:rPr>
+                <w:rFonts w:ascii="Times New Roman" w:hAnsi="Times New Roman" w:eastAsia="Times New Roman"/>
+                <w:color w:val="000000"/>
+                <w:sz w:val="21"/>
+              </w:rPr>
+              <w:t>Phân vị 75% (Q3)</w:t>
+            </w:r>
+          </w:p>
+        </w:tc>
+        <w:tc>
+          <w:tcPr>
+            <w:tcW w:type="dxa" w:w="2835"/>
+          </w:tcPr>
+          <w:p>
+            <w:pPr>
+              <w:spacing w:after="60" w:line="276" w:lineRule="auto"/>
+              <w:jc w:val="left"/>
+            </w:pPr>
+            <w:r>
+              <w:rPr>
+                <w:rFonts w:ascii="Times New Roman" w:hAnsi="Times New Roman" w:eastAsia="Times New Roman"/>
+                <w:color w:val="000000"/>
+                <w:sz w:val="21"/>
+              </w:rPr>
+              <w:t>1.0000 s</w:t>
+            </w:r>
+          </w:p>
+        </w:tc>
+        <w:tc>
+          <w:tcPr>
+            <w:tcW w:type="dxa" w:w="2835"/>
+          </w:tcPr>
+          <w:p>
+            <w:pPr>
+              <w:spacing w:after="60" w:line="276" w:lineRule="auto"/>
+              <w:jc w:val="left"/>
+            </w:pPr>
+            <w:r>
+              <w:rPr>
+                <w:rFonts w:ascii="Times New Roman" w:hAnsi="Times New Roman" w:eastAsia="Times New Roman"/>
+                <w:color w:val="000000"/>
+                <w:sz w:val="21"/>
+              </w:rPr>
+              <w:t>16.000 samples</w:t>
+            </w:r>
+          </w:p>
+        </w:tc>
+      </w:tr>
+      <w:tr>
+        <w:tc>
+          <w:tcPr>
+            <w:tcW w:type="dxa" w:w="2835"/>
+          </w:tcPr>
+          <w:p>
+            <w:pPr>
+              <w:spacing w:after="60" w:line="276" w:lineRule="auto"/>
+              <w:jc w:val="center"/>
+            </w:pPr>
+            <w:r>
+              <w:rPr>
+                <w:rFonts w:ascii="Times New Roman" w:hAnsi="Times New Roman" w:eastAsia="Times New Roman"/>
+                <w:color w:val="000000"/>
+                <w:sz w:val="21"/>
+              </w:rPr>
+              <w:t>Giá trị lớn nhất (Maximum)</w:t>
+            </w:r>
+          </w:p>
+        </w:tc>
+        <w:tc>
+          <w:tcPr>
+            <w:tcW w:type="dxa" w:w="2835"/>
+          </w:tcPr>
+          <w:p>
+            <w:pPr>
+              <w:spacing w:after="60" w:line="276" w:lineRule="auto"/>
+              <w:jc w:val="left"/>
+            </w:pPr>
+            <w:r>
+              <w:rPr>
+                <w:rFonts w:ascii="Times New Roman" w:hAnsi="Times New Roman" w:eastAsia="Times New Roman"/>
+                <w:color w:val="000000"/>
+                <w:sz w:val="21"/>
+              </w:rPr>
+              <w:t>95.1831 s (trong _background_noise_)</w:t>
+            </w:r>
+          </w:p>
+        </w:tc>
+        <w:tc>
+          <w:tcPr>
+            <w:tcW w:type="dxa" w:w="2835"/>
+          </w:tcPr>
+          <w:p>
+            <w:pPr>
+              <w:spacing w:after="60" w:line="276" w:lineRule="auto"/>
+              <w:jc w:val="left"/>
+            </w:pPr>
+            <w:r>
+              <w:rPr>
+                <w:rFonts w:ascii="Times New Roman" w:hAnsi="Times New Roman" w:eastAsia="Times New Roman"/>
+                <w:color w:val="000000"/>
+                <w:sz w:val="21"/>
+              </w:rPr>
+              <w:t>1.522.930 samples</w:t>
+            </w:r>
+          </w:p>
+        </w:tc>
+      </w:tr>
+    </w:tbl>
+    <w:p>
+      <w:pPr>
+        <w:spacing w:after="120"/>
+      </w:pPr>
+    </w:p>
+    <w:p>
+      <w:pPr>
+        <w:spacing w:line="360" w:lineRule="auto" w:after="120"/>
+        <w:ind w:firstLine="0"/>
+        <w:jc w:val="both"/>
+      </w:pPr>
+      <w:r>
+        <w:rPr>
+          <w:rFonts w:ascii="Times New Roman" w:hAnsi="Times New Roman" w:eastAsia="Times New Roman"/>
+          <w:b w:val="0"/>
+          <w:i w:val="0"/>
+          <w:color w:val="000000"/>
+          <w:sz w:val="26"/>
+        </w:rPr>
+        <w:t>Vấn đề âm thanh ngắn (&lt; 1.0 giây): Kết quả audit chỉ ra rằng có đúng 10.435 file âm thanh có thời lượng ngắn hơn 1.0 giây (chiếm 9.8597% tổng số file). File ngắn nhất chỉ dài 0.2133 giây (3.413 mẫu). Vì mạng nơ-ron TD-ResNet yêu cầu ma trận đặc trưng đầu vào có kích thước cố định, các file ngắn hơn 16.000 điểm mẫu sẽ được xử lý tại bước tiền xử lý dữ liệu (Mục 2.3) bằng cách loại bỏ (filtering) hoặc chèn đệm (padding) để đảm bảo tính nhất quán về mặt tensor.</w:t>
       </w:r>
     </w:p>
     <w:p>
@@ -4991,7 +6526,107 @@
           <w:color w:val="000000"/>
           <w:sz w:val="26"/>
         </w:rPr>
-        <w:t>Thư mục _background_noise_ chứa các đoạn âm thanh môi trường không có tiếng nói. Dữ liệu này được sử dụng để tạo lớp Silence (đại diện cho trường hợp không có từ khóa) hoặc trộn vào mẫu âm thanh để mô phỏng môi trường thực tế. Lớp Unknown có thể được thêm vào để đại diện cho các từ nằm ngoài tập mục tiêu, tránh việc hệ thống bắt buộc phải gán nhãn sai cho một từ lạ.</w:t>
+        <w:t>Thư mục _background_noise_ chứa đúng 6 file âm thanh với độ dài từ 60.00 giây đến 95.18 giây (thời lượng trung bình là 66.57 giây). Các file này bao gồm các loại tiếng ồn môi trường thường gặp: tiếng rửa chén (doing_the_dishes.wav), tiếng mèo kêu (dude_miaowing.wav), tiếng ồn hồng (pink_noise.wav), tiếng vòi nước chảy (running_tap.wav), tiếng ồn trắng (white_noise.wav), và tiếng đạp xe tập thể dục (exercise_bike.wav).</w:t>
+      </w:r>
+    </w:p>
+    <w:p>
+      <w:pPr>
+        <w:spacing w:line="360" w:lineRule="auto" w:after="120"/>
+        <w:ind w:firstLine="0"/>
+        <w:jc w:val="both"/>
+      </w:pPr>
+      <w:r>
+        <w:rPr>
+          <w:rFonts w:ascii="Times New Roman" w:hAnsi="Times New Roman" w:eastAsia="Times New Roman"/>
+          <w:b w:val="0"/>
+          <w:i w:val="0"/>
+          <w:color w:val="000000"/>
+          <w:sz w:val="26"/>
+        </w:rPr>
+        <w:t>Vai trò của dữ liệu nhiễu trong hệ thống:</w:t>
+      </w:r>
+    </w:p>
+    <w:p>
+      <w:pPr>
+        <w:spacing w:line="360" w:lineRule="auto" w:after="80"/>
+        <w:ind w:left="340" w:hanging="340"/>
+        <w:jc w:val="both"/>
+      </w:pPr>
+      <w:r>
+        <w:rPr>
+          <w:rFonts w:ascii="Times New Roman" w:hAnsi="Times New Roman" w:eastAsia="Times New Roman"/>
+          <w:b/>
+          <w:color w:val="000000"/>
+          <w:sz w:val="26"/>
+        </w:rPr>
+        <w:t xml:space="preserve">-- </w:t>
+      </w:r>
+      <w:r>
+        <w:rPr>
+          <w:rFonts w:ascii="Times New Roman" w:hAnsi="Times New Roman" w:eastAsia="Times New Roman"/>
+          <w:b/>
+          <w:color w:val="000000"/>
+          <w:sz w:val="26"/>
+        </w:rPr>
+        <w:t xml:space="preserve">Nhận diện khoảng lặng (Silence Detection): </w:t>
+      </w:r>
+      <w:r>
+        <w:rPr>
+          <w:rFonts w:ascii="Times New Roman" w:hAnsi="Times New Roman" w:eastAsia="Times New Roman"/>
+          <w:color w:val="000000"/>
+          <w:sz w:val="26"/>
+        </w:rPr>
+        <w:t>Tạo lớp Silence: Các đoạn âm thanh 1 giây được cắt ngẫu nhiên từ 6 file này để làm mẫu cho lớp Silence (không có người nói), giúp hệ thống nhận diện khi nào không có lệnh thoại.</w:t>
+      </w:r>
+    </w:p>
+    <w:p>
+      <w:pPr>
+        <w:spacing w:line="360" w:lineRule="auto" w:after="80"/>
+        <w:ind w:left="340" w:hanging="340"/>
+        <w:jc w:val="both"/>
+      </w:pPr>
+      <w:r>
+        <w:rPr>
+          <w:rFonts w:ascii="Times New Roman" w:hAnsi="Times New Roman" w:eastAsia="Times New Roman"/>
+          <w:b/>
+          <w:color w:val="000000"/>
+          <w:sz w:val="26"/>
+        </w:rPr>
+        <w:t xml:space="preserve">-- </w:t>
+      </w:r>
+      <w:r>
+        <w:rPr>
+          <w:rFonts w:ascii="Times New Roman" w:hAnsi="Times New Roman" w:eastAsia="Times New Roman"/>
+          <w:b/>
+          <w:color w:val="000000"/>
+          <w:sz w:val="26"/>
+        </w:rPr>
+        <w:t xml:space="preserve">Tăng cường dữ liệu (Data Augmentation): </w:t>
+      </w:r>
+      <w:r>
+        <w:rPr>
+          <w:rFonts w:ascii="Times New Roman" w:hAnsi="Times New Roman" w:eastAsia="Times New Roman"/>
+          <w:color w:val="000000"/>
+          <w:sz w:val="26"/>
+        </w:rPr>
+        <w:t>Trộn vào các mẫu tiếng nói trong quá trình huấn luyện với tỷ lệ SNR tùy biến, giúp mô hình TD-ResNet học được các biểu diễn âm học bền vững, không bị phụ thuộc vào môi trường thu âm lý tưởng.</w:t>
+      </w:r>
+    </w:p>
+    <w:p>
+      <w:pPr>
+        <w:spacing w:line="360" w:lineRule="auto" w:after="120"/>
+        <w:ind w:firstLine="0"/>
+        <w:jc w:val="both"/>
+      </w:pPr>
+      <w:r>
+        <w:rPr>
+          <w:rFonts w:ascii="Times New Roman" w:hAnsi="Times New Roman" w:eastAsia="Times New Roman"/>
+          <w:b w:val="0"/>
+          <w:i w:val="0"/>
+          <w:color w:val="000000"/>
+          <w:sz w:val="26"/>
+        </w:rPr>
+        <w:t>Vai trò của lớp Unknown: 5 từ khóa có số người nói thấp gồm backward, visual, follow, learn, forward được nhóm xếp vào tập Unknown. Trong hệ thống nhận diện từ khóa thực tế (như trợ lý ảo chạy ngầm trên máy tính), lớp Unknown giúp mô hình từ chối các câu lệnh lạ thay vì gán nhãn sai vào các từ khóa kích hoạt hệ thống.</w:t>
       </w:r>
     </w:p>
     <w:p>
@@ -5024,7 +6659,107 @@
           <w:color w:val="000000"/>
           <w:sz w:val="26"/>
         </w:rPr>
-        <w:t>Mỗi episode gồm Support Set và Query Set. Trong cấu hình 5-way 5-shot, hệ thống chọn ngẫu nhiên 5 từ khóa, mỗi từ khóa lấy 5 mẫu làm Support (tổng cộng 25 mẫu) và một số mẫu khác làm Query. Support và Query trong cùng một episode bắt buộc phải là các file âm thanh khác nhau.</w:t>
+        <w:t>Trong bài toán Few-shot Keyword Spotting, dữ liệu không được chia thành tập train/test theo cách phân loại đóng truyền thống. Thay vào đó, dữ liệu được tổ chức thành các Episode mô phỏng bài toán nhận diện với số lượng mẫu hạn chế:</w:t>
+      </w:r>
+    </w:p>
+    <w:p>
+      <w:pPr>
+        <w:spacing w:line="360" w:lineRule="auto" w:after="120"/>
+        <w:ind w:firstLine="0"/>
+        <w:jc w:val="both"/>
+      </w:pPr>
+      <w:r>
+        <w:rPr>
+          <w:rFonts w:ascii="Times New Roman" w:hAnsi="Times New Roman" w:eastAsia="Times New Roman"/>
+          <w:b w:val="0"/>
+          <w:i w:val="0"/>
+          <w:color w:val="000000"/>
+          <w:sz w:val="26"/>
+        </w:rPr>
+        <w:t>Mỗi episode tuân theo cấu hình N-way K-shot và bao gồm hai tập mẫu độc lập:</w:t>
+      </w:r>
+    </w:p>
+    <w:p>
+      <w:pPr>
+        <w:spacing w:line="360" w:lineRule="auto" w:after="80"/>
+        <w:ind w:left="340" w:hanging="340"/>
+        <w:jc w:val="both"/>
+      </w:pPr>
+      <w:r>
+        <w:rPr>
+          <w:rFonts w:ascii="Times New Roman" w:hAnsi="Times New Roman" w:eastAsia="Times New Roman"/>
+          <w:b/>
+          <w:color w:val="000000"/>
+          <w:sz w:val="26"/>
+        </w:rPr>
+        <w:t xml:space="preserve">-- </w:t>
+      </w:r>
+      <w:r>
+        <w:rPr>
+          <w:rFonts w:ascii="Times New Roman" w:hAnsi="Times New Roman" w:eastAsia="Times New Roman"/>
+          <w:b/>
+          <w:color w:val="000000"/>
+          <w:sz w:val="26"/>
+        </w:rPr>
+        <w:t xml:space="preserve">Support Set: </w:t>
+      </w:r>
+      <w:r>
+        <w:rPr>
+          <w:rFonts w:ascii="Times New Roman" w:hAnsi="Times New Roman" w:eastAsia="Times New Roman"/>
+          <w:color w:val="000000"/>
+          <w:sz w:val="26"/>
+        </w:rPr>
+        <w:t>Chứa K mẫu âm thanh có nhãn cho mỗi lớp trong số N lớp từ khóa được chọn ngẫu nhiên. Tập này dùng để tính toán vector trung tâm (Prototype) cho từng lớp: c_k = (1/K) * tổng f_θ(x_i).</w:t>
+      </w:r>
+    </w:p>
+    <w:p>
+      <w:pPr>
+        <w:spacing w:line="360" w:lineRule="auto" w:after="80"/>
+        <w:ind w:left="340" w:hanging="340"/>
+        <w:jc w:val="both"/>
+      </w:pPr>
+      <w:r>
+        <w:rPr>
+          <w:rFonts w:ascii="Times New Roman" w:hAnsi="Times New Roman" w:eastAsia="Times New Roman"/>
+          <w:b/>
+          <w:color w:val="000000"/>
+          <w:sz w:val="26"/>
+        </w:rPr>
+        <w:t xml:space="preserve">-- </w:t>
+      </w:r>
+      <w:r>
+        <w:rPr>
+          <w:rFonts w:ascii="Times New Roman" w:hAnsi="Times New Roman" w:eastAsia="Times New Roman"/>
+          <w:b/>
+          <w:color w:val="000000"/>
+          <w:sz w:val="26"/>
+        </w:rPr>
+        <w:t xml:space="preserve">Query Set: </w:t>
+      </w:r>
+      <w:r>
+        <w:rPr>
+          <w:rFonts w:ascii="Times New Roman" w:hAnsi="Times New Roman" w:eastAsia="Times New Roman"/>
+          <w:color w:val="000000"/>
+          <w:sz w:val="26"/>
+        </w:rPr>
+        <w:t>Chứa Q mẫu âm thanh cần nhận diện cho mỗi lớp trong số N lớp. Mô hình tính toán khoảng cách từ embedding của query tới các prototype để phân loại.</w:t>
+      </w:r>
+    </w:p>
+    <w:p>
+      <w:pPr>
+        <w:spacing w:line="360" w:lineRule="auto" w:after="120"/>
+        <w:ind w:firstLine="0"/>
+        <w:jc w:val="both"/>
+      </w:pPr>
+      <w:r>
+        <w:rPr>
+          <w:rFonts w:ascii="Times New Roman" w:hAnsi="Times New Roman" w:eastAsia="Times New Roman"/>
+          <w:b w:val="0"/>
+          <w:i w:val="0"/>
+          <w:color w:val="000000"/>
+          <w:sz w:val="26"/>
+        </w:rPr>
+        <w:t>Nguyên tắc phân tách lớp nghiêm ngặt (Class-disjoint): Tập các lớp từ khóa dùng để kiểm thử (Test classes) hoàn toàn tách biệt và chưa từng xuất hiện trong quá trình huấn luyện mạng trích xuất đặc trưng TD-ResNet. Điều này bảo đảm rằng hệ thống được đánh giá đúng năng lực học ít mẫu (Few-shot generalization) trên các từ khóa mới xuất hiện.</w:t>
       </w:r>
     </w:p>
     <w:p>

</xml_diff>

<commit_message>
docs: bo sung khung phuong phap chuan hoa du lieu muc 2.3 bao cao giua ky
</commit_message>
<xml_diff>
--- a/docs/report/Bao_cao_hang_muc_cham_giua_ky_Xu_ly_tieng_noi.docx
+++ b/docs/report/Bao_cao_hang_muc_cham_giua_ky_Xu_ly_tieng_noi.docx
@@ -10887,7 +10887,2993 @@
           <w:color w:val="000000"/>
           <w:sz w:val="28"/>
         </w:rPr>
-        <w:t>2.3. Quy trình chuẩn bị dữ liệu</w:t>
+        <w:t>2.3. Quy trình chuẩn bị và chuẩn hóa dữ liệu</w:t>
+      </w:r>
+    </w:p>
+    <w:p>
+      <w:pPr>
+        <w:spacing w:line="360" w:lineRule="auto" w:after="120"/>
+        <w:ind w:firstLine="0"/>
+        <w:jc w:val="both"/>
+      </w:pPr>
+      <w:r>
+        <w:rPr>
+          <w:rFonts w:ascii="Times New Roman" w:hAnsi="Times New Roman" w:eastAsia="Times New Roman"/>
+          <w:b w:val="0"/>
+          <w:i w:val="0"/>
+          <w:color w:val="000000"/>
+          <w:sz w:val="26"/>
+        </w:rPr>
+        <w:t>Sau khi khảo sát cấu trúc của ba dataset, nhóm xây dựng quy trình chuẩn bị dữ liệu nhằm đưa tín hiệu âm thanh về dạng phù hợp với hệ thống Few-shot Keyword Spotting.</w:t>
+      </w:r>
+    </w:p>
+    <w:p>
+      <w:pPr>
+        <w:spacing w:line="360" w:lineRule="auto" w:after="120"/>
+        <w:ind w:firstLine="0"/>
+        <w:jc w:val="both"/>
+      </w:pPr>
+      <w:r>
+        <w:rPr>
+          <w:rFonts w:ascii="Times New Roman" w:hAnsi="Times New Roman" w:eastAsia="Times New Roman"/>
+          <w:b w:val="0"/>
+          <w:i w:val="0"/>
+          <w:color w:val="000000"/>
+          <w:sz w:val="26"/>
+        </w:rPr>
+        <w:t>Do Google Speech Commands, AudioMNIST và Fluent Speech Commands có đặc điểm khác nhau về sample rate, thời lượng và cấu trúc nội dung, nhóm không áp dụng một quy tắc xử lý độ dài duy nhất cho cả ba dataset.</w:t>
+      </w:r>
+    </w:p>
+    <w:p>
+      <w:pPr>
+        <w:spacing w:line="360" w:lineRule="auto" w:after="120"/>
+        <w:ind w:firstLine="0"/>
+        <w:jc w:val="both"/>
+      </w:pPr>
+      <w:r>
+        <w:rPr>
+          <w:rFonts w:ascii="Times New Roman" w:hAnsi="Times New Roman" w:eastAsia="Times New Roman"/>
+          <w:b/>
+          <w:i w:val="0"/>
+          <w:color w:val="000000"/>
+          <w:sz w:val="26"/>
+        </w:rPr>
+        <w:t>Thay vào đó, pipeline được xây dựng theo nguyên tắc: Chuẩn hóa các thuộc tính kỹ thuật chung nhưng bảo toàn đặc điểm nội dung của từng dataset.</w:t>
+      </w:r>
+    </w:p>
+    <w:p>
+      <w:pPr>
+        <w:spacing w:line="360" w:lineRule="auto" w:after="120"/>
+        <w:ind w:firstLine="0"/>
+        <w:jc w:val="both"/>
+      </w:pPr>
+      <w:r>
+        <w:rPr>
+          <w:rFonts w:ascii="Times New Roman" w:hAnsi="Times New Roman" w:eastAsia="Times New Roman"/>
+          <w:b w:val="0"/>
+          <w:i w:val="0"/>
+          <w:color w:val="000000"/>
+          <w:sz w:val="26"/>
+        </w:rPr>
+        <w:t>Quy trình tổng quát:</w:t>
+      </w:r>
+    </w:p>
+    <w:tbl>
+      <w:tblPr>
+        <w:tblW w:type="auto" w:w="0"/>
+        <w:jc w:val="center"/>
+        <w:tblLayout w:type="fixed"/>
+        <w:tblLook w:firstColumn="1" w:firstRow="1" w:lastColumn="0" w:lastRow="0" w:noHBand="0" w:noVBand="1" w:val="04A0"/>
+      </w:tblPr>
+      <w:tblGrid>
+        <w:gridCol w:w="9405"/>
+      </w:tblGrid>
+      <w:tr>
+        <w:tc>
+          <w:tcPr>
+            <w:tcW w:type="dxa" w:w="8787"/>
+            <w:shd w:fill="F8FAFC"/>
+            <w:tcBorders>
+              <w:top w:val="single" w:sz="4" w:space="0" w:color="E2E8F0"/>
+              <w:left w:val="single" w:sz="18" w:space="0" w:color="2563EB"/>
+              <w:bottom w:val="single" w:sz="4" w:space="0" w:color="E2E8F0"/>
+              <w:right w:val="single" w:sz="4" w:space="0" w:color="E2E8F0"/>
+            </w:tcBorders>
+          </w:tcPr>
+          <w:p>
+            <w:pPr>
+              <w:spacing w:before="80" w:after="80" w:line="276" w:lineRule="auto"/>
+            </w:pPr>
+            <w:r>
+              <w:rPr>
+                <w:rFonts w:ascii="Consolas" w:hAnsi="Consolas"/>
+                <w:color w:val="1E293B"/>
+                <w:sz w:val="19"/>
+              </w:rPr>
+              <w:t>Raw Audio</w:t>
+              <w:br/>
+              <w:t xml:space="preserve">    ↓</w:t>
+              <w:br/>
+              <w:t>Kiểm tra định dạng</w:t>
+              <w:br/>
+              <w:t xml:space="preserve">    ↓</w:t>
+              <w:br/>
+              <w:t>Mono</w:t>
+              <w:br/>
+              <w:t xml:space="preserve">    ↓</w:t>
+              <w:br/>
+              <w:t>Resample về 16 kHz nếu cần</w:t>
+              <w:br/>
+              <w:t xml:space="preserve">    ↓</w:t>
+              <w:br/>
+              <w:t>Chuẩn hóa biên độ</w:t>
+              <w:br/>
+              <w:t xml:space="preserve">    ↓</w:t>
+              <w:br/>
+              <w:t>Xử lý độ dài phù hợp dataset</w:t>
+              <w:br/>
+              <w:t xml:space="preserve">    ↓</w:t>
+              <w:br/>
+              <w:t>Audio đã chuẩn hóa</w:t>
+              <w:br/>
+              <w:t xml:space="preserve">    ↓</w:t>
+              <w:br/>
+              <w:t>Feature Extraction</w:t>
+            </w:r>
+          </w:p>
+        </w:tc>
+      </w:tr>
+    </w:tbl>
+    <w:p>
+      <w:pPr>
+        <w:spacing w:after="80"/>
+      </w:pPr>
+    </w:p>
+    <w:p>
+      <w:pPr>
+        <w:spacing w:line="360" w:lineRule="auto" w:after="120"/>
+        <w:ind w:firstLine="0"/>
+        <w:jc w:val="both"/>
+      </w:pPr>
+      <w:r>
+        <w:rPr>
+          <w:rFonts w:ascii="Times New Roman" w:hAnsi="Times New Roman" w:eastAsia="Times New Roman"/>
+          <w:b w:val="0"/>
+          <w:i w:val="0"/>
+          <w:color w:val="000000"/>
+          <w:sz w:val="26"/>
+        </w:rPr>
+        <w:t>Trong đó, 16 kHz được lựa chọn làm sample rate chung vì đây là sample rate được sử dụng trong pipeline Google Speech Commands của repository paper.</w:t>
+      </w:r>
+    </w:p>
+    <w:p>
+      <w:pPr>
+        <w:keepNext/>
+        <w:spacing w:before="160"/>
+        <w:jc w:val="center"/>
+      </w:pPr>
+      <w:r>
+        <w:drawing>
+          <wp:inline xmlns:a="http://schemas.openxmlformats.org/drawingml/2006/main" xmlns:pic="http://schemas.openxmlformats.org/drawingml/2006/picture">
+            <wp:extent cx="5400000" cy="1273107"/>
+            <wp:docPr id="12" name="Picture 12"/>
+            <wp:cNvGraphicFramePr>
+              <a:graphicFrameLocks noChangeAspect="1"/>
+            </wp:cNvGraphicFramePr>
+            <a:graphic>
+              <a:graphicData uri="http://schemas.openxmlformats.org/drawingml/2006/picture">
+                <pic:pic>
+                  <pic:nvPicPr>
+                    <pic:cNvPr id="0" name="fig_12_preprocessing_pipeline.png"/>
+                    <pic:cNvPicPr/>
+                  </pic:nvPicPr>
+                  <pic:blipFill>
+                    <a:blip r:embed="rId20"/>
+                    <a:stretch>
+                      <a:fillRect/>
+                    </a:stretch>
+                  </pic:blipFill>
+                  <pic:spPr>
+                    <a:xfrm>
+                      <a:off x="0" y="0"/>
+                      <a:ext cx="5400000" cy="1273107"/>
+                    </a:xfrm>
+                    <a:prstGeom prst="rect"/>
+                  </pic:spPr>
+                </pic:pic>
+              </a:graphicData>
+            </a:graphic>
+          </wp:inline>
+        </w:drawing>
+      </w:r>
+    </w:p>
+    <w:p>
+      <w:pPr>
+        <w:spacing w:after="200"/>
+        <w:jc w:val="center"/>
+      </w:pPr>
+      <w:r>
+        <w:rPr>
+          <w:rFonts w:ascii="Times New Roman" w:hAnsi="Times New Roman" w:eastAsia="Times New Roman"/>
+          <w:i/>
+          <w:color w:val="000000"/>
+          <w:sz w:val="22"/>
+        </w:rPr>
+        <w:t>Hình 2.4. Quy trình tiền xử lý và chuẩn hóa các thuộc tính kỹ thuật của tín hiệu âm thanh</w:t>
+      </w:r>
+    </w:p>
+    <w:p>
+      <w:pPr>
+        <w:pStyle w:val="Heading3"/>
+        <w:keepNext/>
+        <w:spacing w:before="200" w:after="80"/>
+      </w:pPr>
+      <w:r>
+        <w:rPr>
+          <w:rFonts w:ascii="Times New Roman" w:hAnsi="Times New Roman" w:eastAsia="Times New Roman"/>
+          <w:b/>
+          <w:color w:val="000000"/>
+          <w:sz w:val="26"/>
+        </w:rPr>
+        <w:t>2.3.1. Chuẩn bị FS-GSC theo pipeline của repository paper</w:t>
+      </w:r>
+    </w:p>
+    <w:p>
+      <w:pPr>
+        <w:spacing w:line="360" w:lineRule="auto" w:after="120"/>
+        <w:ind w:firstLine="0"/>
+        <w:jc w:val="both"/>
+      </w:pPr>
+      <w:r>
+        <w:rPr>
+          <w:rFonts w:ascii="Times New Roman" w:hAnsi="Times New Roman" w:eastAsia="Times New Roman"/>
+          <w:b w:val="0"/>
+          <w:i w:val="0"/>
+          <w:color w:val="000000"/>
+          <w:sz w:val="26"/>
+        </w:rPr>
+        <w:t>Đối với Google Speech Commands, nhóm ưu tiên tái hiện trực tiếp pipeline chuẩn bị dữ liệu từ repository Few-Shot-KWS thay vì tự xây dựng một pipeline mới.</w:t>
+      </w:r>
+    </w:p>
+    <w:p>
+      <w:pPr>
+        <w:spacing w:line="360" w:lineRule="auto" w:after="120"/>
+        <w:ind w:firstLine="0"/>
+        <w:jc w:val="both"/>
+      </w:pPr>
+      <w:r>
+        <w:rPr>
+          <w:rFonts w:ascii="Times New Roman" w:hAnsi="Times New Roman" w:eastAsia="Times New Roman"/>
+          <w:b w:val="0"/>
+          <w:i w:val="0"/>
+          <w:color w:val="000000"/>
+          <w:sz w:val="26"/>
+        </w:rPr>
+        <w:t>Script chính:</w:t>
+      </w:r>
+    </w:p>
+    <w:tbl>
+      <w:tblPr>
+        <w:tblW w:type="auto" w:w="0"/>
+        <w:jc w:val="center"/>
+        <w:tblLayout w:type="fixed"/>
+        <w:tblLook w:firstColumn="1" w:firstRow="1" w:lastColumn="0" w:lastRow="0" w:noHBand="0" w:noVBand="1" w:val="04A0"/>
+      </w:tblPr>
+      <w:tblGrid>
+        <w:gridCol w:w="9405"/>
+      </w:tblGrid>
+      <w:tr>
+        <w:tc>
+          <w:tcPr>
+            <w:tcW w:type="dxa" w:w="8787"/>
+            <w:shd w:fill="F8FAFC"/>
+            <w:tcBorders>
+              <w:top w:val="single" w:sz="4" w:space="0" w:color="E2E8F0"/>
+              <w:left w:val="single" w:sz="18" w:space="0" w:color="2563EB"/>
+              <w:bottom w:val="single" w:sz="4" w:space="0" w:color="E2E8F0"/>
+              <w:right w:val="single" w:sz="4" w:space="0" w:color="E2E8F0"/>
+            </w:tcBorders>
+          </w:tcPr>
+          <w:p>
+            <w:pPr>
+              <w:spacing w:before="80" w:after="80" w:line="276" w:lineRule="auto"/>
+            </w:pPr>
+            <w:r>
+              <w:rPr>
+                <w:rFonts w:ascii="Consolas" w:hAnsi="Consolas"/>
+                <w:color w:val="1E293B"/>
+                <w:sz w:val="19"/>
+              </w:rPr>
+              <w:t>data/download_prepare_data.py</w:t>
+            </w:r>
+          </w:p>
+        </w:tc>
+      </w:tr>
+    </w:tbl>
+    <w:p>
+      <w:pPr>
+        <w:spacing w:after="80"/>
+      </w:pPr>
+    </w:p>
+    <w:p>
+      <w:pPr>
+        <w:spacing w:line="360" w:lineRule="auto" w:after="120"/>
+        <w:ind w:firstLine="0"/>
+        <w:jc w:val="both"/>
+      </w:pPr>
+      <w:r>
+        <w:rPr>
+          <w:rFonts w:ascii="Times New Roman" w:hAnsi="Times New Roman" w:eastAsia="Times New Roman"/>
+          <w:b w:val="0"/>
+          <w:i w:val="0"/>
+          <w:color w:val="000000"/>
+          <w:sz w:val="26"/>
+        </w:rPr>
+        <w:t>thực hiện sáu bước tuần tự:</w:t>
+      </w:r>
+    </w:p>
+    <w:tbl>
+      <w:tblPr>
+        <w:tblW w:type="auto" w:w="0"/>
+        <w:jc w:val="center"/>
+        <w:tblLayout w:type="fixed"/>
+        <w:tblLook w:firstColumn="1" w:firstRow="1" w:lastColumn="0" w:lastRow="0" w:noHBand="0" w:noVBand="1" w:val="04A0"/>
+      </w:tblPr>
+      <w:tblGrid>
+        <w:gridCol w:w="9405"/>
+      </w:tblGrid>
+      <w:tr>
+        <w:tc>
+          <w:tcPr>
+            <w:tcW w:type="dxa" w:w="8787"/>
+            <w:shd w:fill="F8FAFC"/>
+            <w:tcBorders>
+              <w:top w:val="single" w:sz="4" w:space="0" w:color="E2E8F0"/>
+              <w:left w:val="single" w:sz="18" w:space="0" w:color="2563EB"/>
+              <w:bottom w:val="single" w:sz="4" w:space="0" w:color="E2E8F0"/>
+              <w:right w:val="single" w:sz="4" w:space="0" w:color="E2E8F0"/>
+            </w:tcBorders>
+          </w:tcPr>
+          <w:p>
+            <w:pPr>
+              <w:spacing w:before="80" w:after="80" w:line="276" w:lineRule="auto"/>
+            </w:pPr>
+            <w:r>
+              <w:rPr>
+                <w:rFonts w:ascii="Consolas" w:hAnsi="Consolas"/>
+                <w:color w:val="1E293B"/>
+                <w:sz w:val="19"/>
+              </w:rPr>
+              <w:t>Google Speech Commands v0.02</w:t>
+              <w:br/>
+              <w:t xml:space="preserve">        ↓</w:t>
+              <w:br/>
+              <w:t>1. Filtering</w:t>
+              <w:br/>
+              <w:t xml:space="preserve">        ↓</w:t>
+              <w:br/>
+              <w:t>2. Grouping by speaker</w:t>
+              <w:br/>
+              <w:t xml:space="preserve">        ↓</w:t>
+              <w:br/>
+              <w:t>3. Analyzing</w:t>
+              <w:br/>
+              <w:t xml:space="preserve">        ↓</w:t>
+              <w:br/>
+              <w:t>4. Balancing</w:t>
+              <w:br/>
+              <w:t xml:space="preserve">        ↓</w:t>
+              <w:br/>
+              <w:t>5. Splitting</w:t>
+              <w:br/>
+              <w:t xml:space="preserve">        ↓</w:t>
+              <w:br/>
+              <w:t>6. Cleaning</w:t>
+            </w:r>
+          </w:p>
+        </w:tc>
+      </w:tr>
+    </w:tbl>
+    <w:p>
+      <w:pPr>
+        <w:spacing w:after="80"/>
+      </w:pPr>
+    </w:p>
+    <w:p>
+      <w:pPr>
+        <w:spacing w:line="360" w:lineRule="auto" w:after="120"/>
+        <w:ind w:firstLine="0"/>
+        <w:jc w:val="both"/>
+      </w:pPr>
+      <w:r>
+        <w:rPr>
+          <w:rFonts w:ascii="Times New Roman" w:hAnsi="Times New Roman" w:eastAsia="Times New Roman"/>
+          <w:b w:val="0"/>
+          <w:i w:val="0"/>
+          <w:color w:val="000000"/>
+          <w:sz w:val="26"/>
+        </w:rPr>
+        <w:t>Các bước này được gọi trực tiếp trong hàm run() của repository.</w:t>
+      </w:r>
+    </w:p>
+    <w:p>
+      <w:pPr>
+        <w:spacing w:line="360" w:lineRule="auto" w:after="120"/>
+        <w:ind w:firstLine="0"/>
+        <w:jc w:val="both"/>
+      </w:pPr>
+      <w:r>
+        <w:rPr>
+          <w:rFonts w:ascii="Times New Roman" w:hAnsi="Times New Roman" w:eastAsia="Times New Roman"/>
+          <w:b/>
+          <w:i w:val="0"/>
+          <w:color w:val="000000"/>
+          <w:sz w:val="26"/>
+        </w:rPr>
+        <w:t>Bước 1. Filtering:</w:t>
+      </w:r>
+    </w:p>
+    <w:p>
+      <w:pPr>
+        <w:spacing w:line="360" w:lineRule="auto" w:after="120"/>
+        <w:ind w:firstLine="0"/>
+        <w:jc w:val="both"/>
+      </w:pPr>
+      <w:r>
+        <w:rPr>
+          <w:rFonts w:ascii="Times New Roman" w:hAnsi="Times New Roman" w:eastAsia="Times New Roman"/>
+          <w:b w:val="0"/>
+          <w:i w:val="0"/>
+          <w:color w:val="000000"/>
+          <w:sz w:val="26"/>
+        </w:rPr>
+        <w:t>Repository sử dụng cấu hình kỹ thuật:</w:t>
+      </w:r>
+    </w:p>
+    <w:tbl>
+      <w:tblPr>
+        <w:tblW w:type="auto" w:w="0"/>
+        <w:jc w:val="center"/>
+        <w:tblLayout w:type="fixed"/>
+        <w:tblLook w:firstColumn="1" w:firstRow="1" w:lastColumn="0" w:lastRow="0" w:noHBand="0" w:noVBand="1" w:val="04A0"/>
+      </w:tblPr>
+      <w:tblGrid>
+        <w:gridCol w:w="9405"/>
+      </w:tblGrid>
+      <w:tr>
+        <w:tc>
+          <w:tcPr>
+            <w:tcW w:type="dxa" w:w="8787"/>
+            <w:shd w:fill="F8FAFC"/>
+            <w:tcBorders>
+              <w:top w:val="single" w:sz="4" w:space="0" w:color="E2E8F0"/>
+              <w:left w:val="single" w:sz="18" w:space="0" w:color="2563EB"/>
+              <w:bottom w:val="single" w:sz="4" w:space="0" w:color="E2E8F0"/>
+              <w:right w:val="single" w:sz="4" w:space="0" w:color="E2E8F0"/>
+            </w:tcBorders>
+          </w:tcPr>
+          <w:p>
+            <w:pPr>
+              <w:spacing w:before="80" w:after="80" w:line="276" w:lineRule="auto"/>
+            </w:pPr>
+            <w:r>
+              <w:rPr>
+                <w:rFonts w:ascii="Consolas" w:hAnsi="Consolas"/>
+                <w:color w:val="1E293B"/>
+                <w:sz w:val="19"/>
+              </w:rPr>
+              <w:t>sample rate      = 16000 Hz</w:t>
+              <w:br/>
+              <w:t>clip duration    = 1000 ms</w:t>
+              <w:br/>
+              <w:t>desired samples  = 16000</w:t>
+            </w:r>
+          </w:p>
+        </w:tc>
+      </w:tr>
+    </w:tbl>
+    <w:p>
+      <w:pPr>
+        <w:spacing w:after="80"/>
+      </w:pPr>
+    </w:p>
+    <w:p>
+      <w:pPr>
+        <w:spacing w:line="360" w:lineRule="auto" w:after="120"/>
+        <w:ind w:firstLine="0"/>
+        <w:jc w:val="both"/>
+      </w:pPr>
+      <w:r>
+        <w:rPr>
+          <w:rFonts w:ascii="Times New Roman" w:hAnsi="Times New Roman" w:eastAsia="Times New Roman"/>
+          <w:b w:val="0"/>
+          <w:i w:val="0"/>
+          <w:color w:val="000000"/>
+          <w:sz w:val="26"/>
+        </w:rPr>
+        <w:t>Mỗi file được đọc tối đa 16.000 sample. Nếu file có ít hơn 16.000 sample, file đó bị loại khỏi dataset.</w:t>
+      </w:r>
+    </w:p>
+    <w:p>
+      <w:pPr>
+        <w:spacing w:line="360" w:lineRule="auto" w:after="120"/>
+        <w:ind w:firstLine="0"/>
+        <w:jc w:val="both"/>
+      </w:pPr>
+      <w:r>
+        <w:rPr>
+          <w:rFonts w:ascii="Times New Roman" w:hAnsi="Times New Roman" w:eastAsia="Times New Roman"/>
+          <w:b w:val="0"/>
+          <w:i w:val="0"/>
+          <w:color w:val="000000"/>
+          <w:sz w:val="26"/>
+        </w:rPr>
+        <w:t>Kết quả audit raw trước preprocessing cho thấy Google Speech Commands có:</w:t>
+      </w:r>
+    </w:p>
+    <w:p>
+      <w:pPr>
+        <w:spacing w:line="360" w:lineRule="auto" w:after="80"/>
+        <w:ind w:left="340" w:hanging="340"/>
+        <w:jc w:val="both"/>
+      </w:pPr>
+      <w:r>
+        <w:rPr>
+          <w:rFonts w:ascii="Times New Roman" w:hAnsi="Times New Roman" w:eastAsia="Times New Roman"/>
+          <w:b/>
+          <w:color w:val="000000"/>
+          <w:sz w:val="26"/>
+        </w:rPr>
+        <w:t xml:space="preserve">-- </w:t>
+      </w:r>
+      <w:r>
+        <w:rPr>
+          <w:rFonts w:ascii="Times New Roman" w:hAnsi="Times New Roman" w:eastAsia="Times New Roman"/>
+          <w:color w:val="000000"/>
+          <w:sz w:val="26"/>
+        </w:rPr>
+        <w:t>Tổng cộng: 105.835 file WAV</w:t>
+      </w:r>
+    </w:p>
+    <w:p>
+      <w:pPr>
+        <w:spacing w:line="360" w:lineRule="auto" w:after="80"/>
+        <w:ind w:left="340" w:hanging="340"/>
+        <w:jc w:val="both"/>
+      </w:pPr>
+      <w:r>
+        <w:rPr>
+          <w:rFonts w:ascii="Times New Roman" w:hAnsi="Times New Roman" w:eastAsia="Times New Roman"/>
+          <w:b/>
+          <w:color w:val="000000"/>
+          <w:sz w:val="26"/>
+        </w:rPr>
+        <w:t xml:space="preserve">-- </w:t>
+      </w:r>
+      <w:r>
+        <w:rPr>
+          <w:rFonts w:ascii="Times New Roman" w:hAnsi="Times New Roman" w:eastAsia="Times New Roman"/>
+          <w:color w:val="000000"/>
+          <w:sz w:val="26"/>
+        </w:rPr>
+        <w:t>Số file ngắn hơn 1 giây: 10.435 file</w:t>
+      </w:r>
+    </w:p>
+    <w:p>
+      <w:pPr>
+        <w:spacing w:line="360" w:lineRule="auto" w:after="80"/>
+        <w:ind w:left="340" w:hanging="340"/>
+        <w:jc w:val="both"/>
+      </w:pPr>
+      <w:r>
+        <w:rPr>
+          <w:rFonts w:ascii="Times New Roman" w:hAnsi="Times New Roman" w:eastAsia="Times New Roman"/>
+          <w:b/>
+          <w:color w:val="000000"/>
+          <w:sz w:val="26"/>
+        </w:rPr>
+        <w:t xml:space="preserve">-- </w:t>
+      </w:r>
+      <w:r>
+        <w:rPr>
+          <w:rFonts w:ascii="Times New Roman" w:hAnsi="Times New Roman" w:eastAsia="Times New Roman"/>
+          <w:color w:val="000000"/>
+          <w:sz w:val="26"/>
+        </w:rPr>
+        <w:t>Tỷ lệ bị loại: tương đương khoảng 9,86% tổng số file</w:t>
+      </w:r>
+    </w:p>
+    <w:p>
+      <w:pPr>
+        <w:spacing w:line="360" w:lineRule="auto" w:after="120"/>
+        <w:ind w:firstLine="0"/>
+        <w:jc w:val="both"/>
+      </w:pPr>
+      <w:r>
+        <w:rPr>
+          <w:rFonts w:ascii="Times New Roman" w:hAnsi="Times New Roman" w:eastAsia="Times New Roman"/>
+          <w:b w:val="0"/>
+          <w:i w:val="0"/>
+          <w:color w:val="000000"/>
+          <w:sz w:val="26"/>
+        </w:rPr>
+        <w:t>Do đó filtering là một bước có ảnh hưởng đáng kể tới dataset.</w:t>
+      </w:r>
+    </w:p>
+    <w:p>
+      <w:pPr>
+        <w:spacing w:line="360" w:lineRule="auto" w:after="120"/>
+        <w:ind w:firstLine="0"/>
+        <w:jc w:val="both"/>
+      </w:pPr>
+      <w:r>
+        <w:rPr>
+          <w:rFonts w:ascii="Times New Roman" w:hAnsi="Times New Roman" w:eastAsia="Times New Roman"/>
+          <w:b/>
+          <w:i w:val="0"/>
+          <w:color w:val="000000"/>
+          <w:sz w:val="26"/>
+        </w:rPr>
+        <w:t>Bước 2. Grouping by speaker:</w:t>
+      </w:r>
+    </w:p>
+    <w:p>
+      <w:pPr>
+        <w:spacing w:line="360" w:lineRule="auto" w:after="120"/>
+        <w:ind w:firstLine="0"/>
+        <w:jc w:val="both"/>
+      </w:pPr>
+      <w:r>
+        <w:rPr>
+          <w:rFonts w:ascii="Times New Roman" w:hAnsi="Times New Roman" w:eastAsia="Times New Roman"/>
+          <w:b w:val="0"/>
+          <w:i w:val="0"/>
+          <w:color w:val="000000"/>
+          <w:sz w:val="26"/>
+        </w:rPr>
+        <w:t>Speaker ID được xác định từ tên file trước chuỗi _nohash_. Ví dụ: 00b01445_nohash_0.wav có speaker ID = 00b01445. Các file sau đó được tổ chức theo cấu trúc:</w:t>
+      </w:r>
+    </w:p>
+    <w:tbl>
+      <w:tblPr>
+        <w:tblW w:type="auto" w:w="0"/>
+        <w:jc w:val="center"/>
+        <w:tblLayout w:type="fixed"/>
+        <w:tblLook w:firstColumn="1" w:firstRow="1" w:lastColumn="0" w:lastRow="0" w:noHBand="0" w:noVBand="1" w:val="04A0"/>
+      </w:tblPr>
+      <w:tblGrid>
+        <w:gridCol w:w="9405"/>
+      </w:tblGrid>
+      <w:tr>
+        <w:tc>
+          <w:tcPr>
+            <w:tcW w:type="dxa" w:w="8787"/>
+            <w:shd w:fill="F8FAFC"/>
+            <w:tcBorders>
+              <w:top w:val="single" w:sz="4" w:space="0" w:color="E2E8F0"/>
+              <w:left w:val="single" w:sz="18" w:space="0" w:color="2563EB"/>
+              <w:bottom w:val="single" w:sz="4" w:space="0" w:color="E2E8F0"/>
+              <w:right w:val="single" w:sz="4" w:space="0" w:color="E2E8F0"/>
+            </w:tcBorders>
+          </w:tcPr>
+          <w:p>
+            <w:pPr>
+              <w:spacing w:before="80" w:after="80" w:line="276" w:lineRule="auto"/>
+            </w:pPr>
+            <w:r>
+              <w:rPr>
+                <w:rFonts w:ascii="Consolas" w:hAnsi="Consolas"/>
+                <w:color w:val="1E293B"/>
+                <w:sz w:val="19"/>
+              </w:rPr>
+              <w:t>keyword/</w:t>
+              <w:br/>
+              <w:t xml:space="preserve">    speaker/</w:t>
+              <w:br/>
+              <w:t xml:space="preserve">        utterance.wav</w:t>
+            </w:r>
+          </w:p>
+        </w:tc>
+      </w:tr>
+    </w:tbl>
+    <w:p>
+      <w:pPr>
+        <w:spacing w:after="80"/>
+      </w:pPr>
+    </w:p>
+    <w:p>
+      <w:pPr>
+        <w:spacing w:line="360" w:lineRule="auto" w:after="120"/>
+        <w:ind w:firstLine="0"/>
+        <w:jc w:val="both"/>
+      </w:pPr>
+      <w:r>
+        <w:rPr>
+          <w:rFonts w:ascii="Times New Roman" w:hAnsi="Times New Roman" w:eastAsia="Times New Roman"/>
+          <w:b/>
+          <w:i w:val="0"/>
+          <w:color w:val="000000"/>
+          <w:sz w:val="26"/>
+        </w:rPr>
+        <w:t>Bước 3. Phân Core và Unknown:</w:t>
+      </w:r>
+    </w:p>
+    <w:p>
+      <w:pPr>
+        <w:spacing w:line="360" w:lineRule="auto" w:after="120"/>
+        <w:ind w:firstLine="0"/>
+        <w:jc w:val="both"/>
+      </w:pPr>
+      <w:r>
+        <w:rPr>
+          <w:rFonts w:ascii="Times New Roman" w:hAnsi="Times New Roman" w:eastAsia="Times New Roman"/>
+          <w:b w:val="0"/>
+          <w:i w:val="0"/>
+          <w:color w:val="000000"/>
+          <w:sz w:val="26"/>
+        </w:rPr>
+        <w:t>Repository sử dụng cấu hình:</w:t>
+      </w:r>
+    </w:p>
+    <w:tbl>
+      <w:tblPr>
+        <w:tblW w:type="auto" w:w="0"/>
+        <w:jc w:val="center"/>
+        <w:tblLayout w:type="fixed"/>
+        <w:tblLook w:firstColumn="1" w:firstRow="1" w:lastColumn="0" w:lastRow="0" w:noHBand="0" w:noVBand="1" w:val="04A0"/>
+      </w:tblPr>
+      <w:tblGrid>
+        <w:gridCol w:w="9405"/>
+      </w:tblGrid>
+      <w:tr>
+        <w:tc>
+          <w:tcPr>
+            <w:tcW w:type="dxa" w:w="8787"/>
+            <w:shd w:fill="F8FAFC"/>
+            <w:tcBorders>
+              <w:top w:val="single" w:sz="4" w:space="0" w:color="E2E8F0"/>
+              <w:left w:val="single" w:sz="18" w:space="0" w:color="2563EB"/>
+              <w:bottom w:val="single" w:sz="4" w:space="0" w:color="E2E8F0"/>
+              <w:right w:val="single" w:sz="4" w:space="0" w:color="E2E8F0"/>
+            </w:tcBorders>
+          </w:tcPr>
+          <w:p>
+            <w:pPr>
+              <w:spacing w:before="80" w:after="80" w:line="276" w:lineRule="auto"/>
+            </w:pPr>
+            <w:r>
+              <w:rPr>
+                <w:rFonts w:ascii="Consolas" w:hAnsi="Consolas"/>
+                <w:color w:val="1E293B"/>
+                <w:sz w:val="19"/>
+              </w:rPr>
+              <w:t>speaker_limit = 1000</w:t>
+            </w:r>
+          </w:p>
+        </w:tc>
+      </w:tr>
+    </w:tbl>
+    <w:p>
+      <w:pPr>
+        <w:spacing w:after="80"/>
+      </w:pPr>
+    </w:p>
+    <w:p>
+      <w:pPr>
+        <w:spacing w:line="360" w:lineRule="auto" w:after="120"/>
+        <w:ind w:firstLine="0"/>
+        <w:jc w:val="both"/>
+      </w:pPr>
+      <w:r>
+        <w:rPr>
+          <w:rFonts w:ascii="Times New Roman" w:hAnsi="Times New Roman" w:eastAsia="Times New Roman"/>
+          <w:b w:val="0"/>
+          <w:i w:val="0"/>
+          <w:color w:val="000000"/>
+          <w:sz w:val="26"/>
+        </w:rPr>
+        <w:t>Keyword có ít nhất 1.000 speaker được xem là core word. Các keyword còn lại được đưa vào nhóm unknown.</w:t>
+      </w:r>
+    </w:p>
+    <w:p>
+      <w:pPr>
+        <w:spacing w:line="360" w:lineRule="auto" w:after="120"/>
+        <w:ind w:firstLine="0"/>
+        <w:jc w:val="both"/>
+      </w:pPr>
+      <w:r>
+        <w:rPr>
+          <w:rFonts w:ascii="Times New Roman" w:hAnsi="Times New Roman" w:eastAsia="Times New Roman"/>
+          <w:b w:val="0"/>
+          <w:i w:val="0"/>
+          <w:color w:val="000000"/>
+          <w:sz w:val="26"/>
+        </w:rPr>
+        <w:t>Kết quả audit trên dữ liệu raw cho thấy:</w:t>
+      </w:r>
+    </w:p>
+    <w:p>
+      <w:pPr>
+        <w:spacing w:line="360" w:lineRule="auto" w:after="80"/>
+        <w:ind w:left="340" w:hanging="340"/>
+        <w:jc w:val="both"/>
+      </w:pPr>
+      <w:r>
+        <w:rPr>
+          <w:rFonts w:ascii="Times New Roman" w:hAnsi="Times New Roman" w:eastAsia="Times New Roman"/>
+          <w:b/>
+          <w:color w:val="000000"/>
+          <w:sz w:val="26"/>
+        </w:rPr>
+        <w:t xml:space="preserve">-- </w:t>
+      </w:r>
+      <w:r>
+        <w:rPr>
+          <w:rFonts w:ascii="Times New Roman" w:hAnsi="Times New Roman" w:eastAsia="Times New Roman"/>
+          <w:color w:val="000000"/>
+          <w:sz w:val="26"/>
+        </w:rPr>
+        <w:t>30 core words (đạt từ 1.000 người nói trở lên).</w:t>
+      </w:r>
+    </w:p>
+    <w:p>
+      <w:pPr>
+        <w:spacing w:line="360" w:lineRule="auto" w:after="80"/>
+        <w:ind w:left="340" w:hanging="340"/>
+        <w:jc w:val="both"/>
+      </w:pPr>
+      <w:r>
+        <w:rPr>
+          <w:rFonts w:ascii="Times New Roman" w:hAnsi="Times New Roman" w:eastAsia="Times New Roman"/>
+          <w:b/>
+          <w:color w:val="000000"/>
+          <w:sz w:val="26"/>
+        </w:rPr>
+        <w:t xml:space="preserve">-- </w:t>
+      </w:r>
+      <w:r>
+        <w:rPr>
+          <w:rFonts w:ascii="Times New Roman" w:hAnsi="Times New Roman" w:eastAsia="Times New Roman"/>
+          <w:color w:val="000000"/>
+          <w:sz w:val="26"/>
+        </w:rPr>
+        <w:t>5 unknown words gồm: visual, learn, follow, forward, backward.</w:t>
+      </w:r>
+    </w:p>
+    <w:p>
+      <w:pPr>
+        <w:spacing w:line="360" w:lineRule="auto" w:after="120"/>
+        <w:ind w:firstLine="0"/>
+        <w:jc w:val="both"/>
+      </w:pPr>
+      <w:r>
+        <w:rPr>
+          <w:rFonts w:ascii="Times New Roman" w:hAnsi="Times New Roman" w:eastAsia="Times New Roman"/>
+          <w:b/>
+          <w:i w:val="0"/>
+          <w:color w:val="000000"/>
+          <w:sz w:val="26"/>
+        </w:rPr>
+        <w:t>Bước 4. Balancing:</w:t>
+      </w:r>
+    </w:p>
+    <w:p>
+      <w:pPr>
+        <w:spacing w:line="360" w:lineRule="auto" w:after="120"/>
+        <w:ind w:firstLine="0"/>
+        <w:jc w:val="both"/>
+      </w:pPr>
+      <w:r>
+        <w:rPr>
+          <w:rFonts w:ascii="Times New Roman" w:hAnsi="Times New Roman" w:eastAsia="Times New Roman"/>
+          <w:b w:val="0"/>
+          <w:i w:val="0"/>
+          <w:color w:val="000000"/>
+          <w:sz w:val="26"/>
+        </w:rPr>
+        <w:t>Dataset được cân bằng theo speaker. Với mỗi keyword:</w:t>
+      </w:r>
+    </w:p>
+    <w:p>
+      <w:pPr>
+        <w:spacing w:line="360" w:lineRule="auto" w:after="80"/>
+        <w:ind w:left="340" w:hanging="340"/>
+        <w:jc w:val="both"/>
+      </w:pPr>
+      <w:r>
+        <w:rPr>
+          <w:rFonts w:ascii="Times New Roman" w:hAnsi="Times New Roman" w:eastAsia="Times New Roman"/>
+          <w:b/>
+          <w:color w:val="000000"/>
+          <w:sz w:val="26"/>
+        </w:rPr>
+        <w:t xml:space="preserve">-- </w:t>
+      </w:r>
+      <w:r>
+        <w:rPr>
+          <w:rFonts w:ascii="Times New Roman" w:hAnsi="Times New Roman" w:eastAsia="Times New Roman"/>
+          <w:color w:val="000000"/>
+          <w:sz w:val="26"/>
+        </w:rPr>
+        <w:t>Các speaker được xáo trộn ngẫu nhiên (random shuffle).</w:t>
+      </w:r>
+    </w:p>
+    <w:p>
+      <w:pPr>
+        <w:spacing w:line="360" w:lineRule="auto" w:after="80"/>
+        <w:ind w:left="340" w:hanging="340"/>
+        <w:jc w:val="both"/>
+      </w:pPr>
+      <w:r>
+        <w:rPr>
+          <w:rFonts w:ascii="Times New Roman" w:hAnsi="Times New Roman" w:eastAsia="Times New Roman"/>
+          <w:b/>
+          <w:color w:val="000000"/>
+          <w:sz w:val="26"/>
+        </w:rPr>
+        <w:t xml:space="preserve">-- </w:t>
+      </w:r>
+      <w:r>
+        <w:rPr>
+          <w:rFonts w:ascii="Times New Roman" w:hAnsi="Times New Roman" w:eastAsia="Times New Roman"/>
+          <w:color w:val="000000"/>
+          <w:sz w:val="26"/>
+        </w:rPr>
+        <w:t>Chỉ giữ cùng một số lượng speaker tối đa (speaker_limit).</w:t>
+      </w:r>
+    </w:p>
+    <w:p>
+      <w:pPr>
+        <w:spacing w:line="360" w:lineRule="auto" w:after="80"/>
+        <w:ind w:left="340" w:hanging="340"/>
+        <w:jc w:val="both"/>
+      </w:pPr>
+      <w:r>
+        <w:rPr>
+          <w:rFonts w:ascii="Times New Roman" w:hAnsi="Times New Roman" w:eastAsia="Times New Roman"/>
+          <w:b/>
+          <w:color w:val="000000"/>
+          <w:sz w:val="26"/>
+        </w:rPr>
+        <w:t xml:space="preserve">-- </w:t>
+      </w:r>
+      <w:r>
+        <w:rPr>
+          <w:rFonts w:ascii="Times New Roman" w:hAnsi="Times New Roman" w:eastAsia="Times New Roman"/>
+          <w:color w:val="000000"/>
+          <w:sz w:val="26"/>
+        </w:rPr>
+        <w:t>Mỗi speaker chỉ đóng góp duy nhất một utterance được chọn ngẫu nhiên.</w:t>
+      </w:r>
+    </w:p>
+    <w:p>
+      <w:pPr>
+        <w:spacing w:line="360" w:lineRule="auto" w:after="120"/>
+        <w:ind w:firstLine="0"/>
+        <w:jc w:val="both"/>
+      </w:pPr>
+      <w:r>
+        <w:rPr>
+          <w:rFonts w:ascii="Times New Roman" w:hAnsi="Times New Roman" w:eastAsia="Times New Roman"/>
+          <w:b w:val="0"/>
+          <w:i w:val="0"/>
+          <w:color w:val="000000"/>
+          <w:sz w:val="26"/>
+        </w:rPr>
+        <w:t>Nhờ đó giảm triệt để tình trạng một speaker có quá nhiều mẫu và giúp dữ liệu đồng đều hơn theo người nói.</w:t>
+      </w:r>
+    </w:p>
+    <w:p>
+      <w:pPr>
+        <w:spacing w:line="360" w:lineRule="auto" w:after="120"/>
+        <w:ind w:firstLine="0"/>
+        <w:jc w:val="both"/>
+      </w:pPr>
+      <w:r>
+        <w:rPr>
+          <w:rFonts w:ascii="Times New Roman" w:hAnsi="Times New Roman" w:eastAsia="Times New Roman"/>
+          <w:b/>
+          <w:i w:val="0"/>
+          <w:color w:val="000000"/>
+          <w:sz w:val="26"/>
+        </w:rPr>
+        <w:t>Bước 5. Splitting:</w:t>
+      </w:r>
+    </w:p>
+    <w:p>
+      <w:pPr>
+        <w:spacing w:line="360" w:lineRule="auto" w:after="120"/>
+        <w:ind w:firstLine="0"/>
+        <w:jc w:val="both"/>
+      </w:pPr>
+      <w:r>
+        <w:rPr>
+          <w:rFonts w:ascii="Times New Roman" w:hAnsi="Times New Roman" w:eastAsia="Times New Roman"/>
+          <w:b w:val="0"/>
+          <w:i w:val="0"/>
+          <w:color w:val="000000"/>
+          <w:sz w:val="26"/>
+        </w:rPr>
+        <w:t>Core dataset được chia thành các nhóm class dùng cho: train, validation, test. Unknown data được chia riêng theo tỷ lệ train/validation/test. Danh sách split cuối cùng sẽ được lấy trực tiếp từ output sau khi chạy hoàn chỉnh pipeline thay vì tự suy đoán từ config.</w:t>
+      </w:r>
+    </w:p>
+    <w:p>
+      <w:pPr>
+        <w:spacing w:line="360" w:lineRule="auto" w:after="120"/>
+        <w:ind w:firstLine="0"/>
+        <w:jc w:val="both"/>
+      </w:pPr>
+      <w:r>
+        <w:rPr>
+          <w:rFonts w:ascii="Times New Roman" w:hAnsi="Times New Roman" w:eastAsia="Times New Roman"/>
+          <w:b/>
+          <w:i w:val="0"/>
+          <w:color w:val="000000"/>
+          <w:sz w:val="26"/>
+        </w:rPr>
+        <w:t>Bước 6. Cleaning:</w:t>
+      </w:r>
+    </w:p>
+    <w:p>
+      <w:pPr>
+        <w:spacing w:line="360" w:lineRule="auto" w:after="120"/>
+        <w:ind w:firstLine="0"/>
+        <w:jc w:val="both"/>
+      </w:pPr>
+      <w:r>
+        <w:rPr>
+          <w:rFonts w:ascii="Times New Roman" w:hAnsi="Times New Roman" w:eastAsia="Times New Roman"/>
+          <w:b w:val="0"/>
+          <w:i w:val="0"/>
+          <w:color w:val="000000"/>
+          <w:sz w:val="26"/>
+        </w:rPr>
+        <w:t>Các file metadata trung gian không còn cần thiết sẽ được loại bỏ sau quá trình chuẩn bị dataset.</w:t>
+      </w:r>
+    </w:p>
+    <w:p>
+      <w:pPr>
+        <w:pStyle w:val="Heading3"/>
+        <w:keepNext/>
+        <w:spacing w:before="200" w:after="80"/>
+      </w:pPr>
+      <w:r>
+        <w:rPr>
+          <w:rFonts w:ascii="Times New Roman" w:hAnsi="Times New Roman" w:eastAsia="Times New Roman"/>
+          <w:b/>
+          <w:color w:val="000000"/>
+          <w:sz w:val="26"/>
+        </w:rPr>
+        <w:t>2.3.2. Chuẩn hóa AudioMNIST</w:t>
+      </w:r>
+    </w:p>
+    <w:p>
+      <w:pPr>
+        <w:spacing w:line="360" w:lineRule="auto" w:after="120"/>
+        <w:ind w:firstLine="0"/>
+        <w:jc w:val="both"/>
+      </w:pPr>
+      <w:r>
+        <w:rPr>
+          <w:rFonts w:ascii="Times New Roman" w:hAnsi="Times New Roman" w:eastAsia="Times New Roman"/>
+          <w:b w:val="0"/>
+          <w:i w:val="0"/>
+          <w:color w:val="000000"/>
+          <w:sz w:val="26"/>
+        </w:rPr>
+        <w:t>AudioMNIST cũng là dữ liệu dạng single-word nên được lựa chọn để kiểm tra xem kiến trúc Few-shot Keyword Spotting có thể hoạt động với một dataset khác ngoài FS-GSC hay không.</w:t>
+      </w:r>
+    </w:p>
+    <w:p>
+      <w:pPr>
+        <w:spacing w:line="360" w:lineRule="auto" w:after="120"/>
+        <w:ind w:firstLine="0"/>
+        <w:jc w:val="both"/>
+      </w:pPr>
+      <w:r>
+        <w:rPr>
+          <w:rFonts w:ascii="Times New Roman" w:hAnsi="Times New Roman" w:eastAsia="Times New Roman"/>
+          <w:b w:val="0"/>
+          <w:i w:val="0"/>
+          <w:color w:val="000000"/>
+          <w:sz w:val="26"/>
+        </w:rPr>
+        <w:t>Tuy nhiên, AudioMNIST khác GSC ở hai điểm quan trọng. Các sample kiểm tra ban đầu cho thấy AudioMNIST sử dụng:</w:t>
+      </w:r>
+    </w:p>
+    <w:tbl>
+      <w:tblPr>
+        <w:tblW w:type="auto" w:w="0"/>
+        <w:jc w:val="center"/>
+        <w:tblLayout w:type="fixed"/>
+        <w:tblLook w:firstColumn="1" w:firstRow="1" w:lastColumn="0" w:lastRow="0" w:noHBand="0" w:noVBand="1" w:val="04A0"/>
+      </w:tblPr>
+      <w:tblGrid>
+        <w:gridCol w:w="9405"/>
+      </w:tblGrid>
+      <w:tr>
+        <w:tc>
+          <w:tcPr>
+            <w:tcW w:type="dxa" w:w="8787"/>
+            <w:shd w:fill="F8FAFC"/>
+            <w:tcBorders>
+              <w:top w:val="single" w:sz="4" w:space="0" w:color="E2E8F0"/>
+              <w:left w:val="single" w:sz="18" w:space="0" w:color="2563EB"/>
+              <w:bottom w:val="single" w:sz="4" w:space="0" w:color="E2E8F0"/>
+              <w:right w:val="single" w:sz="4" w:space="0" w:color="E2E8F0"/>
+            </w:tcBorders>
+          </w:tcPr>
+          <w:p>
+            <w:pPr>
+              <w:spacing w:before="80" w:after="80" w:line="276" w:lineRule="auto"/>
+            </w:pPr>
+            <w:r>
+              <w:rPr>
+                <w:rFonts w:ascii="Consolas" w:hAnsi="Consolas"/>
+                <w:color w:val="1E293B"/>
+                <w:sz w:val="19"/>
+              </w:rPr>
+              <w:t>48 kHz</w:t>
+              <w:br/>
+              <w:t>mono</w:t>
+              <w:br/>
+              <w:t>WAV PCM16</w:t>
+            </w:r>
+          </w:p>
+        </w:tc>
+      </w:tr>
+    </w:tbl>
+    <w:p>
+      <w:pPr>
+        <w:spacing w:after="80"/>
+      </w:pPr>
+    </w:p>
+    <w:p>
+      <w:pPr>
+        <w:spacing w:line="360" w:lineRule="auto" w:after="120"/>
+        <w:ind w:firstLine="0"/>
+        <w:jc w:val="both"/>
+      </w:pPr>
+      <w:r>
+        <w:rPr>
+          <w:rFonts w:ascii="Times New Roman" w:hAnsi="Times New Roman" w:eastAsia="Times New Roman"/>
+          <w:b w:val="0"/>
+          <w:i w:val="0"/>
+          <w:color w:val="000000"/>
+          <w:sz w:val="26"/>
+        </w:rPr>
+        <w:t>và các utterance thường ngắn hơn 1 giây. Do đó nếu áp dụng trực tiếp quy tắc của GSC (audio &lt; 1 second → delete) thì có thể loại bỏ một phần lớn dữ liệu hợp lệ.</w:t>
+      </w:r>
+    </w:p>
+    <w:p>
+      <w:pPr>
+        <w:spacing w:line="360" w:lineRule="auto" w:after="120"/>
+        <w:ind w:firstLine="0"/>
+        <w:jc w:val="both"/>
+      </w:pPr>
+      <w:r>
+        <w:rPr>
+          <w:rFonts w:ascii="Times New Roman" w:hAnsi="Times New Roman" w:eastAsia="Times New Roman"/>
+          <w:b w:val="0"/>
+          <w:i w:val="0"/>
+          <w:color w:val="000000"/>
+          <w:sz w:val="26"/>
+        </w:rPr>
+        <w:t>Vì vậy AudioMNIST được xử lý theo pipeline:</w:t>
+      </w:r>
+    </w:p>
+    <w:tbl>
+      <w:tblPr>
+        <w:tblW w:type="auto" w:w="0"/>
+        <w:jc w:val="center"/>
+        <w:tblLayout w:type="fixed"/>
+        <w:tblLook w:firstColumn="1" w:firstRow="1" w:lastColumn="0" w:lastRow="0" w:noHBand="0" w:noVBand="1" w:val="04A0"/>
+      </w:tblPr>
+      <w:tblGrid>
+        <w:gridCol w:w="9405"/>
+      </w:tblGrid>
+      <w:tr>
+        <w:tc>
+          <w:tcPr>
+            <w:tcW w:type="dxa" w:w="8787"/>
+            <w:shd w:fill="F8FAFC"/>
+            <w:tcBorders>
+              <w:top w:val="single" w:sz="4" w:space="0" w:color="E2E8F0"/>
+              <w:left w:val="single" w:sz="18" w:space="0" w:color="2563EB"/>
+              <w:bottom w:val="single" w:sz="4" w:space="0" w:color="E2E8F0"/>
+              <w:right w:val="single" w:sz="4" w:space="0" w:color="E2E8F0"/>
+            </w:tcBorders>
+          </w:tcPr>
+          <w:p>
+            <w:pPr>
+              <w:spacing w:before="80" w:after="80" w:line="276" w:lineRule="auto"/>
+            </w:pPr>
+            <w:r>
+              <w:rPr>
+                <w:rFonts w:ascii="Consolas" w:hAnsi="Consolas"/>
+                <w:color w:val="1E293B"/>
+                <w:sz w:val="19"/>
+              </w:rPr>
+              <w:t>AudioMNIST Raw</w:t>
+              <w:br/>
+              <w:t>48 kHz / mono</w:t>
+              <w:br/>
+              <w:t xml:space="preserve">      ↓</w:t>
+              <w:br/>
+              <w:t>Resample</w:t>
+              <w:br/>
+              <w:t xml:space="preserve">      ↓</w:t>
+              <w:br/>
+              <w:t>16 kHz</w:t>
+              <w:br/>
+              <w:t xml:space="preserve">      ↓</w:t>
+              <w:br/>
+              <w:t>Amplitude normalization</w:t>
+              <w:br/>
+              <w:t xml:space="preserve">      ↓</w:t>
+              <w:br/>
+              <w:t>Length normalization</w:t>
+              <w:br/>
+              <w:t xml:space="preserve">      ↓</w:t>
+              <w:br/>
+              <w:t>16000 samples</w:t>
+              <w:br/>
+              <w:t xml:space="preserve">      ↓</w:t>
+              <w:br/>
+              <w:t>Audio chuẩn hóa</w:t>
+            </w:r>
+          </w:p>
+        </w:tc>
+      </w:tr>
+    </w:tbl>
+    <w:p>
+      <w:pPr>
+        <w:spacing w:after="80"/>
+      </w:pPr>
+    </w:p>
+    <w:p>
+      <w:pPr>
+        <w:spacing w:line="360" w:lineRule="auto" w:after="120"/>
+        <w:ind w:firstLine="0"/>
+        <w:jc w:val="both"/>
+      </w:pPr>
+      <w:r>
+        <w:rPr>
+          <w:rFonts w:ascii="Times New Roman" w:hAnsi="Times New Roman" w:eastAsia="Times New Roman"/>
+          <w:b/>
+          <w:i w:val="0"/>
+          <w:color w:val="000000"/>
+          <w:sz w:val="26"/>
+        </w:rPr>
+        <w:t>Resampling:</w:t>
+      </w:r>
+    </w:p>
+    <w:p>
+      <w:pPr>
+        <w:spacing w:line="360" w:lineRule="auto" w:after="120"/>
+        <w:ind w:firstLine="0"/>
+        <w:jc w:val="both"/>
+      </w:pPr>
+      <w:r>
+        <w:rPr>
+          <w:rFonts w:ascii="Times New Roman" w:hAnsi="Times New Roman" w:eastAsia="Times New Roman"/>
+          <w:b w:val="0"/>
+          <w:i w:val="0"/>
+          <w:color w:val="000000"/>
+          <w:sz w:val="26"/>
+        </w:rPr>
+        <w:t>Tín hiệu được chuyển từ 48.000 Hz về 16.000 Hz:</w:t>
+      </w:r>
+    </w:p>
+    <w:p>
+      <w:pPr>
+        <w:spacing w:before="80" w:after="120"/>
+        <w:jc w:val="center"/>
+      </w:pPr>
+      <w:r>
+        <w:rPr>
+          <w:rFonts w:ascii="Cambria Math" w:hAnsi="Cambria Math" w:eastAsia="Cambria Math"/>
+          <w:color w:val="000000"/>
+          <w:sz w:val="24"/>
+        </w:rPr>
+        <w:t>48000\text{ Hz} \rightarrow 16000\text{ Hz}</w:t>
+      </w:r>
+    </w:p>
+    <w:p>
+      <w:pPr>
+        <w:spacing w:line="360" w:lineRule="auto" w:after="120"/>
+        <w:ind w:firstLine="0"/>
+        <w:jc w:val="both"/>
+      </w:pPr>
+      <w:r>
+        <w:rPr>
+          <w:rFonts w:ascii="Times New Roman" w:hAnsi="Times New Roman" w:eastAsia="Times New Roman"/>
+          <w:b w:val="0"/>
+          <w:i w:val="0"/>
+          <w:color w:val="000000"/>
+          <w:sz w:val="26"/>
+        </w:rPr>
+        <w:t>để phù hợp với input distribution của mô hình được xây dựng trên GSC.</w:t>
+      </w:r>
+    </w:p>
+    <w:p>
+      <w:pPr>
+        <w:spacing w:line="360" w:lineRule="auto" w:after="120"/>
+        <w:ind w:firstLine="0"/>
+        <w:jc w:val="both"/>
+      </w:pPr>
+      <w:r>
+        <w:rPr>
+          <w:rFonts w:ascii="Times New Roman" w:hAnsi="Times New Roman" w:eastAsia="Times New Roman"/>
+          <w:b/>
+          <w:i w:val="0"/>
+          <w:color w:val="000000"/>
+          <w:sz w:val="26"/>
+        </w:rPr>
+        <w:t>Chuẩn hóa số channel:</w:t>
+      </w:r>
+    </w:p>
+    <w:p>
+      <w:pPr>
+        <w:spacing w:line="360" w:lineRule="auto" w:after="120"/>
+        <w:ind w:firstLine="0"/>
+        <w:jc w:val="both"/>
+      </w:pPr>
+      <w:r>
+        <w:rPr>
+          <w:rFonts w:ascii="Times New Roman" w:hAnsi="Times New Roman" w:eastAsia="Times New Roman"/>
+          <w:b w:val="0"/>
+          <w:i w:val="0"/>
+          <w:color w:val="000000"/>
+          <w:sz w:val="26"/>
+        </w:rPr>
+        <w:t>Nếu xuất hiện dữ liệu nhiều channel, các channel được lấy trung bình để chuyển thành mono.</w:t>
+      </w:r>
+    </w:p>
+    <w:p>
+      <w:pPr>
+        <w:spacing w:line="360" w:lineRule="auto" w:after="120"/>
+        <w:ind w:firstLine="0"/>
+        <w:jc w:val="both"/>
+      </w:pPr>
+      <w:r>
+        <w:rPr>
+          <w:rFonts w:ascii="Times New Roman" w:hAnsi="Times New Roman" w:eastAsia="Times New Roman"/>
+          <w:b/>
+          <w:i w:val="0"/>
+          <w:color w:val="000000"/>
+          <w:sz w:val="26"/>
+        </w:rPr>
+        <w:t>Chuẩn hóa biên độ:</w:t>
+      </w:r>
+    </w:p>
+    <w:p>
+      <w:pPr>
+        <w:spacing w:line="360" w:lineRule="auto" w:after="120"/>
+        <w:ind w:firstLine="0"/>
+        <w:jc w:val="both"/>
+      </w:pPr>
+      <w:r>
+        <w:rPr>
+          <w:rFonts w:ascii="Times New Roman" w:hAnsi="Times New Roman" w:eastAsia="Times New Roman"/>
+          <w:b w:val="0"/>
+          <w:i w:val="0"/>
+          <w:color w:val="000000"/>
+          <w:sz w:val="26"/>
+        </w:rPr>
+        <w:t>Peak normalization được sử dụng:</w:t>
+      </w:r>
+    </w:p>
+    <w:p>
+      <w:pPr>
+        <w:spacing w:before="80" w:after="120"/>
+        <w:jc w:val="center"/>
+      </w:pPr>
+      <w:r>
+        <w:rPr>
+          <w:rFonts w:ascii="Cambria Math" w:hAnsi="Cambria Math" w:eastAsia="Cambria Math"/>
+          <w:color w:val="000000"/>
+          <w:sz w:val="24"/>
+        </w:rPr>
+        <w:t>x' = \frac{x}{\max(|x|)}</w:t>
+      </w:r>
+    </w:p>
+    <w:p>
+      <w:pPr>
+        <w:spacing w:line="360" w:lineRule="auto" w:after="120"/>
+        <w:ind w:firstLine="0"/>
+        <w:jc w:val="both"/>
+      </w:pPr>
+      <w:r>
+        <w:rPr>
+          <w:rFonts w:ascii="Times New Roman" w:hAnsi="Times New Roman" w:eastAsia="Times New Roman"/>
+          <w:b w:val="0"/>
+          <w:i w:val="0"/>
+          <w:color w:val="000000"/>
+          <w:sz w:val="26"/>
+        </w:rPr>
+        <w:t>khi biên độ cực đại khác 0.</w:t>
+      </w:r>
+    </w:p>
+    <w:p>
+      <w:pPr>
+        <w:spacing w:line="360" w:lineRule="auto" w:after="120"/>
+        <w:ind w:firstLine="0"/>
+        <w:jc w:val="both"/>
+      </w:pPr>
+      <w:r>
+        <w:rPr>
+          <w:rFonts w:ascii="Times New Roman" w:hAnsi="Times New Roman" w:eastAsia="Times New Roman"/>
+          <w:b/>
+          <w:i w:val="0"/>
+          <w:color w:val="000000"/>
+          <w:sz w:val="26"/>
+        </w:rPr>
+        <w:t>Chuẩn hóa độ dài:</w:t>
+      </w:r>
+    </w:p>
+    <w:p>
+      <w:pPr>
+        <w:spacing w:line="360" w:lineRule="auto" w:after="120"/>
+        <w:ind w:firstLine="0"/>
+        <w:jc w:val="both"/>
+      </w:pPr>
+      <w:r>
+        <w:rPr>
+          <w:rFonts w:ascii="Times New Roman" w:hAnsi="Times New Roman" w:eastAsia="Times New Roman"/>
+          <w:b w:val="0"/>
+          <w:i w:val="0"/>
+          <w:color w:val="000000"/>
+          <w:sz w:val="26"/>
+        </w:rPr>
+        <w:t>Mục tiêu là đưa mỗi utterance về đúng 16.000 sample tương đương 1 giây ở 16 kHz:</w:t>
+      </w:r>
+    </w:p>
+    <w:p>
+      <w:pPr>
+        <w:spacing w:before="80" w:after="120"/>
+        <w:jc w:val="center"/>
+      </w:pPr>
+      <w:r>
+        <w:rPr>
+          <w:rFonts w:ascii="Cambria Math" w:hAnsi="Cambria Math" w:eastAsia="Cambria Math"/>
+          <w:color w:val="000000"/>
+          <w:sz w:val="24"/>
+        </w:rPr>
+        <w:t>16000\text{ samples}</w:t>
+      </w:r>
+    </w:p>
+    <w:p>
+      <w:pPr>
+        <w:spacing w:line="360" w:lineRule="auto" w:after="120"/>
+        <w:ind w:firstLine="0"/>
+        <w:jc w:val="both"/>
+      </w:pPr>
+      <w:r>
+        <w:rPr>
+          <w:rFonts w:ascii="Times New Roman" w:hAnsi="Times New Roman" w:eastAsia="Times New Roman"/>
+          <w:b w:val="0"/>
+          <w:i w:val="0"/>
+          <w:color w:val="000000"/>
+          <w:sz w:val="26"/>
+        </w:rPr>
+        <w:t>Nếu audio ngắn hơn:</w:t>
+      </w:r>
+    </w:p>
+    <w:tbl>
+      <w:tblPr>
+        <w:tblW w:type="auto" w:w="0"/>
+        <w:jc w:val="center"/>
+        <w:tblLayout w:type="fixed"/>
+        <w:tblLook w:firstColumn="1" w:firstRow="1" w:lastColumn="0" w:lastRow="0" w:noHBand="0" w:noVBand="1" w:val="04A0"/>
+      </w:tblPr>
+      <w:tblGrid>
+        <w:gridCol w:w="9405"/>
+      </w:tblGrid>
+      <w:tr>
+        <w:tc>
+          <w:tcPr>
+            <w:tcW w:type="dxa" w:w="8787"/>
+            <w:shd w:fill="F8FAFC"/>
+            <w:tcBorders>
+              <w:top w:val="single" w:sz="4" w:space="0" w:color="E2E8F0"/>
+              <w:left w:val="single" w:sz="18" w:space="0" w:color="2563EB"/>
+              <w:bottom w:val="single" w:sz="4" w:space="0" w:color="E2E8F0"/>
+              <w:right w:val="single" w:sz="4" w:space="0" w:color="E2E8F0"/>
+            </w:tcBorders>
+          </w:tcPr>
+          <w:p>
+            <w:pPr>
+              <w:spacing w:before="80" w:after="80" w:line="276" w:lineRule="auto"/>
+            </w:pPr>
+            <w:r>
+              <w:rPr>
+                <w:rFonts w:ascii="Consolas" w:hAnsi="Consolas"/>
+                <w:color w:val="1E293B"/>
+                <w:sz w:val="19"/>
+              </w:rPr>
+              <w:t>audio → zero padding → 16000 samples</w:t>
+            </w:r>
+          </w:p>
+        </w:tc>
+      </w:tr>
+    </w:tbl>
+    <w:p>
+      <w:pPr>
+        <w:spacing w:after="80"/>
+      </w:pPr>
+    </w:p>
+    <w:p>
+      <w:pPr>
+        <w:spacing w:line="360" w:lineRule="auto" w:after="120"/>
+        <w:ind w:firstLine="0"/>
+        <w:jc w:val="both"/>
+      </w:pPr>
+      <w:r>
+        <w:rPr>
+          <w:rFonts w:ascii="Times New Roman" w:hAnsi="Times New Roman" w:eastAsia="Times New Roman"/>
+          <w:b w:val="0"/>
+          <w:i w:val="0"/>
+          <w:color w:val="000000"/>
+          <w:sz w:val="26"/>
+        </w:rPr>
+        <w:t>Nếu audio dài hơn:</w:t>
+      </w:r>
+    </w:p>
+    <w:tbl>
+      <w:tblPr>
+        <w:tblW w:type="auto" w:w="0"/>
+        <w:jc w:val="center"/>
+        <w:tblLayout w:type="fixed"/>
+        <w:tblLook w:firstColumn="1" w:firstRow="1" w:lastColumn="0" w:lastRow="0" w:noHBand="0" w:noVBand="1" w:val="04A0"/>
+      </w:tblPr>
+      <w:tblGrid>
+        <w:gridCol w:w="9405"/>
+      </w:tblGrid>
+      <w:tr>
+        <w:tc>
+          <w:tcPr>
+            <w:tcW w:type="dxa" w:w="8787"/>
+            <w:shd w:fill="F8FAFC"/>
+            <w:tcBorders>
+              <w:top w:val="single" w:sz="4" w:space="0" w:color="E2E8F0"/>
+              <w:left w:val="single" w:sz="18" w:space="0" w:color="2563EB"/>
+              <w:bottom w:val="single" w:sz="4" w:space="0" w:color="E2E8F0"/>
+              <w:right w:val="single" w:sz="4" w:space="0" w:color="E2E8F0"/>
+            </w:tcBorders>
+          </w:tcPr>
+          <w:p>
+            <w:pPr>
+              <w:spacing w:before="80" w:after="80" w:line="276" w:lineRule="auto"/>
+            </w:pPr>
+            <w:r>
+              <w:rPr>
+                <w:rFonts w:ascii="Consolas" w:hAnsi="Consolas"/>
+                <w:color w:val="1E293B"/>
+                <w:sz w:val="19"/>
+              </w:rPr>
+              <w:t>audio → center crop → 16000 samples</w:t>
+            </w:r>
+          </w:p>
+        </w:tc>
+      </w:tr>
+    </w:tbl>
+    <w:p>
+      <w:pPr>
+        <w:spacing w:after="80"/>
+      </w:pPr>
+    </w:p>
+    <w:p>
+      <w:pPr>
+        <w:spacing w:line="360" w:lineRule="auto" w:after="120"/>
+        <w:ind w:firstLine="0"/>
+        <w:jc w:val="both"/>
+      </w:pPr>
+      <w:r>
+        <w:rPr>
+          <w:rFonts w:ascii="Times New Roman" w:hAnsi="Times New Roman" w:eastAsia="Times New Roman"/>
+          <w:b w:val="0"/>
+          <w:i w:val="0"/>
+          <w:color w:val="000000"/>
+          <w:sz w:val="26"/>
+        </w:rPr>
+        <w:t>Khác với FS-GSC, các sample AudioMNIST ngắn hơn 1 giây không bị loại, vì đây vẫn là những utterance chữ số hợp lệ. Cách xử lý này giúp AudioMNIST có cấu trúc đầu vào gần với FS-GSC nhất có thể và cho phép nhóm thực hiện thí nghiệm:</w:t>
+      </w:r>
+    </w:p>
+    <w:tbl>
+      <w:tblPr>
+        <w:tblW w:type="auto" w:w="0"/>
+        <w:jc w:val="center"/>
+        <w:tblLayout w:type="fixed"/>
+        <w:tblLook w:firstColumn="1" w:firstRow="1" w:lastColumn="0" w:lastRow="0" w:noHBand="0" w:noVBand="1" w:val="04A0"/>
+      </w:tblPr>
+      <w:tblGrid>
+        <w:gridCol w:w="9405"/>
+      </w:tblGrid>
+      <w:tr>
+        <w:tc>
+          <w:tcPr>
+            <w:tcW w:type="dxa" w:w="8787"/>
+            <w:shd w:fill="F8FAFC"/>
+            <w:tcBorders>
+              <w:top w:val="single" w:sz="4" w:space="0" w:color="E2E8F0"/>
+              <w:left w:val="single" w:sz="18" w:space="0" w:color="2563EB"/>
+              <w:bottom w:val="single" w:sz="4" w:space="0" w:color="E2E8F0"/>
+              <w:right w:val="single" w:sz="4" w:space="0" w:color="E2E8F0"/>
+            </w:tcBorders>
+          </w:tcPr>
+          <w:p>
+            <w:pPr>
+              <w:spacing w:before="80" w:after="80" w:line="276" w:lineRule="auto"/>
+            </w:pPr>
+            <w:r>
+              <w:rPr>
+                <w:rFonts w:ascii="Consolas" w:hAnsi="Consolas"/>
+                <w:color w:val="1E293B"/>
+                <w:sz w:val="19"/>
+              </w:rPr>
+              <w:t>TD-ResNet + ProtoNet (trained on FS-GSC)</w:t>
+              <w:br/>
+              <w:t xml:space="preserve">                   vs</w:t>
+              <w:br/>
+              <w:t>TD-ResNet + ProtoNet (trained on normalized AudioMNIST)</w:t>
+            </w:r>
+          </w:p>
+        </w:tc>
+      </w:tr>
+    </w:tbl>
+    <w:p>
+      <w:pPr>
+        <w:spacing w:after="80"/>
+      </w:pPr>
+    </w:p>
+    <w:p>
+      <w:pPr>
+        <w:spacing w:line="360" w:lineRule="auto" w:after="120"/>
+        <w:ind w:firstLine="0"/>
+        <w:jc w:val="both"/>
+      </w:pPr>
+      <w:r>
+        <w:rPr>
+          <w:rFonts w:ascii="Times New Roman" w:hAnsi="Times New Roman" w:eastAsia="Times New Roman"/>
+          <w:b w:val="0"/>
+          <w:i w:val="0"/>
+          <w:color w:val="000000"/>
+          <w:sz w:val="26"/>
+        </w:rPr>
+        <w:t>trong cùng điều kiện input.</w:t>
+      </w:r>
+    </w:p>
+    <w:p>
+      <w:pPr>
+        <w:pStyle w:val="Heading3"/>
+        <w:keepNext/>
+        <w:spacing w:before="200" w:after="80"/>
+      </w:pPr>
+      <w:r>
+        <w:rPr>
+          <w:rFonts w:ascii="Times New Roman" w:hAnsi="Times New Roman" w:eastAsia="Times New Roman"/>
+          <w:b/>
+          <w:color w:val="000000"/>
+          <w:sz w:val="26"/>
+        </w:rPr>
+        <w:t>2.3.3. Chuẩn hóa Fluent Speech Commands</w:t>
+      </w:r>
+    </w:p>
+    <w:p>
+      <w:pPr>
+        <w:spacing w:line="360" w:lineRule="auto" w:after="120"/>
+        <w:ind w:firstLine="0"/>
+        <w:jc w:val="both"/>
+      </w:pPr>
+      <w:r>
+        <w:rPr>
+          <w:rFonts w:ascii="Times New Roman" w:hAnsi="Times New Roman" w:eastAsia="Times New Roman"/>
+          <w:b w:val="0"/>
+          <w:i w:val="0"/>
+          <w:color w:val="000000"/>
+          <w:sz w:val="26"/>
+        </w:rPr>
+        <w:t>Fluent Speech Commands khác hai dataset còn lại vì mỗi audio chứa một câu lệnh nhiều từ. Các sample audit ban đầu cho thấy dữ liệu có dạng:</w:t>
+      </w:r>
+    </w:p>
+    <w:tbl>
+      <w:tblPr>
+        <w:tblW w:type="auto" w:w="0"/>
+        <w:jc w:val="center"/>
+        <w:tblLayout w:type="fixed"/>
+        <w:tblLook w:firstColumn="1" w:firstRow="1" w:lastColumn="0" w:lastRow="0" w:noHBand="0" w:noVBand="1" w:val="04A0"/>
+      </w:tblPr>
+      <w:tblGrid>
+        <w:gridCol w:w="9405"/>
+      </w:tblGrid>
+      <w:tr>
+        <w:tc>
+          <w:tcPr>
+            <w:tcW w:type="dxa" w:w="8787"/>
+            <w:shd w:fill="F8FAFC"/>
+            <w:tcBorders>
+              <w:top w:val="single" w:sz="4" w:space="0" w:color="E2E8F0"/>
+              <w:left w:val="single" w:sz="18" w:space="0" w:color="2563EB"/>
+              <w:bottom w:val="single" w:sz="4" w:space="0" w:color="E2E8F0"/>
+              <w:right w:val="single" w:sz="4" w:space="0" w:color="E2E8F0"/>
+            </w:tcBorders>
+          </w:tcPr>
+          <w:p>
+            <w:pPr>
+              <w:spacing w:before="80" w:after="80" w:line="276" w:lineRule="auto"/>
+            </w:pPr>
+            <w:r>
+              <w:rPr>
+                <w:rFonts w:ascii="Consolas" w:hAnsi="Consolas"/>
+                <w:color w:val="1E293B"/>
+                <w:sz w:val="19"/>
+              </w:rPr>
+              <w:t>16 kHz</w:t>
+              <w:br/>
+              <w:t>mono</w:t>
+              <w:br/>
+              <w:t>WAV PCM16</w:t>
+            </w:r>
+          </w:p>
+        </w:tc>
+      </w:tr>
+    </w:tbl>
+    <w:p>
+      <w:pPr>
+        <w:spacing w:after="80"/>
+      </w:pPr>
+    </w:p>
+    <w:p>
+      <w:pPr>
+        <w:spacing w:line="360" w:lineRule="auto" w:after="120"/>
+        <w:ind w:firstLine="0"/>
+        <w:jc w:val="both"/>
+      </w:pPr>
+      <w:r>
+        <w:rPr>
+          <w:rFonts w:ascii="Times New Roman" w:hAnsi="Times New Roman" w:eastAsia="Times New Roman"/>
+          <w:b w:val="0"/>
+          <w:i w:val="0"/>
+          <w:color w:val="000000"/>
+          <w:sz w:val="26"/>
+        </w:rPr>
+        <w:t>do đó FSC đã tương thích với FS-GSC về sample rate và channel. Tuy nhiên thời lượng thường dài hơn đáng kể, ví dụ các sample kiểm tra có thời lượng khoảng 1.4 – 2.4 giây. Do đó nhóm không ép toàn bộ FSC về 1 giây bằng cách crop trực tiếp, vì thao tác này có thể làm mất một phần nội dung câu lệnh.</w:t>
+      </w:r>
+    </w:p>
+    <w:p>
+      <w:pPr>
+        <w:spacing w:line="360" w:lineRule="auto" w:after="120"/>
+        <w:ind w:firstLine="0"/>
+        <w:jc w:val="both"/>
+      </w:pPr>
+      <w:r>
+        <w:rPr>
+          <w:rFonts w:ascii="Times New Roman" w:hAnsi="Times New Roman" w:eastAsia="Times New Roman"/>
+          <w:b w:val="0"/>
+          <w:i w:val="0"/>
+          <w:color w:val="000000"/>
+          <w:sz w:val="26"/>
+        </w:rPr>
+        <w:t>Pipeline FSC được thiết kế:</w:t>
+      </w:r>
+    </w:p>
+    <w:tbl>
+      <w:tblPr>
+        <w:tblW w:type="auto" w:w="0"/>
+        <w:jc w:val="center"/>
+        <w:tblLayout w:type="fixed"/>
+        <w:tblLook w:firstColumn="1" w:firstRow="1" w:lastColumn="0" w:lastRow="0" w:noHBand="0" w:noVBand="1" w:val="04A0"/>
+      </w:tblPr>
+      <w:tblGrid>
+        <w:gridCol w:w="9405"/>
+      </w:tblGrid>
+      <w:tr>
+        <w:tc>
+          <w:tcPr>
+            <w:tcW w:type="dxa" w:w="8787"/>
+            <w:shd w:fill="F8FAFC"/>
+            <w:tcBorders>
+              <w:top w:val="single" w:sz="4" w:space="0" w:color="E2E8F0"/>
+              <w:left w:val="single" w:sz="18" w:space="0" w:color="2563EB"/>
+              <w:bottom w:val="single" w:sz="4" w:space="0" w:color="E2E8F0"/>
+              <w:right w:val="single" w:sz="4" w:space="0" w:color="E2E8F0"/>
+            </w:tcBorders>
+          </w:tcPr>
+          <w:p>
+            <w:pPr>
+              <w:spacing w:before="80" w:after="80" w:line="276" w:lineRule="auto"/>
+            </w:pPr>
+            <w:r>
+              <w:rPr>
+                <w:rFonts w:ascii="Consolas" w:hAnsi="Consolas"/>
+                <w:color w:val="1E293B"/>
+                <w:sz w:val="19"/>
+              </w:rPr>
+              <w:t>FSC Raw</w:t>
+              <w:br/>
+              <w:t>16 kHz / mono</w:t>
+              <w:br/>
+              <w:t xml:space="preserve">      ↓</w:t>
+              <w:br/>
+              <w:t>Amplitude normalization</w:t>
+              <w:br/>
+              <w:t xml:space="preserve">      ↓</w:t>
+              <w:br/>
+              <w:t>Giữ toàn bộ utterance</w:t>
+              <w:br/>
+              <w:t xml:space="preserve">      ↓</w:t>
+              <w:br/>
+              <w:t>Segment nếu model yêu cầu fixed-length</w:t>
+              <w:br/>
+              <w:t xml:space="preserve">      ↓</w:t>
+              <w:br/>
+              <w:t>Các segment tối đa 1 giây</w:t>
+              <w:br/>
+              <w:t xml:space="preserve">      ↓</w:t>
+              <w:br/>
+              <w:t>Frozen embedding network</w:t>
+            </w:r>
+          </w:p>
+        </w:tc>
+      </w:tr>
+    </w:tbl>
+    <w:p>
+      <w:pPr>
+        <w:spacing w:after="80"/>
+      </w:pPr>
+    </w:p>
+    <w:p>
+      <w:pPr>
+        <w:spacing w:line="360" w:lineRule="auto" w:after="120"/>
+        <w:ind w:firstLine="0"/>
+        <w:jc w:val="both"/>
+      </w:pPr>
+      <w:r>
+        <w:rPr>
+          <w:rFonts w:ascii="Times New Roman" w:hAnsi="Times New Roman" w:eastAsia="Times New Roman"/>
+          <w:b w:val="0"/>
+          <w:i w:val="0"/>
+          <w:color w:val="000000"/>
+          <w:sz w:val="26"/>
+        </w:rPr>
+        <w:t>Nếu utterance dài hơn 1 giây, tín hiệu có thể được chia thành nhiều segment. Ví dụ:</w:t>
+      </w:r>
+    </w:p>
+    <w:tbl>
+      <w:tblPr>
+        <w:tblW w:type="auto" w:w="0"/>
+        <w:jc w:val="center"/>
+        <w:tblLayout w:type="fixed"/>
+        <w:tblLook w:firstColumn="1" w:firstRow="1" w:lastColumn="0" w:lastRow="0" w:noHBand="0" w:noVBand="1" w:val="04A0"/>
+      </w:tblPr>
+      <w:tblGrid>
+        <w:gridCol w:w="9405"/>
+      </w:tblGrid>
+      <w:tr>
+        <w:tc>
+          <w:tcPr>
+            <w:tcW w:type="dxa" w:w="8787"/>
+            <w:shd w:fill="F8FAFC"/>
+            <w:tcBorders>
+              <w:top w:val="single" w:sz="4" w:space="0" w:color="E2E8F0"/>
+              <w:left w:val="single" w:sz="18" w:space="0" w:color="2563EB"/>
+              <w:bottom w:val="single" w:sz="4" w:space="0" w:color="E2E8F0"/>
+              <w:right w:val="single" w:sz="4" w:space="0" w:color="E2E8F0"/>
+            </w:tcBorders>
+          </w:tcPr>
+          <w:p>
+            <w:pPr>
+              <w:spacing w:before="80" w:after="80" w:line="276" w:lineRule="auto"/>
+            </w:pPr>
+            <w:r>
+              <w:rPr>
+                <w:rFonts w:ascii="Consolas" w:hAnsi="Consolas"/>
+                <w:color w:val="1E293B"/>
+                <w:sz w:val="19"/>
+              </w:rPr>
+              <w:t>"Turn the lights on"</w:t>
+              <w:br/>
+              <w:t>Audio dài ~2.2 s</w:t>
+              <w:br/>
+              <w:t>→ segment 1</w:t>
+              <w:br/>
+              <w:t>→ segment 2</w:t>
+              <w:br/>
+              <w:t>→ segment 3 nếu cần</w:t>
+            </w:r>
+          </w:p>
+        </w:tc>
+      </w:tr>
+    </w:tbl>
+    <w:p>
+      <w:pPr>
+        <w:spacing w:after="80"/>
+      </w:pPr>
+    </w:p>
+    <w:p>
+      <w:pPr>
+        <w:spacing w:line="360" w:lineRule="auto" w:after="120"/>
+        <w:ind w:firstLine="0"/>
+        <w:jc w:val="both"/>
+      </w:pPr>
+      <w:r>
+        <w:rPr>
+          <w:rFonts w:ascii="Times New Roman" w:hAnsi="Times New Roman" w:eastAsia="Times New Roman"/>
+          <w:b w:val="0"/>
+          <w:i w:val="0"/>
+          <w:color w:val="000000"/>
+          <w:sz w:val="26"/>
+        </w:rPr>
+        <w:t>Mỗi segment được đưa qua embedding network. Các embedding sau đó có thể được tổng hợp để tạo representation cho toàn utterance. Một phương pháp đơn giản là lấy trung bình:</w:t>
+      </w:r>
+    </w:p>
+    <w:p>
+      <w:pPr>
+        <w:spacing w:before="80" w:after="120"/>
+        <w:jc w:val="center"/>
+      </w:pPr>
+      <w:r>
+        <w:rPr>
+          <w:rFonts w:ascii="Cambria Math" w:hAnsi="Cambria Math" w:eastAsia="Cambria Math"/>
+          <w:color w:val="000000"/>
+          <w:sz w:val="24"/>
+        </w:rPr>
+        <w:t>z_{utterance} = \frac{1}{M} \sum_{i=1}^{M} z_i</w:t>
+      </w:r>
+    </w:p>
+    <w:p>
+      <w:pPr>
+        <w:spacing w:line="360" w:lineRule="auto" w:after="120"/>
+        <w:ind w:firstLine="0"/>
+        <w:jc w:val="both"/>
+      </w:pPr>
+      <w:r>
+        <w:rPr>
+          <w:rFonts w:ascii="Times New Roman" w:hAnsi="Times New Roman" w:eastAsia="Times New Roman"/>
+          <w:b w:val="0"/>
+          <w:i w:val="0"/>
+          <w:color w:val="000000"/>
+          <w:sz w:val="26"/>
+        </w:rPr>
+        <w:t>trong đó: M là số segment; z_i là embedding của segment thứ i.</w:t>
+      </w:r>
+    </w:p>
+    <w:p>
+      <w:pPr>
+        <w:spacing w:line="360" w:lineRule="auto" w:after="120"/>
+        <w:ind w:firstLine="0"/>
+        <w:jc w:val="both"/>
+      </w:pPr>
+      <w:r>
+        <w:rPr>
+          <w:rFonts w:ascii="Times New Roman" w:hAnsi="Times New Roman" w:eastAsia="Times New Roman"/>
+          <w:b w:val="0"/>
+          <w:i w:val="0"/>
+          <w:color w:val="000000"/>
+          <w:sz w:val="26"/>
+        </w:rPr>
+        <w:t>Cách xử lý này giúp giữ lại toàn bộ thông tin câu lệnh trong khi vẫn duy trì input length tương thích với embedding network được huấn luyện trên GSC. FSC chủ yếu được sử dụng cho thí nghiệm:</w:t>
+      </w:r>
+    </w:p>
+    <w:tbl>
+      <w:tblPr>
+        <w:tblW w:type="auto" w:w="0"/>
+        <w:jc w:val="center"/>
+        <w:tblLayout w:type="fixed"/>
+        <w:tblLook w:firstColumn="1" w:firstRow="1" w:lastColumn="0" w:lastRow="0" w:noHBand="0" w:noVBand="1" w:val="04A0"/>
+      </w:tblPr>
+      <w:tblGrid>
+        <w:gridCol w:w="9405"/>
+      </w:tblGrid>
+      <w:tr>
+        <w:tc>
+          <w:tcPr>
+            <w:tcW w:type="dxa" w:w="8787"/>
+            <w:shd w:fill="F8FAFC"/>
+            <w:tcBorders>
+              <w:top w:val="single" w:sz="4" w:space="0" w:color="E2E8F0"/>
+              <w:left w:val="single" w:sz="18" w:space="0" w:color="2563EB"/>
+              <w:bottom w:val="single" w:sz="4" w:space="0" w:color="E2E8F0"/>
+              <w:right w:val="single" w:sz="4" w:space="0" w:color="E2E8F0"/>
+            </w:tcBorders>
+          </w:tcPr>
+          <w:p>
+            <w:pPr>
+              <w:spacing w:before="80" w:after="80" w:line="276" w:lineRule="auto"/>
+            </w:pPr>
+            <w:r>
+              <w:rPr>
+                <w:rFonts w:ascii="Consolas" w:hAnsi="Consolas"/>
+                <w:color w:val="1E293B"/>
+                <w:sz w:val="19"/>
+              </w:rPr>
+              <w:t>Train model trên FS-GSC</w:t>
+              <w:br/>
+              <w:t xml:space="preserve">        ↓</w:t>
+              <w:br/>
+              <w:t>Freeze model</w:t>
+              <w:br/>
+              <w:t xml:space="preserve">        ↓</w:t>
+              <w:br/>
+              <w:t>FSC Support / Query</w:t>
+              <w:br/>
+              <w:t xml:space="preserve">        ↓</w:t>
+              <w:br/>
+              <w:t>Few-shot external test</w:t>
+            </w:r>
+          </w:p>
+        </w:tc>
+      </w:tr>
+    </w:tbl>
+    <w:p>
+      <w:pPr>
+        <w:spacing w:after="80"/>
+      </w:pPr>
+    </w:p>
+    <w:p>
+      <w:pPr>
+        <w:spacing w:line="360" w:lineRule="auto" w:after="120"/>
+        <w:ind w:firstLine="0"/>
+        <w:jc w:val="both"/>
+      </w:pPr>
+      <w:r>
+        <w:rPr>
+          <w:rFonts w:ascii="Times New Roman" w:hAnsi="Times New Roman" w:eastAsia="Times New Roman"/>
+          <w:b w:val="0"/>
+          <w:i w:val="0"/>
+          <w:color w:val="000000"/>
+          <w:sz w:val="26"/>
+        </w:rPr>
+        <w:t>Mục tiêu là kiểm tra khả năng tổng quát từ single-word speech sang multi-word spoken command.</w:t>
+      </w:r>
+    </w:p>
+    <w:p>
+      <w:pPr>
+        <w:pStyle w:val="Heading3"/>
+        <w:keepNext/>
+        <w:spacing w:before="200" w:after="80"/>
+      </w:pPr>
+      <w:r>
+        <w:rPr>
+          <w:rFonts w:ascii="Times New Roman" w:hAnsi="Times New Roman" w:eastAsia="Times New Roman"/>
+          <w:b/>
+          <w:color w:val="000000"/>
+          <w:sz w:val="26"/>
+        </w:rPr>
+        <w:t>2.3.4. Pipeline chung sau chuẩn hóa</w:t>
+      </w:r>
+    </w:p>
+    <w:p>
+      <w:pPr>
+        <w:spacing w:line="360" w:lineRule="auto" w:after="120"/>
+        <w:ind w:firstLine="0"/>
+        <w:jc w:val="both"/>
+      </w:pPr>
+      <w:r>
+        <w:rPr>
+          <w:rFonts w:ascii="Times New Roman" w:hAnsi="Times New Roman" w:eastAsia="Times New Roman"/>
+          <w:b w:val="0"/>
+          <w:i w:val="0"/>
+          <w:color w:val="000000"/>
+          <w:sz w:val="26"/>
+        </w:rPr>
+        <w:t>Sau quá trình xử lý, dữ liệu được đưa về các dạng:</w:t>
+      </w:r>
+    </w:p>
+    <w:p>
+      <w:pPr>
+        <w:spacing w:line="360" w:lineRule="auto" w:after="120"/>
+        <w:ind w:firstLine="0"/>
+        <w:jc w:val="both"/>
+      </w:pPr>
+      <w:r>
+        <w:rPr>
+          <w:rFonts w:ascii="Times New Roman" w:hAnsi="Times New Roman" w:eastAsia="Times New Roman"/>
+          <w:b/>
+          <w:i w:val="0"/>
+          <w:color w:val="000000"/>
+          <w:sz w:val="26"/>
+        </w:rPr>
+        <w:t>FS-GSC:</w:t>
+      </w:r>
+    </w:p>
+    <w:tbl>
+      <w:tblPr>
+        <w:tblW w:type="auto" w:w="0"/>
+        <w:jc w:val="center"/>
+        <w:tblLayout w:type="fixed"/>
+        <w:tblLook w:firstColumn="1" w:firstRow="1" w:lastColumn="0" w:lastRow="0" w:noHBand="0" w:noVBand="1" w:val="04A0"/>
+      </w:tblPr>
+      <w:tblGrid>
+        <w:gridCol w:w="9405"/>
+      </w:tblGrid>
+      <w:tr>
+        <w:tc>
+          <w:tcPr>
+            <w:tcW w:type="dxa" w:w="8787"/>
+            <w:shd w:fill="F8FAFC"/>
+            <w:tcBorders>
+              <w:top w:val="single" w:sz="4" w:space="0" w:color="E2E8F0"/>
+              <w:left w:val="single" w:sz="18" w:space="0" w:color="2563EB"/>
+              <w:bottom w:val="single" w:sz="4" w:space="0" w:color="E2E8F0"/>
+              <w:right w:val="single" w:sz="4" w:space="0" w:color="E2E8F0"/>
+            </w:tcBorders>
+          </w:tcPr>
+          <w:p>
+            <w:pPr>
+              <w:spacing w:before="80" w:after="80" w:line="276" w:lineRule="auto"/>
+            </w:pPr>
+            <w:r>
+              <w:rPr>
+                <w:rFonts w:ascii="Consolas" w:hAnsi="Consolas"/>
+                <w:color w:val="1E293B"/>
+                <w:sz w:val="19"/>
+              </w:rPr>
+              <w:t>GSC Raw</w:t>
+              <w:br/>
+              <w:t>→ paper filtering</w:t>
+              <w:br/>
+              <w:t>→ speaker grouping</w:t>
+              <w:br/>
+              <w:t>→ balancing</w:t>
+              <w:br/>
+              <w:t>→ class splitting</w:t>
+              <w:br/>
+              <w:t>→ Few-shot dataset</w:t>
+            </w:r>
+          </w:p>
+        </w:tc>
+      </w:tr>
+    </w:tbl>
+    <w:p>
+      <w:pPr>
+        <w:spacing w:after="80"/>
+      </w:pPr>
+    </w:p>
+    <w:p>
+      <w:pPr>
+        <w:spacing w:line="360" w:lineRule="auto" w:after="120"/>
+        <w:ind w:firstLine="0"/>
+        <w:jc w:val="both"/>
+      </w:pPr>
+      <w:r>
+        <w:rPr>
+          <w:rFonts w:ascii="Times New Roman" w:hAnsi="Times New Roman" w:eastAsia="Times New Roman"/>
+          <w:b/>
+          <w:i w:val="0"/>
+          <w:color w:val="000000"/>
+          <w:sz w:val="26"/>
+        </w:rPr>
+        <w:t>AudioMNIST:</w:t>
+      </w:r>
+    </w:p>
+    <w:tbl>
+      <w:tblPr>
+        <w:tblW w:type="auto" w:w="0"/>
+        <w:jc w:val="center"/>
+        <w:tblLayout w:type="fixed"/>
+        <w:tblLook w:firstColumn="1" w:firstRow="1" w:lastColumn="0" w:lastRow="0" w:noHBand="0" w:noVBand="1" w:val="04A0"/>
+      </w:tblPr>
+      <w:tblGrid>
+        <w:gridCol w:w="9405"/>
+      </w:tblGrid>
+      <w:tr>
+        <w:tc>
+          <w:tcPr>
+            <w:tcW w:type="dxa" w:w="8787"/>
+            <w:shd w:fill="F8FAFC"/>
+            <w:tcBorders>
+              <w:top w:val="single" w:sz="4" w:space="0" w:color="E2E8F0"/>
+              <w:left w:val="single" w:sz="18" w:space="0" w:color="2563EB"/>
+              <w:bottom w:val="single" w:sz="4" w:space="0" w:color="E2E8F0"/>
+              <w:right w:val="single" w:sz="4" w:space="0" w:color="E2E8F0"/>
+            </w:tcBorders>
+          </w:tcPr>
+          <w:p>
+            <w:pPr>
+              <w:spacing w:before="80" w:after="80" w:line="276" w:lineRule="auto"/>
+            </w:pPr>
+            <w:r>
+              <w:rPr>
+                <w:rFonts w:ascii="Consolas" w:hAnsi="Consolas"/>
+                <w:color w:val="1E293B"/>
+                <w:sz w:val="19"/>
+              </w:rPr>
+              <w:t>AudioMNIST Raw</w:t>
+              <w:br/>
+              <w:t>48 kHz</w:t>
+              <w:br/>
+              <w:t>→ resample 16 kHz</w:t>
+              <w:br/>
+              <w:t>→ mono</w:t>
+              <w:br/>
+              <w:t>→ normalize</w:t>
+              <w:br/>
+              <w:t>→ pad/crop 1 s</w:t>
+              <w:br/>
+              <w:t>→ training-ready data</w:t>
+            </w:r>
+          </w:p>
+        </w:tc>
+      </w:tr>
+    </w:tbl>
+    <w:p>
+      <w:pPr>
+        <w:spacing w:after="80"/>
+      </w:pPr>
+    </w:p>
+    <w:p>
+      <w:pPr>
+        <w:spacing w:line="360" w:lineRule="auto" w:after="120"/>
+        <w:ind w:firstLine="0"/>
+        <w:jc w:val="both"/>
+      </w:pPr>
+      <w:r>
+        <w:rPr>
+          <w:rFonts w:ascii="Times New Roman" w:hAnsi="Times New Roman" w:eastAsia="Times New Roman"/>
+          <w:b/>
+          <w:i w:val="0"/>
+          <w:color w:val="000000"/>
+          <w:sz w:val="26"/>
+        </w:rPr>
+        <w:t>Fluent Speech Commands (FSC):</w:t>
+      </w:r>
+    </w:p>
+    <w:tbl>
+      <w:tblPr>
+        <w:tblW w:type="auto" w:w="0"/>
+        <w:jc w:val="center"/>
+        <w:tblLayout w:type="fixed"/>
+        <w:tblLook w:firstColumn="1" w:firstRow="1" w:lastColumn="0" w:lastRow="0" w:noHBand="0" w:noVBand="1" w:val="04A0"/>
+      </w:tblPr>
+      <w:tblGrid>
+        <w:gridCol w:w="9405"/>
+      </w:tblGrid>
+      <w:tr>
+        <w:tc>
+          <w:tcPr>
+            <w:tcW w:type="dxa" w:w="8787"/>
+            <w:shd w:fill="F8FAFC"/>
+            <w:tcBorders>
+              <w:top w:val="single" w:sz="4" w:space="0" w:color="E2E8F0"/>
+              <w:left w:val="single" w:sz="18" w:space="0" w:color="2563EB"/>
+              <w:bottom w:val="single" w:sz="4" w:space="0" w:color="E2E8F0"/>
+              <w:right w:val="single" w:sz="4" w:space="0" w:color="E2E8F0"/>
+            </w:tcBorders>
+          </w:tcPr>
+          <w:p>
+            <w:pPr>
+              <w:spacing w:before="80" w:after="80" w:line="276" w:lineRule="auto"/>
+            </w:pPr>
+            <w:r>
+              <w:rPr>
+                <w:rFonts w:ascii="Consolas" w:hAnsi="Consolas"/>
+                <w:color w:val="1E293B"/>
+                <w:sz w:val="19"/>
+              </w:rPr>
+              <w:t>FSC Raw</w:t>
+              <w:br/>
+              <w:t>16 kHz</w:t>
+              <w:br/>
+              <w:t>→ mono</w:t>
+              <w:br/>
+              <w:t>→ normalize</w:t>
+              <w:br/>
+              <w:t>→ giữ toàn bộ utterance</w:t>
+              <w:br/>
+              <w:t>→ segmentation nếu cần</w:t>
+              <w:br/>
+              <w:t>→ external-test data</w:t>
+            </w:r>
+          </w:p>
+        </w:tc>
+      </w:tr>
+    </w:tbl>
+    <w:p>
+      <w:pPr>
+        <w:spacing w:after="80"/>
+      </w:pPr>
+    </w:p>
+    <w:p>
+      <w:pPr>
+        <w:pStyle w:val="Heading3"/>
+        <w:keepNext/>
+        <w:spacing w:before="200" w:after="80"/>
+      </w:pPr>
+      <w:r>
+        <w:rPr>
+          <w:rFonts w:ascii="Times New Roman" w:hAnsi="Times New Roman" w:eastAsia="Times New Roman"/>
+          <w:b/>
+          <w:color w:val="000000"/>
+          <w:sz w:val="26"/>
+        </w:rPr>
+        <w:t>2.3.5. So sánh chính sách preprocessing</w:t>
+      </w:r>
+    </w:p>
+    <w:p>
+      <w:pPr>
+        <w:spacing w:line="360" w:lineRule="auto" w:after="120"/>
+        <w:ind w:firstLine="0"/>
+        <w:jc w:val="both"/>
+      </w:pPr>
+      <w:r>
+        <w:rPr>
+          <w:rFonts w:ascii="Times New Roman" w:hAnsi="Times New Roman" w:eastAsia="Times New Roman"/>
+          <w:b w:val="0"/>
+          <w:i w:val="0"/>
+          <w:color w:val="000000"/>
+          <w:sz w:val="26"/>
+        </w:rPr>
+        <w:t>Bảng so sánh chính sách tiền xử lý và chuẩn hóa tín hiệu giữa ba bộ dữ liệu:</w:t>
+      </w:r>
+    </w:p>
+    <w:tbl>
+      <w:tblPr>
+        <w:tblW w:type="auto" w:w="0"/>
+        <w:jc w:val="center"/>
+        <w:tblLayout w:type="fixed"/>
+        <w:tblLook w:firstColumn="1" w:firstRow="1" w:lastColumn="0" w:lastRow="0" w:noHBand="0" w:noVBand="1" w:val="04A0"/>
+      </w:tblPr>
+      <w:tblGrid>
+        <w:gridCol w:w="2351"/>
+        <w:gridCol w:w="2351"/>
+        <w:gridCol w:w="2351"/>
+        <w:gridCol w:w="2351"/>
+      </w:tblGrid>
+      <w:tr>
+        <w:tc>
+          <w:tcPr>
+            <w:tcW w:type="dxa" w:w="2268"/>
+            <w:shd w:fill="E2E8F0"/>
+          </w:tcPr>
+          <w:p>
+            <w:pPr>
+              <w:spacing w:after="60" w:line="276" w:lineRule="auto"/>
+              <w:jc w:val="center"/>
+            </w:pPr>
+            <w:r>
+              <w:rPr>
+                <w:rFonts w:ascii="Times New Roman" w:hAnsi="Times New Roman" w:eastAsia="Times New Roman"/>
+                <w:b/>
+                <w:color w:val="000000"/>
+                <w:sz w:val="22"/>
+              </w:rPr>
+              <w:t>Thuộc tính</w:t>
+            </w:r>
+          </w:p>
+        </w:tc>
+        <w:tc>
+          <w:tcPr>
+            <w:tcW w:type="dxa" w:w="2154"/>
+            <w:shd w:fill="E2E8F0"/>
+          </w:tcPr>
+          <w:p>
+            <w:pPr>
+              <w:spacing w:after="60" w:line="276" w:lineRule="auto"/>
+              <w:jc w:val="center"/>
+            </w:pPr>
+            <w:r>
+              <w:rPr>
+                <w:rFonts w:ascii="Times New Roman" w:hAnsi="Times New Roman" w:eastAsia="Times New Roman"/>
+                <w:b/>
+                <w:color w:val="000000"/>
+                <w:sz w:val="22"/>
+              </w:rPr>
+              <w:t>FS-GSC</w:t>
+            </w:r>
+          </w:p>
+        </w:tc>
+        <w:tc>
+          <w:tcPr>
+            <w:tcW w:type="dxa" w:w="2154"/>
+            <w:shd w:fill="E2E8F0"/>
+          </w:tcPr>
+          <w:p>
+            <w:pPr>
+              <w:spacing w:after="60" w:line="276" w:lineRule="auto"/>
+              <w:jc w:val="center"/>
+            </w:pPr>
+            <w:r>
+              <w:rPr>
+                <w:rFonts w:ascii="Times New Roman" w:hAnsi="Times New Roman" w:eastAsia="Times New Roman"/>
+                <w:b/>
+                <w:color w:val="000000"/>
+                <w:sz w:val="22"/>
+              </w:rPr>
+              <w:t>AudioMNIST</w:t>
+            </w:r>
+          </w:p>
+        </w:tc>
+        <w:tc>
+          <w:tcPr>
+            <w:tcW w:type="dxa" w:w="2211"/>
+            <w:shd w:fill="E2E8F0"/>
+          </w:tcPr>
+          <w:p>
+            <w:pPr>
+              <w:spacing w:after="60" w:line="276" w:lineRule="auto"/>
+              <w:jc w:val="center"/>
+            </w:pPr>
+            <w:r>
+              <w:rPr>
+                <w:rFonts w:ascii="Times New Roman" w:hAnsi="Times New Roman" w:eastAsia="Times New Roman"/>
+                <w:b/>
+                <w:color w:val="000000"/>
+                <w:sz w:val="22"/>
+              </w:rPr>
+              <w:t>FSC</w:t>
+            </w:r>
+          </w:p>
+        </w:tc>
+      </w:tr>
+      <w:tr>
+        <w:tc>
+          <w:tcPr>
+            <w:tcW w:type="dxa" w:w="2268"/>
+          </w:tcPr>
+          <w:p>
+            <w:pPr>
+              <w:spacing w:after="60" w:line="276" w:lineRule="auto"/>
+              <w:jc w:val="center"/>
+            </w:pPr>
+            <w:r>
+              <w:rPr>
+                <w:rFonts w:ascii="Times New Roman" w:hAnsi="Times New Roman" w:eastAsia="Times New Roman"/>
+                <w:color w:val="000000"/>
+                <w:sz w:val="21"/>
+              </w:rPr>
+              <w:t>Sample rate đích</w:t>
+            </w:r>
+          </w:p>
+        </w:tc>
+        <w:tc>
+          <w:tcPr>
+            <w:tcW w:type="dxa" w:w="2154"/>
+          </w:tcPr>
+          <w:p>
+            <w:pPr>
+              <w:spacing w:after="60" w:line="276" w:lineRule="auto"/>
+              <w:jc w:val="left"/>
+            </w:pPr>
+            <w:r>
+              <w:rPr>
+                <w:rFonts w:ascii="Times New Roman" w:hAnsi="Times New Roman" w:eastAsia="Times New Roman"/>
+                <w:color w:val="000000"/>
+                <w:sz w:val="21"/>
+              </w:rPr>
+              <w:t>16 kHz</w:t>
+            </w:r>
+          </w:p>
+        </w:tc>
+        <w:tc>
+          <w:tcPr>
+            <w:tcW w:type="dxa" w:w="2154"/>
+          </w:tcPr>
+          <w:p>
+            <w:pPr>
+              <w:spacing w:after="60" w:line="276" w:lineRule="auto"/>
+              <w:jc w:val="left"/>
+            </w:pPr>
+            <w:r>
+              <w:rPr>
+                <w:rFonts w:ascii="Times New Roman" w:hAnsi="Times New Roman" w:eastAsia="Times New Roman"/>
+                <w:color w:val="000000"/>
+                <w:sz w:val="21"/>
+              </w:rPr>
+              <w:t>16 kHz</w:t>
+            </w:r>
+          </w:p>
+        </w:tc>
+        <w:tc>
+          <w:tcPr>
+            <w:tcW w:type="dxa" w:w="2211"/>
+          </w:tcPr>
+          <w:p>
+            <w:pPr>
+              <w:spacing w:after="60" w:line="276" w:lineRule="auto"/>
+              <w:jc w:val="left"/>
+            </w:pPr>
+            <w:r>
+              <w:rPr>
+                <w:rFonts w:ascii="Times New Roman" w:hAnsi="Times New Roman" w:eastAsia="Times New Roman"/>
+                <w:color w:val="000000"/>
+                <w:sz w:val="21"/>
+              </w:rPr>
+              <w:t>16 kHz</w:t>
+            </w:r>
+          </w:p>
+        </w:tc>
+      </w:tr>
+      <w:tr>
+        <w:tc>
+          <w:tcPr>
+            <w:tcW w:type="dxa" w:w="2268"/>
+          </w:tcPr>
+          <w:p>
+            <w:pPr>
+              <w:spacing w:after="60" w:line="276" w:lineRule="auto"/>
+              <w:jc w:val="center"/>
+            </w:pPr>
+            <w:r>
+              <w:rPr>
+                <w:rFonts w:ascii="Times New Roman" w:hAnsi="Times New Roman" w:eastAsia="Times New Roman"/>
+                <w:color w:val="000000"/>
+                <w:sz w:val="21"/>
+              </w:rPr>
+              <w:t>Mono</w:t>
+            </w:r>
+          </w:p>
+        </w:tc>
+        <w:tc>
+          <w:tcPr>
+            <w:tcW w:type="dxa" w:w="2154"/>
+          </w:tcPr>
+          <w:p>
+            <w:pPr>
+              <w:spacing w:after="60" w:line="276" w:lineRule="auto"/>
+              <w:jc w:val="left"/>
+            </w:pPr>
+            <w:r>
+              <w:rPr>
+                <w:rFonts w:ascii="Times New Roman" w:hAnsi="Times New Roman" w:eastAsia="Times New Roman"/>
+                <w:color w:val="000000"/>
+                <w:sz w:val="21"/>
+              </w:rPr>
+              <w:t>Có</w:t>
+            </w:r>
+          </w:p>
+        </w:tc>
+        <w:tc>
+          <w:tcPr>
+            <w:tcW w:type="dxa" w:w="2154"/>
+          </w:tcPr>
+          <w:p>
+            <w:pPr>
+              <w:spacing w:after="60" w:line="276" w:lineRule="auto"/>
+              <w:jc w:val="left"/>
+            </w:pPr>
+            <w:r>
+              <w:rPr>
+                <w:rFonts w:ascii="Times New Roman" w:hAnsi="Times New Roman" w:eastAsia="Times New Roman"/>
+                <w:color w:val="000000"/>
+                <w:sz w:val="21"/>
+              </w:rPr>
+              <w:t>Có</w:t>
+            </w:r>
+          </w:p>
+        </w:tc>
+        <w:tc>
+          <w:tcPr>
+            <w:tcW w:type="dxa" w:w="2211"/>
+          </w:tcPr>
+          <w:p>
+            <w:pPr>
+              <w:spacing w:after="60" w:line="276" w:lineRule="auto"/>
+              <w:jc w:val="left"/>
+            </w:pPr>
+            <w:r>
+              <w:rPr>
+                <w:rFonts w:ascii="Times New Roman" w:hAnsi="Times New Roman" w:eastAsia="Times New Roman"/>
+                <w:color w:val="000000"/>
+                <w:sz w:val="21"/>
+              </w:rPr>
+              <w:t>Có</w:t>
+            </w:r>
+          </w:p>
+        </w:tc>
+      </w:tr>
+      <w:tr>
+        <w:tc>
+          <w:tcPr>
+            <w:tcW w:type="dxa" w:w="2268"/>
+          </w:tcPr>
+          <w:p>
+            <w:pPr>
+              <w:spacing w:after="60" w:line="276" w:lineRule="auto"/>
+              <w:jc w:val="center"/>
+            </w:pPr>
+            <w:r>
+              <w:rPr>
+                <w:rFonts w:ascii="Times New Roman" w:hAnsi="Times New Roman" w:eastAsia="Times New Roman"/>
+                <w:color w:val="000000"/>
+                <w:sz w:val="21"/>
+              </w:rPr>
+              <w:t>Amplitude normalization</w:t>
+            </w:r>
+          </w:p>
+        </w:tc>
+        <w:tc>
+          <w:tcPr>
+            <w:tcW w:type="dxa" w:w="2154"/>
+          </w:tcPr>
+          <w:p>
+            <w:pPr>
+              <w:spacing w:after="60" w:line="276" w:lineRule="auto"/>
+              <w:jc w:val="left"/>
+            </w:pPr>
+            <w:r>
+              <w:rPr>
+                <w:rFonts w:ascii="Times New Roman" w:hAnsi="Times New Roman" w:eastAsia="Times New Roman"/>
+                <w:color w:val="000000"/>
+                <w:sz w:val="21"/>
+              </w:rPr>
+              <w:t>theo pipeline model</w:t>
+            </w:r>
+          </w:p>
+        </w:tc>
+        <w:tc>
+          <w:tcPr>
+            <w:tcW w:type="dxa" w:w="2154"/>
+          </w:tcPr>
+          <w:p>
+            <w:pPr>
+              <w:spacing w:after="60" w:line="276" w:lineRule="auto"/>
+              <w:jc w:val="left"/>
+            </w:pPr>
+            <w:r>
+              <w:rPr>
+                <w:rFonts w:ascii="Times New Roman" w:hAnsi="Times New Roman" w:eastAsia="Times New Roman"/>
+                <w:color w:val="000000"/>
+                <w:sz w:val="21"/>
+              </w:rPr>
+              <w:t>Có</w:t>
+            </w:r>
+          </w:p>
+        </w:tc>
+        <w:tc>
+          <w:tcPr>
+            <w:tcW w:type="dxa" w:w="2211"/>
+          </w:tcPr>
+          <w:p>
+            <w:pPr>
+              <w:spacing w:after="60" w:line="276" w:lineRule="auto"/>
+              <w:jc w:val="left"/>
+            </w:pPr>
+            <w:r>
+              <w:rPr>
+                <w:rFonts w:ascii="Times New Roman" w:hAnsi="Times New Roman" w:eastAsia="Times New Roman"/>
+                <w:color w:val="000000"/>
+                <w:sz w:val="21"/>
+              </w:rPr>
+              <w:t>Có</w:t>
+            </w:r>
+          </w:p>
+        </w:tc>
+      </w:tr>
+      <w:tr>
+        <w:tc>
+          <w:tcPr>
+            <w:tcW w:type="dxa" w:w="2268"/>
+          </w:tcPr>
+          <w:p>
+            <w:pPr>
+              <w:spacing w:after="60" w:line="276" w:lineRule="auto"/>
+              <w:jc w:val="center"/>
+            </w:pPr>
+            <w:r>
+              <w:rPr>
+                <w:rFonts w:ascii="Times New Roman" w:hAnsi="Times New Roman" w:eastAsia="Times New Roman"/>
+                <w:color w:val="000000"/>
+                <w:sz w:val="21"/>
+              </w:rPr>
+              <w:t>Độ dài</w:t>
+            </w:r>
+          </w:p>
+        </w:tc>
+        <w:tc>
+          <w:tcPr>
+            <w:tcW w:type="dxa" w:w="2154"/>
+          </w:tcPr>
+          <w:p>
+            <w:pPr>
+              <w:spacing w:after="60" w:line="276" w:lineRule="auto"/>
+              <w:jc w:val="left"/>
+            </w:pPr>
+            <w:r>
+              <w:rPr>
+                <w:rFonts w:ascii="Times New Roman" w:hAnsi="Times New Roman" w:eastAsia="Times New Roman"/>
+                <w:color w:val="000000"/>
+                <w:sz w:val="21"/>
+              </w:rPr>
+              <w:t>1 s</w:t>
+            </w:r>
+          </w:p>
+        </w:tc>
+        <w:tc>
+          <w:tcPr>
+            <w:tcW w:type="dxa" w:w="2154"/>
+          </w:tcPr>
+          <w:p>
+            <w:pPr>
+              <w:spacing w:after="60" w:line="276" w:lineRule="auto"/>
+              <w:jc w:val="left"/>
+            </w:pPr>
+            <w:r>
+              <w:rPr>
+                <w:rFonts w:ascii="Times New Roman" w:hAnsi="Times New Roman" w:eastAsia="Times New Roman"/>
+                <w:color w:val="000000"/>
+                <w:sz w:val="21"/>
+              </w:rPr>
+              <w:t>1 s</w:t>
+            </w:r>
+          </w:p>
+        </w:tc>
+        <w:tc>
+          <w:tcPr>
+            <w:tcW w:type="dxa" w:w="2211"/>
+          </w:tcPr>
+          <w:p>
+            <w:pPr>
+              <w:spacing w:after="60" w:line="276" w:lineRule="auto"/>
+              <w:jc w:val="left"/>
+            </w:pPr>
+            <w:r>
+              <w:rPr>
+                <w:rFonts w:ascii="Times New Roman" w:hAnsi="Times New Roman" w:eastAsia="Times New Roman"/>
+                <w:color w:val="000000"/>
+                <w:sz w:val="21"/>
+              </w:rPr>
+              <w:t>Variable</w:t>
+            </w:r>
+          </w:p>
+        </w:tc>
+      </w:tr>
+      <w:tr>
+        <w:tc>
+          <w:tcPr>
+            <w:tcW w:type="dxa" w:w="2268"/>
+          </w:tcPr>
+          <w:p>
+            <w:pPr>
+              <w:spacing w:after="60" w:line="276" w:lineRule="auto"/>
+              <w:jc w:val="center"/>
+            </w:pPr>
+            <w:r>
+              <w:rPr>
+                <w:rFonts w:ascii="Times New Roman" w:hAnsi="Times New Roman" w:eastAsia="Times New Roman"/>
+                <w:color w:val="000000"/>
+                <w:sz w:val="21"/>
+              </w:rPr>
+              <w:t>Audio &lt; 1 s</w:t>
+            </w:r>
+          </w:p>
+        </w:tc>
+        <w:tc>
+          <w:tcPr>
+            <w:tcW w:type="dxa" w:w="2154"/>
+          </w:tcPr>
+          <w:p>
+            <w:pPr>
+              <w:spacing w:after="60" w:line="276" w:lineRule="auto"/>
+              <w:jc w:val="left"/>
+            </w:pPr>
+            <w:r>
+              <w:rPr>
+                <w:rFonts w:ascii="Times New Roman" w:hAnsi="Times New Roman" w:eastAsia="Times New Roman"/>
+                <w:color w:val="000000"/>
+                <w:sz w:val="21"/>
+              </w:rPr>
+              <w:t>Paper loại bỏ</w:t>
+            </w:r>
+          </w:p>
+        </w:tc>
+        <w:tc>
+          <w:tcPr>
+            <w:tcW w:type="dxa" w:w="2154"/>
+          </w:tcPr>
+          <w:p>
+            <w:pPr>
+              <w:spacing w:after="60" w:line="276" w:lineRule="auto"/>
+              <w:jc w:val="left"/>
+            </w:pPr>
+            <w:r>
+              <w:rPr>
+                <w:rFonts w:ascii="Times New Roman" w:hAnsi="Times New Roman" w:eastAsia="Times New Roman"/>
+                <w:color w:val="000000"/>
+                <w:sz w:val="21"/>
+              </w:rPr>
+              <w:t>Zero-pad</w:t>
+            </w:r>
+          </w:p>
+        </w:tc>
+        <w:tc>
+          <w:tcPr>
+            <w:tcW w:type="dxa" w:w="2211"/>
+          </w:tcPr>
+          <w:p>
+            <w:pPr>
+              <w:spacing w:after="60" w:line="276" w:lineRule="auto"/>
+              <w:jc w:val="left"/>
+            </w:pPr>
+            <w:r>
+              <w:rPr>
+                <w:rFonts w:ascii="Times New Roman" w:hAnsi="Times New Roman" w:eastAsia="Times New Roman"/>
+                <w:color w:val="000000"/>
+                <w:sz w:val="21"/>
+              </w:rPr>
+              <w:t>Giữ/pad segment</w:t>
+            </w:r>
+          </w:p>
+        </w:tc>
+      </w:tr>
+      <w:tr>
+        <w:tc>
+          <w:tcPr>
+            <w:tcW w:type="dxa" w:w="2268"/>
+          </w:tcPr>
+          <w:p>
+            <w:pPr>
+              <w:spacing w:after="60" w:line="276" w:lineRule="auto"/>
+              <w:jc w:val="center"/>
+            </w:pPr>
+            <w:r>
+              <w:rPr>
+                <w:rFonts w:ascii="Times New Roman" w:hAnsi="Times New Roman" w:eastAsia="Times New Roman"/>
+                <w:color w:val="000000"/>
+                <w:sz w:val="21"/>
+              </w:rPr>
+              <w:t>Audio &gt; 1 s</w:t>
+            </w:r>
+          </w:p>
+        </w:tc>
+        <w:tc>
+          <w:tcPr>
+            <w:tcW w:type="dxa" w:w="2154"/>
+          </w:tcPr>
+          <w:p>
+            <w:pPr>
+              <w:spacing w:after="60" w:line="276" w:lineRule="auto"/>
+              <w:jc w:val="left"/>
+            </w:pPr>
+            <w:r>
+              <w:rPr>
+                <w:rFonts w:ascii="Times New Roman" w:hAnsi="Times New Roman" w:eastAsia="Times New Roman"/>
+                <w:color w:val="000000"/>
+                <w:sz w:val="21"/>
+              </w:rPr>
+              <w:t>Không phải trường hợp chính</w:t>
+            </w:r>
+          </w:p>
+        </w:tc>
+        <w:tc>
+          <w:tcPr>
+            <w:tcW w:type="dxa" w:w="2154"/>
+          </w:tcPr>
+          <w:p>
+            <w:pPr>
+              <w:spacing w:after="60" w:line="276" w:lineRule="auto"/>
+              <w:jc w:val="left"/>
+            </w:pPr>
+            <w:r>
+              <w:rPr>
+                <w:rFonts w:ascii="Times New Roman" w:hAnsi="Times New Roman" w:eastAsia="Times New Roman"/>
+                <w:color w:val="000000"/>
+                <w:sz w:val="21"/>
+              </w:rPr>
+              <w:t>Crop nếu cần</w:t>
+            </w:r>
+          </w:p>
+        </w:tc>
+        <w:tc>
+          <w:tcPr>
+            <w:tcW w:type="dxa" w:w="2211"/>
+          </w:tcPr>
+          <w:p>
+            <w:pPr>
+              <w:spacing w:after="60" w:line="276" w:lineRule="auto"/>
+              <w:jc w:val="left"/>
+            </w:pPr>
+            <w:r>
+              <w:rPr>
+                <w:rFonts w:ascii="Times New Roman" w:hAnsi="Times New Roman" w:eastAsia="Times New Roman"/>
+                <w:color w:val="000000"/>
+                <w:sz w:val="21"/>
+              </w:rPr>
+              <w:t>Segment</w:t>
+            </w:r>
+          </w:p>
+        </w:tc>
+      </w:tr>
+      <w:tr>
+        <w:tc>
+          <w:tcPr>
+            <w:tcW w:type="dxa" w:w="2268"/>
+          </w:tcPr>
+          <w:p>
+            <w:pPr>
+              <w:spacing w:after="60" w:line="276" w:lineRule="auto"/>
+              <w:jc w:val="center"/>
+            </w:pPr>
+            <w:r>
+              <w:rPr>
+                <w:rFonts w:ascii="Times New Roman" w:hAnsi="Times New Roman" w:eastAsia="Times New Roman"/>
+                <w:color w:val="000000"/>
+                <w:sz w:val="21"/>
+              </w:rPr>
+              <w:t>Vai trò</w:t>
+            </w:r>
+          </w:p>
+        </w:tc>
+        <w:tc>
+          <w:tcPr>
+            <w:tcW w:type="dxa" w:w="2154"/>
+          </w:tcPr>
+          <w:p>
+            <w:pPr>
+              <w:spacing w:after="60" w:line="276" w:lineRule="auto"/>
+              <w:jc w:val="left"/>
+            </w:pPr>
+            <w:r>
+              <w:rPr>
+                <w:rFonts w:ascii="Times New Roman" w:hAnsi="Times New Roman" w:eastAsia="Times New Roman"/>
+                <w:color w:val="000000"/>
+                <w:sz w:val="21"/>
+              </w:rPr>
+              <w:t>Train chính</w:t>
+            </w:r>
+          </w:p>
+        </w:tc>
+        <w:tc>
+          <w:tcPr>
+            <w:tcW w:type="dxa" w:w="2154"/>
+          </w:tcPr>
+          <w:p>
+            <w:pPr>
+              <w:spacing w:after="60" w:line="276" w:lineRule="auto"/>
+              <w:jc w:val="left"/>
+            </w:pPr>
+            <w:r>
+              <w:rPr>
+                <w:rFonts w:ascii="Times New Roman" w:hAnsi="Times New Roman" w:eastAsia="Times New Roman"/>
+                <w:color w:val="000000"/>
+                <w:sz w:val="21"/>
+              </w:rPr>
+              <w:t>Train thay thế / external test</w:t>
+            </w:r>
+          </w:p>
+        </w:tc>
+        <w:tc>
+          <w:tcPr>
+            <w:tcW w:type="dxa" w:w="2211"/>
+          </w:tcPr>
+          <w:p>
+            <w:pPr>
+              <w:spacing w:after="60" w:line="276" w:lineRule="auto"/>
+              <w:jc w:val="left"/>
+            </w:pPr>
+            <w:r>
+              <w:rPr>
+                <w:rFonts w:ascii="Times New Roman" w:hAnsi="Times New Roman" w:eastAsia="Times New Roman"/>
+                <w:color w:val="000000"/>
+                <w:sz w:val="21"/>
+              </w:rPr>
+              <w:t>External multi-word test</w:t>
+            </w:r>
+          </w:p>
+        </w:tc>
+      </w:tr>
+    </w:tbl>
+    <w:p>
+      <w:pPr>
+        <w:spacing w:after="120"/>
+      </w:pPr>
+    </w:p>
+    <w:p>
+      <w:pPr>
+        <w:spacing w:line="360" w:lineRule="auto" w:after="120"/>
+        <w:ind w:firstLine="0"/>
+        <w:jc w:val="both"/>
+      </w:pPr>
+      <w:r>
+        <w:rPr>
+          <w:rFonts w:ascii="Times New Roman" w:hAnsi="Times New Roman" w:eastAsia="Times New Roman"/>
+          <w:b w:val="0"/>
+          <w:i w:val="0"/>
+          <w:color w:val="000000"/>
+          <w:sz w:val="26"/>
+        </w:rPr>
+        <w:t>Qua đó, nhóm giữ cùng chuẩn kỹ thuật cho ba dataset nhưng điều chỉnh cách xử lý độ dài theo bản chất của dữ liệu. Điều này tránh việc ép tất cả dataset về cùng một dạng một cách máy móc và giúp các thí nghiệm sau có ý nghĩa hơn.</w:t>
       </w:r>
     </w:p>
     <w:p>
@@ -11008,8 +13994,8 @@
       </w:r>
     </w:p>
     <w:sectPr>
-      <w:footerReference w:type="default" r:id="rId20"/>
-      <w:footerReference w:type="first" r:id="rId21"/>
+      <w:footerReference w:type="default" r:id="rId21"/>
+      <w:footerReference w:type="first" r:id="rId22"/>
       <w:pgSz w:w="12240" w:h="15840"/>
       <w:pgMar w:top="1134" w:right="1134" w:bottom="1134" w:left="1701" w:header="720" w:footer="720" w:gutter="0"/>
       <w:cols w:space="720"/>

</xml_diff>

<commit_message>
docs: hoan thien muc 2.4 dac trung tieng noi MFCC va kich thuoc tensor thuc te [1, 51, 40]
</commit_message>
<xml_diff>
--- a/docs/report/Bao_cao_hang_muc_cham_giua_ky_Xu_ly_tieng_noi.docx
+++ b/docs/report/Bao_cao_hang_muc_cham_giua_ky_Xu_ly_tieng_noi.docx
@@ -17456,7 +17456,4076 @@
           <w:color w:val="000000"/>
           <w:sz w:val="28"/>
         </w:rPr>
-        <w:t>2.4. Các đặc trưng tiếng nói sử dụng trong đồ án</w:t>
+        <w:t>2.4. Đặc trưng tiếng nói sử dụng trong đồ án</w:t>
+      </w:r>
+    </w:p>
+    <w:p>
+      <w:pPr>
+        <w:spacing w:line="360" w:lineRule="auto" w:after="120"/>
+        <w:ind w:firstLine="0"/>
+        <w:jc w:val="both"/>
+      </w:pPr>
+      <w:r>
+        <w:rPr>
+          <w:rFonts w:ascii="Times New Roman" w:hAnsi="Times New Roman" w:eastAsia="Times New Roman"/>
+          <w:b w:val="0"/>
+          <w:i w:val="0"/>
+          <w:color w:val="000000"/>
+          <w:sz w:val="26"/>
+        </w:rPr>
+        <w:t>Sau quá trình chuẩn bị dữ liệu, tín hiệu âm thanh chưa được đưa trực tiếp vào TD-ResNet dưới dạng waveform thô. Repository Few-Shot-KWS thực hiện bước trích xuất đặc trưng Mel-Frequency Cepstral Coefficients (MFCC) và sử dụng ma trận MFCC làm đầu vào cho embedding network.</w:t>
+      </w:r>
+    </w:p>
+    <w:p>
+      <w:pPr>
+        <w:spacing w:line="360" w:lineRule="auto" w:after="120"/>
+        <w:ind w:firstLine="0"/>
+        <w:jc w:val="both"/>
+      </w:pPr>
+      <w:r>
+        <w:rPr>
+          <w:rFonts w:ascii="Times New Roman" w:hAnsi="Times New Roman" w:eastAsia="Times New Roman"/>
+          <w:b w:val="0"/>
+          <w:i w:val="0"/>
+          <w:color w:val="000000"/>
+          <w:sz w:val="26"/>
+        </w:rPr>
+        <w:t>Quy trình tổng quát:</w:t>
+      </w:r>
+    </w:p>
+    <w:tbl>
+      <w:tblPr>
+        <w:tblW w:type="auto" w:w="0"/>
+        <w:jc w:val="center"/>
+        <w:tblLayout w:type="fixed"/>
+        <w:tblLook w:firstColumn="1" w:firstRow="1" w:lastColumn="0" w:lastRow="0" w:noHBand="0" w:noVBand="1" w:val="04A0"/>
+      </w:tblPr>
+      <w:tblGrid>
+        <w:gridCol w:w="9405"/>
+      </w:tblGrid>
+      <w:tr>
+        <w:tc>
+          <w:tcPr>
+            <w:tcW w:type="dxa" w:w="8787"/>
+            <w:shd w:fill="F8FAFC"/>
+            <w:tcBorders>
+              <w:top w:val="single" w:sz="4" w:space="0" w:color="E2E8F0"/>
+              <w:left w:val="single" w:sz="18" w:space="0" w:color="2563EB"/>
+              <w:bottom w:val="single" w:sz="4" w:space="0" w:color="E2E8F0"/>
+              <w:right w:val="single" w:sz="4" w:space="0" w:color="E2E8F0"/>
+            </w:tcBorders>
+          </w:tcPr>
+          <w:p>
+            <w:pPr>
+              <w:spacing w:before="80" w:after="80" w:line="276" w:lineRule="auto"/>
+            </w:pPr>
+            <w:r>
+              <w:rPr>
+                <w:rFonts w:ascii="Consolas" w:hAnsi="Consolas"/>
+                <w:color w:val="1E293B"/>
+                <w:sz w:val="19"/>
+              </w:rPr>
+              <w:t>Waveform</w:t>
+              <w:br/>
+              <w:t xml:space="preserve">   ↓</w:t>
+              <w:br/>
+              <w:t>Chia tín hiệu theo các cửa sổ thời gian</w:t>
+              <w:br/>
+              <w:t xml:space="preserve">   ↓</w:t>
+              <w:br/>
+              <w:t>Biểu diễn phổ tần số</w:t>
+              <w:br/>
+              <w:t xml:space="preserve">   ↓</w:t>
+              <w:br/>
+              <w:t>Mel filter bank</w:t>
+              <w:br/>
+              <w:t xml:space="preserve">   ↓</w:t>
+              <w:br/>
+              <w:t>Log-Mel representation</w:t>
+              <w:br/>
+              <w:t xml:space="preserve">   ↓</w:t>
+              <w:br/>
+              <w:t>DCT</w:t>
+              <w:br/>
+              <w:t xml:space="preserve">   ↓</w:t>
+              <w:br/>
+              <w:t>MFCC</w:t>
+              <w:br/>
+              <w:t xml:space="preserve">   ↓</w:t>
+              <w:br/>
+              <w:t>TD-ResNet</w:t>
+            </w:r>
+          </w:p>
+        </w:tc>
+      </w:tr>
+    </w:tbl>
+    <w:p>
+      <w:pPr>
+        <w:spacing w:after="80"/>
+      </w:pPr>
+    </w:p>
+    <w:p>
+      <w:pPr>
+        <w:spacing w:line="360" w:lineRule="auto" w:after="120"/>
+        <w:ind w:firstLine="0"/>
+        <w:jc w:val="both"/>
+      </w:pPr>
+      <w:r>
+        <w:rPr>
+          <w:rFonts w:ascii="Times New Roman" w:hAnsi="Times New Roman" w:eastAsia="Times New Roman"/>
+          <w:b/>
+          <w:i w:val="0"/>
+          <w:color w:val="000000"/>
+          <w:sz w:val="26"/>
+        </w:rPr>
+        <w:t>Do đó, MFCC là đặc trưng tiếng nói chính được sử dụng trực tiếp trong mô hình của đồ án.</w:t>
+      </w:r>
+    </w:p>
+    <w:p>
+      <w:pPr>
+        <w:pStyle w:val="Heading3"/>
+        <w:keepNext/>
+        <w:spacing w:before="200" w:after="80"/>
+      </w:pPr>
+      <w:r>
+        <w:rPr>
+          <w:rFonts w:ascii="Times New Roman" w:hAnsi="Times New Roman" w:eastAsia="Times New Roman"/>
+          <w:b/>
+          <w:color w:val="000000"/>
+          <w:sz w:val="26"/>
+        </w:rPr>
+        <w:t>2.4.1. Waveform</w:t>
+      </w:r>
+    </w:p>
+    <w:p>
+      <w:pPr>
+        <w:spacing w:line="360" w:lineRule="auto" w:after="120"/>
+        <w:ind w:firstLine="0"/>
+        <w:jc w:val="both"/>
+      </w:pPr>
+      <w:r>
+        <w:rPr>
+          <w:rFonts w:ascii="Times New Roman" w:hAnsi="Times New Roman" w:eastAsia="Times New Roman"/>
+          <w:b w:val="0"/>
+          <w:i w:val="0"/>
+          <w:color w:val="000000"/>
+          <w:sz w:val="26"/>
+        </w:rPr>
+        <w:t>Waveform là dạng biểu diễn cơ bản nhất của tín hiệu âm thanh trong miền thời gian. Một tín hiệu có thể biểu diễn:</w:t>
+      </w:r>
+    </w:p>
+    <w:p>
+      <w:pPr>
+        <w:spacing w:before="80" w:after="120"/>
+        <w:jc w:val="center"/>
+      </w:pPr>
+      <w:r>
+        <w:rPr>
+          <w:rFonts w:ascii="Cambria Math" w:hAnsi="Cambria Math" w:eastAsia="Cambria Math"/>
+          <w:color w:val="000000"/>
+          <w:sz w:val="24"/>
+        </w:rPr>
+        <w:t>x[n], \quad n = 0, 1, \ldots, N-1</w:t>
+      </w:r>
+    </w:p>
+    <w:p>
+      <w:pPr>
+        <w:spacing w:line="360" w:lineRule="auto" w:after="120"/>
+        <w:ind w:firstLine="0"/>
+        <w:jc w:val="both"/>
+      </w:pPr>
+      <w:r>
+        <w:rPr>
+          <w:rFonts w:ascii="Times New Roman" w:hAnsi="Times New Roman" w:eastAsia="Times New Roman"/>
+          <w:b w:val="0"/>
+          <w:i w:val="0"/>
+          <w:color w:val="000000"/>
+          <w:sz w:val="26"/>
+        </w:rPr>
+        <w:t>Trong đó: x[n] là biên độ của tín hiệu tại sample thứ n; N là tổng số sample.</w:t>
+      </w:r>
+    </w:p>
+    <w:p>
+      <w:pPr>
+        <w:spacing w:line="360" w:lineRule="auto" w:after="120"/>
+        <w:ind w:firstLine="0"/>
+        <w:jc w:val="both"/>
+      </w:pPr>
+      <w:r>
+        <w:rPr>
+          <w:rFonts w:ascii="Times New Roman" w:hAnsi="Times New Roman" w:eastAsia="Times New Roman"/>
+          <w:b w:val="0"/>
+          <w:i w:val="0"/>
+          <w:color w:val="000000"/>
+          <w:sz w:val="26"/>
+        </w:rPr>
+        <w:t>Sau preprocessing, input chuẩn của hệ thống có sample rate:</w:t>
+      </w:r>
+    </w:p>
+    <w:p>
+      <w:pPr>
+        <w:spacing w:before="80" w:after="120"/>
+        <w:jc w:val="center"/>
+      </w:pPr>
+      <w:r>
+        <w:rPr>
+          <w:rFonts w:ascii="Cambria Math" w:hAnsi="Cambria Math" w:eastAsia="Cambria Math"/>
+          <w:color w:val="000000"/>
+          <w:sz w:val="24"/>
+        </w:rPr>
+        <w:t>f_s = 16000\text{ Hz}</w:t>
+      </w:r>
+    </w:p>
+    <w:p>
+      <w:pPr>
+        <w:spacing w:line="360" w:lineRule="auto" w:after="120"/>
+        <w:ind w:firstLine="0"/>
+        <w:jc w:val="both"/>
+      </w:pPr>
+      <w:r>
+        <w:rPr>
+          <w:rFonts w:ascii="Times New Roman" w:hAnsi="Times New Roman" w:eastAsia="Times New Roman"/>
+          <w:b w:val="0"/>
+          <w:i w:val="0"/>
+          <w:color w:val="000000"/>
+          <w:sz w:val="26"/>
+        </w:rPr>
+        <w:t>Với một đoạn audio dài 1 giây:</w:t>
+      </w:r>
+    </w:p>
+    <w:p>
+      <w:pPr>
+        <w:spacing w:before="80" w:after="120"/>
+        <w:jc w:val="center"/>
+      </w:pPr>
+      <w:r>
+        <w:rPr>
+          <w:rFonts w:ascii="Cambria Math" w:hAnsi="Cambria Math" w:eastAsia="Cambria Math"/>
+          <w:color w:val="000000"/>
+          <w:sz w:val="24"/>
+        </w:rPr>
+        <w:t>N = 16000\text{ sample}</w:t>
+      </w:r>
+    </w:p>
+    <w:p>
+      <w:pPr>
+        <w:spacing w:line="360" w:lineRule="auto" w:after="120"/>
+        <w:ind w:firstLine="0"/>
+        <w:jc w:val="both"/>
+      </w:pPr>
+      <w:r>
+        <w:rPr>
+          <w:rFonts w:ascii="Times New Roman" w:hAnsi="Times New Roman" w:eastAsia="Times New Roman"/>
+          <w:b w:val="0"/>
+          <w:i w:val="0"/>
+          <w:color w:val="000000"/>
+          <w:sz w:val="26"/>
+        </w:rPr>
+        <w:t>Waveform chứa toàn bộ thông tin tín hiệu, tuy nhiên việc sử dụng trực tiếp waveform khiến mô hình phải tự học cả những biến đổi từ miền thời gian sang các đặc trưng liên quan tới phổ tiếng nói. Trong pipeline hiện tại, waveform được chuyển thành MFCC trước khi đưa vào TD-ResNet.</w:t>
+      </w:r>
+    </w:p>
+    <w:p>
+      <w:pPr>
+        <w:pStyle w:val="Heading3"/>
+        <w:keepNext/>
+        <w:spacing w:before="200" w:after="80"/>
+      </w:pPr>
+      <w:r>
+        <w:rPr>
+          <w:rFonts w:ascii="Times New Roman" w:hAnsi="Times New Roman" w:eastAsia="Times New Roman"/>
+          <w:b/>
+          <w:color w:val="000000"/>
+          <w:sz w:val="26"/>
+        </w:rPr>
+        <w:t>2.4.2. Tại sao tín hiệu tiếng nói được chia thành các frame?</w:t>
+      </w:r>
+    </w:p>
+    <w:p>
+      <w:pPr>
+        <w:spacing w:line="360" w:lineRule="auto" w:after="120"/>
+        <w:ind w:firstLine="0"/>
+        <w:jc w:val="both"/>
+      </w:pPr>
+      <w:r>
+        <w:rPr>
+          <w:rFonts w:ascii="Times New Roman" w:hAnsi="Times New Roman" w:eastAsia="Times New Roman"/>
+          <w:b w:val="0"/>
+          <w:i w:val="0"/>
+          <w:color w:val="000000"/>
+          <w:sz w:val="26"/>
+        </w:rPr>
+        <w:t>Tín hiệu tiếng nói thay đổi theo thời gian và không thể xem toàn bộ một utterance dài như một tín hiệu tĩnh.</w:t>
+      </w:r>
+    </w:p>
+    <w:p>
+      <w:pPr>
+        <w:spacing w:line="360" w:lineRule="auto" w:after="120"/>
+        <w:ind w:firstLine="0"/>
+        <w:jc w:val="both"/>
+      </w:pPr>
+      <w:r>
+        <w:rPr>
+          <w:rFonts w:ascii="Times New Roman" w:hAnsi="Times New Roman" w:eastAsia="Times New Roman"/>
+          <w:b w:val="0"/>
+          <w:i w:val="0"/>
+          <w:color w:val="000000"/>
+          <w:sz w:val="26"/>
+        </w:rPr>
+        <w:t>Tuy nhiên, trong một khoảng thời gian ngắn khoảng vài chục mili giây, đặc điểm phổ của tiếng nói có thể được xem là tương đối ổn định. Vì vậy tín hiệu được phân tích theo các cửa sổ ngắn.</w:t>
+      </w:r>
+    </w:p>
+    <w:p>
+      <w:pPr>
+        <w:spacing w:line="360" w:lineRule="auto" w:after="120"/>
+        <w:ind w:firstLine="0"/>
+        <w:jc w:val="both"/>
+      </w:pPr>
+      <w:r>
+        <w:rPr>
+          <w:rFonts w:ascii="Times New Roman" w:hAnsi="Times New Roman" w:eastAsia="Times New Roman"/>
+          <w:b w:val="0"/>
+          <w:i w:val="0"/>
+          <w:color w:val="000000"/>
+          <w:sz w:val="26"/>
+        </w:rPr>
+        <w:t>Repository sử dụng:</w:t>
+      </w:r>
+    </w:p>
+    <w:p>
+      <w:pPr>
+        <w:spacing w:before="80" w:after="120"/>
+        <w:jc w:val="center"/>
+      </w:pPr>
+      <w:r>
+        <w:rPr>
+          <w:rFonts w:ascii="Cambria Math" w:hAnsi="Cambria Math" w:eastAsia="Cambria Math"/>
+          <w:color w:val="000000"/>
+          <w:sz w:val="24"/>
+        </w:rPr>
+        <w:t>window\_size = 40\text{ ms} \quad \text{và} \quad window\_stride = 20\text{ ms}</w:t>
+      </w:r>
+    </w:p>
+    <w:p>
+      <w:pPr>
+        <w:spacing w:line="360" w:lineRule="auto" w:after="120"/>
+        <w:ind w:firstLine="0"/>
+        <w:jc w:val="both"/>
+      </w:pPr>
+      <w:r>
+        <w:rPr>
+          <w:rFonts w:ascii="Times New Roman" w:hAnsi="Times New Roman" w:eastAsia="Times New Roman"/>
+          <w:b w:val="0"/>
+          <w:i w:val="0"/>
+          <w:color w:val="000000"/>
+          <w:sz w:val="26"/>
+        </w:rPr>
+        <w:t>Với sample rate f_s = 16000 Hz, số sample của một cửa sổ là:</w:t>
+      </w:r>
+    </w:p>
+    <w:p>
+      <w:pPr>
+        <w:spacing w:before="80" w:after="120"/>
+        <w:jc w:val="center"/>
+      </w:pPr>
+      <w:r>
+        <w:rPr>
+          <w:rFonts w:ascii="Cambria Math" w:hAnsi="Cambria Math" w:eastAsia="Cambria Math"/>
+          <w:color w:val="000000"/>
+          <w:sz w:val="24"/>
+        </w:rPr>
+        <w:t>0.04 \times 16000 = 640\text{ sample}</w:t>
+      </w:r>
+    </w:p>
+    <w:p>
+      <w:pPr>
+        <w:spacing w:line="360" w:lineRule="auto" w:after="120"/>
+        <w:ind w:firstLine="0"/>
+        <w:jc w:val="both"/>
+      </w:pPr>
+      <w:r>
+        <w:rPr>
+          <w:rFonts w:ascii="Times New Roman" w:hAnsi="Times New Roman" w:eastAsia="Times New Roman"/>
+          <w:b w:val="0"/>
+          <w:i w:val="0"/>
+          <w:color w:val="000000"/>
+          <w:sz w:val="26"/>
+        </w:rPr>
+        <w:t>Khoảng dịch giữa hai cửa sổ liên tiếp:</w:t>
+      </w:r>
+    </w:p>
+    <w:p>
+      <w:pPr>
+        <w:spacing w:before="80" w:after="120"/>
+        <w:jc w:val="center"/>
+      </w:pPr>
+      <w:r>
+        <w:rPr>
+          <w:rFonts w:ascii="Cambria Math" w:hAnsi="Cambria Math" w:eastAsia="Cambria Math"/>
+          <w:color w:val="000000"/>
+          <w:sz w:val="24"/>
+        </w:rPr>
+        <w:t>0.02 \times 16000 = 320\text{ sample}</w:t>
+      </w:r>
+    </w:p>
+    <w:p>
+      <w:pPr>
+        <w:spacing w:line="360" w:lineRule="auto" w:after="120"/>
+        <w:ind w:firstLine="0"/>
+        <w:jc w:val="both"/>
+      </w:pPr>
+      <w:r>
+        <w:rPr>
+          <w:rFonts w:ascii="Times New Roman" w:hAnsi="Times New Roman" w:eastAsia="Times New Roman"/>
+          <w:b w:val="0"/>
+          <w:i w:val="0"/>
+          <w:color w:val="000000"/>
+          <w:sz w:val="26"/>
+        </w:rPr>
+        <w:t>Có thể hình dung sự chồng lấn giữa các frame:</w:t>
+      </w:r>
+    </w:p>
+    <w:tbl>
+      <w:tblPr>
+        <w:tblW w:type="auto" w:w="0"/>
+        <w:jc w:val="center"/>
+        <w:tblLayout w:type="fixed"/>
+        <w:tblLook w:firstColumn="1" w:firstRow="1" w:lastColumn="0" w:lastRow="0" w:noHBand="0" w:noVBand="1" w:val="04A0"/>
+      </w:tblPr>
+      <w:tblGrid>
+        <w:gridCol w:w="9405"/>
+      </w:tblGrid>
+      <w:tr>
+        <w:tc>
+          <w:tcPr>
+            <w:tcW w:type="dxa" w:w="8787"/>
+            <w:shd w:fill="F8FAFC"/>
+            <w:tcBorders>
+              <w:top w:val="single" w:sz="4" w:space="0" w:color="E2E8F0"/>
+              <w:left w:val="single" w:sz="18" w:space="0" w:color="2563EB"/>
+              <w:bottom w:val="single" w:sz="4" w:space="0" w:color="E2E8F0"/>
+              <w:right w:val="single" w:sz="4" w:space="0" w:color="E2E8F0"/>
+            </w:tcBorders>
+          </w:tcPr>
+          <w:p>
+            <w:pPr>
+              <w:spacing w:before="80" w:after="80" w:line="276" w:lineRule="auto"/>
+            </w:pPr>
+            <w:r>
+              <w:rPr>
+                <w:rFonts w:ascii="Consolas" w:hAnsi="Consolas"/>
+                <w:color w:val="1E293B"/>
+                <w:sz w:val="19"/>
+              </w:rPr>
+              <w:t>Audio waveform</w:t>
+              <w:br/>
+              <w:t>|------------- frame 1 -------------|</w:t>
+              <w:br/>
+              <w:t xml:space="preserve">                    |------------- frame 2 -------------|</w:t>
+              <w:br/>
+              <w:t xml:space="preserve">                                        |------------- frame 3 -------------|</w:t>
+            </w:r>
+          </w:p>
+        </w:tc>
+      </w:tr>
+    </w:tbl>
+    <w:p>
+      <w:pPr>
+        <w:spacing w:after="80"/>
+      </w:pPr>
+    </w:p>
+    <w:p>
+      <w:pPr>
+        <w:spacing w:line="360" w:lineRule="auto" w:after="120"/>
+        <w:ind w:firstLine="0"/>
+        <w:jc w:val="both"/>
+      </w:pPr>
+      <w:r>
+        <w:rPr>
+          <w:rFonts w:ascii="Times New Roman" w:hAnsi="Times New Roman" w:eastAsia="Times New Roman"/>
+          <w:b w:val="0"/>
+          <w:i w:val="0"/>
+          <w:color w:val="000000"/>
+          <w:sz w:val="26"/>
+        </w:rPr>
+        <w:t>Do stride nhỏ hơn window size nên các frame liên tiếp bị chồng lấn. Với window = 40 ms và stride = 20 ms, mức overlap là khoảng 20 ms (tương đương khoảng 50% chiều dài cửa sổ). Việc overlap giúp hạn chế tối đa việc mất thông tin tại biên giữa hai frame liên tiếp.</w:t>
+      </w:r>
+    </w:p>
+    <w:p>
+      <w:pPr>
+        <w:pStyle w:val="Heading3"/>
+        <w:keepNext/>
+        <w:spacing w:before="200" w:after="80"/>
+      </w:pPr>
+      <w:r>
+        <w:rPr>
+          <w:rFonts w:ascii="Times New Roman" w:hAnsi="Times New Roman" w:eastAsia="Times New Roman"/>
+          <w:b/>
+          <w:color w:val="000000"/>
+          <w:sz w:val="26"/>
+        </w:rPr>
+        <w:t>2.4.3. Chuyển tín hiệu sang miền tần số</w:t>
+      </w:r>
+    </w:p>
+    <w:p>
+      <w:pPr>
+        <w:spacing w:line="360" w:lineRule="auto" w:after="120"/>
+        <w:ind w:firstLine="0"/>
+        <w:jc w:val="both"/>
+      </w:pPr>
+      <w:r>
+        <w:rPr>
+          <w:rFonts w:ascii="Times New Roman" w:hAnsi="Times New Roman" w:eastAsia="Times New Roman"/>
+          <w:b w:val="0"/>
+          <w:i w:val="0"/>
+          <w:color w:val="000000"/>
+          <w:sz w:val="26"/>
+        </w:rPr>
+        <w:t>Waveform biểu diễn âm thanh trong miền thời gian x[n]. Tuy nhiên để phân tích các thành phần tần số trong tiếng nói, mỗi frame được chuyển sang miền tần số qua phép biến đổi Fourier rời rạc:</w:t>
+      </w:r>
+    </w:p>
+    <w:p>
+      <w:pPr>
+        <w:spacing w:before="80" w:after="120"/>
+        <w:jc w:val="center"/>
+      </w:pPr>
+      <w:r>
+        <w:rPr>
+          <w:rFonts w:ascii="Cambria Math" w:hAnsi="Cambria Math" w:eastAsia="Cambria Math"/>
+          <w:color w:val="000000"/>
+          <w:sz w:val="24"/>
+        </w:rPr>
+        <w:t>X[k] = \sum_{n=0}^{N-1} x[n] e^{-j2\pi kn / N}</w:t>
+      </w:r>
+    </w:p>
+    <w:p>
+      <w:pPr>
+        <w:spacing w:line="360" w:lineRule="auto" w:after="120"/>
+        <w:ind w:firstLine="0"/>
+        <w:jc w:val="both"/>
+      </w:pPr>
+      <w:r>
+        <w:rPr>
+          <w:rFonts w:ascii="Times New Roman" w:hAnsi="Times New Roman" w:eastAsia="Times New Roman"/>
+          <w:b w:val="0"/>
+          <w:i w:val="0"/>
+          <w:color w:val="000000"/>
+          <w:sz w:val="26"/>
+        </w:rPr>
+        <w:t>Kết quả cho biết mức đóng góp của các thành phần tần số khác nhau trong frame. Trong pipeline của repository, kích thước FFT được xác định từ:</w:t>
+      </w:r>
+    </w:p>
+    <w:tbl>
+      <w:tblPr>
+        <w:tblW w:type="auto" w:w="0"/>
+        <w:jc w:val="center"/>
+        <w:tblLayout w:type="fixed"/>
+        <w:tblLook w:firstColumn="1" w:firstRow="1" w:lastColumn="0" w:lastRow="0" w:noHBand="0" w:noVBand="1" w:val="04A0"/>
+      </w:tblPr>
+      <w:tblGrid>
+        <w:gridCol w:w="9405"/>
+      </w:tblGrid>
+      <w:tr>
+        <w:tc>
+          <w:tcPr>
+            <w:tcW w:type="dxa" w:w="8787"/>
+            <w:shd w:fill="F8FAFC"/>
+            <w:tcBorders>
+              <w:top w:val="single" w:sz="4" w:space="0" w:color="E2E8F0"/>
+              <w:left w:val="single" w:sz="18" w:space="0" w:color="2563EB"/>
+              <w:bottom w:val="single" w:sz="4" w:space="0" w:color="E2E8F0"/>
+              <w:right w:val="single" w:sz="4" w:space="0" w:color="E2E8F0"/>
+            </w:tcBorders>
+          </w:tcPr>
+          <w:p>
+            <w:pPr>
+              <w:spacing w:before="80" w:after="80" w:line="276" w:lineRule="auto"/>
+            </w:pPr>
+            <w:r>
+              <w:rPr>
+                <w:rFonts w:ascii="Consolas" w:hAnsi="Consolas"/>
+                <w:color w:val="1E293B"/>
+                <w:sz w:val="19"/>
+              </w:rPr>
+              <w:t>n_fft = frame_len * sample_rate</w:t>
+            </w:r>
+          </w:p>
+        </w:tc>
+      </w:tr>
+    </w:tbl>
+    <w:p>
+      <w:pPr>
+        <w:spacing w:after="80"/>
+      </w:pPr>
+    </w:p>
+    <w:p>
+      <w:pPr>
+        <w:spacing w:line="360" w:lineRule="auto" w:after="120"/>
+        <w:ind w:firstLine="0"/>
+        <w:jc w:val="both"/>
+      </w:pPr>
+      <w:r>
+        <w:rPr>
+          <w:rFonts w:ascii="Times New Roman" w:hAnsi="Times New Roman" w:eastAsia="Times New Roman"/>
+          <w:b w:val="0"/>
+          <w:i w:val="0"/>
+          <w:color w:val="000000"/>
+          <w:sz w:val="26"/>
+        </w:rPr>
+        <w:t>Với frame_len = 0.04 s và sample_rate = 16000, ta có:</w:t>
+      </w:r>
+    </w:p>
+    <w:p>
+      <w:pPr>
+        <w:spacing w:before="80" w:after="120"/>
+        <w:jc w:val="center"/>
+      </w:pPr>
+      <w:r>
+        <w:rPr>
+          <w:rFonts w:ascii="Cambria Math" w:hAnsi="Cambria Math" w:eastAsia="Cambria Math"/>
+          <w:color w:val="000000"/>
+          <w:sz w:val="24"/>
+        </w:rPr>
+        <w:t>n_{fft} = 640</w:t>
+      </w:r>
+    </w:p>
+    <w:p>
+      <w:pPr>
+        <w:spacing w:line="360" w:lineRule="auto" w:after="120"/>
+        <w:ind w:firstLine="0"/>
+        <w:jc w:val="both"/>
+      </w:pPr>
+      <w:r>
+        <w:rPr>
+          <w:rFonts w:ascii="Times New Roman" w:hAnsi="Times New Roman" w:eastAsia="Times New Roman"/>
+          <w:b w:val="0"/>
+          <w:i w:val="0"/>
+          <w:color w:val="000000"/>
+          <w:sz w:val="26"/>
+        </w:rPr>
+        <w:t>Repository truyền trực tiếp giá trị này vào bộ MFCC.</w:t>
+      </w:r>
+    </w:p>
+    <w:p>
+      <w:pPr>
+        <w:pStyle w:val="Heading3"/>
+        <w:keepNext/>
+        <w:spacing w:before="200" w:after="80"/>
+      </w:pPr>
+      <w:r>
+        <w:rPr>
+          <w:rFonts w:ascii="Times New Roman" w:hAnsi="Times New Roman" w:eastAsia="Times New Roman"/>
+          <w:b/>
+          <w:color w:val="000000"/>
+          <w:sz w:val="26"/>
+        </w:rPr>
+        <w:t>2.4.4. Mel scale</w:t>
+      </w:r>
+    </w:p>
+    <w:p>
+      <w:pPr>
+        <w:spacing w:line="360" w:lineRule="auto" w:after="120"/>
+        <w:ind w:firstLine="0"/>
+        <w:jc w:val="both"/>
+      </w:pPr>
+      <w:r>
+        <w:rPr>
+          <w:rFonts w:ascii="Times New Roman" w:hAnsi="Times New Roman" w:eastAsia="Times New Roman"/>
+          <w:b w:val="0"/>
+          <w:i w:val="0"/>
+          <w:color w:val="000000"/>
+          <w:sz w:val="26"/>
+        </w:rPr>
+        <w:t>Tai người không cảm nhận sự thay đổi tần số hoàn toàn tuyến tính. Ở vùng tần số thấp, con người nhạy hơn với những thay đổi nhỏ; ở vùng tần số cao, mức độ phân biệt tần số giảm dần. Vì vậy nhiều hệ thống speech processing sử dụng Mel scale để biến đổi trục tần số vật lý sang thang gần với cảm nhận của con người.</w:t>
+      </w:r>
+    </w:p>
+    <w:p>
+      <w:pPr>
+        <w:spacing w:line="360" w:lineRule="auto" w:after="120"/>
+        <w:ind w:firstLine="0"/>
+        <w:jc w:val="both"/>
+      </w:pPr>
+      <w:r>
+        <w:rPr>
+          <w:rFonts w:ascii="Times New Roman" w:hAnsi="Times New Roman" w:eastAsia="Times New Roman"/>
+          <w:b w:val="0"/>
+          <w:i w:val="0"/>
+          <w:color w:val="000000"/>
+          <w:sz w:val="26"/>
+        </w:rPr>
+        <w:t>Công thức chuyển đổi Mel phổ biến:</w:t>
+      </w:r>
+    </w:p>
+    <w:p>
+      <w:pPr>
+        <w:spacing w:before="80" w:after="120"/>
+        <w:jc w:val="center"/>
+      </w:pPr>
+      <w:r>
+        <w:rPr>
+          <w:rFonts w:ascii="Cambria Math" w:hAnsi="Cambria Math" w:eastAsia="Cambria Math"/>
+          <w:color w:val="000000"/>
+          <w:sz w:val="24"/>
+        </w:rPr>
+        <w:t>Mel(f) = 2595 \log_{10} \left( 1 + \frac{f}{700} \right)</w:t>
+      </w:r>
+    </w:p>
+    <w:p>
+      <w:pPr>
+        <w:spacing w:line="360" w:lineRule="auto" w:after="120"/>
+        <w:ind w:firstLine="0"/>
+        <w:jc w:val="both"/>
+      </w:pPr>
+      <w:r>
+        <w:rPr>
+          <w:rFonts w:ascii="Times New Roman" w:hAnsi="Times New Roman" w:eastAsia="Times New Roman"/>
+          <w:b w:val="0"/>
+          <w:i w:val="0"/>
+          <w:color w:val="000000"/>
+          <w:sz w:val="26"/>
+        </w:rPr>
+        <w:t>Nhờ đó, năng lượng phổ được tổng hợp qua các Mel filter bank thay vì sử dụng trực tiếp toàn bộ FFT bin.</w:t>
+      </w:r>
+    </w:p>
+    <w:tbl>
+      <w:tblPr>
+        <w:tblW w:type="auto" w:w="0"/>
+        <w:jc w:val="center"/>
+        <w:tblLayout w:type="fixed"/>
+        <w:tblLook w:firstColumn="1" w:firstRow="1" w:lastColumn="0" w:lastRow="0" w:noHBand="0" w:noVBand="1" w:val="04A0"/>
+      </w:tblPr>
+      <w:tblGrid>
+        <w:gridCol w:w="9405"/>
+      </w:tblGrid>
+      <w:tr>
+        <w:tc>
+          <w:tcPr>
+            <w:tcW w:type="dxa" w:w="8787"/>
+            <w:shd w:fill="F8FAFC"/>
+            <w:tcBorders>
+              <w:top w:val="single" w:sz="4" w:space="0" w:color="E2E8F0"/>
+              <w:left w:val="single" w:sz="18" w:space="0" w:color="2563EB"/>
+              <w:bottom w:val="single" w:sz="4" w:space="0" w:color="E2E8F0"/>
+              <w:right w:val="single" w:sz="4" w:space="0" w:color="E2E8F0"/>
+            </w:tcBorders>
+          </w:tcPr>
+          <w:p>
+            <w:pPr>
+              <w:spacing w:before="80" w:after="80" w:line="276" w:lineRule="auto"/>
+            </w:pPr>
+            <w:r>
+              <w:rPr>
+                <w:rFonts w:ascii="Consolas" w:hAnsi="Consolas"/>
+                <w:color w:val="1E293B"/>
+                <w:sz w:val="19"/>
+              </w:rPr>
+              <w:t>Spectrum → Mel Filter Bank → Mel energies</w:t>
+            </w:r>
+          </w:p>
+        </w:tc>
+      </w:tr>
+    </w:tbl>
+    <w:p>
+      <w:pPr>
+        <w:spacing w:after="80"/>
+      </w:pPr>
+    </w:p>
+    <w:p>
+      <w:pPr>
+        <w:pStyle w:val="Heading3"/>
+        <w:keepNext/>
+        <w:spacing w:before="200" w:after="80"/>
+      </w:pPr>
+      <w:r>
+        <w:rPr>
+          <w:rFonts w:ascii="Times New Roman" w:hAnsi="Times New Roman" w:eastAsia="Times New Roman"/>
+          <w:b/>
+          <w:color w:val="000000"/>
+          <w:sz w:val="26"/>
+        </w:rPr>
+        <w:t>2.4.5. Log-Mel representation</w:t>
+      </w:r>
+    </w:p>
+    <w:p>
+      <w:pPr>
+        <w:spacing w:line="360" w:lineRule="auto" w:after="120"/>
+        <w:ind w:firstLine="0"/>
+        <w:jc w:val="both"/>
+      </w:pPr>
+      <w:r>
+        <w:rPr>
+          <w:rFonts w:ascii="Times New Roman" w:hAnsi="Times New Roman" w:eastAsia="Times New Roman"/>
+          <w:b w:val="0"/>
+          <w:i w:val="0"/>
+          <w:color w:val="000000"/>
+          <w:sz w:val="26"/>
+        </w:rPr>
+        <w:t>Biên độ và năng lượng trong tiếng nói có phạm vi biến thiên lớn. Do đó, năng lượng Mel thường được chuyển sang miền logarithm:</w:t>
+      </w:r>
+    </w:p>
+    <w:p>
+      <w:pPr>
+        <w:spacing w:before="80" w:after="120"/>
+        <w:jc w:val="center"/>
+      </w:pPr>
+      <w:r>
+        <w:rPr>
+          <w:rFonts w:ascii="Cambria Math" w:hAnsi="Cambria Math" w:eastAsia="Cambria Math"/>
+          <w:color w:val="000000"/>
+          <w:sz w:val="24"/>
+        </w:rPr>
+        <w:t>E_{log} = \log(E_{mel})</w:t>
+      </w:r>
+    </w:p>
+    <w:p>
+      <w:pPr>
+        <w:spacing w:line="360" w:lineRule="auto" w:after="120"/>
+        <w:ind w:firstLine="0"/>
+        <w:jc w:val="both"/>
+      </w:pPr>
+      <w:r>
+        <w:rPr>
+          <w:rFonts w:ascii="Times New Roman" w:hAnsi="Times New Roman" w:eastAsia="Times New Roman"/>
+          <w:b w:val="0"/>
+          <w:i w:val="0"/>
+          <w:color w:val="000000"/>
+          <w:sz w:val="26"/>
+        </w:rPr>
+        <w:t>Logarithm giúp nén miền giá trị và đồng thời gần hơn với đặc điểm cảm nhận cường độ âm thanh của con người.</w:t>
+      </w:r>
+    </w:p>
+    <w:tbl>
+      <w:tblPr>
+        <w:tblW w:type="auto" w:w="0"/>
+        <w:jc w:val="center"/>
+        <w:tblLayout w:type="fixed"/>
+        <w:tblLook w:firstColumn="1" w:firstRow="1" w:lastColumn="0" w:lastRow="0" w:noHBand="0" w:noVBand="1" w:val="04A0"/>
+      </w:tblPr>
+      <w:tblGrid>
+        <w:gridCol w:w="9405"/>
+      </w:tblGrid>
+      <w:tr>
+        <w:tc>
+          <w:tcPr>
+            <w:tcW w:type="dxa" w:w="8787"/>
+            <w:shd w:fill="F8FAFC"/>
+            <w:tcBorders>
+              <w:top w:val="single" w:sz="4" w:space="0" w:color="E2E8F0"/>
+              <w:left w:val="single" w:sz="18" w:space="0" w:color="2563EB"/>
+              <w:bottom w:val="single" w:sz="4" w:space="0" w:color="E2E8F0"/>
+              <w:right w:val="single" w:sz="4" w:space="0" w:color="E2E8F0"/>
+            </w:tcBorders>
+          </w:tcPr>
+          <w:p>
+            <w:pPr>
+              <w:spacing w:before="80" w:after="80" w:line="276" w:lineRule="auto"/>
+            </w:pPr>
+            <w:r>
+              <w:rPr>
+                <w:rFonts w:ascii="Consolas" w:hAnsi="Consolas"/>
+                <w:color w:val="1E293B"/>
+                <w:sz w:val="19"/>
+              </w:rPr>
+              <w:t>Waveform</w:t>
+              <w:br/>
+              <w:t xml:space="preserve">   ↓</w:t>
+              <w:br/>
+              <w:t>FFT</w:t>
+              <w:br/>
+              <w:t xml:space="preserve">   ↓</w:t>
+              <w:br/>
+              <w:t>Mel Filter Bank</w:t>
+              <w:br/>
+              <w:t xml:space="preserve">   ↓</w:t>
+              <w:br/>
+              <w:t>Log</w:t>
+              <w:br/>
+              <w:t xml:space="preserve">   ↓</w:t>
+              <w:br/>
+              <w:t>Log-Mel representation</w:t>
+            </w:r>
+          </w:p>
+        </w:tc>
+      </w:tr>
+    </w:tbl>
+    <w:p>
+      <w:pPr>
+        <w:spacing w:after="80"/>
+      </w:pPr>
+    </w:p>
+    <w:p>
+      <w:pPr>
+        <w:spacing w:line="360" w:lineRule="auto" w:after="120"/>
+        <w:ind w:firstLine="0"/>
+        <w:jc w:val="both"/>
+      </w:pPr>
+      <w:r>
+        <w:rPr>
+          <w:rFonts w:ascii="Times New Roman" w:hAnsi="Times New Roman" w:eastAsia="Times New Roman"/>
+          <w:b w:val="0"/>
+          <w:i w:val="0"/>
+          <w:color w:val="000000"/>
+          <w:sz w:val="26"/>
+        </w:rPr>
+        <w:t>Log-Mel cũng là một đặc trưng phổ biến trong các hệ thống nhận dạng tiếng nói hiện đại. Tuy nhiên, pipeline của paper không dừng ở Log-Mel mà tiếp tục chuyển thành MFCC.</w:t>
+      </w:r>
+    </w:p>
+    <w:p>
+      <w:pPr>
+        <w:pStyle w:val="Heading3"/>
+        <w:keepNext/>
+        <w:spacing w:before="200" w:after="80"/>
+      </w:pPr>
+      <w:r>
+        <w:rPr>
+          <w:rFonts w:ascii="Times New Roman" w:hAnsi="Times New Roman" w:eastAsia="Times New Roman"/>
+          <w:b/>
+          <w:color w:val="000000"/>
+          <w:sz w:val="26"/>
+        </w:rPr>
+        <w:t>2.4.6. MFCC</w:t>
+      </w:r>
+    </w:p>
+    <w:p>
+      <w:pPr>
+        <w:spacing w:line="360" w:lineRule="auto" w:after="120"/>
+        <w:ind w:firstLine="0"/>
+        <w:jc w:val="both"/>
+      </w:pPr>
+      <w:r>
+        <w:rPr>
+          <w:rFonts w:ascii="Times New Roman" w:hAnsi="Times New Roman" w:eastAsia="Times New Roman"/>
+          <w:b w:val="0"/>
+          <w:i w:val="0"/>
+          <w:color w:val="000000"/>
+          <w:sz w:val="26"/>
+        </w:rPr>
+        <w:t>MFCC là viết tắt của Mel-Frequency Cepstral Coefficients. Sau khi tính Log-Mel energies, phép biến đổi cosine rời rạc (DCT) được sử dụng để tạo các hệ số MFCC:</w:t>
+      </w:r>
+    </w:p>
+    <w:p>
+      <w:pPr>
+        <w:spacing w:before="80" w:after="120"/>
+        <w:jc w:val="center"/>
+      </w:pPr>
+      <w:r>
+        <w:rPr>
+          <w:rFonts w:ascii="Cambria Math" w:hAnsi="Cambria Math" w:eastAsia="Cambria Math"/>
+          <w:color w:val="000000"/>
+          <w:sz w:val="24"/>
+        </w:rPr>
+        <w:t>c_n = \sum_{m=1}^{M} \log(E_m) \cos \left[ \frac{\pi n}{M} \left(m - \frac{1}{2}\right) \right]</w:t>
+      </w:r>
+    </w:p>
+    <w:p>
+      <w:pPr>
+        <w:spacing w:line="360" w:lineRule="auto" w:after="120"/>
+        <w:ind w:firstLine="0"/>
+        <w:jc w:val="both"/>
+      </w:pPr>
+      <w:r>
+        <w:rPr>
+          <w:rFonts w:ascii="Times New Roman" w:hAnsi="Times New Roman" w:eastAsia="Times New Roman"/>
+          <w:b w:val="0"/>
+          <w:i w:val="0"/>
+          <w:color w:val="000000"/>
+          <w:sz w:val="26"/>
+        </w:rPr>
+        <w:t>Trong đó: E_m là năng lượng của Mel filter thứ m; M là số Mel filter; c_n là hệ số MFCC thứ n.</w:t>
+      </w:r>
+    </w:p>
+    <w:tbl>
+      <w:tblPr>
+        <w:tblW w:type="auto" w:w="0"/>
+        <w:jc w:val="center"/>
+        <w:tblLayout w:type="fixed"/>
+        <w:tblLook w:firstColumn="1" w:firstRow="1" w:lastColumn="0" w:lastRow="0" w:noHBand="0" w:noVBand="1" w:val="04A0"/>
+      </w:tblPr>
+      <w:tblGrid>
+        <w:gridCol w:w="9405"/>
+      </w:tblGrid>
+      <w:tr>
+        <w:tc>
+          <w:tcPr>
+            <w:tcW w:type="dxa" w:w="8787"/>
+            <w:shd w:fill="F8FAFC"/>
+            <w:tcBorders>
+              <w:top w:val="single" w:sz="4" w:space="0" w:color="E2E8F0"/>
+              <w:left w:val="single" w:sz="18" w:space="0" w:color="2563EB"/>
+              <w:bottom w:val="single" w:sz="4" w:space="0" w:color="E2E8F0"/>
+              <w:right w:val="single" w:sz="4" w:space="0" w:color="E2E8F0"/>
+            </w:tcBorders>
+          </w:tcPr>
+          <w:p>
+            <w:pPr>
+              <w:spacing w:before="80" w:after="80" w:line="276" w:lineRule="auto"/>
+            </w:pPr>
+            <w:r>
+              <w:rPr>
+                <w:rFonts w:ascii="Consolas" w:hAnsi="Consolas"/>
+                <w:color w:val="1E293B"/>
+                <w:sz w:val="19"/>
+              </w:rPr>
+              <w:t>Waveform</w:t>
+              <w:br/>
+              <w:t xml:space="preserve">   ↓</w:t>
+              <w:br/>
+              <w:t>Framing</w:t>
+              <w:br/>
+              <w:t xml:space="preserve">   ↓</w:t>
+              <w:br/>
+              <w:t>FFT / Spectrum</w:t>
+              <w:br/>
+              <w:t xml:space="preserve">   ↓</w:t>
+              <w:br/>
+              <w:t>Mel Filter Bank</w:t>
+              <w:br/>
+              <w:t xml:space="preserve">   ↓</w:t>
+              <w:br/>
+              <w:t>Log Mel Energy</w:t>
+              <w:br/>
+              <w:t xml:space="preserve">   ↓</w:t>
+              <w:br/>
+              <w:t>DCT</w:t>
+              <w:br/>
+              <w:t xml:space="preserve">   ↓</w:t>
+              <w:br/>
+              <w:t>MFCC</w:t>
+            </w:r>
+          </w:p>
+        </w:tc>
+      </w:tr>
+    </w:tbl>
+    <w:p>
+      <w:pPr>
+        <w:spacing w:after="80"/>
+      </w:pPr>
+    </w:p>
+    <w:p>
+      <w:pPr>
+        <w:spacing w:line="360" w:lineRule="auto" w:after="120"/>
+        <w:ind w:firstLine="0"/>
+        <w:jc w:val="both"/>
+      </w:pPr>
+      <w:r>
+        <w:rPr>
+          <w:rFonts w:ascii="Times New Roman" w:hAnsi="Times New Roman" w:eastAsia="Times New Roman"/>
+          <w:b w:val="0"/>
+          <w:i w:val="0"/>
+          <w:color w:val="000000"/>
+          <w:sz w:val="26"/>
+        </w:rPr>
+        <w:t>MFCC giúp nén thông tin phổ thành số lượng hệ số nhỏ hơn trong khi vẫn giữ các đặc điểm quan trọng phục vụ nhận dạng tiếng nói.</w:t>
+      </w:r>
+    </w:p>
+    <w:p>
+      <w:pPr>
+        <w:pStyle w:val="Heading3"/>
+        <w:keepNext/>
+        <w:spacing w:before="200" w:after="80"/>
+      </w:pPr>
+      <w:r>
+        <w:rPr>
+          <w:rFonts w:ascii="Times New Roman" w:hAnsi="Times New Roman" w:eastAsia="Times New Roman"/>
+          <w:b/>
+          <w:color w:val="000000"/>
+          <w:sz w:val="26"/>
+        </w:rPr>
+        <w:t>2.4.7. Cấu hình MFCC thực tế của hệ thống</w:t>
+      </w:r>
+    </w:p>
+    <w:p>
+      <w:pPr>
+        <w:spacing w:line="360" w:lineRule="auto" w:after="120"/>
+        <w:ind w:firstLine="0"/>
+        <w:jc w:val="both"/>
+      </w:pPr>
+      <w:r>
+        <w:rPr>
+          <w:rFonts w:ascii="Times New Roman" w:hAnsi="Times New Roman" w:eastAsia="Times New Roman"/>
+          <w:b w:val="0"/>
+          <w:i w:val="0"/>
+          <w:color w:val="000000"/>
+          <w:sz w:val="26"/>
+        </w:rPr>
+        <w:t>Source code của repository tạo bộ trích xuất MFCC như sau:</w:t>
+      </w:r>
+    </w:p>
+    <w:tbl>
+      <w:tblPr>
+        <w:tblW w:type="auto" w:w="0"/>
+        <w:jc w:val="center"/>
+        <w:tblLayout w:type="fixed"/>
+        <w:tblLook w:firstColumn="1" w:firstRow="1" w:lastColumn="0" w:lastRow="0" w:noHBand="0" w:noVBand="1" w:val="04A0"/>
+      </w:tblPr>
+      <w:tblGrid>
+        <w:gridCol w:w="9405"/>
+      </w:tblGrid>
+      <w:tr>
+        <w:tc>
+          <w:tcPr>
+            <w:tcW w:type="dxa" w:w="8787"/>
+            <w:shd w:fill="F8FAFC"/>
+            <w:tcBorders>
+              <w:top w:val="single" w:sz="4" w:space="0" w:color="E2E8F0"/>
+              <w:left w:val="single" w:sz="18" w:space="0" w:color="2563EB"/>
+              <w:bottom w:val="single" w:sz="4" w:space="0" w:color="E2E8F0"/>
+              <w:right w:val="single" w:sz="4" w:space="0" w:color="E2E8F0"/>
+            </w:tcBorders>
+          </w:tcPr>
+          <w:p>
+            <w:pPr>
+              <w:spacing w:before="80" w:after="80" w:line="276" w:lineRule="auto"/>
+            </w:pPr>
+            <w:r>
+              <w:rPr>
+                <w:rFonts w:ascii="Consolas" w:hAnsi="Consolas"/>
+                <w:color w:val="1E293B"/>
+                <w:sz w:val="19"/>
+              </w:rPr>
+              <w:t>frame_len = self.window_size_ms / 1000</w:t>
+              <w:br/>
+              <w:t>stride = self.window_stride_ms / 1000</w:t>
+              <w:br/>
+              <w:br/>
+              <w:t>mfcc = torchaudio.transforms.MFCC(</w:t>
+              <w:br/>
+              <w:t xml:space="preserve">    self.sample_rate,</w:t>
+              <w:br/>
+              <w:t xml:space="preserve">    n_mfcc=self.feature_bin_count,</w:t>
+              <w:br/>
+              <w:t xml:space="preserve">    melkwargs={</w:t>
+              <w:br/>
+              <w:t xml:space="preserve">        'hop_length': int(stride*self.sample_rate),</w:t>
+              <w:br/>
+              <w:t xml:space="preserve">        'n_fft': int(frame_len*self.sample_rate)</w:t>
+              <w:br/>
+              <w:t xml:space="preserve">    }</w:t>
+              <w:br/>
+              <w:t>)</w:t>
+            </w:r>
+          </w:p>
+        </w:tc>
+      </w:tr>
+    </w:tbl>
+    <w:p>
+      <w:pPr>
+        <w:spacing w:after="80"/>
+      </w:pPr>
+    </w:p>
+    <w:p>
+      <w:pPr>
+        <w:spacing w:line="360" w:lineRule="auto" w:after="120"/>
+        <w:ind w:firstLine="0"/>
+        <w:jc w:val="both"/>
+      </w:pPr>
+      <w:r>
+        <w:rPr>
+          <w:rFonts w:ascii="Times New Roman" w:hAnsi="Times New Roman" w:eastAsia="Times New Roman"/>
+          <w:b w:val="0"/>
+          <w:i w:val="0"/>
+          <w:color w:val="000000"/>
+          <w:sz w:val="26"/>
+        </w:rPr>
+        <w:t>Các tham số training được khai báo:</w:t>
+      </w:r>
+    </w:p>
+    <w:tbl>
+      <w:tblPr>
+        <w:tblW w:type="auto" w:w="0"/>
+        <w:jc w:val="center"/>
+        <w:tblLayout w:type="fixed"/>
+        <w:tblLook w:firstColumn="1" w:firstRow="1" w:lastColumn="0" w:lastRow="0" w:noHBand="0" w:noVBand="1" w:val="04A0"/>
+      </w:tblPr>
+      <w:tblGrid>
+        <w:gridCol w:w="9405"/>
+      </w:tblGrid>
+      <w:tr>
+        <w:tc>
+          <w:tcPr>
+            <w:tcW w:type="dxa" w:w="8787"/>
+            <w:shd w:fill="F8FAFC"/>
+            <w:tcBorders>
+              <w:top w:val="single" w:sz="4" w:space="0" w:color="E2E8F0"/>
+              <w:left w:val="single" w:sz="18" w:space="0" w:color="2563EB"/>
+              <w:bottom w:val="single" w:sz="4" w:space="0" w:color="E2E8F0"/>
+              <w:right w:val="single" w:sz="4" w:space="0" w:color="E2E8F0"/>
+            </w:tcBorders>
+          </w:tcPr>
+          <w:p>
+            <w:pPr>
+              <w:spacing w:before="80" w:after="80" w:line="276" w:lineRule="auto"/>
+            </w:pPr>
+            <w:r>
+              <w:rPr>
+                <w:rFonts w:ascii="Consolas" w:hAnsi="Consolas"/>
+                <w:color w:val="1E293B"/>
+                <w:sz w:val="19"/>
+              </w:rPr>
+              <w:t>clip duration  = 1000 ms</w:t>
+              <w:br/>
+              <w:t>window size    = 40 ms</w:t>
+              <w:br/>
+              <w:t>window stride  = 20 ms</w:t>
+              <w:br/>
+              <w:t>num features   = 40</w:t>
+            </w:r>
+          </w:p>
+        </w:tc>
+      </w:tr>
+    </w:tbl>
+    <w:p>
+      <w:pPr>
+        <w:spacing w:after="80"/>
+      </w:pPr>
+    </w:p>
+    <w:p>
+      <w:pPr>
+        <w:spacing w:line="360" w:lineRule="auto" w:after="120"/>
+        <w:ind w:firstLine="0"/>
+        <w:jc w:val="both"/>
+      </w:pPr>
+      <w:r>
+        <w:rPr>
+          <w:rFonts w:ascii="Times New Roman" w:hAnsi="Times New Roman" w:eastAsia="Times New Roman"/>
+          <w:b w:val="0"/>
+          <w:i w:val="0"/>
+          <w:color w:val="000000"/>
+          <w:sz w:val="26"/>
+        </w:rPr>
+        <w:t>Do đó cấu hình sử dụng trong đồ án là:</w:t>
+      </w:r>
+    </w:p>
+    <w:tbl>
+      <w:tblPr>
+        <w:tblW w:type="auto" w:w="0"/>
+        <w:jc w:val="center"/>
+        <w:tblLayout w:type="fixed"/>
+        <w:tblLook w:firstColumn="1" w:firstRow="1" w:lastColumn="0" w:lastRow="0" w:noHBand="0" w:noVBand="1" w:val="04A0"/>
+      </w:tblPr>
+      <w:tblGrid>
+        <w:gridCol w:w="4702"/>
+        <w:gridCol w:w="4702"/>
+      </w:tblGrid>
+      <w:tr>
+        <w:tc>
+          <w:tcPr>
+            <w:tcW w:type="dxa" w:w="4535"/>
+            <w:shd w:fill="E2E8F0"/>
+          </w:tcPr>
+          <w:p>
+            <w:pPr>
+              <w:spacing w:after="60" w:line="276" w:lineRule="auto"/>
+              <w:jc w:val="center"/>
+            </w:pPr>
+            <w:r>
+              <w:rPr>
+                <w:rFonts w:ascii="Times New Roman" w:hAnsi="Times New Roman" w:eastAsia="Times New Roman"/>
+                <w:b/>
+                <w:color w:val="000000"/>
+                <w:sz w:val="22"/>
+              </w:rPr>
+              <w:t>Tham số cấu hình</w:t>
+            </w:r>
+          </w:p>
+        </w:tc>
+        <w:tc>
+          <w:tcPr>
+            <w:tcW w:type="dxa" w:w="4252"/>
+            <w:shd w:fill="E2E8F0"/>
+          </w:tcPr>
+          <w:p>
+            <w:pPr>
+              <w:spacing w:after="60" w:line="276" w:lineRule="auto"/>
+              <w:jc w:val="center"/>
+            </w:pPr>
+            <w:r>
+              <w:rPr>
+                <w:rFonts w:ascii="Times New Roman" w:hAnsi="Times New Roman" w:eastAsia="Times New Roman"/>
+                <w:b/>
+                <w:color w:val="000000"/>
+                <w:sz w:val="22"/>
+              </w:rPr>
+              <w:t>Giá trị thực tế</w:t>
+            </w:r>
+          </w:p>
+        </w:tc>
+      </w:tr>
+      <w:tr>
+        <w:tc>
+          <w:tcPr>
+            <w:tcW w:type="dxa" w:w="4535"/>
+          </w:tcPr>
+          <w:p>
+            <w:pPr>
+              <w:spacing w:after="60" w:line="276" w:lineRule="auto"/>
+              <w:jc w:val="center"/>
+            </w:pPr>
+            <w:r>
+              <w:rPr>
+                <w:rFonts w:ascii="Times New Roman" w:hAnsi="Times New Roman" w:eastAsia="Times New Roman"/>
+                <w:color w:val="000000"/>
+                <w:sz w:val="21"/>
+              </w:rPr>
+              <w:t>Sample rate</w:t>
+            </w:r>
+          </w:p>
+        </w:tc>
+        <w:tc>
+          <w:tcPr>
+            <w:tcW w:type="dxa" w:w="4252"/>
+          </w:tcPr>
+          <w:p>
+            <w:pPr>
+              <w:spacing w:after="60" w:line="276" w:lineRule="auto"/>
+              <w:jc w:val="left"/>
+            </w:pPr>
+            <w:r>
+              <w:rPr>
+                <w:rFonts w:ascii="Times New Roman" w:hAnsi="Times New Roman" w:eastAsia="Times New Roman"/>
+                <w:color w:val="000000"/>
+                <w:sz w:val="21"/>
+              </w:rPr>
+              <w:t>16 kHz</w:t>
+            </w:r>
+          </w:p>
+        </w:tc>
+      </w:tr>
+      <w:tr>
+        <w:tc>
+          <w:tcPr>
+            <w:tcW w:type="dxa" w:w="4535"/>
+          </w:tcPr>
+          <w:p>
+            <w:pPr>
+              <w:spacing w:after="60" w:line="276" w:lineRule="auto"/>
+              <w:jc w:val="center"/>
+            </w:pPr>
+            <w:r>
+              <w:rPr>
+                <w:rFonts w:ascii="Times New Roman" w:hAnsi="Times New Roman" w:eastAsia="Times New Roman"/>
+                <w:color w:val="000000"/>
+                <w:sz w:val="21"/>
+              </w:rPr>
+              <w:t>Clip duration</w:t>
+            </w:r>
+          </w:p>
+        </w:tc>
+        <w:tc>
+          <w:tcPr>
+            <w:tcW w:type="dxa" w:w="4252"/>
+          </w:tcPr>
+          <w:p>
+            <w:pPr>
+              <w:spacing w:after="60" w:line="276" w:lineRule="auto"/>
+              <w:jc w:val="left"/>
+            </w:pPr>
+            <w:r>
+              <w:rPr>
+                <w:rFonts w:ascii="Times New Roman" w:hAnsi="Times New Roman" w:eastAsia="Times New Roman"/>
+                <w:color w:val="000000"/>
+                <w:sz w:val="21"/>
+              </w:rPr>
+              <w:t>1000 ms (1.0 s)</w:t>
+            </w:r>
+          </w:p>
+        </w:tc>
+      </w:tr>
+      <w:tr>
+        <w:tc>
+          <w:tcPr>
+            <w:tcW w:type="dxa" w:w="4535"/>
+          </w:tcPr>
+          <w:p>
+            <w:pPr>
+              <w:spacing w:after="60" w:line="276" w:lineRule="auto"/>
+              <w:jc w:val="center"/>
+            </w:pPr>
+            <w:r>
+              <w:rPr>
+                <w:rFonts w:ascii="Times New Roman" w:hAnsi="Times New Roman" w:eastAsia="Times New Roman"/>
+                <w:color w:val="000000"/>
+                <w:sz w:val="21"/>
+              </w:rPr>
+              <w:t>Window size</w:t>
+            </w:r>
+          </w:p>
+        </w:tc>
+        <w:tc>
+          <w:tcPr>
+            <w:tcW w:type="dxa" w:w="4252"/>
+          </w:tcPr>
+          <w:p>
+            <w:pPr>
+              <w:spacing w:after="60" w:line="276" w:lineRule="auto"/>
+              <w:jc w:val="left"/>
+            </w:pPr>
+            <w:r>
+              <w:rPr>
+                <w:rFonts w:ascii="Times New Roman" w:hAnsi="Times New Roman" w:eastAsia="Times New Roman"/>
+                <w:color w:val="000000"/>
+                <w:sz w:val="21"/>
+              </w:rPr>
+              <w:t>40 ms</w:t>
+            </w:r>
+          </w:p>
+        </w:tc>
+      </w:tr>
+      <w:tr>
+        <w:tc>
+          <w:tcPr>
+            <w:tcW w:type="dxa" w:w="4535"/>
+          </w:tcPr>
+          <w:p>
+            <w:pPr>
+              <w:spacing w:after="60" w:line="276" w:lineRule="auto"/>
+              <w:jc w:val="center"/>
+            </w:pPr>
+            <w:r>
+              <w:rPr>
+                <w:rFonts w:ascii="Times New Roman" w:hAnsi="Times New Roman" w:eastAsia="Times New Roman"/>
+                <w:color w:val="000000"/>
+                <w:sz w:val="21"/>
+              </w:rPr>
+              <w:t>Window stride</w:t>
+            </w:r>
+          </w:p>
+        </w:tc>
+        <w:tc>
+          <w:tcPr>
+            <w:tcW w:type="dxa" w:w="4252"/>
+          </w:tcPr>
+          <w:p>
+            <w:pPr>
+              <w:spacing w:after="60" w:line="276" w:lineRule="auto"/>
+              <w:jc w:val="left"/>
+            </w:pPr>
+            <w:r>
+              <w:rPr>
+                <w:rFonts w:ascii="Times New Roman" w:hAnsi="Times New Roman" w:eastAsia="Times New Roman"/>
+                <w:color w:val="000000"/>
+                <w:sz w:val="21"/>
+              </w:rPr>
+              <w:t>20 ms</w:t>
+            </w:r>
+          </w:p>
+        </w:tc>
+      </w:tr>
+      <w:tr>
+        <w:tc>
+          <w:tcPr>
+            <w:tcW w:type="dxa" w:w="4535"/>
+          </w:tcPr>
+          <w:p>
+            <w:pPr>
+              <w:spacing w:after="60" w:line="276" w:lineRule="auto"/>
+              <w:jc w:val="center"/>
+            </w:pPr>
+            <w:r>
+              <w:rPr>
+                <w:rFonts w:ascii="Times New Roman" w:hAnsi="Times New Roman" w:eastAsia="Times New Roman"/>
+                <w:color w:val="000000"/>
+                <w:sz w:val="21"/>
+              </w:rPr>
+              <w:t>FFT size (n_fft)</w:t>
+            </w:r>
+          </w:p>
+        </w:tc>
+        <w:tc>
+          <w:tcPr>
+            <w:tcW w:type="dxa" w:w="4252"/>
+          </w:tcPr>
+          <w:p>
+            <w:pPr>
+              <w:spacing w:after="60" w:line="276" w:lineRule="auto"/>
+              <w:jc w:val="left"/>
+            </w:pPr>
+            <w:r>
+              <w:rPr>
+                <w:rFonts w:ascii="Times New Roman" w:hAnsi="Times New Roman" w:eastAsia="Times New Roman"/>
+                <w:color w:val="000000"/>
+                <w:sz w:val="21"/>
+              </w:rPr>
+              <w:t>640 samples</w:t>
+            </w:r>
+          </w:p>
+        </w:tc>
+      </w:tr>
+      <w:tr>
+        <w:tc>
+          <w:tcPr>
+            <w:tcW w:type="dxa" w:w="4535"/>
+          </w:tcPr>
+          <w:p>
+            <w:pPr>
+              <w:spacing w:after="60" w:line="276" w:lineRule="auto"/>
+              <w:jc w:val="center"/>
+            </w:pPr>
+            <w:r>
+              <w:rPr>
+                <w:rFonts w:ascii="Times New Roman" w:hAnsi="Times New Roman" w:eastAsia="Times New Roman"/>
+                <w:color w:val="000000"/>
+                <w:sz w:val="21"/>
+              </w:rPr>
+              <w:t>Hop length</w:t>
+            </w:r>
+          </w:p>
+        </w:tc>
+        <w:tc>
+          <w:tcPr>
+            <w:tcW w:type="dxa" w:w="4252"/>
+          </w:tcPr>
+          <w:p>
+            <w:pPr>
+              <w:spacing w:after="60" w:line="276" w:lineRule="auto"/>
+              <w:jc w:val="left"/>
+            </w:pPr>
+            <w:r>
+              <w:rPr>
+                <w:rFonts w:ascii="Times New Roman" w:hAnsi="Times New Roman" w:eastAsia="Times New Roman"/>
+                <w:color w:val="000000"/>
+                <w:sz w:val="21"/>
+              </w:rPr>
+              <w:t>320 samples</w:t>
+            </w:r>
+          </w:p>
+        </w:tc>
+      </w:tr>
+      <w:tr>
+        <w:tc>
+          <w:tcPr>
+            <w:tcW w:type="dxa" w:w="4535"/>
+          </w:tcPr>
+          <w:p>
+            <w:pPr>
+              <w:spacing w:after="60" w:line="276" w:lineRule="auto"/>
+              <w:jc w:val="center"/>
+            </w:pPr>
+            <w:r>
+              <w:rPr>
+                <w:rFonts w:ascii="Times New Roman" w:hAnsi="Times New Roman" w:eastAsia="Times New Roman"/>
+                <w:color w:val="000000"/>
+                <w:sz w:val="21"/>
+              </w:rPr>
+              <w:t>MFCC coefficients (n_mfcc)</w:t>
+            </w:r>
+          </w:p>
+        </w:tc>
+        <w:tc>
+          <w:tcPr>
+            <w:tcW w:type="dxa" w:w="4252"/>
+          </w:tcPr>
+          <w:p>
+            <w:pPr>
+              <w:spacing w:after="60" w:line="276" w:lineRule="auto"/>
+              <w:jc w:val="left"/>
+            </w:pPr>
+            <w:r>
+              <w:rPr>
+                <w:rFonts w:ascii="Times New Roman" w:hAnsi="Times New Roman" w:eastAsia="Times New Roman"/>
+                <w:color w:val="000000"/>
+                <w:sz w:val="21"/>
+              </w:rPr>
+              <w:t>40</w:t>
+            </w:r>
+          </w:p>
+        </w:tc>
+      </w:tr>
+    </w:tbl>
+    <w:p>
+      <w:pPr>
+        <w:spacing w:after="120"/>
+      </w:pPr>
+    </w:p>
+    <w:p>
+      <w:pPr>
+        <w:spacing w:line="360" w:lineRule="auto" w:after="120"/>
+        <w:ind w:firstLine="0"/>
+        <w:jc w:val="both"/>
+      </w:pPr>
+      <w:r>
+        <w:rPr>
+          <w:rFonts w:ascii="Times New Roman" w:hAnsi="Times New Roman" w:eastAsia="Times New Roman"/>
+          <w:b w:val="0"/>
+          <w:i w:val="0"/>
+          <w:color w:val="000000"/>
+          <w:sz w:val="26"/>
+        </w:rPr>
+        <w:t>Số coefficient n_mfcc = 40 có nghĩa mỗi frame của tín hiệu được biểu diễn bởi một vector gồm 40 giá trị MFCC.</w:t>
+      </w:r>
+    </w:p>
+    <w:p>
+      <w:pPr>
+        <w:pStyle w:val="Heading3"/>
+        <w:keepNext/>
+        <w:spacing w:before="200" w:after="80"/>
+      </w:pPr>
+      <w:r>
+        <w:rPr>
+          <w:rFonts w:ascii="Times New Roman" w:hAnsi="Times New Roman" w:eastAsia="Times New Roman"/>
+          <w:b/>
+          <w:color w:val="000000"/>
+          <w:sz w:val="26"/>
+        </w:rPr>
+        <w:t>2.4.8. Từ audio 1 giây đến ma trận MFCC</w:t>
+      </w:r>
+    </w:p>
+    <w:p>
+      <w:pPr>
+        <w:spacing w:line="360" w:lineRule="auto" w:after="120"/>
+        <w:ind w:firstLine="0"/>
+        <w:jc w:val="both"/>
+      </w:pPr>
+      <w:r>
+        <w:rPr>
+          <w:rFonts w:ascii="Times New Roman" w:hAnsi="Times New Roman" w:eastAsia="Times New Roman"/>
+          <w:b w:val="0"/>
+          <w:i w:val="0"/>
+          <w:color w:val="000000"/>
+          <w:sz w:val="26"/>
+        </w:rPr>
+        <w:t>Input ban đầu là chuỗi sample:</w:t>
+      </w:r>
+    </w:p>
+    <w:p>
+      <w:pPr>
+        <w:spacing w:before="80" w:after="120"/>
+        <w:jc w:val="center"/>
+      </w:pPr>
+      <w:r>
+        <w:rPr>
+          <w:rFonts w:ascii="Cambria Math" w:hAnsi="Cambria Math" w:eastAsia="Cambria Math"/>
+          <w:color w:val="000000"/>
+          <w:sz w:val="24"/>
+        </w:rPr>
+        <w:t>x = [x_1, x_2, \ldots, x_{16000}]</w:t>
+      </w:r>
+    </w:p>
+    <w:p>
+      <w:pPr>
+        <w:spacing w:line="360" w:lineRule="auto" w:after="120"/>
+        <w:ind w:firstLine="0"/>
+        <w:jc w:val="both"/>
+      </w:pPr>
+      <w:r>
+        <w:rPr>
+          <w:rFonts w:ascii="Times New Roman" w:hAnsi="Times New Roman" w:eastAsia="Times New Roman"/>
+          <w:b w:val="0"/>
+          <w:i w:val="0"/>
+          <w:color w:val="000000"/>
+          <w:sz w:val="26"/>
+        </w:rPr>
+        <w:t>Sau MFCC extraction, tín hiệu không còn được biểu diễn bằng 16.000 giá trị waveform mà trở thành một chuỗi vector đặc trưng:</w:t>
+      </w:r>
+    </w:p>
+    <w:p>
+      <w:pPr>
+        <w:spacing w:before="80" w:after="120"/>
+        <w:jc w:val="center"/>
+      </w:pPr>
+      <w:r>
+        <w:rPr>
+          <w:rFonts w:ascii="Cambria Math" w:hAnsi="Cambria Math" w:eastAsia="Cambria Math"/>
+          <w:color w:val="000000"/>
+          <w:sz w:val="24"/>
+        </w:rPr>
+        <w:t>X = [z_1, z_2, \ldots, z_T], \quad z_t \in \mathbb{R}^{40}</w:t>
+      </w:r>
+    </w:p>
+    <w:p>
+      <w:pPr>
+        <w:spacing w:line="360" w:lineRule="auto" w:after="120"/>
+        <w:ind w:firstLine="0"/>
+        <w:jc w:val="both"/>
+      </w:pPr>
+      <w:r>
+        <w:rPr>
+          <w:rFonts w:ascii="Times New Roman" w:hAnsi="Times New Roman" w:eastAsia="Times New Roman"/>
+          <w:b w:val="0"/>
+          <w:i w:val="0"/>
+          <w:color w:val="000000"/>
+          <w:sz w:val="26"/>
+        </w:rPr>
+        <w:t>Mỗi z_t đại diện cho đặc trưng MFCC của một vùng thời gian ngắn:</w:t>
+      </w:r>
+    </w:p>
+    <w:tbl>
+      <w:tblPr>
+        <w:tblW w:type="auto" w:w="0"/>
+        <w:jc w:val="center"/>
+        <w:tblLayout w:type="fixed"/>
+        <w:tblLook w:firstColumn="1" w:firstRow="1" w:lastColumn="0" w:lastRow="0" w:noHBand="0" w:noVBand="1" w:val="04A0"/>
+      </w:tblPr>
+      <w:tblGrid>
+        <w:gridCol w:w="9405"/>
+      </w:tblGrid>
+      <w:tr>
+        <w:tc>
+          <w:tcPr>
+            <w:tcW w:type="dxa" w:w="8787"/>
+            <w:shd w:fill="F8FAFC"/>
+            <w:tcBorders>
+              <w:top w:val="single" w:sz="4" w:space="0" w:color="E2E8F0"/>
+              <w:left w:val="single" w:sz="18" w:space="0" w:color="2563EB"/>
+              <w:bottom w:val="single" w:sz="4" w:space="0" w:color="E2E8F0"/>
+              <w:right w:val="single" w:sz="4" w:space="0" w:color="E2E8F0"/>
+            </w:tcBorders>
+          </w:tcPr>
+          <w:p>
+            <w:pPr>
+              <w:spacing w:before="80" w:after="80" w:line="276" w:lineRule="auto"/>
+            </w:pPr>
+            <w:r>
+              <w:rPr>
+                <w:rFonts w:ascii="Consolas" w:hAnsi="Consolas"/>
+                <w:color w:val="1E293B"/>
+                <w:sz w:val="19"/>
+              </w:rPr>
+              <w:t>1-second waveform (16000 samples)</w:t>
+              <w:br/>
+              <w:t xml:space="preserve">       ↓</w:t>
+              <w:br/>
+              <w:t>MFCC extraction</w:t>
+              <w:br/>
+              <w:t xml:space="preserve">       ↓</w:t>
+              <w:br/>
+              <w:t>time 1 → 40 coefficients</w:t>
+              <w:br/>
+              <w:t>time 2 → 40 coefficients</w:t>
+              <w:br/>
+              <w:t>time 3 → 40 coefficients</w:t>
+              <w:br/>
+              <w:t>...</w:t>
+              <w:br/>
+              <w:t>time T → 40 coefficients</w:t>
+            </w:r>
+          </w:p>
+        </w:tc>
+      </w:tr>
+    </w:tbl>
+    <w:p>
+      <w:pPr>
+        <w:spacing w:after="80"/>
+      </w:pPr>
+    </w:p>
+    <w:p>
+      <w:pPr>
+        <w:spacing w:line="360" w:lineRule="auto" w:after="120"/>
+        <w:ind w:firstLine="0"/>
+        <w:jc w:val="both"/>
+      </w:pPr>
+      <w:r>
+        <w:rPr>
+          <w:rFonts w:ascii="Times New Roman" w:hAnsi="Times New Roman" w:eastAsia="Times New Roman"/>
+          <w:b w:val="0"/>
+          <w:i w:val="0"/>
+          <w:color w:val="000000"/>
+          <w:sz w:val="26"/>
+        </w:rPr>
+        <w:t>Thay vì bắt TD-ResNet xử lý từng sample waveform, model xử lý chuỗi các vector MFCC theo thời gian.</w:t>
+      </w:r>
+    </w:p>
+    <w:p>
+      <w:pPr>
+        <w:pStyle w:val="Heading3"/>
+        <w:keepNext/>
+        <w:spacing w:before="200" w:after="80"/>
+      </w:pPr>
+      <w:r>
+        <w:rPr>
+          <w:rFonts w:ascii="Times New Roman" w:hAnsi="Times New Roman" w:eastAsia="Times New Roman"/>
+          <w:b/>
+          <w:color w:val="000000"/>
+          <w:sz w:val="26"/>
+        </w:rPr>
+        <w:t>2.4.9. Cách repository sắp xếp tensor MFCC</w:t>
+      </w:r>
+    </w:p>
+    <w:p>
+      <w:pPr>
+        <w:spacing w:line="360" w:lineRule="auto" w:after="120"/>
+        <w:ind w:firstLine="0"/>
+        <w:jc w:val="both"/>
+      </w:pPr>
+      <w:r>
+        <w:rPr>
+          <w:rFonts w:ascii="Times New Roman" w:hAnsi="Times New Roman" w:eastAsia="Times New Roman"/>
+          <w:b w:val="0"/>
+          <w:i w:val="0"/>
+          <w:color w:val="000000"/>
+          <w:sz w:val="26"/>
+        </w:rPr>
+        <w:t>Kết quả từ torchaudio.transforms.MFCC ban đầu có dạng: [channel, MFCC, time].</w:t>
+      </w:r>
+    </w:p>
+    <w:p>
+      <w:pPr>
+        <w:spacing w:line="360" w:lineRule="auto" w:after="120"/>
+        <w:ind w:firstLine="0"/>
+        <w:jc w:val="both"/>
+      </w:pPr>
+      <w:r>
+        <w:rPr>
+          <w:rFonts w:ascii="Times New Roman" w:hAnsi="Times New Roman" w:eastAsia="Times New Roman"/>
+          <w:b w:val="0"/>
+          <w:i w:val="0"/>
+          <w:color w:val="000000"/>
+          <w:sz w:val="26"/>
+        </w:rPr>
+        <w:t>Repository chỉ lấy channel đầu tiên:</w:t>
+      </w:r>
+    </w:p>
+    <w:tbl>
+      <w:tblPr>
+        <w:tblW w:type="auto" w:w="0"/>
+        <w:jc w:val="center"/>
+        <w:tblLayout w:type="fixed"/>
+        <w:tblLook w:firstColumn="1" w:firstRow="1" w:lastColumn="0" w:lastRow="0" w:noHBand="0" w:noVBand="1" w:val="04A0"/>
+      </w:tblPr>
+      <w:tblGrid>
+        <w:gridCol w:w="9405"/>
+      </w:tblGrid>
+      <w:tr>
+        <w:tc>
+          <w:tcPr>
+            <w:tcW w:type="dxa" w:w="8787"/>
+            <w:shd w:fill="F8FAFC"/>
+            <w:tcBorders>
+              <w:top w:val="single" w:sz="4" w:space="0" w:color="E2E8F0"/>
+              <w:left w:val="single" w:sz="18" w:space="0" w:color="2563EB"/>
+              <w:bottom w:val="single" w:sz="4" w:space="0" w:color="E2E8F0"/>
+              <w:right w:val="single" w:sz="4" w:space="0" w:color="E2E8F0"/>
+            </w:tcBorders>
+          </w:tcPr>
+          <w:p>
+            <w:pPr>
+              <w:spacing w:before="80" w:after="80" w:line="276" w:lineRule="auto"/>
+            </w:pPr>
+            <w:r>
+              <w:rPr>
+                <w:rFonts w:ascii="Consolas" w:hAnsi="Consolas"/>
+                <w:color w:val="1E293B"/>
+                <w:sz w:val="19"/>
+              </w:rPr>
+              <w:t>features = self.mfcc(d[k])[0]</w:t>
+            </w:r>
+          </w:p>
+        </w:tc>
+      </w:tr>
+    </w:tbl>
+    <w:p>
+      <w:pPr>
+        <w:spacing w:after="80"/>
+      </w:pPr>
+    </w:p>
+    <w:p>
+      <w:pPr>
+        <w:spacing w:line="360" w:lineRule="auto" w:after="120"/>
+        <w:ind w:firstLine="0"/>
+        <w:jc w:val="both"/>
+      </w:pPr>
+      <w:r>
+        <w:rPr>
+          <w:rFonts w:ascii="Times New Roman" w:hAnsi="Times New Roman" w:eastAsia="Times New Roman"/>
+          <w:b w:val="0"/>
+          <w:i w:val="0"/>
+          <w:color w:val="000000"/>
+          <w:sz w:val="26"/>
+        </w:rPr>
+        <w:t>sau đó transpose:</w:t>
+      </w:r>
+    </w:p>
+    <w:tbl>
+      <w:tblPr>
+        <w:tblW w:type="auto" w:w="0"/>
+        <w:jc w:val="center"/>
+        <w:tblLayout w:type="fixed"/>
+        <w:tblLook w:firstColumn="1" w:firstRow="1" w:lastColumn="0" w:lastRow="0" w:noHBand="0" w:noVBand="1" w:val="04A0"/>
+      </w:tblPr>
+      <w:tblGrid>
+        <w:gridCol w:w="9405"/>
+      </w:tblGrid>
+      <w:tr>
+        <w:tc>
+          <w:tcPr>
+            <w:tcW w:type="dxa" w:w="8787"/>
+            <w:shd w:fill="F8FAFC"/>
+            <w:tcBorders>
+              <w:top w:val="single" w:sz="4" w:space="0" w:color="E2E8F0"/>
+              <w:left w:val="single" w:sz="18" w:space="0" w:color="2563EB"/>
+              <w:bottom w:val="single" w:sz="4" w:space="0" w:color="E2E8F0"/>
+              <w:right w:val="single" w:sz="4" w:space="0" w:color="E2E8F0"/>
+            </w:tcBorders>
+          </w:tcPr>
+          <w:p>
+            <w:pPr>
+              <w:spacing w:before="80" w:after="80" w:line="276" w:lineRule="auto"/>
+            </w:pPr>
+            <w:r>
+              <w:rPr>
+                <w:rFonts w:ascii="Consolas" w:hAnsi="Consolas"/>
+                <w:color w:val="1E293B"/>
+                <w:sz w:val="19"/>
+              </w:rPr>
+              <w:t>features = features.T</w:t>
+            </w:r>
+          </w:p>
+        </w:tc>
+      </w:tr>
+    </w:tbl>
+    <w:p>
+      <w:pPr>
+        <w:spacing w:after="80"/>
+      </w:pPr>
+    </w:p>
+    <w:p>
+      <w:pPr>
+        <w:spacing w:line="360" w:lineRule="auto" w:after="120"/>
+        <w:ind w:firstLine="0"/>
+        <w:jc w:val="both"/>
+      </w:pPr>
+      <w:r>
+        <w:rPr>
+          <w:rFonts w:ascii="Times New Roman" w:hAnsi="Times New Roman" w:eastAsia="Times New Roman"/>
+          <w:b w:val="0"/>
+          <w:i w:val="0"/>
+          <w:color w:val="000000"/>
+          <w:sz w:val="26"/>
+        </w:rPr>
+        <w:t>tức [MFCC × Time] được chuyển thành [Time × MFCC]. Cuối cùng repository thêm một dimension:</w:t>
+      </w:r>
+    </w:p>
+    <w:tbl>
+      <w:tblPr>
+        <w:tblW w:type="auto" w:w="0"/>
+        <w:jc w:val="center"/>
+        <w:tblLayout w:type="fixed"/>
+        <w:tblLook w:firstColumn="1" w:firstRow="1" w:lastColumn="0" w:lastRow="0" w:noHBand="0" w:noVBand="1" w:val="04A0"/>
+      </w:tblPr>
+      <w:tblGrid>
+        <w:gridCol w:w="9405"/>
+      </w:tblGrid>
+      <w:tr>
+        <w:tc>
+          <w:tcPr>
+            <w:tcW w:type="dxa" w:w="8787"/>
+            <w:shd w:fill="F8FAFC"/>
+            <w:tcBorders>
+              <w:top w:val="single" w:sz="4" w:space="0" w:color="E2E8F0"/>
+              <w:left w:val="single" w:sz="18" w:space="0" w:color="2563EB"/>
+              <w:bottom w:val="single" w:sz="4" w:space="0" w:color="E2E8F0"/>
+              <w:right w:val="single" w:sz="4" w:space="0" w:color="E2E8F0"/>
+            </w:tcBorders>
+          </w:tcPr>
+          <w:p>
+            <w:pPr>
+              <w:spacing w:before="80" w:after="80" w:line="276" w:lineRule="auto"/>
+            </w:pPr>
+            <w:r>
+              <w:rPr>
+                <w:rFonts w:ascii="Consolas" w:hAnsi="Consolas"/>
+                <w:color w:val="1E293B"/>
+                <w:sz w:val="19"/>
+              </w:rPr>
+              <w:t>torch.unsqueeze(features, 0)</w:t>
+            </w:r>
+          </w:p>
+        </w:tc>
+      </w:tr>
+    </w:tbl>
+    <w:p>
+      <w:pPr>
+        <w:spacing w:after="80"/>
+      </w:pPr>
+    </w:p>
+    <w:p>
+      <w:pPr>
+        <w:spacing w:line="360" w:lineRule="auto" w:after="120"/>
+        <w:ind w:firstLine="0"/>
+        <w:jc w:val="both"/>
+      </w:pPr>
+      <w:r>
+        <w:rPr>
+          <w:rFonts w:ascii="Times New Roman" w:hAnsi="Times New Roman" w:eastAsia="Times New Roman"/>
+          <w:b w:val="0"/>
+          <w:i w:val="0"/>
+          <w:color w:val="000000"/>
+          <w:sz w:val="26"/>
+        </w:rPr>
+        <w:t>Pipeline tensor hoàn chỉnh:</w:t>
+      </w:r>
+    </w:p>
+    <w:tbl>
+      <w:tblPr>
+        <w:tblW w:type="auto" w:w="0"/>
+        <w:jc w:val="center"/>
+        <w:tblLayout w:type="fixed"/>
+        <w:tblLook w:firstColumn="1" w:firstRow="1" w:lastColumn="0" w:lastRow="0" w:noHBand="0" w:noVBand="1" w:val="04A0"/>
+      </w:tblPr>
+      <w:tblGrid>
+        <w:gridCol w:w="9405"/>
+      </w:tblGrid>
+      <w:tr>
+        <w:tc>
+          <w:tcPr>
+            <w:tcW w:type="dxa" w:w="8787"/>
+            <w:shd w:fill="F8FAFC"/>
+            <w:tcBorders>
+              <w:top w:val="single" w:sz="4" w:space="0" w:color="E2E8F0"/>
+              <w:left w:val="single" w:sz="18" w:space="0" w:color="2563EB"/>
+              <w:bottom w:val="single" w:sz="4" w:space="0" w:color="E2E8F0"/>
+              <w:right w:val="single" w:sz="4" w:space="0" w:color="E2E8F0"/>
+            </w:tcBorders>
+          </w:tcPr>
+          <w:p>
+            <w:pPr>
+              <w:spacing w:before="80" w:after="80" w:line="276" w:lineRule="auto"/>
+            </w:pPr>
+            <w:r>
+              <w:rPr>
+                <w:rFonts w:ascii="Consolas" w:hAnsi="Consolas"/>
+                <w:color w:val="1E293B"/>
+                <w:sz w:val="19"/>
+              </w:rPr>
+              <w:t>Waveform</w:t>
+              <w:br/>
+              <w:t xml:space="preserve">   ↓</w:t>
+              <w:br/>
+              <w:t>MFCC</w:t>
+              <w:br/>
+              <w:t xml:space="preserve">   ↓</w:t>
+              <w:br/>
+              <w:t>[MFCC × Time]</w:t>
+              <w:br/>
+              <w:t xml:space="preserve">   ↓</w:t>
+              <w:br/>
+              <w:t>Transpose</w:t>
+              <w:br/>
+              <w:t xml:space="preserve">   ↓</w:t>
+              <w:br/>
+              <w:t>[Time × MFCC]</w:t>
+              <w:br/>
+              <w:t xml:space="preserve">   ↓</w:t>
+              <w:br/>
+              <w:t>Unsqueeze</w:t>
+              <w:br/>
+              <w:t xml:space="preserve">   ↓</w:t>
+              <w:br/>
+              <w:t>[1 × Time × MFCC]</w:t>
+            </w:r>
+          </w:p>
+        </w:tc>
+      </w:tr>
+    </w:tbl>
+    <w:p>
+      <w:pPr>
+        <w:spacing w:after="80"/>
+      </w:pPr>
+    </w:p>
+    <w:p>
+      <w:pPr>
+        <w:spacing w:line="360" w:lineRule="auto" w:after="120"/>
+        <w:ind w:firstLine="0"/>
+        <w:jc w:val="both"/>
+      </w:pPr>
+      <w:r>
+        <w:rPr>
+          <w:rFonts w:ascii="Times New Roman" w:hAnsi="Times New Roman" w:eastAsia="Times New Roman"/>
+          <w:b w:val="0"/>
+          <w:i w:val="0"/>
+          <w:color w:val="000000"/>
+          <w:sz w:val="26"/>
+        </w:rPr>
+        <w:t>Cách biểu diễn này giúp TD-ResNet xử lý MFCC như một chuỗi đặc trưng theo trục thời gian.</w:t>
+      </w:r>
+    </w:p>
+    <w:p>
+      <w:pPr>
+        <w:pStyle w:val="Heading3"/>
+        <w:keepNext/>
+        <w:spacing w:before="200" w:after="80"/>
+      </w:pPr>
+      <w:r>
+        <w:rPr>
+          <w:rFonts w:ascii="Times New Roman" w:hAnsi="Times New Roman" w:eastAsia="Times New Roman"/>
+          <w:b/>
+          <w:color w:val="000000"/>
+          <w:sz w:val="26"/>
+        </w:rPr>
+        <w:t>2.4.10. Kích thước tensor MFCC thực tế</w:t>
+      </w:r>
+    </w:p>
+    <w:p>
+      <w:pPr>
+        <w:spacing w:line="360" w:lineRule="auto" w:after="120"/>
+        <w:ind w:firstLine="0"/>
+        <w:jc w:val="both"/>
+      </w:pPr>
+      <w:r>
+        <w:rPr>
+          <w:rFonts w:ascii="Times New Roman" w:hAnsi="Times New Roman" w:eastAsia="Times New Roman"/>
+          <w:b w:val="0"/>
+          <w:i w:val="0"/>
+          <w:color w:val="000000"/>
+          <w:sz w:val="26"/>
+        </w:rPr>
+        <w:t>Nhóm kiểm tra trực tiếp pipeline MFCC trên một waveform có kích thước:</w:t>
+      </w:r>
+    </w:p>
+    <w:p>
+      <w:pPr>
+        <w:spacing w:before="80" w:after="120"/>
+        <w:jc w:val="center"/>
+      </w:pPr>
+      <w:r>
+        <w:rPr>
+          <w:rFonts w:ascii="Cambria Math" w:hAnsi="Cambria Math" w:eastAsia="Cambria Math"/>
+          <w:color w:val="000000"/>
+          <w:sz w:val="24"/>
+        </w:rPr>
+        <w:t>1 \times 16000</w:t>
+      </w:r>
+    </w:p>
+    <w:p>
+      <w:pPr>
+        <w:spacing w:line="360" w:lineRule="auto" w:after="120"/>
+        <w:ind w:firstLine="0"/>
+        <w:jc w:val="both"/>
+      </w:pPr>
+      <w:r>
+        <w:rPr>
+          <w:rFonts w:ascii="Times New Roman" w:hAnsi="Times New Roman" w:eastAsia="Times New Roman"/>
+          <w:b w:val="0"/>
+          <w:i w:val="0"/>
+          <w:color w:val="000000"/>
+          <w:sz w:val="26"/>
+        </w:rPr>
+        <w:t>tương ứng với một đoạn audio mono dài 1 giây ở sample rate 16 kHz. Kết quả từ torchaudio.transforms.MFCC:</w:t>
+      </w:r>
+    </w:p>
+    <w:tbl>
+      <w:tblPr>
+        <w:tblW w:type="auto" w:w="0"/>
+        <w:jc w:val="center"/>
+        <w:tblLayout w:type="fixed"/>
+        <w:tblLook w:firstColumn="1" w:firstRow="1" w:lastColumn="0" w:lastRow="0" w:noHBand="0" w:noVBand="1" w:val="04A0"/>
+      </w:tblPr>
+      <w:tblGrid>
+        <w:gridCol w:w="9405"/>
+      </w:tblGrid>
+      <w:tr>
+        <w:tc>
+          <w:tcPr>
+            <w:tcW w:type="dxa" w:w="8787"/>
+            <w:shd w:fill="F8FAFC"/>
+            <w:tcBorders>
+              <w:top w:val="single" w:sz="4" w:space="0" w:color="E2E8F0"/>
+              <w:left w:val="single" w:sz="18" w:space="0" w:color="2563EB"/>
+              <w:bottom w:val="single" w:sz="4" w:space="0" w:color="E2E8F0"/>
+              <w:right w:val="single" w:sz="4" w:space="0" w:color="E2E8F0"/>
+            </w:tcBorders>
+          </w:tcPr>
+          <w:p>
+            <w:pPr>
+              <w:spacing w:before="80" w:after="80" w:line="276" w:lineRule="auto"/>
+            </w:pPr>
+            <w:r>
+              <w:rPr>
+                <w:rFonts w:ascii="Consolas" w:hAnsi="Consolas"/>
+                <w:color w:val="1E293B"/>
+                <w:sz w:val="19"/>
+              </w:rPr>
+              <w:t>MFCC raw shape: [1, 40, 51]</w:t>
+            </w:r>
+          </w:p>
+        </w:tc>
+      </w:tr>
+    </w:tbl>
+    <w:p>
+      <w:pPr>
+        <w:spacing w:after="80"/>
+      </w:pPr>
+    </w:p>
+    <w:p>
+      <w:pPr>
+        <w:spacing w:line="360" w:lineRule="auto" w:after="120"/>
+        <w:ind w:firstLine="0"/>
+        <w:jc w:val="both"/>
+      </w:pPr>
+      <w:r>
+        <w:rPr>
+          <w:rFonts w:ascii="Times New Roman" w:hAnsi="Times New Roman" w:eastAsia="Times New Roman"/>
+          <w:b w:val="0"/>
+          <w:i w:val="0"/>
+          <w:color w:val="000000"/>
+          <w:sz w:val="26"/>
+        </w:rPr>
+        <w:t>Trong đó: 1 là số channel; 40 là số hệ số MFCC; 51 là số frame thời gian.</w:t>
+      </w:r>
+    </w:p>
+    <w:p>
+      <w:pPr>
+        <w:spacing w:line="360" w:lineRule="auto" w:after="120"/>
+        <w:ind w:firstLine="0"/>
+        <w:jc w:val="both"/>
+      </w:pPr>
+      <w:r>
+        <w:rPr>
+          <w:rFonts w:ascii="Times New Roman" w:hAnsi="Times New Roman" w:eastAsia="Times New Roman"/>
+          <w:b w:val="0"/>
+          <w:i w:val="0"/>
+          <w:color w:val="000000"/>
+          <w:sz w:val="26"/>
+        </w:rPr>
+        <w:t>Repository sau đó lấy channel đầu tiên và transpose:</w:t>
+      </w:r>
+    </w:p>
+    <w:tbl>
+      <w:tblPr>
+        <w:tblW w:type="auto" w:w="0"/>
+        <w:jc w:val="center"/>
+        <w:tblLayout w:type="fixed"/>
+        <w:tblLook w:firstColumn="1" w:firstRow="1" w:lastColumn="0" w:lastRow="0" w:noHBand="0" w:noVBand="1" w:val="04A0"/>
+      </w:tblPr>
+      <w:tblGrid>
+        <w:gridCol w:w="9405"/>
+      </w:tblGrid>
+      <w:tr>
+        <w:tc>
+          <w:tcPr>
+            <w:tcW w:type="dxa" w:w="8787"/>
+            <w:shd w:fill="F8FAFC"/>
+            <w:tcBorders>
+              <w:top w:val="single" w:sz="4" w:space="0" w:color="E2E8F0"/>
+              <w:left w:val="single" w:sz="18" w:space="0" w:color="2563EB"/>
+              <w:bottom w:val="single" w:sz="4" w:space="0" w:color="E2E8F0"/>
+              <w:right w:val="single" w:sz="4" w:space="0" w:color="E2E8F0"/>
+            </w:tcBorders>
+          </w:tcPr>
+          <w:p>
+            <w:pPr>
+              <w:spacing w:before="80" w:after="80" w:line="276" w:lineRule="auto"/>
+            </w:pPr>
+            <w:r>
+              <w:rPr>
+                <w:rFonts w:ascii="Consolas" w:hAnsi="Consolas"/>
+                <w:color w:val="1E293B"/>
+                <w:sz w:val="19"/>
+              </w:rPr>
+              <w:t>features = self.mfcc(d[k])[0]</w:t>
+              <w:br/>
+              <w:t>features = features.T  # kết quả: [51, 40]</w:t>
+            </w:r>
+          </w:p>
+        </w:tc>
+      </w:tr>
+    </w:tbl>
+    <w:p>
+      <w:pPr>
+        <w:spacing w:after="80"/>
+      </w:pPr>
+    </w:p>
+    <w:p>
+      <w:pPr>
+        <w:spacing w:line="360" w:lineRule="auto" w:after="120"/>
+        <w:ind w:firstLine="0"/>
+        <w:jc w:val="both"/>
+      </w:pPr>
+      <w:r>
+        <w:rPr>
+          <w:rFonts w:ascii="Times New Roman" w:hAnsi="Times New Roman" w:eastAsia="Times New Roman"/>
+          <w:b w:val="0"/>
+          <w:i w:val="0"/>
+          <w:color w:val="000000"/>
+          <w:sz w:val="26"/>
+        </w:rPr>
+        <w:t>Cuối cùng thêm một dimension để tạo tensor đầu vào hoàn chỉnh:</w:t>
+      </w:r>
+    </w:p>
+    <w:tbl>
+      <w:tblPr>
+        <w:tblW w:type="auto" w:w="0"/>
+        <w:jc w:val="center"/>
+        <w:tblLayout w:type="fixed"/>
+        <w:tblLook w:firstColumn="1" w:firstRow="1" w:lastColumn="0" w:lastRow="0" w:noHBand="0" w:noVBand="1" w:val="04A0"/>
+      </w:tblPr>
+      <w:tblGrid>
+        <w:gridCol w:w="9405"/>
+      </w:tblGrid>
+      <w:tr>
+        <w:tc>
+          <w:tcPr>
+            <w:tcW w:type="dxa" w:w="8787"/>
+            <w:shd w:fill="F8FAFC"/>
+            <w:tcBorders>
+              <w:top w:val="single" w:sz="4" w:space="0" w:color="E2E8F0"/>
+              <w:left w:val="single" w:sz="18" w:space="0" w:color="2563EB"/>
+              <w:bottom w:val="single" w:sz="4" w:space="0" w:color="E2E8F0"/>
+              <w:right w:val="single" w:sz="4" w:space="0" w:color="E2E8F0"/>
+            </w:tcBorders>
+          </w:tcPr>
+          <w:p>
+            <w:pPr>
+              <w:spacing w:before="80" w:after="80" w:line="276" w:lineRule="auto"/>
+            </w:pPr>
+            <w:r>
+              <w:rPr>
+                <w:rFonts w:ascii="Consolas" w:hAnsi="Consolas"/>
+                <w:color w:val="1E293B"/>
+                <w:sz w:val="19"/>
+              </w:rPr>
+              <w:t>torch.unsqueeze(features, 0)  # kết quả: [1, 51, 40]</w:t>
+            </w:r>
+          </w:p>
+        </w:tc>
+      </w:tr>
+    </w:tbl>
+    <w:p>
+      <w:pPr>
+        <w:spacing w:after="80"/>
+      </w:pPr>
+    </w:p>
+    <w:p>
+      <w:pPr>
+        <w:spacing w:line="360" w:lineRule="auto" w:after="120"/>
+        <w:ind w:firstLine="0"/>
+        <w:jc w:val="both"/>
+      </w:pPr>
+      <w:r>
+        <w:rPr>
+          <w:rFonts w:ascii="Times New Roman" w:hAnsi="Times New Roman" w:eastAsia="Times New Roman"/>
+          <w:b w:val="0"/>
+          <w:i w:val="0"/>
+          <w:color w:val="000000"/>
+          <w:sz w:val="26"/>
+        </w:rPr>
+        <w:t>Do đó, input thực tế đưa vào pipeline model có dạng:</w:t>
+      </w:r>
+    </w:p>
+    <w:p>
+      <w:pPr>
+        <w:spacing w:before="80" w:after="120"/>
+        <w:jc w:val="center"/>
+      </w:pPr>
+      <w:r>
+        <w:rPr>
+          <w:rFonts w:ascii="Cambria Math" w:hAnsi="Cambria Math" w:eastAsia="Cambria Math"/>
+          <w:color w:val="000000"/>
+          <w:sz w:val="24"/>
+        </w:rPr>
+        <w:t>1 \times 51 \times 40</w:t>
+      </w:r>
+    </w:p>
+    <w:p>
+      <w:pPr>
+        <w:spacing w:line="360" w:lineRule="auto" w:after="120"/>
+        <w:ind w:firstLine="0"/>
+        <w:jc w:val="both"/>
+      </w:pPr>
+      <w:r>
+        <w:rPr>
+          <w:rFonts w:ascii="Times New Roman" w:hAnsi="Times New Roman" w:eastAsia="Times New Roman"/>
+          <w:b w:val="0"/>
+          <w:i w:val="0"/>
+          <w:color w:val="000000"/>
+          <w:sz w:val="26"/>
+        </w:rPr>
+        <w:t>Có thể hiểu là: 1 channel × 51 frame thời gian × 40 MFCC coefficients. Mỗi utterance 1 giây sau feature extraction không còn được biểu diễn bởi 16.000 sample waveform mà được nén thành một ma trận:</w:t>
+      </w:r>
+    </w:p>
+    <w:p>
+      <w:pPr>
+        <w:spacing w:before="80" w:after="120"/>
+        <w:jc w:val="center"/>
+      </w:pPr>
+      <w:r>
+        <w:rPr>
+          <w:rFonts w:ascii="Cambria Math" w:hAnsi="Cambria Math" w:eastAsia="Cambria Math"/>
+          <w:color w:val="000000"/>
+          <w:sz w:val="24"/>
+        </w:rPr>
+        <w:t>X \in \mathbb{R}^{51 \times 40}</w:t>
+      </w:r>
+    </w:p>
+    <w:p>
+      <w:pPr>
+        <w:spacing w:line="360" w:lineRule="auto" w:after="120"/>
+        <w:ind w:firstLine="0"/>
+        <w:jc w:val="both"/>
+      </w:pPr>
+      <w:r>
+        <w:rPr>
+          <w:rFonts w:ascii="Times New Roman" w:hAnsi="Times New Roman" w:eastAsia="Times New Roman"/>
+          <w:b/>
+          <w:i w:val="0"/>
+          <w:color w:val="000000"/>
+          <w:sz w:val="26"/>
+        </w:rPr>
+        <w:t>Trong đó mỗi hàng tương ứng với một frame thời gian và mỗi cột tương ứng với một hệ số MFCC. Đây là representation đầu vào mà TD-ResNet sử dụng để học embedding tiếng nói.</w:t>
+      </w:r>
+    </w:p>
+    <w:p>
+      <w:pPr>
+        <w:pStyle w:val="Heading3"/>
+        <w:keepNext/>
+        <w:spacing w:before="200" w:after="80"/>
+      </w:pPr>
+      <w:r>
+        <w:rPr>
+          <w:rFonts w:ascii="Times New Roman" w:hAnsi="Times New Roman" w:eastAsia="Times New Roman"/>
+          <w:b/>
+          <w:color w:val="000000"/>
+          <w:sz w:val="26"/>
+        </w:rPr>
+        <w:t>2.4.11. Ý nghĩa của hai chiều Time và Feature</w:t>
+      </w:r>
+    </w:p>
+    <w:p>
+      <w:pPr>
+        <w:spacing w:line="360" w:lineRule="auto" w:after="120"/>
+        <w:ind w:firstLine="0"/>
+        <w:jc w:val="both"/>
+      </w:pPr>
+      <w:r>
+        <w:rPr>
+          <w:rFonts w:ascii="Times New Roman" w:hAnsi="Times New Roman" w:eastAsia="Times New Roman"/>
+          <w:b w:val="0"/>
+          <w:i w:val="0"/>
+          <w:color w:val="000000"/>
+          <w:sz w:val="26"/>
+        </w:rPr>
+        <w:t>Ma trận MFCC có hai chiều chính:</w:t>
+      </w:r>
+    </w:p>
+    <w:p>
+      <w:pPr>
+        <w:spacing w:before="80" w:after="120"/>
+        <w:jc w:val="center"/>
+      </w:pPr>
+      <w:r>
+        <w:rPr>
+          <w:rFonts w:ascii="Cambria Math" w:hAnsi="Cambria Math" w:eastAsia="Cambria Math"/>
+          <w:color w:val="000000"/>
+          <w:sz w:val="24"/>
+        </w:rPr>
+        <w:t>T \times F \quad (với \; F = 40, \; T = 51)</w:t>
+      </w:r>
+    </w:p>
+    <w:p>
+      <w:pPr>
+        <w:spacing w:line="360" w:lineRule="auto" w:after="120"/>
+        <w:ind w:firstLine="0"/>
+        <w:jc w:val="both"/>
+      </w:pPr>
+      <w:r>
+        <w:rPr>
+          <w:rFonts w:ascii="Times New Roman" w:hAnsi="Times New Roman" w:eastAsia="Times New Roman"/>
+          <w:b w:val="0"/>
+          <w:i w:val="0"/>
+          <w:color w:val="000000"/>
+          <w:sz w:val="26"/>
+        </w:rPr>
+        <w:t>Có thể hình dung cấu trúc ma trận đặc trưng:</w:t>
+      </w:r>
+    </w:p>
+    <w:tbl>
+      <w:tblPr>
+        <w:tblW w:type="auto" w:w="0"/>
+        <w:jc w:val="center"/>
+        <w:tblLayout w:type="fixed"/>
+        <w:tblLook w:firstColumn="1" w:firstRow="1" w:lastColumn="0" w:lastRow="0" w:noHBand="0" w:noVBand="1" w:val="04A0"/>
+      </w:tblPr>
+      <w:tblGrid>
+        <w:gridCol w:w="9405"/>
+      </w:tblGrid>
+      <w:tr>
+        <w:tc>
+          <w:tcPr>
+            <w:tcW w:type="dxa" w:w="8787"/>
+            <w:shd w:fill="F8FAFC"/>
+            <w:tcBorders>
+              <w:top w:val="single" w:sz="4" w:space="0" w:color="E2E8F0"/>
+              <w:left w:val="single" w:sz="18" w:space="0" w:color="2563EB"/>
+              <w:bottom w:val="single" w:sz="4" w:space="0" w:color="E2E8F0"/>
+              <w:right w:val="single" w:sz="4" w:space="0" w:color="E2E8F0"/>
+            </w:tcBorders>
+          </w:tcPr>
+          <w:p>
+            <w:pPr>
+              <w:spacing w:before="80" w:after="80" w:line="276" w:lineRule="auto"/>
+            </w:pPr>
+            <w:r>
+              <w:rPr>
+                <w:rFonts w:ascii="Consolas" w:hAnsi="Consolas"/>
+                <w:color w:val="1E293B"/>
+                <w:sz w:val="19"/>
+              </w:rPr>
+              <w:t xml:space="preserve">            MFCC coefficients</w:t>
+              <w:br/>
+              <w:t xml:space="preserve">        1   2   3   ...   40</w:t>
+              <w:br/>
+              <w:t xml:space="preserve">      ┌──────────────────────</w:t>
+              <w:br/>
+              <w:t>t1    │ •   •   •         •</w:t>
+              <w:br/>
+              <w:t>t2    │ •   •   •         •</w:t>
+              <w:br/>
+              <w:t>t3    │ •   •   •         •</w:t>
+              <w:br/>
+              <w:t>...</w:t>
+              <w:br/>
+              <w:t>t51   │ •   •   •         •</w:t>
+              <w:br/>
+              <w:t xml:space="preserve">      └──────────────────────</w:t>
+            </w:r>
+          </w:p>
+        </w:tc>
+      </w:tr>
+    </w:tbl>
+    <w:p>
+      <w:pPr>
+        <w:spacing w:after="80"/>
+      </w:pPr>
+    </w:p>
+    <w:p>
+      <w:pPr>
+        <w:spacing w:line="360" w:lineRule="auto" w:after="120"/>
+        <w:ind w:firstLine="0"/>
+        <w:jc w:val="both"/>
+      </w:pPr>
+      <w:r>
+        <w:rPr>
+          <w:rFonts w:ascii="Times New Roman" w:hAnsi="Times New Roman" w:eastAsia="Times New Roman"/>
+          <w:b w:val="0"/>
+          <w:i w:val="0"/>
+          <w:color w:val="000000"/>
+          <w:sz w:val="26"/>
+        </w:rPr>
+        <w:t>Mỗi hàng mô tả đặc trưng phổ tại một thời điểm. TD-ResNet thực hiện các phép convolution theo chiều thời gian để học mối liên hệ ngữ cảnh giữa những frame liên tiếp.</w:t>
+      </w:r>
+    </w:p>
+    <w:p>
+      <w:pPr>
+        <w:pStyle w:val="Heading3"/>
+        <w:keepNext/>
+        <w:spacing w:before="200" w:after="80"/>
+      </w:pPr>
+      <w:r>
+        <w:rPr>
+          <w:rFonts w:ascii="Times New Roman" w:hAnsi="Times New Roman" w:eastAsia="Times New Roman"/>
+          <w:b/>
+          <w:color w:val="000000"/>
+          <w:sz w:val="26"/>
+        </w:rPr>
+        <w:t>2.4.12. Tại sao sử dụng MFCC cho Keyword Spotting?</w:t>
+      </w:r>
+    </w:p>
+    <w:p>
+      <w:pPr>
+        <w:spacing w:line="360" w:lineRule="auto" w:after="120"/>
+        <w:ind w:firstLine="0"/>
+        <w:jc w:val="both"/>
+      </w:pPr>
+      <w:r>
+        <w:rPr>
+          <w:rFonts w:ascii="Times New Roman" w:hAnsi="Times New Roman" w:eastAsia="Times New Roman"/>
+          <w:b w:val="0"/>
+          <w:i w:val="0"/>
+          <w:color w:val="000000"/>
+          <w:sz w:val="26"/>
+        </w:rPr>
+        <w:t>Keyword Spotting tập trung vào việc phân biệt các từ có cấu trúc âm thanh khác nhau (ví dụ: yes, no, stop, seven). Sự khác biệt quan trọng nằm trong quá trình thay đổi phổ theo thời gian.</w:t>
+      </w:r>
+    </w:p>
+    <w:p>
+      <w:pPr>
+        <w:spacing w:line="360" w:lineRule="auto" w:after="120"/>
+        <w:ind w:firstLine="0"/>
+        <w:jc w:val="both"/>
+      </w:pPr>
+      <w:r>
+        <w:rPr>
+          <w:rFonts w:ascii="Times New Roman" w:hAnsi="Times New Roman" w:eastAsia="Times New Roman"/>
+          <w:b w:val="0"/>
+          <w:i w:val="0"/>
+          <w:color w:val="000000"/>
+          <w:sz w:val="26"/>
+        </w:rPr>
+        <w:t>MFCC có các ưu điểm nổi bật:</w:t>
+      </w:r>
+    </w:p>
+    <w:p>
+      <w:pPr>
+        <w:spacing w:line="360" w:lineRule="auto" w:after="80"/>
+        <w:ind w:left="340" w:hanging="340"/>
+        <w:jc w:val="both"/>
+      </w:pPr>
+      <w:r>
+        <w:rPr>
+          <w:rFonts w:ascii="Times New Roman" w:hAnsi="Times New Roman" w:eastAsia="Times New Roman"/>
+          <w:b/>
+          <w:color w:val="000000"/>
+          <w:sz w:val="26"/>
+        </w:rPr>
+        <w:t xml:space="preserve">-- </w:t>
+      </w:r>
+      <w:r>
+        <w:rPr>
+          <w:rFonts w:ascii="Times New Roman" w:hAnsi="Times New Roman" w:eastAsia="Times New Roman"/>
+          <w:color w:val="000000"/>
+          <w:sz w:val="26"/>
+        </w:rPr>
+        <w:t>giảm kích thước dữ liệu so với waveform (từ 16.000 điểm mẫu xuống ma trận 51 × 40 = 2.040 giá trị).</w:t>
+      </w:r>
+    </w:p>
+    <w:p>
+      <w:pPr>
+        <w:spacing w:line="360" w:lineRule="auto" w:after="80"/>
+        <w:ind w:left="340" w:hanging="340"/>
+        <w:jc w:val="both"/>
+      </w:pPr>
+      <w:r>
+        <w:rPr>
+          <w:rFonts w:ascii="Times New Roman" w:hAnsi="Times New Roman" w:eastAsia="Times New Roman"/>
+          <w:b/>
+          <w:color w:val="000000"/>
+          <w:sz w:val="26"/>
+        </w:rPr>
+        <w:t xml:space="preserve">-- </w:t>
+      </w:r>
+      <w:r>
+        <w:rPr>
+          <w:rFonts w:ascii="Times New Roman" w:hAnsi="Times New Roman" w:eastAsia="Times New Roman"/>
+          <w:color w:val="000000"/>
+          <w:sz w:val="26"/>
+        </w:rPr>
+        <w:t>tập trung vào thông tin phổ có ý nghĩa đối với thính giác tiếng nói con người.</w:t>
+      </w:r>
+    </w:p>
+    <w:p>
+      <w:pPr>
+        <w:spacing w:line="360" w:lineRule="auto" w:after="80"/>
+        <w:ind w:left="340" w:hanging="340"/>
+        <w:jc w:val="both"/>
+      </w:pPr>
+      <w:r>
+        <w:rPr>
+          <w:rFonts w:ascii="Times New Roman" w:hAnsi="Times New Roman" w:eastAsia="Times New Roman"/>
+          <w:b/>
+          <w:color w:val="000000"/>
+          <w:sz w:val="26"/>
+        </w:rPr>
+        <w:t xml:space="preserve">-- </w:t>
+      </w:r>
+      <w:r>
+        <w:rPr>
+          <w:rFonts w:ascii="Times New Roman" w:hAnsi="Times New Roman" w:eastAsia="Times New Roman"/>
+          <w:color w:val="000000"/>
+          <w:sz w:val="26"/>
+        </w:rPr>
+        <w:t>giảm bớt các chi tiết tín hiệu nhiễu không cần thiết.</w:t>
+      </w:r>
+    </w:p>
+    <w:p>
+      <w:pPr>
+        <w:spacing w:line="360" w:lineRule="auto" w:after="80"/>
+        <w:ind w:left="340" w:hanging="340"/>
+        <w:jc w:val="both"/>
+      </w:pPr>
+      <w:r>
+        <w:rPr>
+          <w:rFonts w:ascii="Times New Roman" w:hAnsi="Times New Roman" w:eastAsia="Times New Roman"/>
+          <w:b/>
+          <w:color w:val="000000"/>
+          <w:sz w:val="26"/>
+        </w:rPr>
+        <w:t xml:space="preserve">-- </w:t>
+      </w:r>
+      <w:r>
+        <w:rPr>
+          <w:rFonts w:ascii="Times New Roman" w:hAnsi="Times New Roman" w:eastAsia="Times New Roman"/>
+          <w:color w:val="000000"/>
+          <w:sz w:val="26"/>
+        </w:rPr>
+        <w:t>tạo chuỗi feature phù hợp trực tiếp với convolution theo thời gian của mạng ResNet.</w:t>
+      </w:r>
+    </w:p>
+    <w:p>
+      <w:pPr>
+        <w:spacing w:line="360" w:lineRule="auto" w:after="80"/>
+        <w:ind w:left="340" w:hanging="340"/>
+        <w:jc w:val="both"/>
+      </w:pPr>
+      <w:r>
+        <w:rPr>
+          <w:rFonts w:ascii="Times New Roman" w:hAnsi="Times New Roman" w:eastAsia="Times New Roman"/>
+          <w:b/>
+          <w:color w:val="000000"/>
+          <w:sz w:val="26"/>
+        </w:rPr>
+        <w:t xml:space="preserve">-- </w:t>
+      </w:r>
+      <w:r>
+        <w:rPr>
+          <w:rFonts w:ascii="Times New Roman" w:hAnsi="Times New Roman" w:eastAsia="Times New Roman"/>
+          <w:color w:val="000000"/>
+          <w:sz w:val="26"/>
+        </w:rPr>
+        <w:t>được sử dụng phổ biến và chuẩn mực trong các hệ thống speech recognition và Keyword Spotting.</w:t>
+      </w:r>
+    </w:p>
+    <w:p>
+      <w:pPr>
+        <w:spacing w:line="360" w:lineRule="auto" w:after="120"/>
+        <w:ind w:firstLine="0"/>
+        <w:jc w:val="both"/>
+      </w:pPr>
+      <w:r>
+        <w:rPr>
+          <w:rFonts w:ascii="Times New Roman" w:hAnsi="Times New Roman" w:eastAsia="Times New Roman"/>
+          <w:b w:val="0"/>
+          <w:i w:val="0"/>
+          <w:color w:val="000000"/>
+          <w:sz w:val="26"/>
+        </w:rPr>
+        <w:t>Trong đồ án, MFCC đóng vai trò biến Audio waveform thành Sequence of acoustic features trước khi TD-ResNet học vector embedding.</w:t>
+      </w:r>
+    </w:p>
+    <w:p>
+      <w:pPr>
+        <w:pStyle w:val="Heading3"/>
+        <w:keepNext/>
+        <w:spacing w:before="200" w:after="80"/>
+      </w:pPr>
+      <w:r>
+        <w:rPr>
+          <w:rFonts w:ascii="Times New Roman" w:hAnsi="Times New Roman" w:eastAsia="Times New Roman"/>
+          <w:b/>
+          <w:color w:val="000000"/>
+          <w:sz w:val="26"/>
+        </w:rPr>
+        <w:t>2.4.13. Data augmentation trước khi trích xuất MFCC</w:t>
+      </w:r>
+    </w:p>
+    <w:p>
+      <w:pPr>
+        <w:spacing w:line="360" w:lineRule="auto" w:after="120"/>
+        <w:ind w:firstLine="0"/>
+        <w:jc w:val="both"/>
+      </w:pPr>
+      <w:r>
+        <w:rPr>
+          <w:rFonts w:ascii="Times New Roman" w:hAnsi="Times New Roman" w:eastAsia="Times New Roman"/>
+          <w:b w:val="0"/>
+          <w:i w:val="0"/>
+          <w:color w:val="000000"/>
+          <w:sz w:val="26"/>
+        </w:rPr>
+        <w:t>Source code cho thấy feature extraction không phải bước duy nhất tác động lên waveform. Pipeline data loader gồm:</w:t>
+      </w:r>
+    </w:p>
+    <w:tbl>
+      <w:tblPr>
+        <w:tblW w:type="auto" w:w="0"/>
+        <w:jc w:val="center"/>
+        <w:tblLayout w:type="fixed"/>
+        <w:tblLook w:firstColumn="1" w:firstRow="1" w:lastColumn="0" w:lastRow="0" w:noHBand="0" w:noVBand="1" w:val="04A0"/>
+      </w:tblPr>
+      <w:tblGrid>
+        <w:gridCol w:w="9405"/>
+      </w:tblGrid>
+      <w:tr>
+        <w:tc>
+          <w:tcPr>
+            <w:tcW w:type="dxa" w:w="8787"/>
+            <w:shd w:fill="F8FAFC"/>
+            <w:tcBorders>
+              <w:top w:val="single" w:sz="4" w:space="0" w:color="E2E8F0"/>
+              <w:left w:val="single" w:sz="18" w:space="0" w:color="2563EB"/>
+              <w:bottom w:val="single" w:sz="4" w:space="0" w:color="E2E8F0"/>
+              <w:right w:val="single" w:sz="4" w:space="0" w:color="E2E8F0"/>
+            </w:tcBorders>
+          </w:tcPr>
+          <w:p>
+            <w:pPr>
+              <w:spacing w:before="80" w:after="80" w:line="276" w:lineRule="auto"/>
+            </w:pPr>
+            <w:r>
+              <w:rPr>
+                <w:rFonts w:ascii="Consolas" w:hAnsi="Consolas"/>
+                <w:color w:val="1E293B"/>
+                <w:sz w:val="19"/>
+              </w:rPr>
+              <w:t>load_audio → adjust_volume → shift_and_pad → mix_background → extract_features</w:t>
+            </w:r>
+          </w:p>
+        </w:tc>
+      </w:tr>
+    </w:tbl>
+    <w:p>
+      <w:pPr>
+        <w:spacing w:after="80"/>
+      </w:pPr>
+    </w:p>
+    <w:p>
+      <w:pPr>
+        <w:spacing w:line="360" w:lineRule="auto" w:after="120"/>
+        <w:ind w:firstLine="0"/>
+        <w:jc w:val="both"/>
+      </w:pPr>
+      <w:r>
+        <w:rPr>
+          <w:rFonts w:ascii="Times New Roman" w:hAnsi="Times New Roman" w:eastAsia="Times New Roman"/>
+          <w:b w:val="0"/>
+          <w:i w:val="0"/>
+          <w:color w:val="000000"/>
+          <w:sz w:val="26"/>
+        </w:rPr>
+        <w:t>Trong đó repository có các cấu hình:</w:t>
+      </w:r>
+    </w:p>
+    <w:tbl>
+      <w:tblPr>
+        <w:tblW w:type="auto" w:w="0"/>
+        <w:jc w:val="center"/>
+        <w:tblLayout w:type="fixed"/>
+        <w:tblLook w:firstColumn="1" w:firstRow="1" w:lastColumn="0" w:lastRow="0" w:noHBand="0" w:noVBand="1" w:val="04A0"/>
+      </w:tblPr>
+      <w:tblGrid>
+        <w:gridCol w:w="9405"/>
+      </w:tblGrid>
+      <w:tr>
+        <w:tc>
+          <w:tcPr>
+            <w:tcW w:type="dxa" w:w="8787"/>
+            <w:shd w:fill="F8FAFC"/>
+            <w:tcBorders>
+              <w:top w:val="single" w:sz="4" w:space="0" w:color="E2E8F0"/>
+              <w:left w:val="single" w:sz="18" w:space="0" w:color="2563EB"/>
+              <w:bottom w:val="single" w:sz="4" w:space="0" w:color="E2E8F0"/>
+              <w:right w:val="single" w:sz="4" w:space="0" w:color="E2E8F0"/>
+            </w:tcBorders>
+          </w:tcPr>
+          <w:p>
+            <w:pPr>
+              <w:spacing w:before="80" w:after="80" w:line="276" w:lineRule="auto"/>
+            </w:pPr>
+            <w:r>
+              <w:rPr>
+                <w:rFonts w:ascii="Consolas" w:hAnsi="Consolas"/>
+                <w:color w:val="1E293B"/>
+                <w:sz w:val="19"/>
+              </w:rPr>
+              <w:t>time_shift</w:t>
+              <w:br/>
+              <w:t>background_volume</w:t>
+              <w:br/>
+              <w:t>background_frequency</w:t>
+              <w:br/>
+              <w:t>include_background</w:t>
+              <w:br/>
+              <w:t>include_silence</w:t>
+              <w:br/>
+              <w:t>include_unknown</w:t>
+            </w:r>
+          </w:p>
+        </w:tc>
+      </w:tr>
+    </w:tbl>
+    <w:p>
+      <w:pPr>
+        <w:spacing w:after="80"/>
+      </w:pPr>
+    </w:p>
+    <w:p>
+      <w:pPr>
+        <w:spacing w:line="360" w:lineRule="auto" w:after="120"/>
+        <w:ind w:firstLine="0"/>
+        <w:jc w:val="both"/>
+      </w:pPr>
+      <w:r>
+        <w:rPr>
+          <w:rFonts w:ascii="Times New Roman" w:hAnsi="Times New Roman" w:eastAsia="Times New Roman"/>
+          <w:b w:val="0"/>
+          <w:i w:val="0"/>
+          <w:color w:val="000000"/>
+          <w:sz w:val="26"/>
+        </w:rPr>
+        <w:t>Dataset class cũng có khả năng đọc dữ liệu từ _background_noise_ khi background augmentation hoặc silence được kích hoạt. Do đó cần phân biệt: Dataset preparation (ở mục 2.3) và Training-time augmentation + feature extraction.</w:t>
+      </w:r>
+    </w:p>
+    <w:p>
+      <w:pPr>
+        <w:spacing w:line="360" w:lineRule="auto" w:after="120"/>
+        <w:ind w:firstLine="0"/>
+        <w:jc w:val="both"/>
+      </w:pPr>
+      <w:r>
+        <w:rPr>
+          <w:rFonts w:ascii="Times New Roman" w:hAnsi="Times New Roman" w:eastAsia="Times New Roman"/>
+          <w:b w:val="0"/>
+          <w:i w:val="0"/>
+          <w:color w:val="000000"/>
+          <w:sz w:val="26"/>
+        </w:rPr>
+        <w:t>Pipeline đầy đủ:</w:t>
+      </w:r>
+    </w:p>
+    <w:tbl>
+      <w:tblPr>
+        <w:tblW w:type="auto" w:w="0"/>
+        <w:jc w:val="center"/>
+        <w:tblLayout w:type="fixed"/>
+        <w:tblLook w:firstColumn="1" w:firstRow="1" w:lastColumn="0" w:lastRow="0" w:noHBand="0" w:noVBand="1" w:val="04A0"/>
+      </w:tblPr>
+      <w:tblGrid>
+        <w:gridCol w:w="9405"/>
+      </w:tblGrid>
+      <w:tr>
+        <w:tc>
+          <w:tcPr>
+            <w:tcW w:type="dxa" w:w="8787"/>
+            <w:shd w:fill="F8FAFC"/>
+            <w:tcBorders>
+              <w:top w:val="single" w:sz="4" w:space="0" w:color="E2E8F0"/>
+              <w:left w:val="single" w:sz="18" w:space="0" w:color="2563EB"/>
+              <w:bottom w:val="single" w:sz="4" w:space="0" w:color="E2E8F0"/>
+              <w:right w:val="single" w:sz="4" w:space="0" w:color="E2E8F0"/>
+            </w:tcBorders>
+          </w:tcPr>
+          <w:p>
+            <w:pPr>
+              <w:spacing w:before="80" w:after="80" w:line="276" w:lineRule="auto"/>
+            </w:pPr>
+            <w:r>
+              <w:rPr>
+                <w:rFonts w:ascii="Consolas" w:hAnsi="Consolas"/>
+                <w:color w:val="1E293B"/>
+                <w:sz w:val="19"/>
+              </w:rPr>
+              <w:t>Prepared WAV</w:t>
+              <w:br/>
+              <w:t xml:space="preserve">     ↓</w:t>
+              <w:br/>
+              <w:t>Load audio</w:t>
+              <w:br/>
+              <w:t xml:space="preserve">     ↓</w:t>
+              <w:br/>
+              <w:t>Volume processing</w:t>
+              <w:br/>
+              <w:t xml:space="preserve">     ↓</w:t>
+              <w:br/>
+              <w:t>Time shift</w:t>
+              <w:br/>
+              <w:t xml:space="preserve">     ↓</w:t>
+              <w:br/>
+              <w:t>Background mixing</w:t>
+              <w:br/>
+              <w:t xml:space="preserve">     ↓</w:t>
+              <w:br/>
+              <w:t>MFCC extraction</w:t>
+              <w:br/>
+              <w:t xml:space="preserve">     ↓</w:t>
+              <w:br/>
+              <w:t>TD-ResNet</w:t>
+            </w:r>
+          </w:p>
+        </w:tc>
+      </w:tr>
+    </w:tbl>
+    <w:p>
+      <w:pPr>
+        <w:spacing w:after="80"/>
+      </w:pPr>
+    </w:p>
+    <w:p>
+      <w:pPr>
+        <w:spacing w:line="360" w:lineRule="auto" w:after="120"/>
+        <w:ind w:firstLine="0"/>
+        <w:jc w:val="both"/>
+      </w:pPr>
+      <w:r>
+        <w:rPr>
+          <w:rFonts w:ascii="Times New Roman" w:hAnsi="Times New Roman" w:eastAsia="Times New Roman"/>
+          <w:b w:val="0"/>
+          <w:i w:val="0"/>
+          <w:color w:val="000000"/>
+          <w:sz w:val="26"/>
+        </w:rPr>
+        <w:t>Các augmentation này xảy ra trong data loader khi tạo dữ liệu huấn luyện, không phải trong bước xây dựng FS-GSC ở mục 2.3.</w:t>
+      </w:r>
+    </w:p>
+    <w:p>
+      <w:pPr>
+        <w:pStyle w:val="Heading3"/>
+        <w:keepNext/>
+        <w:spacing w:before="200" w:after="80"/>
+      </w:pPr>
+      <w:r>
+        <w:rPr>
+          <w:rFonts w:ascii="Times New Roman" w:hAnsi="Times New Roman" w:eastAsia="Times New Roman"/>
+          <w:b/>
+          <w:color w:val="000000"/>
+          <w:sz w:val="26"/>
+        </w:rPr>
+        <w:t>2.4.14. Áp dụng cùng MFCC extractor cho AudioMNIST</w:t>
+      </w:r>
+    </w:p>
+    <w:p>
+      <w:pPr>
+        <w:spacing w:line="360" w:lineRule="auto" w:after="120"/>
+        <w:ind w:firstLine="0"/>
+        <w:jc w:val="both"/>
+      </w:pPr>
+      <w:r>
+        <w:rPr>
+          <w:rFonts w:ascii="Times New Roman" w:hAnsi="Times New Roman" w:eastAsia="Times New Roman"/>
+          <w:b w:val="0"/>
+          <w:i w:val="0"/>
+          <w:color w:val="000000"/>
+          <w:sz w:val="26"/>
+        </w:rPr>
+        <w:t>Sau preprocessing, AudioMNIST đã được đưa về: 16 kHz, mono, 16000 samples, 1 second — hoàn toàn trùng khớp với chuẩn input của FS-GSC. Do đó cùng một MFCC extractor có thể được sử dụng trực tiếp:</w:t>
+      </w:r>
+    </w:p>
+    <w:tbl>
+      <w:tblPr>
+        <w:tblW w:type="auto" w:w="0"/>
+        <w:jc w:val="center"/>
+        <w:tblLayout w:type="fixed"/>
+        <w:tblLook w:firstColumn="1" w:firstRow="1" w:lastColumn="0" w:lastRow="0" w:noHBand="0" w:noVBand="1" w:val="04A0"/>
+      </w:tblPr>
+      <w:tblGrid>
+        <w:gridCol w:w="9405"/>
+      </w:tblGrid>
+      <w:tr>
+        <w:tc>
+          <w:tcPr>
+            <w:tcW w:type="dxa" w:w="8787"/>
+            <w:shd w:fill="F8FAFC"/>
+            <w:tcBorders>
+              <w:top w:val="single" w:sz="4" w:space="0" w:color="E2E8F0"/>
+              <w:left w:val="single" w:sz="18" w:space="0" w:color="2563EB"/>
+              <w:bottom w:val="single" w:sz="4" w:space="0" w:color="E2E8F0"/>
+              <w:right w:val="single" w:sz="4" w:space="0" w:color="E2E8F0"/>
+            </w:tcBorders>
+          </w:tcPr>
+          <w:p>
+            <w:pPr>
+              <w:spacing w:before="80" w:after="80" w:line="276" w:lineRule="auto"/>
+            </w:pPr>
+            <w:r>
+              <w:rPr>
+                <w:rFonts w:ascii="Consolas" w:hAnsi="Consolas"/>
+                <w:color w:val="1E293B"/>
+                <w:sz w:val="19"/>
+              </w:rPr>
+              <w:t>AudioMNIST (16 kHz / 1 s)</w:t>
+              <w:br/>
+              <w:t xml:space="preserve">     ↓</w:t>
+              <w:br/>
+              <w:t>MFCC (window = 40 ms, stride = 20 ms, 40 coefficients)</w:t>
+              <w:br/>
+              <w:t xml:space="preserve">     ↓</w:t>
+              <w:br/>
+              <w:t>TD-ResNet</w:t>
+            </w:r>
+          </w:p>
+        </w:tc>
+      </w:tr>
+    </w:tbl>
+    <w:p>
+      <w:pPr>
+        <w:spacing w:after="80"/>
+      </w:pPr>
+    </w:p>
+    <w:p>
+      <w:pPr>
+        <w:spacing w:line="360" w:lineRule="auto" w:after="120"/>
+        <w:ind w:firstLine="0"/>
+        <w:jc w:val="both"/>
+      </w:pPr>
+      <w:r>
+        <w:rPr>
+          <w:rFonts w:ascii="Times New Roman" w:hAnsi="Times New Roman" w:eastAsia="Times New Roman"/>
+          <w:b w:val="0"/>
+          <w:i/>
+          <w:color w:val="000000"/>
+          <w:sz w:val="26"/>
+        </w:rPr>
+        <w:t>Điều này rất quan trọng đối với experiment: Thay FS-GSC bằng AudioMNIST nhưng giữ nguyên preprocessing input, MFCC extractor, TD-ResNet và Prototypical Network. Nhờ đó sự thay đổi chính của experiment là dataset, thay vì đồng thời thay cả feature representation.</w:t>
+      </w:r>
+    </w:p>
+    <w:p>
+      <w:pPr>
+        <w:pStyle w:val="Heading3"/>
+        <w:keepNext/>
+        <w:spacing w:before="200" w:after="80"/>
+      </w:pPr>
+      <w:r>
+        <w:rPr>
+          <w:rFonts w:ascii="Times New Roman" w:hAnsi="Times New Roman" w:eastAsia="Times New Roman"/>
+          <w:b/>
+          <w:color w:val="000000"/>
+          <w:sz w:val="26"/>
+        </w:rPr>
+        <w:t>2.4.15. Áp dụng MFCC extractor cho Fluent Speech Commands</w:t>
+      </w:r>
+    </w:p>
+    <w:p>
+      <w:pPr>
+        <w:spacing w:line="360" w:lineRule="auto" w:after="120"/>
+        <w:ind w:firstLine="0"/>
+        <w:jc w:val="both"/>
+      </w:pPr>
+      <w:r>
+        <w:rPr>
+          <w:rFonts w:ascii="Times New Roman" w:hAnsi="Times New Roman" w:eastAsia="Times New Roman"/>
+          <w:b w:val="0"/>
+          <w:i w:val="0"/>
+          <w:color w:val="000000"/>
+          <w:sz w:val="26"/>
+        </w:rPr>
+        <w:t>FSC sau preprocessing được chia thành các segment: 16 kHz, 16000 samples, 1 second. Do đó từng segment cũng có thể sử dụng đúng MFCC extractor:</w:t>
+      </w:r>
+    </w:p>
+    <w:tbl>
+      <w:tblPr>
+        <w:tblW w:type="auto" w:w="0"/>
+        <w:jc w:val="center"/>
+        <w:tblLayout w:type="fixed"/>
+        <w:tblLook w:firstColumn="1" w:firstRow="1" w:lastColumn="0" w:lastRow="0" w:noHBand="0" w:noVBand="1" w:val="04A0"/>
+      </w:tblPr>
+      <w:tblGrid>
+        <w:gridCol w:w="9405"/>
+      </w:tblGrid>
+      <w:tr>
+        <w:tc>
+          <w:tcPr>
+            <w:tcW w:type="dxa" w:w="8787"/>
+            <w:shd w:fill="F8FAFC"/>
+            <w:tcBorders>
+              <w:top w:val="single" w:sz="4" w:space="0" w:color="E2E8F0"/>
+              <w:left w:val="single" w:sz="18" w:space="0" w:color="2563EB"/>
+              <w:bottom w:val="single" w:sz="4" w:space="0" w:color="E2E8F0"/>
+              <w:right w:val="single" w:sz="4" w:space="0" w:color="E2E8F0"/>
+            </w:tcBorders>
+          </w:tcPr>
+          <w:p>
+            <w:pPr>
+              <w:spacing w:before="80" w:after="80" w:line="276" w:lineRule="auto"/>
+            </w:pPr>
+            <w:r>
+              <w:rPr>
+                <w:rFonts w:ascii="Consolas" w:hAnsi="Consolas"/>
+                <w:color w:val="1E293B"/>
+                <w:sz w:val="19"/>
+              </w:rPr>
+              <w:t>FSC utterance</w:t>
+              <w:br/>
+              <w:t xml:space="preserve">       ↓</w:t>
+              <w:br/>
+              <w:t>1-second segments</w:t>
+              <w:br/>
+              <w:t xml:space="preserve">       ↓</w:t>
+              <w:br/>
+              <w:t>MFCC segment 1, MFCC segment 2, ...</w:t>
+              <w:br/>
+              <w:t xml:space="preserve">       ↓</w:t>
+              <w:br/>
+              <w:t>Frozen TD-ResNet</w:t>
+            </w:r>
+          </w:p>
+        </w:tc>
+      </w:tr>
+    </w:tbl>
+    <w:p>
+      <w:pPr>
+        <w:spacing w:after="80"/>
+      </w:pPr>
+    </w:p>
+    <w:p>
+      <w:pPr>
+        <w:spacing w:line="360" w:lineRule="auto" w:after="120"/>
+        <w:ind w:firstLine="0"/>
+        <w:jc w:val="both"/>
+      </w:pPr>
+      <w:r>
+        <w:rPr>
+          <w:rFonts w:ascii="Times New Roman" w:hAnsi="Times New Roman" w:eastAsia="Times New Roman"/>
+          <w:b w:val="0"/>
+          <w:i w:val="0"/>
+          <w:color w:val="000000"/>
+          <w:sz w:val="26"/>
+        </w:rPr>
+        <w:t>Mỗi segment tạo một embedding z_1, z_2, ..., z_M. Sau đó các embedding có thể được tổng hợp thành utterance embedding:</w:t>
+      </w:r>
+    </w:p>
+    <w:p>
+      <w:pPr>
+        <w:spacing w:before="80" w:after="120"/>
+        <w:jc w:val="center"/>
+      </w:pPr>
+      <w:r>
+        <w:rPr>
+          <w:rFonts w:ascii="Cambria Math" w:hAnsi="Cambria Math" w:eastAsia="Cambria Math"/>
+          <w:color w:val="000000"/>
+          <w:sz w:val="24"/>
+        </w:rPr>
+        <w:t>z_{utt} = \frac{1}{M} \sum_{i=1}^{M} z_i</w:t>
+      </w:r>
+    </w:p>
+    <w:p>
+      <w:pPr>
+        <w:spacing w:line="360" w:lineRule="auto" w:after="120"/>
+        <w:ind w:firstLine="0"/>
+        <w:jc w:val="both"/>
+      </w:pPr>
+      <w:r>
+        <w:rPr>
+          <w:rFonts w:ascii="Times New Roman" w:hAnsi="Times New Roman" w:eastAsia="Times New Roman"/>
+          <w:b w:val="0"/>
+          <w:i w:val="0"/>
+          <w:color w:val="000000"/>
+          <w:sz w:val="26"/>
+        </w:rPr>
+        <w:t>Điều này giúp nhóm giữ cùng feature representation giữa FS-GSC, AudioMNIST và FSC trong các thí nghiệm cross-dataset và cross-domain.</w:t>
+      </w:r>
+    </w:p>
+    <w:p>
+      <w:pPr>
+        <w:pStyle w:val="Heading3"/>
+        <w:keepNext/>
+        <w:spacing w:before="200" w:after="80"/>
+      </w:pPr>
+      <w:r>
+        <w:rPr>
+          <w:rFonts w:ascii="Times New Roman" w:hAnsi="Times New Roman" w:eastAsia="Times New Roman"/>
+          <w:b/>
+          <w:color w:val="000000"/>
+          <w:sz w:val="26"/>
+        </w:rPr>
+        <w:t>2.4.16. Các đặc trưng bổ sung phục vụ phân tích dữ liệu</w:t>
+      </w:r>
+    </w:p>
+    <w:p>
+      <w:pPr>
+        <w:spacing w:line="360" w:lineRule="auto" w:after="120"/>
+        <w:ind w:firstLine="0"/>
+        <w:jc w:val="both"/>
+      </w:pPr>
+      <w:r>
+        <w:rPr>
+          <w:rFonts w:ascii="Times New Roman" w:hAnsi="Times New Roman" w:eastAsia="Times New Roman"/>
+          <w:b w:val="0"/>
+          <w:i w:val="0"/>
+          <w:color w:val="000000"/>
+          <w:sz w:val="26"/>
+        </w:rPr>
+        <w:t>Ngoài MFCC được sử dụng trực tiếp trong model, nhóm có thể tính thêm một số đặc trưng phục vụ mục 2.5 để trực quan hóa và nhận xét dữ liệu. Các đặc trưng này không nhất thiết là input của TD-ResNet:</w:t>
+      </w:r>
+    </w:p>
+    <w:p>
+      <w:pPr>
+        <w:spacing w:line="360" w:lineRule="auto" w:after="80"/>
+        <w:ind w:left="340" w:hanging="340"/>
+        <w:jc w:val="both"/>
+      </w:pPr>
+      <w:r>
+        <w:rPr>
+          <w:rFonts w:ascii="Times New Roman" w:hAnsi="Times New Roman" w:eastAsia="Times New Roman"/>
+          <w:b/>
+          <w:color w:val="000000"/>
+          <w:sz w:val="26"/>
+        </w:rPr>
+        <w:t xml:space="preserve">-- </w:t>
+      </w:r>
+      <w:r>
+        <w:rPr>
+          <w:rFonts w:ascii="Times New Roman" w:hAnsi="Times New Roman" w:eastAsia="Times New Roman"/>
+          <w:b/>
+          <w:color w:val="000000"/>
+          <w:sz w:val="26"/>
+        </w:rPr>
+        <w:t xml:space="preserve">Waveform:: </w:t>
+      </w:r>
+      <w:r>
+        <w:rPr>
+          <w:rFonts w:ascii="Times New Roman" w:hAnsi="Times New Roman" w:eastAsia="Times New Roman"/>
+          <w:color w:val="000000"/>
+          <w:sz w:val="26"/>
+        </w:rPr>
+        <w:t>Cho biết sự thay đổi biên độ tín hiệu theo thời gian.</w:t>
+      </w:r>
+    </w:p>
+    <w:p>
+      <w:pPr>
+        <w:spacing w:line="360" w:lineRule="auto" w:after="80"/>
+        <w:ind w:left="340" w:hanging="340"/>
+        <w:jc w:val="both"/>
+      </w:pPr>
+      <w:r>
+        <w:rPr>
+          <w:rFonts w:ascii="Times New Roman" w:hAnsi="Times New Roman" w:eastAsia="Times New Roman"/>
+          <w:b/>
+          <w:color w:val="000000"/>
+          <w:sz w:val="26"/>
+        </w:rPr>
+        <w:t xml:space="preserve">-- </w:t>
+      </w:r>
+      <w:r>
+        <w:rPr>
+          <w:rFonts w:ascii="Times New Roman" w:hAnsi="Times New Roman" w:eastAsia="Times New Roman"/>
+          <w:b/>
+          <w:color w:val="000000"/>
+          <w:sz w:val="26"/>
+        </w:rPr>
+        <w:t xml:space="preserve">Spectrogram:: </w:t>
+      </w:r>
+      <w:r>
+        <w:rPr>
+          <w:rFonts w:ascii="Times New Roman" w:hAnsi="Times New Roman" w:eastAsia="Times New Roman"/>
+          <w:color w:val="000000"/>
+          <w:sz w:val="26"/>
+        </w:rPr>
+        <w:t>Biểu diễn sự thay đổi năng lượng theo cả thời gian và tần số.</w:t>
+      </w:r>
+    </w:p>
+    <w:p>
+      <w:pPr>
+        <w:spacing w:line="360" w:lineRule="auto" w:after="80"/>
+        <w:ind w:left="340" w:hanging="340"/>
+        <w:jc w:val="both"/>
+      </w:pPr>
+      <w:r>
+        <w:rPr>
+          <w:rFonts w:ascii="Times New Roman" w:hAnsi="Times New Roman" w:eastAsia="Times New Roman"/>
+          <w:b/>
+          <w:color w:val="000000"/>
+          <w:sz w:val="26"/>
+        </w:rPr>
+        <w:t xml:space="preserve">-- </w:t>
+      </w:r>
+      <w:r>
+        <w:rPr>
+          <w:rFonts w:ascii="Times New Roman" w:hAnsi="Times New Roman" w:eastAsia="Times New Roman"/>
+          <w:b/>
+          <w:color w:val="000000"/>
+          <w:sz w:val="26"/>
+        </w:rPr>
+        <w:t xml:space="preserve">Mel-spectrogram:: </w:t>
+      </w:r>
+      <w:r>
+        <w:rPr>
+          <w:rFonts w:ascii="Times New Roman" w:hAnsi="Times New Roman" w:eastAsia="Times New Roman"/>
+          <w:color w:val="000000"/>
+          <w:sz w:val="26"/>
+        </w:rPr>
+        <w:t>Biểu diễn phổ trên Mel scale, gần với quá trình tạo MFCC.</w:t>
+      </w:r>
+    </w:p>
+    <w:p>
+      <w:pPr>
+        <w:spacing w:line="360" w:lineRule="auto" w:after="80"/>
+        <w:ind w:left="340" w:hanging="340"/>
+        <w:jc w:val="both"/>
+      </w:pPr>
+      <w:r>
+        <w:rPr>
+          <w:rFonts w:ascii="Times New Roman" w:hAnsi="Times New Roman" w:eastAsia="Times New Roman"/>
+          <w:b/>
+          <w:color w:val="000000"/>
+          <w:sz w:val="26"/>
+        </w:rPr>
+        <w:t xml:space="preserve">-- </w:t>
+      </w:r>
+      <w:r>
+        <w:rPr>
+          <w:rFonts w:ascii="Times New Roman" w:hAnsi="Times New Roman" w:eastAsia="Times New Roman"/>
+          <w:b/>
+          <w:color w:val="000000"/>
+          <w:sz w:val="26"/>
+        </w:rPr>
+        <w:t xml:space="preserve">Energy / RMS:: </w:t>
+      </w:r>
+      <w:r>
+        <w:rPr>
+          <w:rFonts w:ascii="Times New Roman" w:hAnsi="Times New Roman" w:eastAsia="Times New Roman"/>
+          <w:color w:val="000000"/>
+          <w:sz w:val="26"/>
+        </w:rPr>
+        <w:t>Dùng để đánh giá mức năng lượng tín hiệu:</w:t>
+      </w:r>
+    </w:p>
+    <w:p>
+      <w:pPr>
+        <w:spacing w:before="80" w:after="120"/>
+        <w:jc w:val="center"/>
+      </w:pPr>
+      <w:r>
+        <w:rPr>
+          <w:rFonts w:ascii="Cambria Math" w:hAnsi="Cambria Math" w:eastAsia="Cambria Math"/>
+          <w:color w:val="000000"/>
+          <w:sz w:val="24"/>
+        </w:rPr>
+        <w:t>RMS = \sqrt{ \frac{1}{N} \sum_{n=1}^{N} x[n]^2 }</w:t>
+      </w:r>
+    </w:p>
+    <w:p>
+      <w:pPr>
+        <w:spacing w:line="360" w:lineRule="auto" w:after="80"/>
+        <w:ind w:left="340" w:hanging="340"/>
+        <w:jc w:val="both"/>
+      </w:pPr>
+      <w:r>
+        <w:rPr>
+          <w:rFonts w:ascii="Times New Roman" w:hAnsi="Times New Roman" w:eastAsia="Times New Roman"/>
+          <w:b/>
+          <w:color w:val="000000"/>
+          <w:sz w:val="26"/>
+        </w:rPr>
+        <w:t xml:space="preserve">-- </w:t>
+      </w:r>
+      <w:r>
+        <w:rPr>
+          <w:rFonts w:ascii="Times New Roman" w:hAnsi="Times New Roman" w:eastAsia="Times New Roman"/>
+          <w:b/>
+          <w:color w:val="000000"/>
+          <w:sz w:val="26"/>
+        </w:rPr>
+        <w:t xml:space="preserve">Zero Crossing Rate (ZCR):: </w:t>
+      </w:r>
+      <w:r>
+        <w:rPr>
+          <w:rFonts w:ascii="Times New Roman" w:hAnsi="Times New Roman" w:eastAsia="Times New Roman"/>
+          <w:color w:val="000000"/>
+          <w:sz w:val="26"/>
+        </w:rPr>
+        <w:t>Đo số lần waveform đổi dấu, hỗ trợ nhận xét về mức độ dao động:</w:t>
+      </w:r>
+    </w:p>
+    <w:p>
+      <w:pPr>
+        <w:spacing w:before="80" w:after="120"/>
+        <w:jc w:val="center"/>
+      </w:pPr>
+      <w:r>
+        <w:rPr>
+          <w:rFonts w:ascii="Cambria Math" w:hAnsi="Cambria Math" w:eastAsia="Cambria Math"/>
+          <w:color w:val="000000"/>
+          <w:sz w:val="24"/>
+        </w:rPr>
+        <w:t>ZCR = \frac{1}{2N} \sum_{n=1}^{N-1} |\text{sign}(x[n]) - \text{sign}(x[n-1])|</w:t>
+      </w:r>
+    </w:p>
+    <w:p>
+      <w:pPr>
+        <w:spacing w:line="360" w:lineRule="auto" w:after="120"/>
+        <w:ind w:firstLine="0"/>
+        <w:jc w:val="both"/>
+      </w:pPr>
+      <w:r>
+        <w:rPr>
+          <w:rFonts w:ascii="Times New Roman" w:hAnsi="Times New Roman" w:eastAsia="Times New Roman"/>
+          <w:b w:val="0"/>
+          <w:i w:val="0"/>
+          <w:color w:val="000000"/>
+          <w:sz w:val="26"/>
+        </w:rPr>
+        <w:t>Các đặc trưng bổ sung này chủ yếu phục vụ visualization và data analysis thay vì làm đầu vào chính của model.</w:t>
+      </w:r>
+    </w:p>
+    <w:p>
+      <w:pPr>
+        <w:keepNext/>
+        <w:spacing w:before="160"/>
+        <w:jc w:val="center"/>
+      </w:pPr>
+      <w:r>
+        <w:drawing>
+          <wp:inline xmlns:a="http://schemas.openxmlformats.org/drawingml/2006/main" xmlns:pic="http://schemas.openxmlformats.org/drawingml/2006/picture">
+            <wp:extent cx="5400000" cy="3727470"/>
+            <wp:docPr id="13" name="Picture 13"/>
+            <wp:cNvGraphicFramePr>
+              <a:graphicFrameLocks noChangeAspect="1"/>
+            </wp:cNvGraphicFramePr>
+            <a:graphic>
+              <a:graphicData uri="http://schemas.openxmlformats.org/drawingml/2006/picture">
+                <pic:pic>
+                  <pic:nvPicPr>
+                    <pic:cNvPr id="0" name="fig_13_feature_gallery.png"/>
+                    <pic:cNvPicPr/>
+                  </pic:nvPicPr>
+                  <pic:blipFill>
+                    <a:blip r:embed="rId21"/>
+                    <a:stretch>
+                      <a:fillRect/>
+                    </a:stretch>
+                  </pic:blipFill>
+                  <pic:spPr>
+                    <a:xfrm>
+                      <a:off x="0" y="0"/>
+                      <a:ext cx="5400000" cy="3727470"/>
+                    </a:xfrm>
+                    <a:prstGeom prst="rect"/>
+                  </pic:spPr>
+                </pic:pic>
+              </a:graphicData>
+            </a:graphic>
+          </wp:inline>
+        </w:drawing>
+      </w:r>
+    </w:p>
+    <w:p>
+      <w:pPr>
+        <w:spacing w:after="200"/>
+        <w:jc w:val="center"/>
+      </w:pPr>
+      <w:r>
+        <w:rPr>
+          <w:rFonts w:ascii="Times New Roman" w:hAnsi="Times New Roman" w:eastAsia="Times New Roman"/>
+          <w:i/>
+          <w:color w:val="000000"/>
+          <w:sz w:val="22"/>
+        </w:rPr>
+        <w:t>Hình 2.5. Trực quan hóa 6 đặc trưng tiếng nói tiêu biểu của tín hiệu âm thanh</w:t>
+      </w:r>
+    </w:p>
+    <w:p>
+      <w:pPr>
+        <w:pStyle w:val="Heading3"/>
+        <w:keepNext/>
+        <w:spacing w:before="200" w:after="80"/>
+      </w:pPr>
+      <w:r>
+        <w:rPr>
+          <w:rFonts w:ascii="Times New Roman" w:hAnsi="Times New Roman" w:eastAsia="Times New Roman"/>
+          <w:b/>
+          <w:color w:val="000000"/>
+          <w:sz w:val="26"/>
+        </w:rPr>
+        <w:t>2.4.17. Tổng hợp đặc trưng sử dụng</w:t>
+      </w:r>
+    </w:p>
+    <w:p>
+      <w:pPr>
+        <w:spacing w:line="360" w:lineRule="auto" w:after="120"/>
+        <w:ind w:firstLine="0"/>
+        <w:jc w:val="both"/>
+      </w:pPr>
+      <w:r>
+        <w:rPr>
+          <w:rFonts w:ascii="Times New Roman" w:hAnsi="Times New Roman" w:eastAsia="Times New Roman"/>
+          <w:b w:val="0"/>
+          <w:i w:val="0"/>
+          <w:color w:val="000000"/>
+          <w:sz w:val="26"/>
+        </w:rPr>
+        <w:t>Bảng tổng hợp vai trò của từng đặc trưng trong đồ án:</w:t>
+      </w:r>
+    </w:p>
+    <w:tbl>
+      <w:tblPr>
+        <w:tblW w:type="auto" w:w="0"/>
+        <w:jc w:val="center"/>
+        <w:tblLayout w:type="fixed"/>
+        <w:tblLook w:firstColumn="1" w:firstRow="1" w:lastColumn="0" w:lastRow="0" w:noHBand="0" w:noVBand="1" w:val="04A0"/>
+      </w:tblPr>
+      <w:tblGrid>
+        <w:gridCol w:w="4702"/>
+        <w:gridCol w:w="4702"/>
+      </w:tblGrid>
+      <w:tr>
+        <w:tc>
+          <w:tcPr>
+            <w:tcW w:type="dxa" w:w="3118"/>
+            <w:shd w:fill="E2E8F0"/>
+          </w:tcPr>
+          <w:p>
+            <w:pPr>
+              <w:spacing w:after="60" w:line="276" w:lineRule="auto"/>
+              <w:jc w:val="center"/>
+            </w:pPr>
+            <w:r>
+              <w:rPr>
+                <w:rFonts w:ascii="Times New Roman" w:hAnsi="Times New Roman" w:eastAsia="Times New Roman"/>
+                <w:b/>
+                <w:color w:val="000000"/>
+                <w:sz w:val="22"/>
+              </w:rPr>
+              <w:t>Đặc trưng</w:t>
+            </w:r>
+          </w:p>
+        </w:tc>
+        <w:tc>
+          <w:tcPr>
+            <w:tcW w:type="dxa" w:w="5669"/>
+            <w:shd w:fill="E2E8F0"/>
+          </w:tcPr>
+          <w:p>
+            <w:pPr>
+              <w:spacing w:after="60" w:line="276" w:lineRule="auto"/>
+              <w:jc w:val="center"/>
+            </w:pPr>
+            <w:r>
+              <w:rPr>
+                <w:rFonts w:ascii="Times New Roman" w:hAnsi="Times New Roman" w:eastAsia="Times New Roman"/>
+                <w:b/>
+                <w:color w:val="000000"/>
+                <w:sz w:val="22"/>
+              </w:rPr>
+              <w:t>Vai trò trong đồ án</w:t>
+            </w:r>
+          </w:p>
+        </w:tc>
+      </w:tr>
+      <w:tr>
+        <w:tc>
+          <w:tcPr>
+            <w:tcW w:type="dxa" w:w="3118"/>
+          </w:tcPr>
+          <w:p>
+            <w:pPr>
+              <w:spacing w:after="60" w:line="276" w:lineRule="auto"/>
+              <w:jc w:val="center"/>
+            </w:pPr>
+            <w:r>
+              <w:rPr>
+                <w:rFonts w:ascii="Times New Roman" w:hAnsi="Times New Roman" w:eastAsia="Times New Roman"/>
+                <w:color w:val="000000"/>
+                <w:sz w:val="21"/>
+              </w:rPr>
+              <w:t>Waveform</w:t>
+            </w:r>
+          </w:p>
+        </w:tc>
+        <w:tc>
+          <w:tcPr>
+            <w:tcW w:type="dxa" w:w="5669"/>
+          </w:tcPr>
+          <w:p>
+            <w:pPr>
+              <w:spacing w:after="60" w:line="276" w:lineRule="auto"/>
+              <w:jc w:val="left"/>
+            </w:pPr>
+            <w:r>
+              <w:rPr>
+                <w:rFonts w:ascii="Times New Roman" w:hAnsi="Times New Roman" w:eastAsia="Times New Roman"/>
+                <w:color w:val="000000"/>
+                <w:sz w:val="21"/>
+              </w:rPr>
+              <w:t>Tín hiệu âm thanh gốc trong miền thời gian</w:t>
+            </w:r>
+          </w:p>
+        </w:tc>
+      </w:tr>
+      <w:tr>
+        <w:tc>
+          <w:tcPr>
+            <w:tcW w:type="dxa" w:w="3118"/>
+          </w:tcPr>
+          <w:p>
+            <w:pPr>
+              <w:spacing w:after="60" w:line="276" w:lineRule="auto"/>
+              <w:jc w:val="center"/>
+            </w:pPr>
+            <w:r>
+              <w:rPr>
+                <w:rFonts w:ascii="Times New Roman" w:hAnsi="Times New Roman" w:eastAsia="Times New Roman"/>
+                <w:color w:val="000000"/>
+                <w:sz w:val="21"/>
+              </w:rPr>
+              <w:t>Spectrogram</w:t>
+            </w:r>
+          </w:p>
+        </w:tc>
+        <w:tc>
+          <w:tcPr>
+            <w:tcW w:type="dxa" w:w="5669"/>
+          </w:tcPr>
+          <w:p>
+            <w:pPr>
+              <w:spacing w:after="60" w:line="276" w:lineRule="auto"/>
+              <w:jc w:val="left"/>
+            </w:pPr>
+            <w:r>
+              <w:rPr>
+                <w:rFonts w:ascii="Times New Roman" w:hAnsi="Times New Roman" w:eastAsia="Times New Roman"/>
+                <w:color w:val="000000"/>
+                <w:sz w:val="21"/>
+              </w:rPr>
+              <w:t>Phân tích biến thiên miền thời gian - tần số (Time-Frequency)</w:t>
+            </w:r>
+          </w:p>
+        </w:tc>
+      </w:tr>
+      <w:tr>
+        <w:tc>
+          <w:tcPr>
+            <w:tcW w:type="dxa" w:w="3118"/>
+          </w:tcPr>
+          <w:p>
+            <w:pPr>
+              <w:spacing w:after="60" w:line="276" w:lineRule="auto"/>
+              <w:jc w:val="center"/>
+            </w:pPr>
+            <w:r>
+              <w:rPr>
+                <w:rFonts w:ascii="Times New Roman" w:hAnsi="Times New Roman" w:eastAsia="Times New Roman"/>
+                <w:color w:val="000000"/>
+                <w:sz w:val="21"/>
+              </w:rPr>
+              <w:t>Mel-spectrogram</w:t>
+            </w:r>
+          </w:p>
+        </w:tc>
+        <w:tc>
+          <w:tcPr>
+            <w:tcW w:type="dxa" w:w="5669"/>
+          </w:tcPr>
+          <w:p>
+            <w:pPr>
+              <w:spacing w:after="60" w:line="276" w:lineRule="auto"/>
+              <w:jc w:val="left"/>
+            </w:pPr>
+            <w:r>
+              <w:rPr>
+                <w:rFonts w:ascii="Times New Roman" w:hAnsi="Times New Roman" w:eastAsia="Times New Roman"/>
+                <w:color w:val="000000"/>
+                <w:sz w:val="21"/>
+              </w:rPr>
+              <w:t>Minh họa phổ theo thang đo Mel scale</w:t>
+            </w:r>
+          </w:p>
+        </w:tc>
+      </w:tr>
+      <w:tr>
+        <w:tc>
+          <w:tcPr>
+            <w:tcW w:type="dxa" w:w="3118"/>
+          </w:tcPr>
+          <w:p>
+            <w:pPr>
+              <w:spacing w:after="60" w:line="276" w:lineRule="auto"/>
+              <w:jc w:val="center"/>
+            </w:pPr>
+            <w:r>
+              <w:rPr>
+                <w:rFonts w:ascii="Times New Roman" w:hAnsi="Times New Roman" w:eastAsia="Times New Roman"/>
+                <w:color w:val="000000"/>
+                <w:sz w:val="21"/>
+              </w:rPr>
+              <w:t>MFCC</w:t>
+            </w:r>
+          </w:p>
+        </w:tc>
+        <w:tc>
+          <w:tcPr>
+            <w:tcW w:type="dxa" w:w="5669"/>
+          </w:tcPr>
+          <w:p>
+            <w:pPr>
+              <w:spacing w:after="60" w:line="276" w:lineRule="auto"/>
+              <w:jc w:val="left"/>
+            </w:pPr>
+            <w:r>
+              <w:rPr>
+                <w:rFonts w:ascii="Times New Roman" w:hAnsi="Times New Roman" w:eastAsia="Times New Roman"/>
+                <w:color w:val="000000"/>
+                <w:sz w:val="21"/>
+              </w:rPr>
+              <w:t>ĐẦU VÀO CHÍNH CỦA MÔ HÌNH TD-RESNET (Tensor 1 × 51 × 40)</w:t>
+            </w:r>
+          </w:p>
+        </w:tc>
+      </w:tr>
+      <w:tr>
+        <w:tc>
+          <w:tcPr>
+            <w:tcW w:type="dxa" w:w="3118"/>
+          </w:tcPr>
+          <w:p>
+            <w:pPr>
+              <w:spacing w:after="60" w:line="276" w:lineRule="auto"/>
+              <w:jc w:val="center"/>
+            </w:pPr>
+            <w:r>
+              <w:rPr>
+                <w:rFonts w:ascii="Times New Roman" w:hAnsi="Times New Roman" w:eastAsia="Times New Roman"/>
+                <w:color w:val="000000"/>
+                <w:sz w:val="21"/>
+              </w:rPr>
+              <w:t>RMS / Energy</w:t>
+            </w:r>
+          </w:p>
+        </w:tc>
+        <w:tc>
+          <w:tcPr>
+            <w:tcW w:type="dxa" w:w="5669"/>
+          </w:tcPr>
+          <w:p>
+            <w:pPr>
+              <w:spacing w:after="60" w:line="276" w:lineRule="auto"/>
+              <w:jc w:val="left"/>
+            </w:pPr>
+            <w:r>
+              <w:rPr>
+                <w:rFonts w:ascii="Times New Roman" w:hAnsi="Times New Roman" w:eastAsia="Times New Roman"/>
+                <w:color w:val="000000"/>
+                <w:sz w:val="21"/>
+              </w:rPr>
+              <w:t>Phân tích mức năng lượng tín hiệu</w:t>
+            </w:r>
+          </w:p>
+        </w:tc>
+      </w:tr>
+      <w:tr>
+        <w:tc>
+          <w:tcPr>
+            <w:tcW w:type="dxa" w:w="3118"/>
+          </w:tcPr>
+          <w:p>
+            <w:pPr>
+              <w:spacing w:after="60" w:line="276" w:lineRule="auto"/>
+              <w:jc w:val="center"/>
+            </w:pPr>
+            <w:r>
+              <w:rPr>
+                <w:rFonts w:ascii="Times New Roman" w:hAnsi="Times New Roman" w:eastAsia="Times New Roman"/>
+                <w:color w:val="000000"/>
+                <w:sz w:val="21"/>
+              </w:rPr>
+              <w:t>ZCR</w:t>
+            </w:r>
+          </w:p>
+        </w:tc>
+        <w:tc>
+          <w:tcPr>
+            <w:tcW w:type="dxa" w:w="5669"/>
+          </w:tcPr>
+          <w:p>
+            <w:pPr>
+              <w:spacing w:after="60" w:line="276" w:lineRule="auto"/>
+              <w:jc w:val="left"/>
+            </w:pPr>
+            <w:r>
+              <w:rPr>
+                <w:rFonts w:ascii="Times New Roman" w:hAnsi="Times New Roman" w:eastAsia="Times New Roman"/>
+                <w:color w:val="000000"/>
+                <w:sz w:val="21"/>
+              </w:rPr>
+              <w:t>Phân tích mức biến thiên waveform và âm vô thanh/hữu thanh</w:t>
+            </w:r>
+          </w:p>
+        </w:tc>
+      </w:tr>
+      <w:tr>
+        <w:tc>
+          <w:tcPr>
+            <w:tcW w:type="dxa" w:w="3118"/>
+          </w:tcPr>
+          <w:p>
+            <w:pPr>
+              <w:spacing w:after="60" w:line="276" w:lineRule="auto"/>
+              <w:jc w:val="center"/>
+            </w:pPr>
+            <w:r>
+              <w:rPr>
+                <w:rFonts w:ascii="Times New Roman" w:hAnsi="Times New Roman" w:eastAsia="Times New Roman"/>
+                <w:color w:val="000000"/>
+                <w:sz w:val="21"/>
+              </w:rPr>
+              <w:t>Pitch</w:t>
+            </w:r>
+          </w:p>
+        </w:tc>
+        <w:tc>
+          <w:tcPr>
+            <w:tcW w:type="dxa" w:w="5669"/>
+          </w:tcPr>
+          <w:p>
+            <w:pPr>
+              <w:spacing w:after="60" w:line="276" w:lineRule="auto"/>
+              <w:jc w:val="left"/>
+            </w:pPr>
+            <w:r>
+              <w:rPr>
+                <w:rFonts w:ascii="Times New Roman" w:hAnsi="Times New Roman" w:eastAsia="Times New Roman"/>
+                <w:color w:val="000000"/>
+                <w:sz w:val="21"/>
+              </w:rPr>
+              <w:t>Có thể dùng phân tích bổ sung tần số cơ bản nếu cần</w:t>
+            </w:r>
+          </w:p>
+        </w:tc>
+      </w:tr>
+    </w:tbl>
+    <w:p>
+      <w:pPr>
+        <w:spacing w:after="120"/>
+      </w:pPr>
+    </w:p>
+    <w:p>
+      <w:pPr>
+        <w:spacing w:line="360" w:lineRule="auto" w:after="120"/>
+        <w:ind w:firstLine="0"/>
+        <w:jc w:val="both"/>
+      </w:pPr>
+      <w:r>
+        <w:rPr>
+          <w:rFonts w:ascii="Times New Roman" w:hAnsi="Times New Roman" w:eastAsia="Times New Roman"/>
+          <w:b w:val="0"/>
+          <w:i w:val="0"/>
+          <w:color w:val="000000"/>
+          <w:sz w:val="26"/>
+        </w:rPr>
+        <w:t>Đối với mô hình chính, pipeline thực tế là:</w:t>
+      </w:r>
+    </w:p>
+    <w:tbl>
+      <w:tblPr>
+        <w:tblW w:type="auto" w:w="0"/>
+        <w:jc w:val="center"/>
+        <w:tblLayout w:type="fixed"/>
+        <w:tblLook w:firstColumn="1" w:firstRow="1" w:lastColumn="0" w:lastRow="0" w:noHBand="0" w:noVBand="1" w:val="04A0"/>
+      </w:tblPr>
+      <w:tblGrid>
+        <w:gridCol w:w="9405"/>
+      </w:tblGrid>
+      <w:tr>
+        <w:tc>
+          <w:tcPr>
+            <w:tcW w:type="dxa" w:w="8787"/>
+            <w:shd w:fill="F8FAFC"/>
+            <w:tcBorders>
+              <w:top w:val="single" w:sz="4" w:space="0" w:color="E2E8F0"/>
+              <w:left w:val="single" w:sz="18" w:space="0" w:color="2563EB"/>
+              <w:bottom w:val="single" w:sz="4" w:space="0" w:color="E2E8F0"/>
+              <w:right w:val="single" w:sz="4" w:space="0" w:color="E2E8F0"/>
+            </w:tcBorders>
+          </w:tcPr>
+          <w:p>
+            <w:pPr>
+              <w:spacing w:before="80" w:after="80" w:line="276" w:lineRule="auto"/>
+            </w:pPr>
+            <w:r>
+              <w:rPr>
+                <w:rFonts w:ascii="Consolas" w:hAnsi="Consolas"/>
+                <w:color w:val="1E293B"/>
+                <w:sz w:val="19"/>
+              </w:rPr>
+              <w:t>Audio waveform</w:t>
+              <w:br/>
+              <w:t xml:space="preserve">      ↓</w:t>
+              <w:br/>
+              <w:t>40-dimensional MFCC</w:t>
+              <w:br/>
+              <w:t xml:space="preserve">      ↓</w:t>
+              <w:br/>
+              <w:t>Time × Feature (51 × 40)</w:t>
+              <w:br/>
+              <w:t xml:space="preserve">      ↓</w:t>
+              <w:br/>
+              <w:t>TD-ResNet</w:t>
+              <w:br/>
+              <w:t xml:space="preserve">      ↓</w:t>
+              <w:br/>
+              <w:t>Embedding z</w:t>
+              <w:br/>
+              <w:t xml:space="preserve">      ↓</w:t>
+              <w:br/>
+              <w:t>Prototypical Network</w:t>
+            </w:r>
+          </w:p>
+        </w:tc>
+      </w:tr>
+    </w:tbl>
+    <w:p>
+      <w:pPr>
+        <w:spacing w:after="80"/>
+      </w:pPr>
+    </w:p>
+    <w:p>
+      <w:pPr>
+        <w:pStyle w:val="Heading3"/>
+        <w:keepNext/>
+        <w:spacing w:before="200" w:after="80"/>
+      </w:pPr>
+      <w:r>
+        <w:rPr>
+          <w:rFonts w:ascii="Times New Roman" w:hAnsi="Times New Roman" w:eastAsia="Times New Roman"/>
+          <w:b/>
+          <w:color w:val="000000"/>
+          <w:sz w:val="26"/>
+        </w:rPr>
+        <w:t>2.4.18. Nhận xét</w:t>
+      </w:r>
+    </w:p>
+    <w:p>
+      <w:pPr>
+        <w:spacing w:line="360" w:lineRule="auto" w:after="120"/>
+        <w:ind w:firstLine="0"/>
+        <w:jc w:val="both"/>
+      </w:pPr>
+      <w:r>
+        <w:rPr>
+          <w:rFonts w:ascii="Times New Roman" w:hAnsi="Times New Roman" w:eastAsia="Times New Roman"/>
+          <w:b w:val="0"/>
+          <w:i w:val="0"/>
+          <w:color w:val="000000"/>
+          <w:sz w:val="26"/>
+        </w:rPr>
+        <w:t>Từ source code của repository có thể xác nhận rằng MFCC là đặc trưng tiếng nói chính được sử dụng trong hệ thống.</w:t>
+      </w:r>
+    </w:p>
+    <w:p>
+      <w:pPr>
+        <w:spacing w:line="360" w:lineRule="auto" w:after="120"/>
+        <w:ind w:firstLine="0"/>
+        <w:jc w:val="both"/>
+      </w:pPr>
+      <w:r>
+        <w:rPr>
+          <w:rFonts w:ascii="Times New Roman" w:hAnsi="Times New Roman" w:eastAsia="Times New Roman"/>
+          <w:b w:val="0"/>
+          <w:i w:val="0"/>
+          <w:color w:val="000000"/>
+          <w:sz w:val="26"/>
+        </w:rPr>
+        <w:t>Mỗi audio sau preprocessing được chuyển thành chuỗi các vector gồm 40 MFCC coefficients, sử dụng cửa sổ 40 ms và stride 20 ms. Với sample rate 16 kHz, các tham số tương ứng là n_fft = 640 và hop_length = 320.</w:t>
+      </w:r>
+    </w:p>
+    <w:p>
+      <w:pPr>
+        <w:spacing w:line="360" w:lineRule="auto" w:after="120"/>
+        <w:ind w:firstLine="0"/>
+        <w:jc w:val="both"/>
+      </w:pPr>
+      <w:r>
+        <w:rPr>
+          <w:rFonts w:ascii="Times New Roman" w:hAnsi="Times New Roman" w:eastAsia="Times New Roman"/>
+          <w:b w:val="0"/>
+          <w:i w:val="0"/>
+          <w:color w:val="000000"/>
+          <w:sz w:val="26"/>
+        </w:rPr>
+        <w:t>Ma trận MFCC được transpose và unsqueeze thành dạng 1 × 51 × 40 trước khi được đưa vào TD-ResNet.</w:t>
+      </w:r>
+    </w:p>
+    <w:p>
+      <w:pPr>
+        <w:spacing w:line="360" w:lineRule="auto" w:after="120"/>
+        <w:ind w:firstLine="0"/>
+        <w:jc w:val="both"/>
+      </w:pPr>
+      <w:r>
+        <w:rPr>
+          <w:rFonts w:ascii="Times New Roman" w:hAnsi="Times New Roman" w:eastAsia="Times New Roman"/>
+          <w:b w:val="0"/>
+          <w:i w:val="0"/>
+          <w:color w:val="000000"/>
+          <w:sz w:val="26"/>
+        </w:rPr>
+        <w:t>Việc sử dụng cùng một pipeline MFCC cho FS-GSC, AudioMNIST và các segment FSC giúp giữ representation đầu vào thống nhất giữa các experiment. Nhờ đó nhóm có thể đánh giá sự khác biệt do dataset và domain thay vì do mỗi dataset sử dụng một loại đặc trưng khác nhau.</w:t>
       </w:r>
     </w:p>
     <w:p>
@@ -17561,8 +21630,8 @@
       </w:r>
     </w:p>
     <w:sectPr>
-      <w:footerReference w:type="default" r:id="rId21"/>
-      <w:footerReference w:type="first" r:id="rId22"/>
+      <w:footerReference w:type="default" r:id="rId22"/>
+      <w:footerReference w:type="first" r:id="rId23"/>
       <w:pgSz w:w="12240" w:h="15840"/>
       <w:pgMar w:top="1134" w:right="1134" w:bottom="1134" w:left="1701" w:header="720" w:footer="720" w:gutter="0"/>
       <w:cols w:space="720"/>

</xml_diff>